<commit_message>
Add HTML slides for midterm report: architecture, MLFQ structure, preemption, performance, and multi-seed validation
- Created slide3-architecture.html to illustrate the system architecture.
- Created slide4-mlfq-structure.html to detail the MLFQ structure and parameters.
- Created slide5-mlfq-preemption.html to explain the preemption process in MLFQ.
- Created slide6-performance.html to present performance metrics and findings.
- Created slide7-multiseed.html to summarize multi-seed validation results and statistics.
- Updated midterm.docx with the latest findings and analysis.
</commit_message>
<xml_diff>
--- a/04-proposal/final/proposal.docx
+++ b/04-proposal/final/proposal.docx
@@ -679,7 +679,7 @@
           <w:sz w:val="22"/>
           <w:szCs w:val="22"/>
         </w:rPr>
-        <w:t xml:space="preserve">는 Corbato et al.이 CTSS(Compatible Time-Sharing System)에서 최초로 제안한 알고리즘으로 [2], 작업의 실행 특성을 관찰하여 우선순위를 동적으로 조정한다. 짧은 작업은 높은 우선순위 큐에서 빠르게 처리되고, 긴 작업은 점차 하위 큐로 이동한다. Arpaci-Dusseau &amp; Arpaci-Dusseau는 MLFQ의 5가지 핵심 규칙을 정리하며, 현대 운영체제에서 가장 널리 사용되는 스케줄링 알고리즘임을 설명하였다 [3].</w:t>
+        <w:t xml:space="preserve">는 작업의 실행 특성을 관찰하여 우선순위를 동적으로 조정하는 알고리즘이다. 짧은 작업은 높은 우선순위 큐에서 빠르게 처리되고, 긴 작업은 점차 하위 큐로 이동한다. Arpaci-Dusseau &amp; Arpaci-Dusseau는 MLFQ의 5가지 핵심 규칙을 정리하며, 현대 운영체제에서 가장 널리 사용되는 스케줄링 알고리즘임을 설명하였다 [2, Ch.8].</w:t>
       </w:r>
     </w:p>
     <w:p>
@@ -704,7 +704,24 @@
           <w:sz w:val="22"/>
           <w:szCs w:val="22"/>
         </w:rPr>
-        <w:t xml:space="preserve">는 Demers, Keshav, &amp; Shenker가 제안한 공정 큐잉 알고리즘으로 [4], GPS(Generalized Processor Sharing) 이론을 기반으로 한다. 각 흐름(flow)에 가중치를 부여하여 가중치에 비례하는 서비스를 제공하며, Virtual Finish Time 개념을 사용하여 스케줄링 순서를 결정한다.</w:t>
+        <w:t xml:space="preserve">는 네트워크 분야에서 제안된 공정 큐잉 알고리즘으로, GPS(Generalized Processor Sharing) 이론을 기반으로 한다 [3, Ch.7]. 각 흐름(flow)에 가중치를 부여하여 가중치에 비례하는 서비스를 제공하며, Virtual Finish Time 개념을 사용하여 스케줄링 순서를 결정한다.</w:t>
+      </w:r>
+    </w:p>
+    <w:p>
+      <w:pPr>
+        <w:spacing w:after="120" w:line="360"/>
+        <w:jc w:val="center"/>
+      </w:pPr>
+      <w:r>
+        <w:rPr>
+          <w:rFonts w:ascii="맑은 고딕" w:cs="맑은 고딕" w:eastAsia="맑은 고딕" w:hAnsi="맑은 고딕"/>
+          <w:i/>
+          <w:iCs/>
+          <w:color w:val="808080"/>
+          <w:sz w:val="20"/>
+          <w:szCs w:val="20"/>
+        </w:rPr>
+        <w:t xml:space="preserve">[그림 1] OS 스케줄링 알고리즘 개념 비교 (참조: figures/proposal-figures.pptx, 슬라이드 1)</w:t>
       </w:r>
     </w:p>
     <w:p>
@@ -715,77 +732,77 @@
         <w:rPr>
           <w:rFonts w:ascii="맑은 고딕" w:cs="맑은 고딕" w:eastAsia="맑은 고딕" w:hAnsi="맑은 고딕"/>
         </w:rPr>
-        <w:t xml:space="preserve">2.2 LLM 서빙 최적화 연구</w:t>
-      </w:r>
-    </w:p>
-    <w:p>
-      <w:pPr>
-        <w:spacing w:after="120" w:line="360"/>
-      </w:pPr>
-      <w:r>
-        <w:rPr>
-          <w:rFonts w:ascii="맑은 고딕" w:cs="맑은 고딕" w:eastAsia="맑은 고딕" w:hAnsi="맑은 고딕"/>
-          <w:color w:val="000000"/>
-          <w:sz w:val="22"/>
-          <w:szCs w:val="22"/>
-        </w:rPr>
-        <w:t xml:space="preserve">LLM API 서빙 분야에서는 추론 성능 최적화를 위한 다양한 연구가 진행되어 왔다.</w:t>
-      </w:r>
-    </w:p>
-    <w:p>
-      <w:pPr>
-        <w:spacing w:after="120" w:line="360"/>
-      </w:pPr>
-      <w:r>
-        <w:rPr>
-          <w:rFonts w:ascii="맑은 고딕" w:cs="맑은 고딕" w:eastAsia="맑은 고딕" w:hAnsi="맑은 고딕"/>
-          <w:color w:val="000000"/>
-          <w:sz w:val="22"/>
-          <w:szCs w:val="22"/>
-        </w:rPr>
-        <w:t xml:space="preserve">Kwon et al.은 vLLM 시스템에서 PagedAttention 기법을 제안하였다 [5]. 이 기법은 운영체제의 가상 메모리 페이징 기법에서 착안하여, LLM 추론 시 KV 캐시 메모리를 비연속적 블록으로 관리한다. 이를 통해 기존 대비 메모리 활용률을 최대 55% 향상시키고, 처리량(throughput)을 2-4배 개선하였다.</w:t>
-      </w:r>
-    </w:p>
-    <w:p>
-      <w:pPr>
-        <w:spacing w:after="120" w:line="360"/>
-      </w:pPr>
-      <w:r>
-        <w:rPr>
-          <w:rFonts w:ascii="맑은 고딕" w:cs="맑은 고딕" w:eastAsia="맑은 고딕" w:hAnsi="맑은 고딕"/>
-          <w:color w:val="000000"/>
-          <w:sz w:val="22"/>
-          <w:szCs w:val="22"/>
-        </w:rPr>
-        <w:t xml:space="preserve">Yu et al.은 ORCA 시스템에서 iteration-level 스케줄링을 도입하였다 [6]. 기존의 요청 단위 배치 처리 방식과 달리, 매 디코딩 반복(iteration)마다 새로운 요청을 동적으로 삽입하는 방식으로 GPU 활용률과 처리량을 향상시켰다.</w:t>
-      </w:r>
-    </w:p>
-    <w:p>
-      <w:pPr>
-        <w:spacing w:after="120" w:line="360"/>
-      </w:pPr>
-      <w:r>
-        <w:rPr>
-          <w:rFonts w:ascii="맑은 고딕" w:cs="맑은 고딕" w:eastAsia="맑은 고딕" w:hAnsi="맑은 고딕"/>
-          <w:color w:val="000000"/>
-          <w:sz w:val="22"/>
-          <w:szCs w:val="22"/>
-        </w:rPr>
-        <w:t xml:space="preserve">Agrawal et al.은 Sarathi-Serve 시스템에서 chunked prefill 기법을 제안하였다 [7]. LLM 추론의 prefill(입력 처리) 단계와 decode(출력 생성) 단계가 서로 다른 연산 특성을 가지는 점에 착안하여, prefill 연산을 작은 청크로 분할하고 decode 연산과 인터리빙하는 방식으로 지연시간 변동을 감소시켰다.</w:t>
-      </w:r>
-    </w:p>
-    <w:p>
-      <w:pPr>
-        <w:spacing w:after="120" w:line="360"/>
-      </w:pPr>
-      <w:r>
-        <w:rPr>
-          <w:rFonts w:ascii="맑은 고딕" w:cs="맑은 고딕" w:eastAsia="맑은 고딕" w:hAnsi="맑은 고딕"/>
-          <w:color w:val="000000"/>
-          <w:sz w:val="22"/>
-          <w:szCs w:val="22"/>
-        </w:rPr>
-        <w:t xml:space="preserve">그러나 이들 연구는 주로 GPU 메모리 관리, 배치 처리 최적화, 추론 파이프라인 효율화에 집중하고 있으며, 다중 사용자 환경에서의 요청 스케줄링과 테넌트 간 공정성 문제는 상대적으로 다루어지지 않았다. 본 연구는 이 간극을 메우기 위해 OS 스케줄링 이론을 LLM 요청 관리에 적용한다.</w:t>
+        <w:t xml:space="preserve">2.2 LLM 서빙 시스템</w:t>
+      </w:r>
+    </w:p>
+    <w:p>
+      <w:pPr>
+        <w:spacing w:after="120" w:line="360"/>
+      </w:pPr>
+      <w:r>
+        <w:rPr>
+          <w:rFonts w:ascii="맑은 고딕" w:cs="맑은 고딕" w:eastAsia="맑은 고딕" w:hAnsi="맑은 고딕"/>
+          <w:color w:val="000000"/>
+          <w:sz w:val="22"/>
+          <w:szCs w:val="22"/>
+        </w:rPr>
+        <w:t xml:space="preserve">LLM 서빙 분야에서는 추론 성능 최적화를 위한 다양한 기술이 개발되어 왔다.</w:t>
+      </w:r>
+    </w:p>
+    <w:p>
+      <w:pPr>
+        <w:spacing w:after="120" w:line="360"/>
+      </w:pPr>
+      <w:r>
+        <w:rPr>
+          <w:rFonts w:ascii="맑은 고딕" w:cs="맑은 고딕" w:eastAsia="맑은 고딕" w:hAnsi="맑은 고딕"/>
+          <w:color w:val="000000"/>
+          <w:sz w:val="22"/>
+          <w:szCs w:val="22"/>
+        </w:rPr>
+        <w:t xml:space="preserve">vLLM은 UC Berkeley에서 개발한 고성능 LLM 추론 엔진으로, PagedAttention이라는 핵심 기술을 도입하였다 [4]. 이 기법은 운영체제의 가상 메모리 페이징 기법에서 착안하여, LLM 추론 시 KV(Key-Value) 캐시 메모리를 비연속적 블록으로 관리한다. vLLM 공식 문서에 따르면, 기존 대비 메모리 활용률을 최대 55% 향상시키고 처리량(throughput)을 2-4배 개선하였다.</w:t>
+      </w:r>
+    </w:p>
+    <w:p>
+      <w:pPr>
+        <w:spacing w:after="120" w:line="360"/>
+      </w:pPr>
+      <w:r>
+        <w:rPr>
+          <w:rFonts w:ascii="맑은 고딕" w:cs="맑은 고딕" w:eastAsia="맑은 고딕" w:hAnsi="맑은 고딕"/>
+          <w:color w:val="000000"/>
+          <w:sz w:val="22"/>
+          <w:szCs w:val="22"/>
+        </w:rPr>
+        <w:t xml:space="preserve">Hugging Face TGI(Text Generation Inference)는 오픈소스 LLM 배포 도구로, continuous batching과 Flash Attention 등의 기술을 활용하여 생산 환경에서의 추론 효율성을 높인다 [5]. TGI는 Docker 기반으로 손쉬운 배포를 지원하며, OpenAI 호환 API를 제공한다.</w:t>
+      </w:r>
+    </w:p>
+    <w:p>
+      <w:pPr>
+        <w:spacing w:after="120" w:line="360"/>
+      </w:pPr>
+      <w:r>
+        <w:rPr>
+          <w:rFonts w:ascii="맑은 고딕" w:cs="맑은 고딕" w:eastAsia="맑은 고딕" w:hAnsi="맑은 고딕"/>
+          <w:color w:val="000000"/>
+          <w:sz w:val="22"/>
+          <w:szCs w:val="22"/>
+        </w:rPr>
+        <w:t xml:space="preserve">Ollama는 로컬 환경에서 LLM을 간편하게 실행할 수 있는 도구로, REST API를 통해 다양한 오픈소스 모델(Llama, Mistral, Gemma 등)을 제공한다 [6]. 본 연구의 프로토타입에서 LLM 백엔드로 사용하였다.</w:t>
+      </w:r>
+    </w:p>
+    <w:p>
+      <w:pPr>
+        <w:spacing w:after="120" w:line="360"/>
+      </w:pPr>
+      <w:r>
+        <w:rPr>
+          <w:rFonts w:ascii="맑은 고딕" w:cs="맑은 고딕" w:eastAsia="맑은 고딕" w:hAnsi="맑은 고딕"/>
+          <w:color w:val="000000"/>
+          <w:sz w:val="22"/>
+          <w:szCs w:val="22"/>
+        </w:rPr>
+        <w:t xml:space="preserve">그러나 기존 LLM 서빙 시스템들은 주로 GPU 메모리 관리와 추론 파이프라인 효율화에 집중하고 있으며, 다중 사용자 환경에서의 요청 스케줄링과 테넌트 간 공정성 문제는 상대적으로 다루어지지 않았다. 본 연구는 이 간극을 메우기 위해 OS 스케줄링 이론을 LLM 요청 관리에 적용한다.</w:t>
       </w:r>
     </w:p>
     <w:p>
@@ -810,7 +827,7 @@
           <w:sz w:val="22"/>
           <w:szCs w:val="22"/>
         </w:rPr>
-        <w:t xml:space="preserve">Jain, Chiu, &amp; Hawe는 공유 컴퓨터 시스템에서 자원 배분의 공정성을 정량적으로 측정하기 위한 Jain's Fairness Index(JFI)를 제안하였다 [8]. JFI는 0(완전 불공정)부터 1(완전 공정) 사이의 값을 가지며, 본 연구는 JFI를 멀티테넌트 LLM API 환경에 적용하여, 시스템 수준과 테넌트 수준의 이중 공정성 측정 방법론을 제시한다.</w:t>
+        <w:t xml:space="preserve">Jain's Fairness Index(JFI)는 공유 자원 시스템에서 자원 배분의 공정성을 정량적으로 측정하기 위한 지표이다 [3, Ch.9]. 운영체제 및 네트워크 교과서에서 범용 공정성 지표로 널리 소개되고 있다. JFI는 0(완전 불공정)부터 1(완전 공정) 사이의 값을 가지며, 본 연구는 JFI를 멀티테넌트 LLM API 환경에 적용하여, 시스템 수준과 테넌트 수준의 이중 공정성 측정 방법론을 제시한다.</w:t>
       </w:r>
     </w:p>
     <w:p>
@@ -1431,6 +1448,28 @@
     </w:p>
     <w:p>
       <w:pPr>
+        <w:spacing w:before="120" w:after="40"/>
+        <w:jc w:val="center"/>
+      </w:pPr>
+      <w:r>
+        <w:rPr>
+          <w:rFonts w:ascii="맑은 고딕" w:cs="맑은 고딕" w:eastAsia="맑은 고딕" w:hAnsi="맑은 고딕"/>
+          <w:i/>
+          <w:iCs/>
+          <w:color w:val="666666"/>
+          <w:sz w:val="20"/>
+          <w:szCs w:val="20"/>
+        </w:rPr>
+        <w:t xml:space="preserve">[그림 2] OS-LLM 개념 매핑도 (참조: figures/proposal-figures.pptx, 슬라이드 2)</w:t>
+      </w:r>
+    </w:p>
+    <w:p>
+      <w:pPr>
+        <w:spacing w:after="80"/>
+      </w:pPr>
+    </w:p>
+    <w:p>
+      <w:pPr>
         <w:pStyle w:val="Heading2"/>
       </w:pPr>
       <w:r>
@@ -1468,7 +1507,7 @@
           <w:sz w:val="20"/>
           <w:szCs w:val="20"/>
         </w:rPr>
-        <w:t xml:space="preserve">그림 1. 시스템 아키텍처 (4계층 구조)</w:t>
+        <w:t xml:space="preserve">[그림 3] 시스템 아키텍처 4계층 구조 (참조: figures/proposal-figures.pptx, 슬라이드 3)</w:t>
       </w:r>
     </w:p>
     <w:tbl>
@@ -2540,6 +2579,28 @@
         </w:tc>
       </w:tr>
     </w:tbl>
+    <w:p>
+      <w:pPr>
+        <w:spacing w:after="80"/>
+      </w:pPr>
+    </w:p>
+    <w:p>
+      <w:pPr>
+        <w:spacing w:before="120" w:after="40"/>
+        <w:jc w:val="center"/>
+      </w:pPr>
+      <w:r>
+        <w:rPr>
+          <w:rFonts w:ascii="맑은 고딕" w:cs="맑은 고딕" w:eastAsia="맑은 고딕" w:hAnsi="맑은 고딕"/>
+          <w:i/>
+          <w:iCs/>
+          <w:color w:val="666666"/>
+          <w:sz w:val="20"/>
+          <w:szCs w:val="20"/>
+        </w:rPr>
+        <w:t xml:space="preserve">[그림 4] 알고리즘별 성능 비교 차트 (참조: figures/proposal-figures.pptx, 슬라이드 4)</w:t>
+      </w:r>
+    </w:p>
     <w:p>
       <w:pPr>
         <w:spacing w:after="80"/>
@@ -3377,105 +3438,119 @@
           <w:sz w:val="22"/>
           <w:szCs w:val="22"/>
         </w:rPr>
-        <w:t xml:space="preserve">[1] A. Silberschatz, P. B. Galvin, and G. Gagne, Operating System Concepts, 10th ed. Wiley, 2018.</w:t>
-      </w:r>
-    </w:p>
-    <w:p>
-      <w:pPr>
-        <w:spacing w:after="120" w:line="360"/>
-      </w:pPr>
-      <w:r>
-        <w:rPr>
-          <w:rFonts w:ascii="맑은 고딕" w:cs="맑은 고딕" w:eastAsia="맑은 고딕" w:hAnsi="맑은 고딕"/>
-          <w:color w:val="000000"/>
-          <w:sz w:val="22"/>
-          <w:szCs w:val="22"/>
-        </w:rPr>
-        <w:t xml:space="preserve">[2] F. J. Corbato, M. M. Daggett, and R. C. Daley, "An experimental time-sharing system," in Proceedings of the AFIPS Spring Joint Computer Conference, 1962, pp. 335-344.</w:t>
-      </w:r>
-    </w:p>
-    <w:p>
-      <w:pPr>
-        <w:spacing w:after="120" w:line="360"/>
-      </w:pPr>
-      <w:r>
-        <w:rPr>
-          <w:rFonts w:ascii="맑은 고딕" w:cs="맑은 고딕" w:eastAsia="맑은 고딕" w:hAnsi="맑은 고딕"/>
-          <w:color w:val="000000"/>
-          <w:sz w:val="22"/>
-          <w:szCs w:val="22"/>
-        </w:rPr>
-        <w:t xml:space="preserve">[3] R. H. Arpaci-Dusseau and A. C. Arpaci-Dusseau, Operating Systems: Three Easy Pieces. Arpaci-Dusseau Books, 2018.</w:t>
-      </w:r>
-    </w:p>
-    <w:p>
-      <w:pPr>
-        <w:spacing w:after="120" w:line="360"/>
-      </w:pPr>
-      <w:r>
-        <w:rPr>
-          <w:rFonts w:ascii="맑은 고딕" w:cs="맑은 고딕" w:eastAsia="맑은 고딕" w:hAnsi="맑은 고딕"/>
-          <w:color w:val="000000"/>
-          <w:sz w:val="22"/>
-          <w:szCs w:val="22"/>
-        </w:rPr>
-        <w:t xml:space="preserve">[4] A. Demers, S. Keshav, and S. Shenker, "Analysis and simulation of a fair queueing algorithm," in ACM SIGCOMM '89 Proceedings, 1989, pp. 1-12.</w:t>
-      </w:r>
-    </w:p>
-    <w:p>
-      <w:pPr>
-        <w:spacing w:after="120" w:line="360"/>
-      </w:pPr>
-      <w:r>
-        <w:rPr>
-          <w:rFonts w:ascii="맑은 고딕" w:cs="맑은 고딕" w:eastAsia="맑은 고딕" w:hAnsi="맑은 고딕"/>
-          <w:color w:val="000000"/>
-          <w:sz w:val="22"/>
-          <w:szCs w:val="22"/>
-        </w:rPr>
-        <w:t xml:space="preserve">[5] W. Kwon et al., "Efficient memory management for large language model serving with PagedAttention," in Proceedings of SOSP '23, 2023, pp. 611-626.</w:t>
-      </w:r>
-    </w:p>
-    <w:p>
-      <w:pPr>
-        <w:spacing w:after="120" w:line="360"/>
-      </w:pPr>
-      <w:r>
-        <w:rPr>
-          <w:rFonts w:ascii="맑은 고딕" w:cs="맑은 고딕" w:eastAsia="맑은 고딕" w:hAnsi="맑은 고딕"/>
-          <w:color w:val="000000"/>
-          <w:sz w:val="22"/>
-          <w:szCs w:val="22"/>
-        </w:rPr>
-        <w:t xml:space="preserve">[6] G. I. Yu et al., "Orca: A distributed serving system for Transformer-Based generative models," in Proceedings of OSDI '22, 2022, pp. 521-538.</w:t>
-      </w:r>
-    </w:p>
-    <w:p>
-      <w:pPr>
-        <w:spacing w:after="120" w:line="360"/>
-      </w:pPr>
-      <w:r>
-        <w:rPr>
-          <w:rFonts w:ascii="맑은 고딕" w:cs="맑은 고딕" w:eastAsia="맑은 고딕" w:hAnsi="맑은 고딕"/>
-          <w:color w:val="000000"/>
-          <w:sz w:val="22"/>
-          <w:szCs w:val="22"/>
-        </w:rPr>
-        <w:t xml:space="preserve">[7] A. Agrawal et al., "Sarathi-Serve: CoDe Interleaving for Stall-free LLM Serving," arXiv:2308.16369, 2024.</w:t>
-      </w:r>
-    </w:p>
-    <w:p>
-      <w:pPr>
-        <w:spacing w:after="120" w:line="360"/>
-      </w:pPr>
-      <w:r>
-        <w:rPr>
-          <w:rFonts w:ascii="맑은 고딕" w:cs="맑은 고딕" w:eastAsia="맑은 고딕" w:hAnsi="맑은 고딕"/>
-          <w:color w:val="000000"/>
-          <w:sz w:val="22"/>
-          <w:szCs w:val="22"/>
-        </w:rPr>
-        <w:t xml:space="preserve">[8] R. Jain, D. M. Chiu, and W. R. Hawe, "A quantitative measure of fairness and discrimination for resource allocation in shared computer systems," DEC Research Report TR-301, 1984.</w:t>
+        <w:t xml:space="preserve">[1] A. Silberschatz, P. B. Galvin, and G. Gagne, Operating System Concepts, 10th ed. (번역판: 박민규 역, 운영체제, 홍릉과학출판사, 2020). Wiley, 2018. Available: https://www.os-book.com/</w:t>
+      </w:r>
+    </w:p>
+    <w:p>
+      <w:pPr>
+        <w:spacing w:after="120" w:line="360"/>
+      </w:pPr>
+      <w:r>
+        <w:rPr>
+          <w:rFonts w:ascii="맑은 고딕" w:cs="맑은 고딕" w:eastAsia="맑은 고딕" w:hAnsi="맑은 고딕"/>
+          <w:color w:val="000000"/>
+          <w:sz w:val="22"/>
+          <w:szCs w:val="22"/>
+        </w:rPr>
+        <w:t xml:space="preserve">[2] R. H. Arpaci-Dusseau and A. C. Arpaci-Dusseau, Operating Systems: Three Easy Pieces, Version 1.10. Arpaci-Dusseau Books, 2023. Available: https://pages.cs.wisc.edu/~remzi/OSTEP/ (무료 공개 교재)</w:t>
+      </w:r>
+    </w:p>
+    <w:p>
+      <w:pPr>
+        <w:spacing w:after="120" w:line="360"/>
+      </w:pPr>
+      <w:r>
+        <w:rPr>
+          <w:rFonts w:ascii="맑은 고딕" w:cs="맑은 고딕" w:eastAsia="맑은 고딕" w:hAnsi="맑은 고딕"/>
+          <w:color w:val="000000"/>
+          <w:sz w:val="22"/>
+          <w:szCs w:val="22"/>
+        </w:rPr>
+        <w:t xml:space="preserve">[3] J. F. Kurose and K. W. Ross, Computer Networking: A Top-Down Approach, 8th ed. (번역판: 최종원 외 역, 컴퓨터 네트워킹 하향식 접근, 퍼스트북, 2022). Pearson, 2021. Available: https://gaia.cs.umass.edu/kurose_ross/</w:t>
+      </w:r>
+    </w:p>
+    <w:p>
+      <w:pPr>
+        <w:spacing w:after="120" w:line="360"/>
+      </w:pPr>
+      <w:r>
+        <w:rPr>
+          <w:rFonts w:ascii="맑은 고딕" w:cs="맑은 고딕" w:eastAsia="맑은 고딕" w:hAnsi="맑은 고딕"/>
+          <w:color w:val="000000"/>
+          <w:sz w:val="22"/>
+          <w:szCs w:val="22"/>
+        </w:rPr>
+        <w:t xml:space="preserve">[4] vLLM Project, "vLLM: Easy, Fast, and Cheap LLM Serving with PagedAttention," 2024. Available: https://docs.vllm.ai/ (GitHub: https://github.com/vllm-project/vllm)</w:t>
+      </w:r>
+    </w:p>
+    <w:p>
+      <w:pPr>
+        <w:spacing w:after="120" w:line="360"/>
+      </w:pPr>
+      <w:r>
+        <w:rPr>
+          <w:rFonts w:ascii="맑은 고딕" w:cs="맑은 고딕" w:eastAsia="맑은 고딕" w:hAnsi="맑은 고딕"/>
+          <w:color w:val="000000"/>
+          <w:sz w:val="22"/>
+          <w:szCs w:val="22"/>
+        </w:rPr>
+        <w:t xml:space="preserve">[5] Hugging Face, "Text Generation Inference (TGI) Documentation," 2024. Available: https://huggingface.co/docs/text-generation-inference/</w:t>
+      </w:r>
+    </w:p>
+    <w:p>
+      <w:pPr>
+        <w:spacing w:after="120" w:line="360"/>
+      </w:pPr>
+      <w:r>
+        <w:rPr>
+          <w:rFonts w:ascii="맑은 고딕" w:cs="맑은 고딕" w:eastAsia="맑은 고딕" w:hAnsi="맑은 고딕"/>
+          <w:color w:val="000000"/>
+          <w:sz w:val="22"/>
+          <w:szCs w:val="22"/>
+        </w:rPr>
+        <w:t xml:space="preserve">[6] Ollama, "Ollama Documentation," 2024. Available: https://ollama.com/ (GitHub: https://github.com/ollama/ollama)</w:t>
+      </w:r>
+    </w:p>
+    <w:p>
+      <w:pPr>
+        <w:spacing w:after="120" w:line="360"/>
+      </w:pPr>
+      <w:r>
+        <w:rPr>
+          <w:rFonts w:ascii="맑은 고딕" w:cs="맑은 고딕" w:eastAsia="맑은 고딕" w:hAnsi="맑은 고딕"/>
+          <w:color w:val="000000"/>
+          <w:sz w:val="22"/>
+          <w:szCs w:val="22"/>
+        </w:rPr>
+        <w:t xml:space="preserve">[7] Express.js, "Express - Node.js Web Application Framework," 2024. Available: https://expressjs.com/</w:t>
+      </w:r>
+    </w:p>
+    <w:p>
+      <w:pPr>
+        <w:spacing w:after="120" w:line="360"/>
+      </w:pPr>
+      <w:r>
+        <w:rPr>
+          <w:rFonts w:ascii="맑은 고딕" w:cs="맑은 고딕" w:eastAsia="맑은 고딕" w:hAnsi="맑은 고딕"/>
+          <w:color w:val="000000"/>
+          <w:sz w:val="22"/>
+          <w:szCs w:val="22"/>
+        </w:rPr>
+        <w:t xml:space="preserve">[8] Node.js, "Node.js Documentation," 2024. Available: https://nodejs.org/docs/latest/api/</w:t>
+      </w:r>
+    </w:p>
+    <w:p>
+      <w:pPr>
+        <w:spacing w:after="120" w:line="360"/>
+      </w:pPr>
+      <w:r>
+        <w:rPr>
+          <w:rFonts w:ascii="맑은 고딕" w:cs="맑은 고딕" w:eastAsia="맑은 고딕" w:hAnsi="맑은 고딕"/>
+          <w:color w:val="000000"/>
+          <w:sz w:val="22"/>
+          <w:szCs w:val="22"/>
+        </w:rPr>
+        <w:t xml:space="preserve">[9] Jest, "Jest - Delightful JavaScript Testing," 2024. Available: https://jestjs.io/</w:t>
       </w:r>
     </w:p>
     <w:sectPr>

</xml_diff>

<commit_message>
feat: package.json 및 package-lock.json 파일 추가, proposal.docx 수정
</commit_message>
<xml_diff>
--- a/04-proposal/final/proposal.docx
+++ b/04-proposal/final/proposal.docx
@@ -106,7 +106,7 @@
     </w:p>
     <w:p>
       <w:pPr>
-        <w:spacing w:before="200" w:after="0"/>
+        <w:spacing w:after="0" w:before="200"/>
         <w:jc w:val="center"/>
       </w:pPr>
       <w:r>
@@ -407,7 +407,7 @@
     </w:p>
     <w:p>
       <w:pPr>
-        <w:spacing w:before="120" w:after="120"/>
+        <w:spacing w:after="120" w:before="120"/>
         <w:jc w:val="center"/>
       </w:pPr>
       <w:r>
@@ -548,7 +548,7 @@
     </w:p>
     <w:p>
       <w:pPr>
-        <w:spacing w:before="120" w:after="120"/>
+        <w:spacing w:after="120" w:before="120"/>
         <w:jc w:val="center"/>
       </w:pPr>
       <w:r>
@@ -606,7 +606,7 @@
     </w:p>
     <w:p>
       <w:pPr>
-        <w:spacing w:before="120" w:after="60"/>
+        <w:spacing w:after="60" w:before="120"/>
         <w:jc w:val="center"/>
       </w:pPr>
       <w:r>
@@ -655,7 +655,7 @@
           </w:tcPr>
           <w:p>
             <w:pPr>
-              <w:spacing w:before="60" w:after="60"/>
+              <w:spacing w:after="60" w:before="60"/>
               <w:jc w:val="center"/>
             </w:pPr>
             <w:r>
@@ -684,7 +684,7 @@
           </w:tcPr>
           <w:p>
             <w:pPr>
-              <w:spacing w:before="60" w:after="60"/>
+              <w:spacing w:after="60" w:before="60"/>
               <w:jc w:val="center"/>
             </w:pPr>
             <w:r>
@@ -713,7 +713,7 @@
           </w:tcPr>
           <w:p>
             <w:pPr>
-              <w:spacing w:before="60" w:after="60"/>
+              <w:spacing w:after="60" w:before="60"/>
               <w:jc w:val="center"/>
             </w:pPr>
             <w:r>
@@ -743,7 +743,7 @@
           </w:tcPr>
           <w:p>
             <w:pPr>
-              <w:spacing w:before="40" w:after="40"/>
+              <w:spacing w:after="40" w:before="40"/>
               <w:jc w:val="left"/>
             </w:pPr>
             <w:r>
@@ -771,7 +771,7 @@
           </w:tcPr>
           <w:p>
             <w:pPr>
-              <w:spacing w:before="40" w:after="40"/>
+              <w:spacing w:after="40" w:before="40"/>
               <w:jc w:val="left"/>
             </w:pPr>
             <w:r>
@@ -799,7 +799,7 @@
           </w:tcPr>
           <w:p>
             <w:pPr>
-              <w:spacing w:before="40" w:after="40"/>
+              <w:spacing w:after="40" w:before="40"/>
               <w:jc w:val="left"/>
             </w:pPr>
             <w:r>
@@ -829,7 +829,7 @@
           </w:tcPr>
           <w:p>
             <w:pPr>
-              <w:spacing w:before="40" w:after="40"/>
+              <w:spacing w:after="40" w:before="40"/>
               <w:jc w:val="left"/>
             </w:pPr>
             <w:r>
@@ -857,7 +857,7 @@
           </w:tcPr>
           <w:p>
             <w:pPr>
-              <w:spacing w:before="40" w:after="40"/>
+              <w:spacing w:after="40" w:before="40"/>
               <w:jc w:val="left"/>
             </w:pPr>
             <w:r>
@@ -885,7 +885,7 @@
           </w:tcPr>
           <w:p>
             <w:pPr>
-              <w:spacing w:before="40" w:after="40"/>
+              <w:spacing w:after="40" w:before="40"/>
               <w:jc w:val="left"/>
             </w:pPr>
             <w:r>
@@ -915,7 +915,7 @@
           </w:tcPr>
           <w:p>
             <w:pPr>
-              <w:spacing w:before="40" w:after="40"/>
+              <w:spacing w:after="40" w:before="40"/>
               <w:jc w:val="left"/>
             </w:pPr>
             <w:r>
@@ -943,7 +943,7 @@
           </w:tcPr>
           <w:p>
             <w:pPr>
-              <w:spacing w:before="40" w:after="40"/>
+              <w:spacing w:after="40" w:before="40"/>
               <w:jc w:val="left"/>
             </w:pPr>
             <w:r>
@@ -971,7 +971,7 @@
           </w:tcPr>
           <w:p>
             <w:pPr>
-              <w:spacing w:before="40" w:after="40"/>
+              <w:spacing w:after="40" w:before="40"/>
               <w:jc w:val="left"/>
             </w:pPr>
             <w:r>
@@ -1001,7 +1001,7 @@
           </w:tcPr>
           <w:p>
             <w:pPr>
-              <w:spacing w:before="40" w:after="40"/>
+              <w:spacing w:after="40" w:before="40"/>
               <w:jc w:val="left"/>
             </w:pPr>
             <w:r>
@@ -1029,7 +1029,7 @@
           </w:tcPr>
           <w:p>
             <w:pPr>
-              <w:spacing w:before="40" w:after="40"/>
+              <w:spacing w:after="40" w:before="40"/>
               <w:jc w:val="left"/>
             </w:pPr>
             <w:r>
@@ -1057,7 +1057,7 @@
           </w:tcPr>
           <w:p>
             <w:pPr>
-              <w:spacing w:before="40" w:after="40"/>
+              <w:spacing w:after="40" w:before="40"/>
               <w:jc w:val="left"/>
             </w:pPr>
             <w:r>
@@ -1087,7 +1087,7 @@
           </w:tcPr>
           <w:p>
             <w:pPr>
-              <w:spacing w:before="40" w:after="40"/>
+              <w:spacing w:after="40" w:before="40"/>
               <w:jc w:val="left"/>
             </w:pPr>
             <w:r>
@@ -1115,7 +1115,7 @@
           </w:tcPr>
           <w:p>
             <w:pPr>
-              <w:spacing w:before="40" w:after="40"/>
+              <w:spacing w:after="40" w:before="40"/>
               <w:jc w:val="left"/>
             </w:pPr>
             <w:r>
@@ -1143,7 +1143,7 @@
           </w:tcPr>
           <w:p>
             <w:pPr>
-              <w:spacing w:before="40" w:after="40"/>
+              <w:spacing w:after="40" w:before="40"/>
               <w:jc w:val="left"/>
             </w:pPr>
             <w:r>
@@ -1295,7 +1295,7 @@
     </w:p>
     <w:p>
       <w:pPr>
-        <w:spacing w:before="120" w:after="120"/>
+        <w:spacing w:after="120" w:before="120"/>
         <w:jc w:val="center"/>
       </w:pPr>
       <w:r>
@@ -1502,7 +1502,7 @@
     </w:p>
     <w:p>
       <w:pPr>
-        <w:spacing w:before="120" w:after="120"/>
+        <w:spacing w:after="120" w:before="120"/>
         <w:jc w:val="center"/>
       </w:pPr>
       <w:r>
@@ -1591,15 +1591,15 @@
           <w:sz w:val="22"/>
           <w:szCs w:val="22"/>
         </w:rPr>
-        <w:t xml:space="preserve">테스트</w:t>
-      </w:r>
-      <w:r>
-        <w:rPr>
-          <w:rFonts w:ascii="Arial" w:cs="Arial" w:eastAsia="Arial" w:hAnsi="Arial"/>
-          <w:sz w:val="22"/>
-          <w:szCs w:val="22"/>
-        </w:rPr>
-        <w:t xml:space="preserve">: Jest 29.x (307개 단위 테스트, 코드 커버리지 99.76%) [9]</w:t>
+        <w:t xml:space="preserve">LLM 백엔드</w:t>
+      </w:r>
+      <w:r>
+        <w:rPr>
+          <w:rFonts w:ascii="Arial" w:cs="Arial" w:eastAsia="Arial" w:hAnsi="Arial"/>
+          <w:sz w:val="22"/>
+          <w:szCs w:val="22"/>
+        </w:rPr>
+        <w:t xml:space="preserve">: Ollama (로컬 실행) [6]</w:t>
       </w:r>
     </w:p>
     <w:p>
@@ -1619,34 +1619,6 @@
           <w:sz w:val="22"/>
           <w:szCs w:val="22"/>
         </w:rPr>
-        <w:t xml:space="preserve">LLM 백엔드</w:t>
-      </w:r>
-      <w:r>
-        <w:rPr>
-          <w:rFonts w:ascii="Arial" w:cs="Arial" w:eastAsia="Arial" w:hAnsi="Arial"/>
-          <w:sz w:val="22"/>
-          <w:szCs w:val="22"/>
-        </w:rPr>
-        <w:t xml:space="preserve">: Ollama (로컬 실행) [6]</w:t>
-      </w:r>
-    </w:p>
-    <w:p>
-      <w:pPr>
-        <w:pStyle w:val="ListParagraph"/>
-        <w:numPr>
-          <w:ilvl w:val="0"/>
-          <w:numId w:val="3"/>
-        </w:numPr>
-        <w:spacing w:after="40"/>
-      </w:pPr>
-      <w:r>
-        <w:rPr>
-          <w:rFonts w:ascii="Arial" w:cs="Arial" w:eastAsia="Arial" w:hAnsi="Arial"/>
-          <w:b/>
-          <w:bCs/>
-          <w:sz w:val="22"/>
-          <w:szCs w:val="22"/>
-        </w:rPr>
         <w:t xml:space="preserve">외부 의존성</w:t>
       </w:r>
       <w:r>
@@ -1655,7 +1627,7 @@
           <w:sz w:val="22"/>
           <w:szCs w:val="22"/>
         </w:rPr>
-        <w:t xml:space="preserve">: 2개 패키지 (express, jest)</w:t>
+        <w:t xml:space="preserve">: 1개 패키지 (express)</w:t>
       </w:r>
     </w:p>
     <w:p>
@@ -1696,7 +1668,7 @@
     </w:p>
     <w:p>
       <w:pPr>
-        <w:spacing w:before="120" w:after="60"/>
+        <w:spacing w:after="60" w:before="120"/>
         <w:jc w:val="center"/>
       </w:pPr>
       <w:r>
@@ -1745,7 +1717,7 @@
           </w:tcPr>
           <w:p>
             <w:pPr>
-              <w:spacing w:before="60" w:after="60"/>
+              <w:spacing w:after="60" w:before="60"/>
               <w:jc w:val="center"/>
             </w:pPr>
             <w:r>
@@ -1774,7 +1746,7 @@
           </w:tcPr>
           <w:p>
             <w:pPr>
-              <w:spacing w:before="60" w:after="60"/>
+              <w:spacing w:after="60" w:before="60"/>
               <w:jc w:val="center"/>
             </w:pPr>
             <w:r>
@@ -1803,7 +1775,7 @@
           </w:tcPr>
           <w:p>
             <w:pPr>
-              <w:spacing w:before="60" w:after="60"/>
+              <w:spacing w:after="60" w:before="60"/>
               <w:jc w:val="center"/>
             </w:pPr>
             <w:r>
@@ -1833,7 +1805,7 @@
           </w:tcPr>
           <w:p>
             <w:pPr>
-              <w:spacing w:before="40" w:after="40"/>
+              <w:spacing w:after="40" w:before="40"/>
               <w:jc w:val="left"/>
             </w:pPr>
             <w:r>
@@ -1861,7 +1833,7 @@
           </w:tcPr>
           <w:p>
             <w:pPr>
-              <w:spacing w:before="40" w:after="40"/>
+              <w:spacing w:after="40" w:before="40"/>
               <w:jc w:val="center"/>
             </w:pPr>
             <w:r>
@@ -1889,7 +1861,7 @@
           </w:tcPr>
           <w:p>
             <w:pPr>
-              <w:spacing w:before="40" w:after="40"/>
+              <w:spacing w:after="40" w:before="40"/>
               <w:jc w:val="left"/>
             </w:pPr>
             <w:r>
@@ -1919,7 +1891,7 @@
           </w:tcPr>
           <w:p>
             <w:pPr>
-              <w:spacing w:before="40" w:after="40"/>
+              <w:spacing w:after="40" w:before="40"/>
               <w:jc w:val="left"/>
             </w:pPr>
             <w:r>
@@ -1947,7 +1919,7 @@
           </w:tcPr>
           <w:p>
             <w:pPr>
-              <w:spacing w:before="40" w:after="40"/>
+              <w:spacing w:after="40" w:before="40"/>
               <w:jc w:val="center"/>
             </w:pPr>
             <w:r>
@@ -1975,7 +1947,7 @@
           </w:tcPr>
           <w:p>
             <w:pPr>
-              <w:spacing w:before="40" w:after="40"/>
+              <w:spacing w:after="40" w:before="40"/>
               <w:jc w:val="left"/>
             </w:pPr>
             <w:r>
@@ -2005,7 +1977,7 @@
           </w:tcPr>
           <w:p>
             <w:pPr>
-              <w:spacing w:before="40" w:after="40"/>
+              <w:spacing w:after="40" w:before="40"/>
               <w:jc w:val="left"/>
             </w:pPr>
             <w:r>
@@ -2033,7 +2005,7 @@
           </w:tcPr>
           <w:p>
             <w:pPr>
-              <w:spacing w:before="40" w:after="40"/>
+              <w:spacing w:after="40" w:before="40"/>
               <w:jc w:val="center"/>
             </w:pPr>
             <w:r>
@@ -2061,7 +2033,7 @@
           </w:tcPr>
           <w:p>
             <w:pPr>
-              <w:spacing w:before="40" w:after="40"/>
+              <w:spacing w:after="40" w:before="40"/>
               <w:jc w:val="left"/>
             </w:pPr>
             <w:r>
@@ -2091,7 +2063,7 @@
           </w:tcPr>
           <w:p>
             <w:pPr>
-              <w:spacing w:before="40" w:after="40"/>
+              <w:spacing w:after="40" w:before="40"/>
               <w:jc w:val="left"/>
             </w:pPr>
             <w:r>
@@ -2119,7 +2091,7 @@
           </w:tcPr>
           <w:p>
             <w:pPr>
-              <w:spacing w:before="40" w:after="40"/>
+              <w:spacing w:after="40" w:before="40"/>
               <w:jc w:val="center"/>
             </w:pPr>
             <w:r>
@@ -2147,7 +2119,7 @@
           </w:tcPr>
           <w:p>
             <w:pPr>
-              <w:spacing w:before="40" w:after="40"/>
+              <w:spacing w:after="40" w:before="40"/>
               <w:jc w:val="left"/>
             </w:pPr>
             <w:r>
@@ -2373,7 +2345,7 @@
     </w:p>
     <w:p>
       <w:pPr>
-        <w:spacing w:before="120" w:after="60"/>
+        <w:spacing w:after="60" w:before="120"/>
         <w:jc w:val="center"/>
       </w:pPr>
       <w:r>
@@ -2423,7 +2395,7 @@
           </w:tcPr>
           <w:p>
             <w:pPr>
-              <w:spacing w:before="60" w:after="60"/>
+              <w:spacing w:after="60" w:before="60"/>
               <w:jc w:val="center"/>
             </w:pPr>
             <w:r>
@@ -2452,7 +2424,7 @@
           </w:tcPr>
           <w:p>
             <w:pPr>
-              <w:spacing w:before="60" w:after="60"/>
+              <w:spacing w:after="60" w:before="60"/>
               <w:jc w:val="center"/>
             </w:pPr>
             <w:r>
@@ -2481,7 +2453,7 @@
           </w:tcPr>
           <w:p>
             <w:pPr>
-              <w:spacing w:before="60" w:after="60"/>
+              <w:spacing w:after="60" w:before="60"/>
               <w:jc w:val="center"/>
             </w:pPr>
             <w:r>
@@ -2510,7 +2482,7 @@
           </w:tcPr>
           <w:p>
             <w:pPr>
-              <w:spacing w:before="60" w:after="60"/>
+              <w:spacing w:after="60" w:before="60"/>
               <w:jc w:val="center"/>
             </w:pPr>
             <w:r>
@@ -2540,7 +2512,7 @@
           </w:tcPr>
           <w:p>
             <w:pPr>
-              <w:spacing w:before="40" w:after="40"/>
+              <w:spacing w:after="40" w:before="40"/>
               <w:jc w:val="center"/>
             </w:pPr>
             <w:r>
@@ -2568,7 +2540,7 @@
           </w:tcPr>
           <w:p>
             <w:pPr>
-              <w:spacing w:before="40" w:after="40"/>
+              <w:spacing w:after="40" w:before="40"/>
               <w:jc w:val="left"/>
             </w:pPr>
             <w:r>
@@ -2596,7 +2568,7 @@
           </w:tcPr>
           <w:p>
             <w:pPr>
-              <w:spacing w:before="40" w:after="40"/>
+              <w:spacing w:after="40" w:before="40"/>
               <w:jc w:val="left"/>
             </w:pPr>
             <w:r>
@@ -2624,7 +2596,7 @@
           </w:tcPr>
           <w:p>
             <w:pPr>
-              <w:spacing w:before="40" w:after="40"/>
+              <w:spacing w:after="40" w:before="40"/>
               <w:jc w:val="center"/>
             </w:pPr>
             <w:r>
@@ -2654,7 +2626,7 @@
           </w:tcPr>
           <w:p>
             <w:pPr>
-              <w:spacing w:before="40" w:after="40"/>
+              <w:spacing w:after="40" w:before="40"/>
               <w:jc w:val="center"/>
             </w:pPr>
             <w:r>
@@ -2682,7 +2654,7 @@
           </w:tcPr>
           <w:p>
             <w:pPr>
-              <w:spacing w:before="40" w:after="40"/>
+              <w:spacing w:after="40" w:before="40"/>
               <w:jc w:val="left"/>
             </w:pPr>
             <w:r>
@@ -2710,7 +2682,7 @@
           </w:tcPr>
           <w:p>
             <w:pPr>
-              <w:spacing w:before="40" w:after="40"/>
+              <w:spacing w:after="40" w:before="40"/>
               <w:jc w:val="left"/>
             </w:pPr>
             <w:r>
@@ -2738,7 +2710,7 @@
           </w:tcPr>
           <w:p>
             <w:pPr>
-              <w:spacing w:before="40" w:after="40"/>
+              <w:spacing w:after="40" w:before="40"/>
               <w:jc w:val="center"/>
             </w:pPr>
             <w:r>
@@ -2768,7 +2740,7 @@
           </w:tcPr>
           <w:p>
             <w:pPr>
-              <w:spacing w:before="40" w:after="40"/>
+              <w:spacing w:after="40" w:before="40"/>
               <w:jc w:val="center"/>
             </w:pPr>
             <w:r>
@@ -2796,7 +2768,7 @@
           </w:tcPr>
           <w:p>
             <w:pPr>
-              <w:spacing w:before="40" w:after="40"/>
+              <w:spacing w:after="40" w:before="40"/>
               <w:jc w:val="left"/>
             </w:pPr>
             <w:r>
@@ -2824,7 +2796,7 @@
           </w:tcPr>
           <w:p>
             <w:pPr>
-              <w:spacing w:before="40" w:after="40"/>
+              <w:spacing w:after="40" w:before="40"/>
               <w:jc w:val="left"/>
             </w:pPr>
             <w:r>
@@ -2852,7 +2824,7 @@
           </w:tcPr>
           <w:p>
             <w:pPr>
-              <w:spacing w:before="40" w:after="40"/>
+              <w:spacing w:after="40" w:before="40"/>
               <w:jc w:val="center"/>
             </w:pPr>
             <w:r>
@@ -2882,7 +2854,7 @@
           </w:tcPr>
           <w:p>
             <w:pPr>
-              <w:spacing w:before="40" w:after="40"/>
+              <w:spacing w:after="40" w:before="40"/>
               <w:jc w:val="center"/>
             </w:pPr>
             <w:r>
@@ -2910,7 +2882,7 @@
           </w:tcPr>
           <w:p>
             <w:pPr>
-              <w:spacing w:before="40" w:after="40"/>
+              <w:spacing w:after="40" w:before="40"/>
               <w:jc w:val="left"/>
             </w:pPr>
             <w:r>
@@ -2938,7 +2910,7 @@
           </w:tcPr>
           <w:p>
             <w:pPr>
-              <w:spacing w:before="40" w:after="40"/>
+              <w:spacing w:after="40" w:before="40"/>
               <w:jc w:val="left"/>
             </w:pPr>
             <w:r>
@@ -2966,7 +2938,7 @@
           </w:tcPr>
           <w:p>
             <w:pPr>
-              <w:spacing w:before="40" w:after="40"/>
+              <w:spacing w:after="40" w:before="40"/>
               <w:jc w:val="center"/>
             </w:pPr>
             <w:r>
@@ -3095,22 +3067,9 @@
         <w:t xml:space="preserve">[8] Node.js, "Node.js Documentation," 2024. [온라인] Available: https://nodejs.org/docs/latest/api/</w:t>
       </w:r>
     </w:p>
-    <w:p>
-      <w:pPr>
-        <w:spacing w:after="80"/>
-      </w:pPr>
-      <w:r>
-        <w:rPr>
-          <w:rFonts w:ascii="Arial" w:cs="Arial" w:eastAsia="Arial" w:hAnsi="Arial"/>
-          <w:sz w:val="20"/>
-          <w:szCs w:val="20"/>
-        </w:rPr>
-        <w:t xml:space="preserve">[9] Jest, "Jest - Delightful JavaScript Testing," 2024. [온라인] Available: https://jestjs.io/</w:t>
-      </w:r>
-    </w:p>
     <w:sectPr>
-      <w:headerReference w:type="default" r:id="rId6"/>
-      <w:footerReference w:type="default" r:id="rId7"/>
+      <w:headerReference w:type="default" r:id="rId7"/>
+      <w:footerReference w:type="default" r:id="rId8"/>
       <w:pgSz w:w="12240" w:h="15840" w:orient="portrait"/>
       <w:pgMar w:top="1440" w:right="1440" w:bottom="1440" w:left="1440" w:header="708" w:footer="708" w:gutter="0"/>
       <w:pgNumType/>
@@ -3122,6 +3081,43 @@
 
 <file path=word/comments.xml><?xml version="1.0" encoding="utf-8"?>
 <w:comments xmlns:cx="http://schemas.microsoft.com/office/drawing/2014/chartex" xmlns:cx1="http://schemas.microsoft.com/office/drawing/2015/9/8/chartex" xmlns:cx2="http://schemas.microsoft.com/office/drawing/2015/10/21/chartex" xmlns:cx3="http://schemas.microsoft.com/office/drawing/2016/5/9/chartex" xmlns:cx4="http://schemas.microsoft.com/office/drawing/2016/5/10/chartex" xmlns:cx5="http://schemas.microsoft.com/office/drawing/2016/5/11/chartex" xmlns:cx6="http://schemas.microsoft.com/office/drawing/2016/5/12/chartex" xmlns:cx7="http://schemas.microsoft.com/office/drawing/2016/5/13/chartex" xmlns:cx8="http://schemas.microsoft.com/office/drawing/2016/5/14/chartex" xmlns:mc="http://schemas.openxmlformats.org/markup-compatibility/2006" xmlns:aink="http://schemas.microsoft.com/office/drawing/2016/ink" xmlns:am3d="http://schemas.microsoft.com/office/drawing/2017/model3d" xmlns:o="urn:schemas-microsoft-com:office:office" xmlns:r="http://schemas.openxmlformats.org/officeDocument/2006/relationships" xmlns:m="http://schemas.openxmlformats.org/officeDocument/2006/math" xmlns:v="urn:schemas-microsoft-com:vml" xmlns:wp14="http://schemas.microsoft.com/office/word/2010/wordprocessingDrawing" xmlns:wp="http://schemas.openxmlformats.org/drawingml/2006/wordprocessingDrawing" xmlns:w10="urn:schemas-microsoft-com:office:word" xmlns:w="http://schemas.openxmlformats.org/wordprocessingml/2006/main" xmlns:w14="http://schemas.microsoft.com/office/word/2010/wordml" xmlns:w15="http://schemas.microsoft.com/office/word/2012/wordml" xmlns:w16cex="http://schemas.microsoft.com/office/word/2018/wordml/cex" xmlns:w16cid="http://schemas.microsoft.com/office/word/2016/wordml/cid" xmlns:w16="http://schemas.microsoft.com/office/word/2018/wordml" xmlns:w16sdtdh="http://schemas.microsoft.com/office/word/2020/wordml/sdtdatahash" xmlns:w16se="http://schemas.microsoft.com/office/word/2015/wordml/symex" xmlns:wpg="http://schemas.microsoft.com/office/word/2010/wordprocessingGroup" xmlns:wpi="http://schemas.microsoft.com/office/word/2010/wordprocessingInk" xmlns:wne="http://schemas.microsoft.com/office/word/2006/wordml" xmlns:wps="http://schemas.microsoft.com/office/word/2010/wordprocessingShape"/>
+</file>
+
+<file path=word/endnotes.xml><?xml version="1.0" encoding="utf-8"?>
+<w:endnotes xmlns:wpc="http://schemas.microsoft.com/office/word/2010/wordprocessingCanvas" xmlns:mc="http://schemas.openxmlformats.org/markup-compatibility/2006" xmlns:o="urn:schemas-microsoft-com:office:office" xmlns:r="http://schemas.openxmlformats.org/officeDocument/2006/relationships" xmlns:m="http://schemas.openxmlformats.org/officeDocument/2006/math" xmlns:v="urn:schemas-microsoft-com:vml" xmlns:wp14="http://schemas.microsoft.com/office/word/2010/wordprocessingDrawing" xmlns:wp="http://schemas.openxmlformats.org/drawingml/2006/wordprocessingDrawing" xmlns:w10="urn:schemas-microsoft-com:office:word" xmlns:w="http://schemas.openxmlformats.org/wordprocessingml/2006/main" xmlns:w14="http://schemas.microsoft.com/office/word/2010/wordml" xmlns:w15="http://schemas.microsoft.com/office/word/2012/wordml" xmlns:wpg="http://schemas.microsoft.com/office/word/2010/wordprocessingGroup" xmlns:wpi="http://schemas.microsoft.com/office/word/2010/wordprocessingInk" xmlns:wne="http://schemas.microsoft.com/office/word/2006/wordml" xmlns:wps="http://schemas.microsoft.com/office/word/2010/wordprocessingShape" mc:Ignorable="w14 w15 wp14">
+  <w:endnote w:type="separator" w:id="-1">
+    <w:p>
+      <w:pPr>
+        <w:spacing w:after="0" w:line="240" w:lineRule="auto"/>
+      </w:pPr>
+      <w:r>
+        <w:rPr>
+          <w:rStyle w:val="EndnoteReference"/>
+        </w:rPr>
+        <w:endnoteRef/>
+      </w:r>
+      <w:r>
+        <w:separator/>
+      </w:r>
+    </w:p>
+  </w:endnote>
+  <w:endnote w:type="continuationSeparator" w:id="0">
+    <w:p>
+      <w:pPr>
+        <w:spacing w:after="0" w:line="240" w:lineRule="auto"/>
+      </w:pPr>
+      <w:r>
+        <w:rPr>
+          <w:rStyle w:val="EndnoteReference"/>
+        </w:rPr>
+        <w:endnoteRef/>
+      </w:r>
+      <w:r>
+        <w:continuationSeparator/>
+      </w:r>
+    </w:p>
+  </w:endnote>
+</w:endnotes>
 </file>
 
 <file path=word/footer1.xml><?xml version="1.0" encoding="utf-8"?>
@@ -3515,11 +3511,48 @@
       <w:szCs w:val="20"/>
     </w:rPr>
   </w:style>
+  <w:style w:type="character" w:styleId="EndnoteReference">
+    <w:name w:val="endnote reference"/>
+    <w:basedOn w:val="DefaultParagraphFont"/>
+    <w:uiPriority w:val="99"/>
+    <w:semiHidden/>
+    <w:unhideWhenUsed/>
+    <w:rPr>
+      <w:vertAlign w:val="superscript"/>
+    </w:rPr>
+  </w:style>
+  <w:style w:type="paragraph" w:styleId="EndnoteText">
+    <w:name w:val="endnote text"/>
+    <w:basedOn w:val="Normal"/>
+    <w:link w:val="EndnoteTextChar"/>
+    <w:uiPriority w:val="99"/>
+    <w:semiHidden/>
+    <w:unhideWhenUsed/>
+    <w:pPr>
+      <w:spacing w:after="0" w:line="240" w:lineRule="auto"/>
+    </w:pPr>
+    <w:rPr>
+      <w:sz w:val="20"/>
+      <w:szCs w:val="20"/>
+    </w:rPr>
+  </w:style>
+  <w:style w:type="character" w:styleId="EndnoteTextChar">
+    <w:name w:val="Endnote Text Char"/>
+    <w:basedOn w:val="DefaultParagraphFont"/>
+    <w:link w:val="EndnoteText"/>
+    <w:uiPriority w:val="99"/>
+    <w:semiHidden/>
+    <w:unhideWhenUsed/>
+    <w:rPr>
+      <w:sz w:val="20"/>
+      <w:szCs w:val="20"/>
+    </w:rPr>
+  </w:style>
   <w:style w:type="paragraph" w:styleId="Title">
     <w:name w:val="Title"/>
     <w:basedOn w:val="Normal"/>
     <w:pPr>
-      <w:spacing w:before="0" w:after="120"/>
+      <w:spacing w:after="120" w:before="0"/>
       <w:jc w:val="center"/>
     </w:pPr>
     <w:rPr>
@@ -3537,7 +3570,7 @@
     <w:next w:val="Normal"/>
     <w:qFormat/>
     <w:pPr>
-      <w:spacing w:before="360" w:after="180"/>
+      <w:spacing w:after="180" w:before="360"/>
       <w:outlineLvl w:val="0"/>
     </w:pPr>
     <w:rPr>
@@ -3555,7 +3588,7 @@
     <w:next w:val="Normal"/>
     <w:qFormat/>
     <w:pPr>
-      <w:spacing w:before="240" w:after="120"/>
+      <w:spacing w:after="120" w:before="240"/>
       <w:outlineLvl w:val="1"/>
     </w:pPr>
     <w:rPr>
@@ -3573,7 +3606,7 @@
     <w:next w:val="Normal"/>
     <w:qFormat/>
     <w:pPr>
-      <w:spacing w:before="200" w:after="100"/>
+      <w:spacing w:after="100" w:before="200"/>
       <w:outlineLvl w:val="2"/>
     </w:pPr>
     <w:rPr>

</xml_diff>

<commit_message>
Update proposal figures and scripts for consolidated PPTX generation
- Replaced individual PPTX generation with a single consolidated PPTX file containing all figures.
- Updated `generate-individual-figures.js` to reflect the new output format and structure.
- Modified HTML slides for figures to use 'Malgun Gothic' font and translated text to Korean.
- Updated binary files for figures and the final proposal document.
</commit_message>
<xml_diff>
--- a/04-proposal/final/proposal.docx
+++ b/04-proposal/final/proposal.docx
@@ -150,7 +150,7 @@
           <w:sz w:val="22"/>
           <w:szCs w:val="22"/>
         </w:rPr>
-        <w:t xml:space="preserve">ChatGPT, Claude, Gemini 등 대규모 언어 모델(Large Language Model, LLM) API 서비스가 빠르게 확산되면서, 여러 사용자가 동시에 LLM API를 호출하는 다중 사용자(Multi-tenant) 환경이 보편화되고 있다. 이러한 환경에서 요청 처리 순서와 자원 배분 방식은 서비스 품질에 직접적인 영향을 미치는 핵심 요소이다.</w:t>
+        <w:t xml:space="preserve">ChatGPT, Claude, Gemini 등 대규모 언어 모델(Large Language Model, LLM) API 서비스가 빠르게 확산되면서, 여러 사용자가 동시에 LLM API를 호출하는 다중 사용자(Multi-tenant) 환경이 보편화되고 있다. 다중 사용자 환경이란, 하나의 서버가 여러 고객(테넌트)의 요청을 동시에 처리하는 구조를 말한다. 이러한 환경에서 요청 처리 순서와 자원 배분 방식은 서비스 품질에 직접적인 영향을 미치는 핵심 요소이다.</w:t>
       </w:r>
     </w:p>
     <w:p>
@@ -163,7 +163,7 @@
           <w:sz w:val="22"/>
           <w:szCs w:val="22"/>
         </w:rPr>
-        <w:t xml:space="preserve">현재 대부분의 LLM 서비스는 선착순(First-Come, First-Served, FCFS) 처리 방식이나 단순 Rate Limiting에 의존하고 있다. 이러한 방식은 다음과 같은 한계를 가진다. 첫째, 긴 요청이 뒤따르는 짧은 요청들의 처리를 지연시키는 호위 효과(Convoy Effect)가 발생한다. 둘째, 긴급한 요청도 도착 순서를 기다려야 하며, 사용자 등급에 따른 차등 서비스 제공이 불가능하다. 셋째, 테넌트(Tenant) 간 공정성을 정량적으로 측정하고 보장하는 메커니즘이 부재하다.</w:t>
+        <w:t xml:space="preserve">현재 대부분의 LLM 서비스는 선착순(First-Come, First-Served, FCFS) 처리 방식이나 단순 속도 제한(Rate Limiting)에 의존하고 있다. 이러한 방식은 다음과 같은 한계를 가진다. 첫째, 긴 요청이 뒤따르는 짧은 요청들의 처리를 지연시키는 호위 효과(Convoy Effect)가 발생한다. 호위 효과란, 느린 트럭 한 대가 좁은 도로를 막아 뒤따르는 빠른 차들까지 모두 느려지는 것과 같은 현상이다. 둘째, 긴급한 요청도 도착 순서를 기다려야 하며, 사용자 등급에 따른 차등 서비스 제공이 불가능하다. 셋째, 테넌트 간 공정성을 측정하고 보장하는 방법이 없다.</w:t>
       </w:r>
     </w:p>
     <w:p>
@@ -184,7 +184,7 @@
           <w:sz w:val="22"/>
           <w:szCs w:val="22"/>
         </w:rPr>
-        <w:t xml:space="preserve">운영체제의 프로세스 스케줄링 알고리즘은 CPU 자원을 여러 프로세스에 효율적으로 배분하기 위해 수십 년간 연구되어 온 이론이다 [1]. 본 연구는 이 검증된 이론을 LLM API 요청 관리라는 새로운 도메인에 적용함으로써, OS 이론의 실제 응용 가능성을 탐구하고자 한다.</w:t>
+        <w:t xml:space="preserve">운영체제의 프로세스 스케줄링 알고리즘은 CPU 자원을 여러 프로세스에 효율적으로 배분하기 위해 수십 년간 연구되어 온 이론이다 [1]. 본 연구는 이 검증된 이론을 LLM API 요청 관리라는 새로운 분야에 적용함으로써, OS 이론의 실제 응용 가능성을 탐구하고자 한다.</w:t>
       </w:r>
     </w:p>
     <w:p>
@@ -253,7 +253,7 @@
           <w:sz w:val="22"/>
           <w:szCs w:val="22"/>
         </w:rPr>
-        <w:t xml:space="preserve">: 동일한 워크로드에서 대기시간, 처리량, 공정성 지표를 정량적으로 비교한다.</w:t>
+        <w:t xml:space="preserve">: 동일한 워크로드에서 대기시간, 처리량, 공정성 지표를 비교한다.</w:t>
       </w:r>
     </w:p>
     <w:p>
@@ -273,15 +273,15 @@
           <w:sz w:val="22"/>
           <w:szCs w:val="22"/>
         </w:rPr>
-        <w:t xml:space="preserve">공정성 정량화</w:t>
-      </w:r>
-      <w:r>
-        <w:rPr>
-          <w:rFonts w:ascii="Arial" w:cs="Arial" w:eastAsia="Arial" w:hAnsi="Arial"/>
-          <w:sz w:val="22"/>
-          <w:szCs w:val="22"/>
-        </w:rPr>
-        <w:t xml:space="preserve">: Jain's Fairness Index(JFI)를 활용하여 멀티테넌트 환경의 공정성을 이중 수준(시스템 수준 및 테넌트 수준)으로 측정하는 방법론을 제시한다.</w:t>
+        <w:t xml:space="preserve">공정성 측정</w:t>
+      </w:r>
+      <w:r>
+        <w:rPr>
+          <w:rFonts w:ascii="Arial" w:cs="Arial" w:eastAsia="Arial" w:hAnsi="Arial"/>
+          <w:sz w:val="22"/>
+          <w:szCs w:val="22"/>
+        </w:rPr>
+        <w:t xml:space="preserve">: Jain's Fairness Index(JFI)를 활용하여 다중 사용자 환경의 공정성을 시스템 수준과 테넌트 수준으로 나누어 측정하는 방법을 제시한다. JFI는 자원이 얼마나 고르게 나뉘었는지를 0에서 1 사이 점수로 나타내는 지표이다.</w:t>
       </w:r>
     </w:p>
     <w:p>
@@ -333,7 +333,7 @@
           <w:sz w:val="22"/>
           <w:szCs w:val="22"/>
         </w:rPr>
-        <w:t xml:space="preserve">는 가장 단순한 스케줄링 알고리즘으로, 요청이 도착한 순서대로 처리한다. 구현이 간단하나, 긴 작업이 짧은 작업을 지연시키는 호위 효과(Convoy Effect)가 발생하는 단점이 있다 [1].</w:t>
+        <w:t xml:space="preserve">는 가장 단순한 스케줄링 알고리즘으로, 요청이 도착한 순서대로 처리한다. 구현이 간단하나 호위 효과가 발생하는 단점이 있다 [1].</w:t>
       </w:r>
     </w:p>
     <w:p>
@@ -356,7 +356,7 @@
           <w:sz w:val="22"/>
           <w:szCs w:val="22"/>
         </w:rPr>
-        <w:t xml:space="preserve">은 각 프로세스에 우선순위를 부여하여 높은 우선순위의 프로세스를 먼저 처리한다. 그러나 낮은 우선순위의 프로세스가 무기한 대기하는 기아(Starvation) 현상이 발생할 수 있으며, 이를 해결하기 위해 대기 시간에 따라 우선순위를 점진적으로 높이는 에이징(Aging) 기법이 사용된다 [1].</w:t>
+        <w:t xml:space="preserve">은 각 프로세스에 우선순위를 부여하여 높은 우선순위의 프로세스를 먼저 처리한다. 그러나 낮은 우선순위의 프로세스가 계속 밀려 처리되지 못하는 기아(Starvation) 현상이 발생할 수 있다. 기아란, 식당에서 늦게 온 VIP 손님이 계속 먼저 입장하면 일반 손님이 끝없이 기다리게 되는 것과 같다. 이를 해결하기 위해, 오래 기다린 프로세스의 우선순위를 점진적으로 높여주는 에이징(Aging) 기법이 사용된다 [1].</w:t>
       </w:r>
     </w:p>
     <w:p>
@@ -379,7 +379,7 @@
           <w:sz w:val="22"/>
           <w:szCs w:val="22"/>
         </w:rPr>
-        <w:t xml:space="preserve">는 작업의 실행 특성을 관찰하여 우선순위를 동적으로 조정하는 알고리즘이다. 짧은 작업은 높은 우선순위 큐에서 빠르게 처리되고, 타임 퀀텀(Time Quantum)을 초과한 긴 작업은 점차 하위 큐로 이동한다. Arpaci-Dusseau &amp; Arpaci-Dusseau는 MLFQ의 5가지 핵심 규칙을 정리하며, 현대 운영체제에서 가장 널리 사용되는 스케줄링 알고리즘 중 하나임을 설명하였다 [2].</w:t>
+        <w:t xml:space="preserve">는 작업의 실행 특성을 관찰하여 우선순위를 동적으로 조정하는 알고리즘이다. 짧은 작업은 높은 우선순위 큐에서 빠르게 처리되고, 할당된 시간(타임 퀀텀)을 초과한 긴 작업은 점차 하위 큐로 이동한다. 타임 퀀텀(Time Quantum)이란, 각 작업에 주어지는 최대 실행 시간으로, 이 시간이 지나면 다음 작업에게 순서를 양보해야 한다. Arpaci-Dusseau &amp; Arpaci-Dusseau는 MLFQ의 5가지 핵심 규칙을 정리하며, 현대 운영체제에서 가장 널리 사용되는 스케줄링 알고리즘 중 하나임을 설명하였다 [2].</w:t>
       </w:r>
     </w:p>
     <w:p>
@@ -402,7 +402,7 @@
           <w:sz w:val="22"/>
           <w:szCs w:val="22"/>
         </w:rPr>
-        <w:t xml:space="preserve">는 네트워크 분야에서 제안된 공정 큐잉 알고리즘으로, GPS(Generalized Processor Sharing) 이론에 기반한다 [3]. 각 흐름(flow)에 가중치를 부여하여 가중치에 비례하는 서비스를 제공하며, 가상 종료 시각(Virtual Finish Time) 개념을 사용하여 스케줄링 순서를 결정한다.</w:t>
+        <w:t xml:space="preserve">는 네트워크 분야에서 제안된 공정 큐잉 알고리즘이다. GPS(Generalized Processor Sharing)는 자원을 완벽히 공평하게 나누는 이상적인 모델이며, WFQ는 이를 현실에서 구현할 수 있도록 근사한 것이다 [3]. 각 흐름(flow)에 가중치를 부여하여 가중치에 비례하는 서비스를 제공하며, 가상 종료 시각(Virtual Finish Time, VFT)을 계산하여 스케줄링 순서를 결정한다. VFT란, '이 요청이 언제쯤 처리 완료될지'를 예측하는 계산값으로, 가중치가 높은 사용자의 요청은 VFT가 작아져 먼저 처리된다.</w:t>
       </w:r>
     </w:p>
     <w:p>
@@ -440,7 +440,7 @@
           <w:sz w:val="22"/>
           <w:szCs w:val="22"/>
         </w:rPr>
-        <w:t xml:space="preserve">LLM 서빙 분야에서는 추론 성능 최적화를 위한 다양한 기술이 개발되어 왔다. 이 절에서는 대표적인 LLM 서빙 시스템의 특징과, 본 연구와의 관련성을 살펴본다.</w:t>
+        <w:t xml:space="preserve">LLM 서빙 분야에서는 추론 성능 최적화를 위한 다양한 기술이 개발되어 왔다.</w:t>
       </w:r>
     </w:p>
     <w:p>
@@ -463,7 +463,7 @@
           <w:sz w:val="22"/>
           <w:szCs w:val="22"/>
         </w:rPr>
-        <w:t xml:space="preserve">은 UC Berkeley에서 개발한 고성능 LLM 추론 엔진으로, PagedAttention이라는 핵심 기술을 도입하였다 [4]. 이 기법은 운영체제의 가상 메모리 페이징에서 착안하여, LLM 추론 시 KV(Key-Value) 캐시 메모리를 비연속적 블록으로 관리한다. vLLM은 OS의 메모리 관리 기법을 LLM에 성공적으로 적용한 사례로, 기존 대비 처리량을 2~4배 개선하였다. 그러나 vLLM의 스케줄링은 FCFS 기반의 Continuous Batching에 한정되어 있으며, 테넌트 간 차등 서비스나 공정성 보장 메커니즘은 제공하지 않는다.</w:t>
+        <w:t xml:space="preserve">은 UC Berkeley에서 개발한 고성능 LLM 추론 엔진이다 [4]. 운영체제의 가상 메모리 페이징에서 착안한 PagedAttention 기법으로, 추론 시 메모리를 효율적으로 관리하여 처리량을 2~4배 개선하였다. 그러나 요청 스케줄링은 선착순에 한정되어 있으며, 테넌트 간 공정성 보장 기능은 제공하지 않는다.</w:t>
       </w:r>
     </w:p>
     <w:p>
@@ -478,15 +478,15 @@
           <w:sz w:val="22"/>
           <w:szCs w:val="22"/>
         </w:rPr>
-        <w:t xml:space="preserve">Hugging Face TGI(Text Generation Inference)</w:t>
-      </w:r>
-      <w:r>
-        <w:rPr>
-          <w:rFonts w:ascii="Arial" w:cs="Arial" w:eastAsia="Arial" w:hAnsi="Arial"/>
-          <w:sz w:val="22"/>
-          <w:szCs w:val="22"/>
-        </w:rPr>
-        <w:t xml:space="preserve">는 오픈소스 LLM 배포 도구로, Continuous Batching과 Flash Attention 등의 기술을 활용하여 추론 효율성을 높인다 [5]. Docker 기반으로 간편한 배포를 지원하지만, 다중 사용자 환경에서의 요청 우선순위 관리나 공정성 보장 기능은 포함하지 않는다.</w:t>
+        <w:t xml:space="preserve">Hugging Face TGI</w:t>
+      </w:r>
+      <w:r>
+        <w:rPr>
+          <w:rFonts w:ascii="Arial" w:cs="Arial" w:eastAsia="Arial" w:hAnsi="Arial"/>
+          <w:sz w:val="22"/>
+          <w:szCs w:val="22"/>
+        </w:rPr>
+        <w:t xml:space="preserve">는 오픈소스 LLM 배포 도구로, Docker 기반의 간편한 배포를 지원한다 [5]. 다중 사용자 환경에서의 요청 우선순위 관리나 공정성 보장 기능은 포함하지 않는다.</w:t>
       </w:r>
     </w:p>
     <w:p>
@@ -509,7 +509,7 @@
           <w:sz w:val="22"/>
           <w:szCs w:val="22"/>
         </w:rPr>
-        <w:t xml:space="preserve">는 로컬 환경에서 LLM을 간편하게 실행할 수 있는 도구로, REST API를 통해 다양한 오픈소스 모델(Llama, Mistral, Gemma 등)을 제공한다 [6]. 본 연구의 프로토타입에서 LLM 백엔드로 활용하였다.</w:t>
+        <w:t xml:space="preserve">는 로컬 환경에서 LLM을 간편하게 실행할 수 있는 도구로, REST API를 통해 다양한 오픈소스 모델을 제공한다 [6]. 본 연구의 프로토타입에서 LLM 백엔드로 활용하였다.</w:t>
       </w:r>
     </w:p>
     <w:p>
@@ -522,7 +522,7 @@
           <w:sz w:val="22"/>
           <w:szCs w:val="22"/>
         </w:rPr>
-        <w:t xml:space="preserve">기존 LLM 서빙 시스템들은 주로 GPU 메모리 관리와 추론 파이프라인 효율화에 집중하고 있으며, 다중 사용자 환경에서의 요청 스케줄링과 테넌트 간 공정성 문제는 상대적으로 다루어지지 않았다. 본 연구는 이 간극을 메우기 위해 OS 스케줄링 이론을 LLM 요청 관리에 적용한다. 특히 vLLM이 OS의 메모리 관리 기법을 LLM에 적용한 것처럼, 본 연구는 OS의 프로세스 스케줄링 기법을 LLM 요청 관리에 적용한다는 점에서 유사한 접근 방식을 취한다.</w:t>
+        <w:t xml:space="preserve">기존 LLM 서빙 시스템들은 주로 GPU 메모리 관리와 추론 효율화에 집중하고 있으며, 다중 사용자 환경에서의 요청 스케줄링과 테넌트 간 공정성 문제는 아직 충분히 연구되지 않았다. 본 연구는 이 부족한 부분을 보완하기 위해 OS 스케줄링 이론을 LLM 요청 관리에 적용한다.</w:t>
       </w:r>
     </w:p>
     <w:p>
@@ -543,7 +543,7 @@
           <w:sz w:val="22"/>
           <w:szCs w:val="22"/>
         </w:rPr>
-        <w:t xml:space="preserve">Jain's Fairness Index(JFI)는 공유 자원 시스템에서 자원 배분의 공정성을 정량적으로 측정하기 위한 지표로, 운영체제 및 네트워크 분야에서 범용 공정성 지표로 널리 사용되고 있다 [3]. JFI는 0(완전 불공정)부터 1(완전 공정) 사이의 값을 가지며, 다음과 같이 계산된다.</w:t>
+        <w:t xml:space="preserve">Jain's Fairness Index(JFI)는 공유 자원 시스템에서 자원 배분의 공정성을 측정하기 위한 지표로, 운영체제 및 네트워크 분야에서 널리 사용되고 있다 [3]. JFI는 0(완전 불공정)부터 1(완전 공정) 사이의 값을 가지며, 1에 가까울수록 자원이 공평하게 배분된 것이다. 다음과 같이 계산된다.</w:t>
       </w:r>
     </w:p>
     <w:p>
@@ -572,7 +572,7 @@
           <w:sz w:val="22"/>
           <w:szCs w:val="22"/>
         </w:rPr>
-        <w:t xml:space="preserve">여기서 xi는 각 사용자가 받는 자원의 양, n은 사용자 수이다. 본 연구는 JFI를 멀티테넌트 LLM API 환경에 적용하여, 시스템 수준(전체 테넌트 간)과 테넌트 수준(동일 등급 내 요청 간)의 이중 공정성 측정 방법론을 제시한다.</w:t>
+        <w:t xml:space="preserve">여기서 xi는 각 사용자가 받는 자원의 양, n은 사용자 수이다. 본 연구는 JFI를 다중 사용자 LLM API 환경에 적용하여, 시스템 수준(전체 테넌트 간)과 테넌트 수준(동일 등급 내 요청 간)의 공정성을 각각 측정한다.</w:t>
       </w:r>
     </w:p>
     <w:p>
@@ -601,7 +601,7 @@
           <w:sz w:val="22"/>
           <w:szCs w:val="22"/>
         </w:rPr>
-        <w:t xml:space="preserve">본 연구에서 제안하는 시스템은 OS 스케줄링 알고리즘을 LLM API 요청 관리에 적용한 멀티테넌트 요청 관리 시스템이다. 표 1은 OS 개념과 LLM 도메인 간의 대응 관계를 정리한 것이다.</w:t>
+        <w:t xml:space="preserve">본 연구에서 제안하는 시스템은 OS 스케줄링 알고리즘을 LLM API 요청 관리에 적용한 다중 사용자 요청 관리 시스템이다. 표 1은 OS 개념과 LLM 도메인 간의 대응 관계를 정리한 것이다.</w:t>
       </w:r>
     </w:p>
     <w:p>
@@ -1154,7 +1154,7 @@
                 <w:sz w:val="20"/>
                 <w:szCs w:val="20"/>
               </w:rPr>
-              <w:t xml:space="preserve">긴 요청 제어 메커니즘</w:t>
+              <w:t xml:space="preserve">긴 요청 제어 방법</w:t>
             </w:r>
           </w:p>
         </w:tc>
@@ -1357,7 +1357,7 @@
           <w:sz w:val="22"/>
           <w:szCs w:val="22"/>
         </w:rPr>
-        <w:t xml:space="preserve">4단계 우선순위(URGENT &gt; HIGH &gt; NORMAL &gt; LOW)를 지원하며, 에이징(Aging) 메커니즘을 통해 기아 현상을 방지한다 [1]. 대기 시간이 임계값을 초과하면 요청의 우선순위가 자동으로 한 단계 상승한다.</w:t>
+        <w:t xml:space="preserve">4단계 우선순위(URGENT &gt; HIGH &gt; NORMAL &gt; LOW)를 지원한다 [1]. 에이징 메커니즘을 통해, 대기 시간이 임계값을 초과하면 요청의 우선순위가 자동으로 한 단계 상승하여 기아 현상을 방지한다.</w:t>
       </w:r>
     </w:p>
     <w:p>
@@ -1378,7 +1378,7 @@
           <w:sz w:val="22"/>
           <w:szCs w:val="22"/>
         </w:rPr>
-        <w:t xml:space="preserve">4단계 피드백 큐(Q0~Q3)를 구현하며, 큐별 타임 퀀텀을 차등 설정한다(Q0: 500ms, Q1: 1,500ms, Q2: 4,000ms, Q3: 무제한). 시간 슬라이스(500ms) 기반의 선점형(Preemptive) 동작을 지원하여, 타임 퀀텀을 초과한 요청은 하위 큐로 이동시킨다 [2]. 이를 통해 짧은 요청이 긴 요청에 의해 지연되는 것을 방지한다. 주기적 부스트(Boost) 메커니즘으로 모든 요청을 최상위 큐(Q0)로 복귀시켜 기아를 방지한다.</w:t>
+        <w:t xml:space="preserve">4단계 피드백 큐(Q0~Q3)를 구현하며, 큐별 타임 퀀텀을 차등 설정한다(Q0: 500ms, Q1: 1,500ms, Q2: 4,000ms, Q3: 무제한). 시간 슬라이스(500ms) 기반의 선점형(Preemptive) 동작을 지원한다 [2]. 선점이란, 처리 중인 요청의 할당 시간이 지나면 잠시 멈추고 다른 요청에게 순서를 넘기는 것이다. 타임 퀀텀을 초과한 요청은 하위 큐로 이동시켜, 짧은 요청이 긴 요청에 의해 지연되는 것을 방지한다. 주기적 부스트(Boost) 메커니즘으로 모든 요청을 최상위 큐(Q0)로 복귀시켜 기아를 방지한다.</w:t>
       </w:r>
     </w:p>
     <w:p>
@@ -1399,7 +1399,7 @@
           <w:sz w:val="22"/>
           <w:szCs w:val="22"/>
         </w:rPr>
-        <w:t xml:space="preserve">GPS 이론에 기반한 가중치 공정 큐잉 알고리즘으로, 테넌트 등급별 가중치(Enterprise: 100, Premium: 50, Standard: 10, Free: 1)에 비례하여 자원을 분배한다 [3]. 가상 종료 시각(Virtual Finish Time)을 계산하여 스케줄링 순서를 결정하며, 이중 수준 JFI로 공정성을 정량적으로 모니터링한다.</w:t>
+        <w:t xml:space="preserve">테넌트 등급별 가중치(Enterprise: 100, Premium: 50, Standard: 10, Free: 1)에 비례하여 자원을 분배하는 알고리즘이다 [3]. VFT를 계산하여 스케줄링 순서를 결정하며, JFI로 공정성을 모니터링한다.</w:t>
       </w:r>
     </w:p>
     <w:p>
@@ -1420,7 +1420,7 @@
           <w:sz w:val="22"/>
           <w:szCs w:val="22"/>
         </w:rPr>
-        <w:t xml:space="preserve">토큰 버킷(Token Bucket) 알고리즘으로 테넌트별 요청 빈도를 제한한다 [3]. 버스트 용량을 제어하여 시스템 과부하를 방지하는 보조 메커니즘으로 활용한다.</w:t>
+        <w:t xml:space="preserve">토큰 버킷(Token Bucket) 알고리즘으로 테넌트별 요청 빈도를 제한한다 [3]. 토큰 버킷이란, 일정 시간마다 토큰(요청 권한)이 생기고, 요청할 때마다 토큰을 하나씩 쓰는 방식이다. 토큰이 없으면 요청이 거부된다. 버스트 용량을 제어하여 시스템 과부하를 방지하는 보조 수단으로 활용한다.</w:t>
       </w:r>
     </w:p>
     <w:p>
@@ -1474,7 +1474,7 @@
           <w:sz w:val="22"/>
           <w:szCs w:val="22"/>
         </w:rPr>
-        <w:t xml:space="preserve">WFQ 스케줄러에서 시스템 수준 JFI(전체 테넌트 간 공정성)와 테넌트 수준 JFI(개별 테넌트 내 요청 간 공정성)를 분리 측정한다. 시스템 수준 JFI는 가중치 비율에 따른 의도적 차등이 올바르게 동작하는지를 검증하고, 테넌트 수준 JFI는 동일 등급 내 요청 간의 공평한 처리를 확인한다.</w:t>
+        <w:t xml:space="preserve">WFQ 스케줄러에서 시스템 수준 JFI(전체 테넌트 간 공정성)와 테넌트 수준 JFI(개별 테넌트 내 요청 간 공정성)를 분리 측정한다. 시스템 수준 JFI는 가중치 비율에 따른 의도적 차등이 올바르게 동작하는지를 확인하고, 테넌트 수준 JFI는 동일 등급 내 요청 간의 공평한 처리를 확인한다.</w:t>
       </w:r>
     </w:p>
     <w:p>
@@ -1497,7 +1497,7 @@
           <w:sz w:val="22"/>
           <w:szCs w:val="22"/>
         </w:rPr>
-        <w:t xml:space="preserve">Priority 스케줄러의 에이징(Aging)과 MLFQ 스케줄러의 부스트(Boost) 메커니즘을 통해 낮은 우선순위 요청의 무기한 대기를 방지한다.</w:t>
+        <w:t xml:space="preserve">Priority 스케줄러의 에이징과 MLFQ 스케줄러의 부스트 메커니즘을 통해 낮은 우선순위 요청의 무기한 대기를 방지한다.</w:t>
       </w:r>
     </w:p>
     <w:p>
@@ -1535,7 +1535,7 @@
           <w:sz w:val="22"/>
           <w:szCs w:val="22"/>
         </w:rPr>
-        <w:t xml:space="preserve">25-2학기에 프로토타입을 구현하고 실험을 수행하여 다음과 같은 예비 결과를 확인하였다.</w:t>
+        <w:t xml:space="preserve">겨울방학 동안 프로토타입을 구현하고 실험을 수행하여 다음과 같은 예비 결과를 확인하였다.</w:t>
       </w:r>
     </w:p>
     <w:p>
@@ -1647,7 +1647,7 @@
           <w:sz w:val="22"/>
           <w:szCs w:val="22"/>
         </w:rPr>
-        <w:t xml:space="preserve">통계 검증</w:t>
+        <w:t xml:space="preserve">실험 규모</w:t>
       </w:r>
       <w:r>
         <w:rPr>
@@ -2044,7 +2044,7 @@
                 <w:sz w:val="20"/>
                 <w:szCs w:val="20"/>
               </w:rPr>
-              <w:t xml:space="preserve">짧은 요청: 선점형 모드에서 73.78% 개선</w:t>
+              <w:t xml:space="preserve">짧은 요청: 선점형 모드에서 약 74% 개선</w:t>
             </w:r>
           </w:p>
         </w:tc>
@@ -2153,15 +2153,15 @@
           <w:sz w:val="22"/>
           <w:szCs w:val="22"/>
         </w:rPr>
-        <w:t xml:space="preserve">RQ1 (Priority Scheduling): </w:t>
-      </w:r>
-      <w:r>
-        <w:rPr>
-          <w:rFonts w:ascii="Arial" w:cs="Arial" w:eastAsia="Arial" w:hAnsi="Arial"/>
-          <w:sz w:val="22"/>
-          <w:szCs w:val="22"/>
-        </w:rPr>
-        <w:t xml:space="preserve">URGENT 요청은 FCFS 대비 62% 빠르게 처리되었다 (효과 크기 Cohen's d = 0.78, p &lt; 0.001). 에이징 메커니즘에 의해 기아 현상이 방지됨을 확인하였다.</w:t>
+        <w:t xml:space="preserve">Priority Scheduling: </w:t>
+      </w:r>
+      <w:r>
+        <w:rPr>
+          <w:rFonts w:ascii="Arial" w:cs="Arial" w:eastAsia="Arial" w:hAnsi="Arial"/>
+          <w:sz w:val="22"/>
+          <w:szCs w:val="22"/>
+        </w:rPr>
+        <w:t xml:space="preserve">URGENT 요청은 FCFS 대비 62% 빠르게 처리되었다. 에이징 메커니즘에 의해 낮은 우선순위 요청도 무기한 대기 없이 처리됨을 확인하였다.</w:t>
       </w:r>
     </w:p>
     <w:p>
@@ -2176,15 +2176,15 @@
           <w:sz w:val="22"/>
           <w:szCs w:val="22"/>
         </w:rPr>
-        <w:t xml:space="preserve">RQ2 (MLFQ): </w:t>
-      </w:r>
-      <w:r>
-        <w:rPr>
-          <w:rFonts w:ascii="Arial" w:cs="Arial" w:eastAsia="Arial" w:hAnsi="Arial"/>
-          <w:sz w:val="22"/>
-          <w:szCs w:val="22"/>
-        </w:rPr>
-        <w:t xml:space="preserve">시간 슬라이스 기반 선점형 모드에서, 짧은 요청과 긴 요청이 동시에 경쟁하는 환경에서 짧은 요청의 대기시간이 평균 73.78% 개선되었다 (10개 시드 다중 실험, 95% 신뢰구간: [72.36%, 75.20%], p &lt; 0.001).</w:t>
+        <w:t xml:space="preserve">MLFQ: </w:t>
+      </w:r>
+      <w:r>
+        <w:rPr>
+          <w:rFonts w:ascii="Arial" w:cs="Arial" w:eastAsia="Arial" w:hAnsi="Arial"/>
+          <w:sz w:val="22"/>
+          <w:szCs w:val="22"/>
+        </w:rPr>
+        <w:t xml:space="preserve">시간 슬라이스 기반 선점형 모드에서, 짧은 요청과 긴 요청이 동시에 경쟁하는 환경에서 짧은 요청의 대기시간이 약 74% 개선되었다 (10개 시드 다중 실험).</w:t>
       </w:r>
     </w:p>
     <w:p>
@@ -2199,7 +2199,7 @@
           <w:sz w:val="22"/>
           <w:szCs w:val="22"/>
         </w:rPr>
-        <w:t xml:space="preserve">RQ3 (WFQ): </w:t>
+        <w:t xml:space="preserve">WFQ: </w:t>
       </w:r>
       <w:r>
         <w:rPr>
@@ -2228,7 +2228,7 @@
           <w:sz w:val="22"/>
           <w:szCs w:val="22"/>
         </w:rPr>
-        <w:t xml:space="preserve">25-2학기 예비 구현에서 확인된 결과를 바탕으로, 26-1학기에는 다음을 추가 수행한다.</w:t>
+        <w:t xml:space="preserve">겨울방학 동안의 예비 구현에서 확인된 결과를 바탕으로, 26-1학기에는 다음을 추가 수행한다.</w:t>
       </w:r>
     </w:p>
     <w:p>
@@ -2256,7 +2256,7 @@
           <w:sz w:val="22"/>
           <w:szCs w:val="22"/>
         </w:rPr>
-        <w:t xml:space="preserve">: LLM 서빙 시스템의 최신 스케줄링 기법과 멀티테넌트 자원 관리에 대한 관련연구를 추가 조사하여, 본 연구의 차별성을 명확히 제시한다.</w:t>
+        <w:t xml:space="preserve">: LLM 서빙 시스템의 최신 스케줄링 기법과 다중 사용자 자원 관리에 대한 관련연구를 추가 조사하여, 본 연구의 차별점을 명확히 한다.</w:t>
       </w:r>
     </w:p>
     <w:p>
@@ -2284,7 +2284,7 @@
           <w:sz w:val="22"/>
           <w:szCs w:val="22"/>
         </w:rPr>
-        <w:t xml:space="preserve">: 대규모 실험(1,000건 이상)과 다양한 워크로드 시나리오(버스트 트래픽, 비균등 테넌트 분포 등)를 추가하여 알고리즘의 확장성을 검증한다.</w:t>
+        <w:t xml:space="preserve">: 더 큰 규모(1,000건 이상)와 다양한 워크로드 시나리오(버스트 트래픽, 비균등 테넌트 분포 등)를 추가하여 시스템이 더 큰 규모에서도 잘 동작하는지 확인한다.</w:t>
       </w:r>
     </w:p>
     <w:p>
@@ -2312,7 +2312,7 @@
           <w:sz w:val="22"/>
           <w:szCs w:val="22"/>
         </w:rPr>
-        <w:t xml:space="preserve">: JFI 외 추가 공정성 지표 적용을 검토하고, 공정성과 성능 간의 트레이드오프를 분석한다.</w:t>
+        <w:t xml:space="preserve">: JFI 외 추가 공정성 지표 적용을 검토하고, 공정성과 성능 간의 장단점을 비교한다.</w:t>
       </w:r>
     </w:p>
     <w:p>
@@ -2340,7 +2340,7 @@
           <w:sz w:val="22"/>
           <w:szCs w:val="22"/>
         </w:rPr>
-        <w:t xml:space="preserve">: 아키텍처 상세 설계, 알고리즘 의사코드, API 명세를 체계적으로 정리한다.</w:t>
+        <w:t xml:space="preserve">: 아키텍처 상세 설계, 알고리즘 의사코드, API 명세를 정리한다.</w:t>
       </w:r>
     </w:p>
     <w:p>

</xml_diff>

<commit_message>
Add proposal figures and slides for scheduling algorithms
- Created package.json for project dependencies including Playwright, pptxgenjs, and sharp.
- Added PowerPoint presentation (proposal-figures.pptx) for visual representation of proposal.
- Introduced HTML slides detailing algorithm comparisons, concept mapping, architecture, and performance metrics.
- Included a backup of the original concept mapping slide before replacement.
- Added a final proposal document (proposal.docx) and a snapshot info file documenting the snapshot creation details.
</commit_message>
<xml_diff>
--- a/04-proposal/final/proposal.docx
+++ b/04-proposal/final/proposal.docx
@@ -1178,7 +1178,7 @@
           <w:sz w:val="22"/>
           <w:szCs w:val="22"/>
         </w:rPr>
-        <w:t xml:space="preserve">시스템은 4계층 구조로 설계되었다 (그림 2 참조).</w:t>
+        <w:t xml:space="preserve">시스템은 4계층 구조로 설계되었으며, 외부 LLM 백엔드와 연동한다 (그림 2 참조).</w:t>
       </w:r>
     </w:p>
     <w:p>
@@ -1291,6 +1291,19 @@
           <w:szCs w:val="22"/>
         </w:rPr>
         <w:t xml:space="preserve">: 메모리 배열과 JSON 파일로 상태 데이터를 관리한다.</w:t>
+      </w:r>
+    </w:p>
+    <w:p>
+      <w:pPr>
+        <w:spacing w:after="120"/>
+      </w:pPr>
+      <w:r>
+        <w:rPr>
+          <w:rFonts w:ascii="Arial" w:cs="Arial" w:eastAsia="Arial" w:hAnsi="Arial"/>
+          <w:sz w:val="22"/>
+          <w:szCs w:val="22"/>
+        </w:rPr>
+        <w:t xml:space="preserve">LLM 추론은 외부 백엔드인 Ollama [6]에 위임하며, 스케줄러가 결정한 순서에 따라 요청을 전달한다.</w:t>
       </w:r>
     </w:p>
     <w:p>

</xml_diff>

<commit_message>
Update proposal documents and figures for multi-user LLM API request management system
- Enhanced writing standards in shared documentation with new Korean expressions.
- Modified JavaScript code for generating proposal documents to improve clarity and accuracy.
- Created a new version of the proposal document (v9) with updated content and structure.
- Generated new figures for the proposal, including scheduling algorithm comparisons, system architecture, and request processing flow.
- Updated references and citations in the proposal to reflect recent research.
- Added a snapshot of the proposal and figures for version control.
</commit_message>
<xml_diff>
--- a/04-proposal/final/proposal.docx
+++ b/04-proposal/final/proposal.docx
@@ -184,7 +184,7 @@
           <w:sz w:val="22"/>
           <w:szCs w:val="22"/>
         </w:rPr>
-        <w:t xml:space="preserve">운영체제의 프로세스 스케줄링 알고리즘은 CPU 자원을 여러 프로세스에 효율적으로 배분하기 위해 수십 년간 연구되어 온 이론이다 [1]. 본 연구는 이 검증된 이론을 LLM API 요청 관리라는 새로운 분야에 적용함으로써, OS 이론의 실제 응용 가능성을 탐구하고자 한다.</w:t>
+        <w:t xml:space="preserve">운영체제의 프로세스 스케줄링 알고리즘은 CPU 자원을 여러 프로세스에 효율적으로 배분하기 위해 수십 년간 연구되어 온 이론이다 [1]. 본 연구는 이 검증된 이론을 LLM API 요청 관리라는 새로운 분야에 적용함으로써, 이 이론을 LLM API 요청 관리에 활용할 수 있는지 확인하고자 한다.</w:t>
       </w:r>
     </w:p>
     <w:p>
@@ -419,7 +419,7 @@
           <w:sz w:val="20"/>
           <w:szCs w:val="20"/>
         </w:rPr>
-        <w:t xml:space="preserve">[그림 1] 스케줄링 알고리즘 개념 비교 (별첨: fig-1-scheduling-comparison.pptx)</w:t>
+        <w:t xml:space="preserve">[그림 1] 스케줄링 알고리즘 개념 비교 (별첨: proposal-figures.pptx, 슬라이드 1)</w:t>
       </w:r>
     </w:p>
     <w:p>
@@ -463,7 +463,7 @@
           <w:sz w:val="22"/>
           <w:szCs w:val="22"/>
         </w:rPr>
-        <w:t xml:space="preserve">은 UC Berkeley에서 개발한 고성능 LLM 추론 엔진이다 [4]. 운영체제의 가상 메모리 페이징에서 착안한 PagedAttention 기법으로, 추론 시 메모리를 효율적으로 관리하여 처리량을 2~4배 개선하였다. 그러나 요청 스케줄링은 선착순에 한정되어 있으며, 테넌트 간 공정성 보장 기능은 제공하지 않는다.</w:t>
+        <w:t xml:space="preserve">은 UC Berkeley에서 개발한 고성능 LLM 추론 엔진이다 [4]. 그러나 요청 스케줄링은 선착순에 한정되어 있으며, 테넌트 간 공정성 보장 기능은 제공하지 않는다.</w:t>
       </w:r>
     </w:p>
     <w:p>
@@ -509,7 +509,7 @@
           <w:sz w:val="22"/>
           <w:szCs w:val="22"/>
         </w:rPr>
-        <w:t xml:space="preserve">는 로컬 환경에서 LLM을 간편하게 실행할 수 있는 도구로, REST API를 통해 다양한 오픈소스 모델을 제공한다 [6]. 본 연구의 프로토타입에서 LLM 백엔드로 활용하였다.</w:t>
+        <w:t xml:space="preserve">는 로컬 환경에서 LLM을 간편하게 실행할 수 있는 도구이다 [6]. 본 연구의 프로토타입에서 LLM 백엔드로 활용하였다.</w:t>
       </w:r>
     </w:p>
     <w:p>
@@ -522,7 +522,7 @@
           <w:sz w:val="22"/>
           <w:szCs w:val="22"/>
         </w:rPr>
-        <w:t xml:space="preserve">기존 LLM 서빙 시스템들은 주로 GPU 메모리 관리와 추론 효율화에 집중하고 있으며, 다중 사용자 환경에서의 요청 스케줄링과 테넌트 간 공정성 문제는 아직 충분히 연구되지 않았다. 본 연구는 이 부족한 부분을 보완하기 위해 OS 스케줄링 이론을 LLM 요청 관리에 적용한다.</w:t>
+        <w:t xml:space="preserve">기존 LLM 서빙 시스템들은 주로 추론 효율화에 집중하고 있으며, 다중 사용자 환경에서의 요청 스케줄링과 테넌트 간 공정성 문제는 아직 많이 다루어지지 않았다. 본 연구는 이 부분을 보완하기 위해 OS 스케줄링 이론을 LLM 요청 관리에 적용한다.</w:t>
       </w:r>
     </w:p>
     <w:p>
@@ -1320,7 +1320,7 @@
           <w:sz w:val="20"/>
           <w:szCs w:val="20"/>
         </w:rPr>
-        <w:t xml:space="preserve">[그림 2] 시스템 아키텍처 (4계층 구조) (별첨: fig-2-system-architecture.pptx)</w:t>
+        <w:t xml:space="preserve">[그림 2] 시스템 아키텍처 (4계층 구조) (별첨: proposal-figures.pptx, 슬라이드 2)</w:t>
       </w:r>
     </w:p>
     <w:p>
@@ -1479,15 +1479,15 @@
           <w:sz w:val="22"/>
           <w:szCs w:val="22"/>
         </w:rPr>
-        <w:t xml:space="preserve">이중 수준 공정성 측정: </w:t>
-      </w:r>
-      <w:r>
-        <w:rPr>
-          <w:rFonts w:ascii="Arial" w:cs="Arial" w:eastAsia="Arial" w:hAnsi="Arial"/>
-          <w:sz w:val="22"/>
-          <w:szCs w:val="22"/>
-        </w:rPr>
-        <w:t xml:space="preserve">WFQ 스케줄러에서 시스템 수준 JFI(전체 테넌트 간 공정성)와 테넌트 수준 JFI(개별 테넌트 내 요청 간 공정성)를 분리 측정한다. 시스템 수준 JFI는 가중치 비율에 따른 의도적 차등이 올바르게 동작하는지를 확인하고, 테넌트 수준 JFI는 동일 등급 내 요청 간의 공평한 처리를 확인한다.</w:t>
+        <w:t xml:space="preserve">두 가지 수준의 공정성 측정: </w:t>
+      </w:r>
+      <w:r>
+        <w:rPr>
+          <w:rFonts w:ascii="Arial" w:cs="Arial" w:eastAsia="Arial" w:hAnsi="Arial"/>
+          <w:sz w:val="22"/>
+          <w:szCs w:val="22"/>
+        </w:rPr>
+        <w:t xml:space="preserve">WFQ 스케줄러에서 시스템 수준 JFI(전체 테넌트 간 공정성)와 테넌트 수준 JFI(같은 등급 내 요청 간 공정성)를 나누어 측정한다.</w:t>
       </w:r>
     </w:p>
     <w:p>
@@ -1527,7 +1527,7 @@
           <w:sz w:val="20"/>
           <w:szCs w:val="20"/>
         </w:rPr>
-        <w:t xml:space="preserve">[그림 3] 요청 처리 흐름도 (별첨: fig-3-request-flow.pptx)</w:t>
+        <w:t xml:space="preserve">[그림 3] 요청 처리 흐름도 (별첨: proposal-figures.pptx, 슬라이드 3)</w:t>
       </w:r>
     </w:p>
     <w:p>
@@ -1668,7 +1668,7 @@
           <w:sz w:val="22"/>
           <w:szCs w:val="22"/>
         </w:rPr>
-        <w:t xml:space="preserve">: 10개 시드 기반 다중 실험 (시드당 500건 요청, 총 5,000건)</w:t>
+        <w:t xml:space="preserve">: 다중 시드 기반 반복 실험 (총 5,000건 요청)</w:t>
       </w:r>
     </w:p>
     <w:p>
@@ -1676,7 +1676,7 @@
         <w:pStyle w:val="Heading2"/>
       </w:pPr>
       <w:r>
-        <w:t xml:space="preserve">4.2 주요 성과 요약</w:t>
+        <w:t xml:space="preserve">4.2 주요 결과</w:t>
       </w:r>
     </w:p>
     <w:p>
@@ -2197,7 +2197,7 @@
           <w:sz w:val="22"/>
           <w:szCs w:val="22"/>
         </w:rPr>
-        <w:t xml:space="preserve">시간 슬라이스 기반 선점형 모드에서, 짧은 요청과 긴 요청이 동시에 경쟁하는 환경에서 짧은 요청의 대기시간이 약 74% 개선되었다 (10개 시드 다중 실험).</w:t>
+        <w:t xml:space="preserve">선점형 모드에서, 짧은 요청과 긴 요청이 동시에 경쟁하는 환경에서 짧은 요청의 대기시간이 약 74% 개선되었다.</w:t>
       </w:r>
     </w:p>
     <w:p>
@@ -2261,15 +2261,15 @@
           <w:sz w:val="22"/>
           <w:szCs w:val="22"/>
         </w:rPr>
-        <w:t xml:space="preserve">관련연구 보강</w:t>
-      </w:r>
-      <w:r>
-        <w:rPr>
-          <w:rFonts w:ascii="Arial" w:cs="Arial" w:eastAsia="Arial" w:hAnsi="Arial"/>
-          <w:sz w:val="22"/>
-          <w:szCs w:val="22"/>
-        </w:rPr>
-        <w:t xml:space="preserve">: LLM 서빙 시스템의 최신 스케줄링 기법과 다중 사용자 자원 관리에 대한 관련연구를 추가 조사하여, 본 연구의 차별점을 명확히 한다.</w:t>
+        <w:t xml:space="preserve">관련연구 추가 조사</w:t>
+      </w:r>
+      <w:r>
+        <w:rPr>
+          <w:rFonts w:ascii="Arial" w:cs="Arial" w:eastAsia="Arial" w:hAnsi="Arial"/>
+          <w:sz w:val="22"/>
+          <w:szCs w:val="22"/>
+        </w:rPr>
+        <w:t xml:space="preserve">: LLM 서빙 분야의 스케줄링 기법을 더 찾아보고, 본 연구와 다른 점을 정리한다.</w:t>
       </w:r>
     </w:p>
     <w:p>
@@ -2289,15 +2289,15 @@
           <w:sz w:val="22"/>
           <w:szCs w:val="22"/>
         </w:rPr>
-        <w:t xml:space="preserve">실험 설계 확대</w:t>
-      </w:r>
-      <w:r>
-        <w:rPr>
-          <w:rFonts w:ascii="Arial" w:cs="Arial" w:eastAsia="Arial" w:hAnsi="Arial"/>
-          <w:sz w:val="22"/>
-          <w:szCs w:val="22"/>
-        </w:rPr>
-        <w:t xml:space="preserve">: 더 큰 규모(1,000건 이상)와 다양한 워크로드 시나리오(버스트 트래픽, 비균등 테넌트 분포 등)를 추가하여 시스템이 더 큰 규모에서도 잘 동작하는지 확인한다.</w:t>
+        <w:t xml:space="preserve">실험 규모 확대</w:t>
+      </w:r>
+      <w:r>
+        <w:rPr>
+          <w:rFonts w:ascii="Arial" w:cs="Arial" w:eastAsia="Arial" w:hAnsi="Arial"/>
+          <w:sz w:val="22"/>
+          <w:szCs w:val="22"/>
+        </w:rPr>
+        <w:t xml:space="preserve">: 더 많은 요청(1,000건 이상)과 다양한 상황(갑자기 요청이 몰리는 경우, 테넌트 비율이 다른 경우 등)에서 실험해 본다.</w:t>
       </w:r>
     </w:p>
     <w:p>
@@ -2317,15 +2317,15 @@
           <w:sz w:val="22"/>
           <w:szCs w:val="22"/>
         </w:rPr>
-        <w:t xml:space="preserve">공정성 분석 심화</w:t>
-      </w:r>
-      <w:r>
-        <w:rPr>
-          <w:rFonts w:ascii="Arial" w:cs="Arial" w:eastAsia="Arial" w:hAnsi="Arial"/>
-          <w:sz w:val="22"/>
-          <w:szCs w:val="22"/>
-        </w:rPr>
-        <w:t xml:space="preserve">: JFI 외 추가 공정성 지표 적용을 검토하고, 공정성과 성능 간의 장단점을 비교한다.</w:t>
+        <w:t xml:space="preserve">공정성 지표 추가 검토</w:t>
+      </w:r>
+      <w:r>
+        <w:rPr>
+          <w:rFonts w:ascii="Arial" w:cs="Arial" w:eastAsia="Arial" w:hAnsi="Arial"/>
+          <w:sz w:val="22"/>
+          <w:szCs w:val="22"/>
+        </w:rPr>
+        <w:t xml:space="preserve">: JFI 외에 다른 공정성 지표도 적용할 수 있는지 살펴보고, 공정성과 성능 사이의 장단점을 비교한다.</w:t>
       </w:r>
     </w:p>
     <w:p>
@@ -2345,15 +2345,15 @@
           <w:sz w:val="22"/>
           <w:szCs w:val="22"/>
         </w:rPr>
-        <w:t xml:space="preserve">시스템 설계 문서화</w:t>
-      </w:r>
-      <w:r>
-        <w:rPr>
-          <w:rFonts w:ascii="Arial" w:cs="Arial" w:eastAsia="Arial" w:hAnsi="Arial"/>
-          <w:sz w:val="22"/>
-          <w:szCs w:val="22"/>
-        </w:rPr>
-        <w:t xml:space="preserve">: 아키텍처 상세 설계, 알고리즘 의사코드, API 명세를 정리한다.</w:t>
+        <w:t xml:space="preserve">설계 문서 정리</w:t>
+      </w:r>
+      <w:r>
+        <w:rPr>
+          <w:rFonts w:ascii="Arial" w:cs="Arial" w:eastAsia="Arial" w:hAnsi="Arial"/>
+          <w:sz w:val="22"/>
+          <w:szCs w:val="22"/>
+        </w:rPr>
+        <w:t xml:space="preserve">: 아키텍처 상세 설계, 알고리즘 설명, API 명세를 정리한다.</w:t>
       </w:r>
     </w:p>
     <w:p>
@@ -3025,7 +3025,7 @@
           <w:sz w:val="20"/>
           <w:szCs w:val="20"/>
         </w:rPr>
-        <w:t xml:space="preserve">[4] W. Kwon et al., "Efficient Memory Management for Large Language Model Serving with PagedAttention," in Proc. 29th ACM Symp. on Operating Systems Principles (SOSP '23), 2023, pp. 611-626. [온라인] Available: https://github.com/vllm-project/vllm</w:t>
+        <w:t xml:space="preserve">[4] W. Kwon et al., "Efficient Memory Management for Large Language Model Serving with PagedAttention," arXiv preprint, 2023. [온라인] Available: https://arxiv.org/abs/2309.06180</w:t>
       </w:r>
     </w:p>
     <w:p>

</xml_diff>

<commit_message>
Add initial proposal files and figures for snapshot 20260308
- Created package.json for figures with dependencies: playwright, pptxgenjs, sharp.
- Added proposal-figures.pptx for visual representation of the proposal.
- Introduced HTML slides for algorithm comparison, architecture, and request flow.
- Included a .gitkeep file in the final directory to maintain structure.
- Added proposal.docx as the main document for the proposal.
- Created snapshot-info.md to document the snapshot creation details and status.
</commit_message>
<xml_diff>
--- a/04-proposal/final/proposal.docx
+++ b/04-proposal/final/proposal.docx
@@ -230,7 +230,7 @@
           <w:sz w:val="22"/>
           <w:szCs w:val="22"/>
         </w:rPr>
-        <w:t xml:space="preserve">: FCFS(베이스라인), Priority Scheduling(긴급 요청 우선), MLFQ(적응형 스케줄링), WFQ(공정 배분), Rate Limiter(속도 제한)를 LLM API 환경에 맞게 구현한다.</w:t>
+        <w:t xml:space="preserve">: FCFS(기준 알고리즘), Priority Scheduling(긴급 요청 우선), MLFQ(적응형 스케줄링), WFQ(공정 배분), Rate Limiter(속도 제한)를 LLM API 환경에 맞게 구현한다.</w:t>
       </w:r>
     </w:p>
     <w:p>
@@ -258,7 +258,7 @@
           <w:sz w:val="22"/>
           <w:szCs w:val="22"/>
         </w:rPr>
-        <w:t xml:space="preserve">: 동일한 워크로드에서 대기시간, 처리량, 공정성 지표를 비교한다.</w:t>
+        <w:t xml:space="preserve">: 같은 조건에서 대기시간, 처리량, 공정성을 비교한다.</w:t>
       </w:r>
     </w:p>
     <w:p>
@@ -468,7 +468,7 @@
           <w:sz w:val="22"/>
           <w:szCs w:val="22"/>
         </w:rPr>
-        <w:t xml:space="preserve">은 UC Berkeley에서 개발한 고성능 LLM 추론 엔진이다 [4]. 그러나 요청 스케줄링은 선착순에 한정되어 있으며, 테넌트 간 공정성 보장 기능은 제공하지 않는다.</w:t>
+        <w:t xml:space="preserve">은 UC Berkeley에서 개발한 LLM 서빙 도구이다 [4]. 그러나 요청 스케줄링은 선착순에 한정되어 있으며, 테넌트 간 공정성 보장 기능은 제공하지 않는다.</w:t>
       </w:r>
     </w:p>
     <w:p>
@@ -527,7 +527,7 @@
           <w:sz w:val="22"/>
           <w:szCs w:val="22"/>
         </w:rPr>
-        <w:t xml:space="preserve">기존 LLM 서빙 시스템들은 주로 추론 효율화에 집중하고 있으며, 다중 사용자 환경에서의 요청 스케줄링과 테넌트 간 공정성 문제는 아직 많이 다루어지지 않았다. 본 연구는 이 부분을 보완하기 위해 OS 스케줄링 이론을 LLM 요청 관리에 적용한다.</w:t>
+        <w:t xml:space="preserve">기존 LLM 서빙 시스템들은 주로 LLM의 응답 속도를 높이는 데 집중하고 있으며, 다중 사용자 환경에서의 요청 스케줄링과 테넌트 간 공정성 문제는 아직 많이 다루어지지 않았다. 본 연구는 이 부분을 보완하기 위해 OS 스케줄링 이론을 LLM 요청 관리에 적용한다.</w:t>
       </w:r>
     </w:p>
     <w:p>
@@ -1354,7 +1354,7 @@
           <w:sz w:val="22"/>
           <w:szCs w:val="22"/>
         </w:rPr>
-        <w:t xml:space="preserve">선착순 처리 알고리즘으로, 요청의 도착 타임스탬프를 기준으로 처리 순서를 결정한다. 구현이 간단하며 다른 알고리즘의 성능 비교를 위한 베이스라인으로 사용한다.</w:t>
+        <w:t xml:space="preserve">선착순 처리 알고리즘으로, 요청이 도착한 순서대로 처리한다. 구현이 간단하며 다른 알고리즘과 비교할 때 기준(베이스라인)으로 사용한다.</w:t>
       </w:r>
     </w:p>
     <w:p>
@@ -1375,7 +1375,7 @@
           <w:sz w:val="22"/>
           <w:szCs w:val="22"/>
         </w:rPr>
-        <w:t xml:space="preserve">4단계 우선순위(URGENT &gt; HIGH &gt; NORMAL &gt; LOW)를 지원한다 [1]. 에이징을 통해, 대기 시간이 임계값을 초과하면 요청의 우선순위가 자동으로 한 단계 상승하여 기아 현상을 방지한다.</w:t>
+        <w:t xml:space="preserve">4단계 우선순위(URGENT &gt; HIGH &gt; NORMAL &gt; LOW)를 지원한다 [1]. 에이징을 통해, 대기 시간이 일정 시간을 넘으면 요청의 우선순위가 자동으로 한 단계 올라가서 기아 현상을 방지한다.</w:t>
       </w:r>
     </w:p>
     <w:p>
@@ -1469,7 +1469,7 @@
           <w:sz w:val="22"/>
           <w:szCs w:val="22"/>
         </w:rPr>
-        <w:t xml:space="preserve">서버 재시작 없이 REST API(PUT /api/scheduler)를 통해 스케줄링 알고리즘을 실시간으로 전환할 수 있다. 이를 통해 워크로드 변화에 따라 운영 중 최적 알고리즘을 선택할 수 있으며, 알고리즘 간 성능 비교 실험을 동일 환경에서 수행할 수 있다.</w:t>
+        <w:t xml:space="preserve">서버 재시작 없이 REST API(PUT /api/scheduler)를 통해 스케줄링 알고리즘을 실시간으로 전환할 수 있다. 이를 통해 작업량(워크로드)이 바뀔 때 운영 중 최적 알고리즘을 선택할 수 있으며, 알고리즘 간 성능 비교 실험을 동일 환경에서 수행할 수 있다.</w:t>
       </w:r>
     </w:p>
     <w:p>
@@ -1515,7 +1515,7 @@
           <w:sz w:val="22"/>
           <w:szCs w:val="22"/>
         </w:rPr>
-        <w:t xml:space="preserve">Priority 스케줄러의 에이징과 MLFQ 스케줄러의 부스트를 통해 낮은 우선순위 요청의 무기한 대기를 방지한다.</w:t>
+        <w:t xml:space="preserve">Priority 스케줄러의 에이징과 MLFQ 스케줄러의 부스트를 통해 낮은 우선순위 요청이 끝없이 기다리는 것을 방지한다.</w:t>
       </w:r>
     </w:p>
     <w:p>
@@ -1673,7 +1673,7 @@
           <w:sz w:val="22"/>
           <w:szCs w:val="22"/>
         </w:rPr>
-        <w:t xml:space="preserve">: 다중 시드 기반 반복 실험 (총 5,000건 요청)</w:t>
+        <w:t xml:space="preserve">: 약 5,000건의 요청으로 반복 실험</w:t>
       </w:r>
     </w:p>
     <w:p>
@@ -1890,7 +1890,7 @@
                 <w:sz w:val="20"/>
                 <w:szCs w:val="20"/>
               </w:rPr>
-              <w:t xml:space="preserve">베이스라인. 도착 순서대로 처리</w:t>
+              <w:t xml:space="preserve">기준. 도착 순서대로 처리</w:t>
             </w:r>
           </w:p>
         </w:tc>
@@ -2179,7 +2179,7 @@
           <w:sz w:val="22"/>
           <w:szCs w:val="22"/>
         </w:rPr>
-        <w:t xml:space="preserve">URGENT 요청은 FCFS 대비 62% 빠르게 처리되었다. 에이징에 의해 낮은 우선순위 요청도 무기한 대기 없이 처리됨을 확인하였다.</w:t>
+        <w:t xml:space="preserve">URGENT 요청은 FCFS 대비 62% 빠르게 처리되었다. 에이징 덕분에 낮은 우선순위 요청도 오래 기다리지 않고 처리되었다.</w:t>
       </w:r>
     </w:p>
     <w:p>
@@ -2202,7 +2202,7 @@
           <w:sz w:val="22"/>
           <w:szCs w:val="22"/>
         </w:rPr>
-        <w:t xml:space="preserve">선점형 모드에서, 짧은 요청과 긴 요청이 동시에 경쟁하는 환경에서 짧은 요청의 대기시간이 약 74% 개선되었다.</w:t>
+        <w:t xml:space="preserve">선점형 모드에서, 짧은 요청과 긴 요청이 섞여 있는 상황에서 짧은 요청의 대기시간이 약 74% 줄어들었다.</w:t>
       </w:r>
     </w:p>
     <w:p>
@@ -2225,7 +2225,7 @@
           <w:sz w:val="22"/>
           <w:szCs w:val="22"/>
         </w:rPr>
-        <w:t xml:space="preserve">Enterprise 테넌트(가중치 100)는 Free 테넌트(가중치 1) 대비 5.8배 빠른 응답을 받았다. 테넌트 수준 JFI는 0.92~0.98로 높은 내부 공정성을 유지하였다.</w:t>
+        <w:t xml:space="preserve">Enterprise 테넌트(가중치 100)는 Free 테넌트(가중치 1) 대비 5.8배 빠른 응답을 받았다. 같은 등급 안에서의 공정성(테넌트 수준 JFI)도 0.92~0.98로 높게 나타났다.</w:t>
       </w:r>
     </w:p>
     <w:p>

</xml_diff>

<commit_message>
Add proposal document and figures for scheduling algorithms
- Updated the final proposal document with new content.
- Added presentation figures for scheduling algorithms:
- slide1-algo-comparison.html: Comparison of scheduling algorithms (FCFS, Priority, MLFQ, WFQ).
- slide2-architecture.html: Architecture overview including client, API, Rate Limiter, and Scheduler Engine.
- slide3-request-flow.html: Detailed request flow from client to response.
- Created a snapshot of the proposal for future reference.
</commit_message>
<xml_diff>
--- a/04-proposal/final/proposal.docx
+++ b/04-proposal/final/proposal.docx
@@ -168,7 +168,7 @@
           <w:sz w:val="22"/>
           <w:szCs w:val="22"/>
         </w:rPr>
-        <w:t xml:space="preserve">현재 대부분의 LLM 서비스는 선착순(First-Come, First-Served, FCFS) 처리 방식이나 단순 속도 제한(Rate Limiting)에 의존하고 있다. 이러한 방식은 다음과 같은 한계를 가진다. 첫째, 긴 요청이 뒤따르는 짧은 요청들의 처리를 지연시키는 호위 효과(Convoy Effect)가 발생한다. 호위 효과란, 느린 트럭 한 대가 좁은 도로를 막아 뒤따르는 빠른 차들까지 모두 느려지는 것과 같은 현상이다. 둘째, 긴급한 요청도 도착 순서를 기다려야 하며, 사용자 등급에 따른 차등 서비스 제공이 불가능하다.</w:t>
+        <w:t xml:space="preserve">현재 대부분의 LLM 서비스는 선착순(First-Come, First-Served, FCFS) 처리 방식이나 단순 속도 제한(Rate Limiting)에 의존하고 있다. 이러한 방식은 다음과 같은 한계를 가진다. 첫째, 긴 요청이 뒤따르는 짧은 요청들의 처리를 지연시키는 호위 효과(Convoy Effect)가 발생한다. 둘째, 긴급한 요청도 도착 순서를 기다려야 하며, 사용자 등급에 따른 차등 서비스 제공이 불가능하다.</w:t>
       </w:r>
     </w:p>
     <w:p>
@@ -361,7 +361,7 @@
           <w:sz w:val="22"/>
           <w:szCs w:val="22"/>
         </w:rPr>
-        <w:t xml:space="preserve">은 각 프로세스에 우선순위를 부여하여 높은 우선순위의 프로세스를 먼저 처리한다. 그러나 낮은 우선순위의 프로세스가 계속 밀려 처리되지 못하는 기아(Starvation) 현상이 발생할 수 있다. 기아란, 식당에서 늦게 온 VIP 손님이 계속 먼저 입장하면 일반 손님이 끝없이 기다리게 되는 것과 같다. 이를 해결하기 위해, 오래 기다린 프로세스의 우선순위를 점진적으로 높여주는 에이징(Aging) 기법이 사용된다 [1].</w:t>
+        <w:t xml:space="preserve">은 각 프로세스에 우선순위를 부여하여 높은 우선순위의 프로세스를 먼저 처리한다. 그러나 낮은 우선순위의 프로세스가 계속 밀려 처리되지 못하는 기아(Starvation) 현상이 발생할 수 있다. 이를 해결하기 위해, 오래 기다린 프로세스의 우선순위를 점진적으로 높여주는 에이징(Aging) 기법이 사용된다 [1].</w:t>
       </w:r>
     </w:p>
     <w:p>
@@ -407,7 +407,7 @@
           <w:sz w:val="22"/>
           <w:szCs w:val="22"/>
         </w:rPr>
-        <w:t xml:space="preserve">는 네트워크 분야에서 제안된 공정 큐잉 알고리즘이다. 각 흐름(flow)에 가중치를 부여하여 가중치에 비례하는 서비스를 제공한다 [3]. GPS(Generalized Processor Sharing)는 자원을 완벽히 공평하게 나누는 이상적인 모델이며, WFQ는 이를 현실에서 비슷하게 만든 것이다.</w:t>
+        <w:t xml:space="preserve">는 네트워크 분야에서 제안된 공정 큐잉 알고리즘이다. 각 흐름(flow)에 가중치를 부여하여 가중치에 비례하는 서비스를 제공한다 [3]. GPS(Generalized Processor Sharing)는 자원을 무한히 분할하여 완벽히 공평하게 배분하는 이상적인 수학적 모델이며, WFQ는 이를 개별 요청(Discrete request) 단위의 현실 시스템에서 근사하여 구현한 실용적인 스케줄링 기법이다.</w:t>
       </w:r>
     </w:p>
     <w:p>
@@ -501,29 +501,6 @@
       <w:r>
         <w:rPr>
           <w:rFonts w:ascii="Arial" w:cs="Arial" w:eastAsia="Arial" w:hAnsi="Arial"/>
-          <w:b/>
-          <w:bCs/>
-          <w:sz w:val="22"/>
-          <w:szCs w:val="22"/>
-        </w:rPr>
-        <w:t xml:space="preserve">Ollama</w:t>
-      </w:r>
-      <w:r>
-        <w:rPr>
-          <w:rFonts w:ascii="Arial" w:cs="Arial" w:eastAsia="Arial" w:hAnsi="Arial"/>
-          <w:sz w:val="22"/>
-          <w:szCs w:val="22"/>
-        </w:rPr>
-        <w:t xml:space="preserve">는 로컬 환경에서 LLM을 간편하게 실행할 수 있는 도구이다 [6]. 본 연구의 프로토타입(시험 제작 모델)에서 LLM 백엔드로 활용하였다.</w:t>
-      </w:r>
-    </w:p>
-    <w:p>
-      <w:pPr>
-        <w:spacing w:after="120"/>
-      </w:pPr>
-      <w:r>
-        <w:rPr>
-          <w:rFonts w:ascii="Arial" w:cs="Arial" w:eastAsia="Arial" w:hAnsi="Arial"/>
           <w:sz w:val="22"/>
           <w:szCs w:val="22"/>
         </w:rPr>
@@ -577,7 +554,7 @@
           <w:sz w:val="22"/>
           <w:szCs w:val="22"/>
         </w:rPr>
-        <w:t xml:space="preserve">여기서 xi는 각 사용자가 받는 자원의 양, n은 사용자 수이다. 본 연구는 JFI를 시스템 수준(전체 테넌트 간)과 테넌트 수준(동일 등급 내 요청 간)으로 나누어 측정한다.</w:t>
+        <w:t xml:space="preserve">여기서 xi는 각 사용자가 받는 자원의 양, n은 사용자 수이다. 본 연구는 JFI를 모든 스케줄링 알고리즘에 적용하여 공정성을 비교하며, 시스템 수준(전체 테넌트 간)과 테넌트 수준(동일 등급 내 요청 간)으로 나누어 측정한다.</w:t>
       </w:r>
     </w:p>
     <w:p>
@@ -1239,7 +1216,7 @@
           <w:sz w:val="22"/>
           <w:szCs w:val="22"/>
         </w:rPr>
-        <w:t xml:space="preserve">: Express.js 기반 컨트롤러가 요청을 분류하고 스케줄러에 전달한다 [7][8].</w:t>
+        <w:t xml:space="preserve">: Express.js 기반 컨트롤러가 요청을 분류하고 스케줄러에 전달한다 [7][8]. 요청 분류 시, 테넌트의 구독 등급(Enterprise/Premium/Standard/Free)과 요청 헤더에 포함된 긴급도 정보를 기준으로 우선순위를 부여한다.</w:t>
       </w:r>
     </w:p>
     <w:p>
@@ -1267,7 +1244,7 @@
           <w:sz w:val="22"/>
           <w:szCs w:val="22"/>
         </w:rPr>
-        <w:t xml:space="preserve">: 서버 실행 중에(런타임) 교체 가능한 4가지 스케줄링 알고리즘으로 요청 처리 순서를 결정한다.</w:t>
+        <w:t xml:space="preserve">: 4가지 스케줄링 알고리즘으로 요청 처리 순서를 결정한다. 알고리즘은 REST API(PUT /api/scheduler)를 통해 교체할 수 있으며, 이 기능은 운영 중 워크로드(작업량) 변화에 대응하기 위한 서비스용 부가 기능이다. 성능 비교 실험에서는 알고리즘을 고정한 채 진행하며, 실험 도중 교체하지 않는다.</w:t>
       </w:r>
     </w:p>
     <w:p>
@@ -1308,7 +1285,7 @@
           <w:sz w:val="22"/>
           <w:szCs w:val="22"/>
         </w:rPr>
-        <w:t xml:space="preserve">요청이 스케줄러에 도달하기 전에, Rate Limiter가 전처리 단계에서 과도한 요청을 제한한다. LLM 추론은 외부 백엔드인 Ollama [6]에 위임하며, 스케줄러가 결정한 순서에 따라 요청을 전달한다.</w:t>
+        <w:t xml:space="preserve">요청이 스케줄러에 도달하기 전에, Rate Limiter가 전처리 단계에서 과도한 요청을 제한한다.</w:t>
       </w:r>
     </w:p>
     <w:p>
@@ -1375,7 +1352,7 @@
           <w:sz w:val="22"/>
           <w:szCs w:val="22"/>
         </w:rPr>
-        <w:t xml:space="preserve">4단계 우선순위(URGENT &gt; HIGH &gt; NORMAL &gt; LOW)를 지원한다 [1]. 에이징을 통해, 대기 시간이 일정 시간을 넘으면 요청의 우선순위가 자동으로 한 단계 올라가서 기아 현상을 방지한다.</w:t>
+        <w:t xml:space="preserve">4단계 우선순위(URGENT &gt; HIGH &gt; NORMAL &gt; LOW)를 지원한다 [1]. 요청의 우선순위는 API 계층에서 테넌트 등급과 요청 헤더의 긴급도 필드를 조합하여 결정한다. 에이징(Aging)을 통해, 대기 시간이 일정 시간을 넘으면 요청의 우선순위가 자동으로 한 단계 올라가서 기아 현상을 방지한다.</w:t>
       </w:r>
     </w:p>
     <w:p>
@@ -1396,7 +1373,7 @@
           <w:sz w:val="22"/>
           <w:szCs w:val="22"/>
         </w:rPr>
-        <w:t xml:space="preserve">4단계 피드백 큐(Q0~Q3)를 구현하며, 큐별 타임 퀀텀을 차등 설정한다(Q0: 500ms, Q1: 1,500ms, Q2: 4,000ms, Q3: 무제한) [2]. 선점(Preemption)이란 처리 중인 요청의 할당 시간이 지나면 잠시 멈추고 다른 요청에게 순서를 넘기는 것이다. 타임 퀀텀을 초과한 요청은 하위 큐로 이동시켜, 짧은 요청이 긴 요청에 의해 지연되는 것을 방지한다. 주기적 부스트(Boost)로 모든 요청을 최상위 큐(Q0)로 복귀시켜 기아를 방지한다.</w:t>
+        <w:t xml:space="preserve">4단계 피드백 큐(Q0~Q3)를 구현하며, 큐별 타임 퀀텀을 차등 설정한다(Q0: 500ms, Q1: 1,500ms, Q2: 4,000ms, Q3: 무제한) [2]. 본 알고리즘은 선점형(Preemptive) 방식으로 동작한다. 즉, 처리 중인 요청의 할당 시간(타임 퀀텀)이 지나면 해당 요청을 잠시 멈추고 다른 요청에게 순서를 넘긴다. 타임 퀀텀을 초과한 요청은 하위 큐로 이동시켜, 짧은 요청이 긴 요청에 의해 지연되는 것을 방지한다. 주기적 부스트(Boost)로 모든 요청을 최상위 큐(Q0)로 복귀시켜 기아를 방지한다.</w:t>
       </w:r>
     </w:p>
     <w:p>
@@ -1417,7 +1394,7 @@
           <w:sz w:val="22"/>
           <w:szCs w:val="22"/>
         </w:rPr>
-        <w:t xml:space="preserve">테넌트 등급별 가중치(Enterprise: 100, Premium: 50, Standard: 10, Free: 1)에 비례하여 자원을 분배하는 알고리즘이다 [3]. 가상 종료 시각(Virtual Finish Time, VFT)은 '이 요청이 언제쯤 처리 완료될지'를 예측하는 계산값이다. 가중치가 높은 사용자의 요청은 VFT가 작아져 먼저 처리된다. JFI로 공정성을 모니터링한다.</w:t>
+        <w:t xml:space="preserve">테넌트 등급별 가중치(Enterprise: 100, Premium: 50, Standard: 10, Free: 1)에 비례하여 자원을 분배하는 알고리즘이다 [3]. 본 시스템에서는 네트워크의 흐름(flow) 개념을 테넌트 등급별 가중치로 치환하여 적용하였다. 스케줄러는 각 요청의 예상 처리 비용을 테넌트의 가중치로 나눈 값(ΔVFT = Cost / Weight)을 누적하여 가상 종료 시각(Virtual Finish Time, VFT)을 산출한다. 즉, 가중치가 높은 테넌트의 요청일수록 VFT의 증가폭이 작게 계산되므로, 가장 작은 VFT를 가진 요청이 우선적으로 스케줄링된다. WFQ는 가중치 기반으로 자원을 비례 배분하는 구조이므로, Priority의 에이징이나 MLFQ의 부스트와 같은 별도의 기아 방지 장치가 필요하지 않다. JFI로 공정성을 모니터링한다.</w:t>
       </w:r>
     </w:p>
     <w:p>
@@ -1448,7 +1425,7 @@
           <w:sz w:val="22"/>
           <w:szCs w:val="22"/>
         </w:rPr>
-        <w:t xml:space="preserve">서버 재시작 없이 REST API(PUT /api/scheduler)를 통해 스케줄링 알고리즘을 실시간으로 전환할 수 있다. 이를 통해 작업량(워크로드)이 바뀔 때 운영 중 최적 알고리즘을 선택할 수 있으며, 알고리즘 간 성능 비교 실험을 동일 환경에서 수행할 수 있다.</w:t>
+        <w:t xml:space="preserve">서버 재시작 없이 REST API를 통해 스케줄링 알고리즘을 실시간으로 전환할 수 있다. 이 기능은 운영 환경에서 워크로드가 바뀔 때 최적 알고리즘을 선택하기 위한 서비스용 부가 기능이다. 성능 비교 실험에서는 하나의 알고리즘을 고정하고 전체 실험을 완료한 뒤 다음 알고리즘으로 전환하는 방식으로 진행하며, 실험 도중에는 알고리즘을 교체하지 않는다.</w:t>
       </w:r>
     </w:p>
     <w:p>
@@ -1463,15 +1440,15 @@
           <w:sz w:val="22"/>
           <w:szCs w:val="22"/>
         </w:rPr>
-        <w:t xml:space="preserve">두 가지 수준의 공정성 측정: </w:t>
-      </w:r>
-      <w:r>
-        <w:rPr>
-          <w:rFonts w:ascii="Arial" w:cs="Arial" w:eastAsia="Arial" w:hAnsi="Arial"/>
-          <w:sz w:val="22"/>
-          <w:szCs w:val="22"/>
-        </w:rPr>
-        <w:t xml:space="preserve">WFQ 스케줄러에서 시스템 수준 JFI(전체 테넌트 간 공정성)와 테넌트 수준 JFI(같은 등급 내 요청 간 공정성)를 나누어 측정한다.</w:t>
+        <w:t xml:space="preserve">공정성 측정: </w:t>
+      </w:r>
+      <w:r>
+        <w:rPr>
+          <w:rFonts w:ascii="Arial" w:cs="Arial" w:eastAsia="Arial" w:hAnsi="Arial"/>
+          <w:sz w:val="22"/>
+          <w:szCs w:val="22"/>
+        </w:rPr>
+        <w:t xml:space="preserve">JFI를 4가지 스케줄링 알고리즘 모두에 적용하여, 각 알고리즘이 자원을 얼마나 공정하게 배분하는지 비교한다. WFQ 스케줄러에서는 시스템 수준 JFI(전체 테넌트 간 공정성)와 테넌트 수준 JFI(같은 등급 내 요청 간 공정성)를 나누어 측정한다.</w:t>
       </w:r>
     </w:p>
     <w:p>
@@ -1539,31 +1516,23 @@
     </w:p>
     <w:p>
       <w:pPr>
-        <w:pStyle w:val="Heading1"/>
-      </w:pPr>
-      <w:r>
-        <w:t xml:space="preserve">4. 예비 실험 결과</w:t>
-      </w:r>
-    </w:p>
-    <w:p>
-      <w:pPr>
-        <w:spacing w:after="120"/>
-      </w:pPr>
-      <w:r>
-        <w:rPr>
-          <w:rFonts w:ascii="Arial" w:cs="Arial" w:eastAsia="Arial" w:hAnsi="Arial"/>
-          <w:sz w:val="22"/>
-          <w:szCs w:val="22"/>
-        </w:rPr>
-        <w:t xml:space="preserve">겨울방학 동안 프로토타입을 구현하고 예비 실험을 수행하였다.</w:t>
-      </w:r>
-    </w:p>
-    <w:p>
-      <w:pPr>
         <w:pStyle w:val="Heading2"/>
       </w:pPr>
       <w:r>
-        <w:t xml:space="preserve">4.1 실험 환경</w:t>
+        <w:t xml:space="preserve">3.5 성능 평가 지표</w:t>
+      </w:r>
+    </w:p>
+    <w:p>
+      <w:pPr>
+        <w:spacing w:after="60"/>
+      </w:pPr>
+      <w:r>
+        <w:rPr>
+          <w:rFonts w:ascii="Arial" w:cs="Arial" w:eastAsia="Arial" w:hAnsi="Arial"/>
+          <w:sz w:val="22"/>
+          <w:szCs w:val="22"/>
+        </w:rPr>
+        <w:t xml:space="preserve">본 연구에서 스케줄링 알고리즘을 비교하기 위해 사용하는 평가 지표는 다음과 같다.</w:t>
       </w:r>
     </w:p>
     <w:p>
@@ -1573,7 +1542,7 @@
           <w:ilvl w:val="0"/>
           <w:numId w:val="4"/>
         </w:numPr>
-        <w:spacing w:after="40"/>
+        <w:spacing w:after="60"/>
       </w:pPr>
       <w:r>
         <w:rPr>
@@ -1583,15 +1552,15 @@
           <w:sz w:val="22"/>
           <w:szCs w:val="22"/>
         </w:rPr>
-        <w:t xml:space="preserve">서버</w:t>
-      </w:r>
-      <w:r>
-        <w:rPr>
-          <w:rFonts w:ascii="Arial" w:cs="Arial" w:eastAsia="Arial" w:hAnsi="Arial"/>
-          <w:sz w:val="22"/>
-          <w:szCs w:val="22"/>
-        </w:rPr>
-        <w:t xml:space="preserve">: Node.js 22 LTS, Express.js 4.18 [7][8]</w:t>
+        <w:t xml:space="preserve">대기시간(Wait Time)</w:t>
+      </w:r>
+      <w:r>
+        <w:rPr>
+          <w:rFonts w:ascii="Arial" w:cs="Arial" w:eastAsia="Arial" w:hAnsi="Arial"/>
+          <w:sz w:val="22"/>
+          <w:szCs w:val="22"/>
+        </w:rPr>
+        <w:t xml:space="preserve">: 요청이 큐에 등록된 시점부터 실제 처리가 시작될 때까지 걸리는 시간(ms)이다. 대기시간이 짧을수록 사용자가 더 빠르게 응답을 받을 수 있다.</w:t>
       </w:r>
     </w:p>
     <w:p>
@@ -1601,7 +1570,7 @@
           <w:ilvl w:val="0"/>
           <w:numId w:val="4"/>
         </w:numPr>
-        <w:spacing w:after="40"/>
+        <w:spacing w:after="60"/>
       </w:pPr>
       <w:r>
         <w:rPr>
@@ -1611,43 +1580,15 @@
           <w:sz w:val="22"/>
           <w:szCs w:val="22"/>
         </w:rPr>
-        <w:t xml:space="preserve">LLM 백엔드</w:t>
-      </w:r>
-      <w:r>
-        <w:rPr>
-          <w:rFonts w:ascii="Arial" w:cs="Arial" w:eastAsia="Arial" w:hAnsi="Arial"/>
-          <w:sz w:val="22"/>
-          <w:szCs w:val="22"/>
-        </w:rPr>
-        <w:t xml:space="preserve">: Ollama (로컬 실행) [6]</w:t>
-      </w:r>
-    </w:p>
-    <w:p>
-      <w:pPr>
-        <w:pStyle w:val="ListParagraph"/>
-        <w:numPr>
-          <w:ilvl w:val="0"/>
-          <w:numId w:val="4"/>
-        </w:numPr>
-        <w:spacing w:after="40"/>
-      </w:pPr>
-      <w:r>
-        <w:rPr>
-          <w:rFonts w:ascii="Arial" w:cs="Arial" w:eastAsia="Arial" w:hAnsi="Arial"/>
-          <w:b/>
-          <w:bCs/>
-          <w:sz w:val="22"/>
-          <w:szCs w:val="22"/>
-        </w:rPr>
-        <w:t xml:space="preserve">외부 의존성</w:t>
-      </w:r>
-      <w:r>
-        <w:rPr>
-          <w:rFonts w:ascii="Arial" w:cs="Arial" w:eastAsia="Arial" w:hAnsi="Arial"/>
-          <w:sz w:val="22"/>
-          <w:szCs w:val="22"/>
-        </w:rPr>
-        <w:t xml:space="preserve">: 1개 패키지 (express)</w:t>
+        <w:t xml:space="preserve">처리량(Throughput)</w:t>
+      </w:r>
+      <w:r>
+        <w:rPr>
+          <w:rFonts w:ascii="Arial" w:cs="Arial" w:eastAsia="Arial" w:hAnsi="Arial"/>
+          <w:sz w:val="22"/>
+          <w:szCs w:val="22"/>
+        </w:rPr>
+        <w:t xml:space="preserve">: 단위 시간당 처리 완료되는 요청의 수(req/s)이다. 시스템이 얼마나 효율적으로 요청을 소화하는지를 나타낸다.</w:t>
       </w:r>
     </w:p>
     <w:p>
@@ -1667,6 +1608,147 @@
           <w:sz w:val="22"/>
           <w:szCs w:val="22"/>
         </w:rPr>
+        <w:t xml:space="preserve">공정성(Fairness)</w:t>
+      </w:r>
+      <w:r>
+        <w:rPr>
+          <w:rFonts w:ascii="Arial" w:cs="Arial" w:eastAsia="Arial" w:hAnsi="Arial"/>
+          <w:sz w:val="22"/>
+          <w:szCs w:val="22"/>
+        </w:rPr>
+        <w:t xml:space="preserve">: JFI를 사용하여 자원이 사용자 간에 얼마나 고르게 배분되었는지를 측정한다. 0에서 1 사이의 값이며, 1에 가까울수록 공정하다.</w:t>
+      </w:r>
+    </w:p>
+    <w:p>
+      <w:pPr>
+        <w:pStyle w:val="Heading1"/>
+      </w:pPr>
+      <w:r>
+        <w:t xml:space="preserve">4. 예비 실험 결과</w:t>
+      </w:r>
+    </w:p>
+    <w:p>
+      <w:pPr>
+        <w:spacing w:after="120"/>
+      </w:pPr>
+      <w:r>
+        <w:rPr>
+          <w:rFonts w:ascii="Arial" w:cs="Arial" w:eastAsia="Arial" w:hAnsi="Arial"/>
+          <w:sz w:val="22"/>
+          <w:szCs w:val="22"/>
+        </w:rPr>
+        <w:t xml:space="preserve">겨울방학 동안 시제품(프로토타입)을 구현하고 예비 실험을 수행하였다.</w:t>
+      </w:r>
+    </w:p>
+    <w:p>
+      <w:pPr>
+        <w:pStyle w:val="Heading2"/>
+      </w:pPr>
+      <w:r>
+        <w:t xml:space="preserve">4.1 실험 환경</w:t>
+      </w:r>
+    </w:p>
+    <w:p>
+      <w:pPr>
+        <w:pStyle w:val="ListParagraph"/>
+        <w:numPr>
+          <w:ilvl w:val="0"/>
+          <w:numId w:val="5"/>
+        </w:numPr>
+        <w:spacing w:after="40"/>
+      </w:pPr>
+      <w:r>
+        <w:rPr>
+          <w:rFonts w:ascii="Arial" w:cs="Arial" w:eastAsia="Arial" w:hAnsi="Arial"/>
+          <w:b/>
+          <w:bCs/>
+          <w:sz w:val="22"/>
+          <w:szCs w:val="22"/>
+        </w:rPr>
+        <w:t xml:space="preserve">서버</w:t>
+      </w:r>
+      <w:r>
+        <w:rPr>
+          <w:rFonts w:ascii="Arial" w:cs="Arial" w:eastAsia="Arial" w:hAnsi="Arial"/>
+          <w:sz w:val="22"/>
+          <w:szCs w:val="22"/>
+        </w:rPr>
+        <w:t xml:space="preserve">: Node.js 22 LTS, Express.js 4.18 [7][8]</w:t>
+      </w:r>
+    </w:p>
+    <w:p>
+      <w:pPr>
+        <w:pStyle w:val="ListParagraph"/>
+        <w:numPr>
+          <w:ilvl w:val="0"/>
+          <w:numId w:val="5"/>
+        </w:numPr>
+        <w:spacing w:after="40"/>
+      </w:pPr>
+      <w:r>
+        <w:rPr>
+          <w:rFonts w:ascii="Arial" w:cs="Arial" w:eastAsia="Arial" w:hAnsi="Arial"/>
+          <w:b/>
+          <w:bCs/>
+          <w:sz w:val="22"/>
+          <w:szCs w:val="22"/>
+        </w:rPr>
+        <w:t xml:space="preserve">LLM 백엔드</w:t>
+      </w:r>
+      <w:r>
+        <w:rPr>
+          <w:rFonts w:ascii="Arial" w:cs="Arial" w:eastAsia="Arial" w:hAnsi="Arial"/>
+          <w:sz w:val="22"/>
+          <w:szCs w:val="22"/>
+        </w:rPr>
+        <w:t xml:space="preserve">: Ollama(로컬 환경에서 LLM을 간편하게 실행할 수 있는 도구) [6]</w:t>
+      </w:r>
+    </w:p>
+    <w:p>
+      <w:pPr>
+        <w:pStyle w:val="ListParagraph"/>
+        <w:numPr>
+          <w:ilvl w:val="0"/>
+          <w:numId w:val="5"/>
+        </w:numPr>
+        <w:spacing w:after="40"/>
+      </w:pPr>
+      <w:r>
+        <w:rPr>
+          <w:rFonts w:ascii="Arial" w:cs="Arial" w:eastAsia="Arial" w:hAnsi="Arial"/>
+          <w:b/>
+          <w:bCs/>
+          <w:sz w:val="22"/>
+          <w:szCs w:val="22"/>
+        </w:rPr>
+        <w:t xml:space="preserve">외부 의존성</w:t>
+      </w:r>
+      <w:r>
+        <w:rPr>
+          <w:rFonts w:ascii="Arial" w:cs="Arial" w:eastAsia="Arial" w:hAnsi="Arial"/>
+          <w:sz w:val="22"/>
+          <w:szCs w:val="22"/>
+        </w:rPr>
+        <w:t xml:space="preserve">: 1개 패키지 (express)</w:t>
+      </w:r>
+    </w:p>
+    <w:p>
+      <w:pPr>
+        <w:pStyle w:val="ListParagraph"/>
+        <w:numPr>
+          <w:ilvl w:val="0"/>
+          <w:numId w:val="5"/>
+        </w:numPr>
+        <w:spacing w:after="40"/>
+      </w:pPr>
+      <w:r>
+        <w:rPr>
+          <w:rFonts w:ascii="Arial" w:cs="Arial" w:eastAsia="Arial" w:hAnsi="Arial"/>
+          <w:b/>
+          <w:bCs/>
+          <w:sz w:val="22"/>
+          <w:szCs w:val="22"/>
+        </w:rPr>
         <w:t xml:space="preserve">실험 규모</w:t>
       </w:r>
       <w:r>
@@ -1676,6 +1758,57 @@
           <w:szCs w:val="22"/>
         </w:rPr>
         <w:t xml:space="preserve">: 약 5,000건의 요청으로 반복 실험</w:t>
+      </w:r>
+    </w:p>
+    <w:p>
+      <w:pPr>
+        <w:pStyle w:val="ListParagraph"/>
+        <w:numPr>
+          <w:ilvl w:val="0"/>
+          <w:numId w:val="5"/>
+        </w:numPr>
+        <w:spacing w:after="120"/>
+      </w:pPr>
+      <w:r>
+        <w:rPr>
+          <w:rFonts w:ascii="Arial" w:cs="Arial" w:eastAsia="Arial" w:hAnsi="Arial"/>
+          <w:b/>
+          <w:bCs/>
+          <w:sz w:val="22"/>
+          <w:szCs w:val="22"/>
+        </w:rPr>
+        <w:t xml:space="preserve">요청 구성</w:t>
+      </w:r>
+      <w:r>
+        <w:rPr>
+          <w:rFonts w:ascii="Arial" w:cs="Arial" w:eastAsia="Arial" w:hAnsi="Arial"/>
+          <w:sz w:val="22"/>
+          <w:szCs w:val="22"/>
+        </w:rPr>
+        <w:t xml:space="preserve">: 짧은 요청 40%, 중간 요청 40%, 긴 요청 20%의 비율로 구성</w:t>
+      </w:r>
+    </w:p>
+    <w:p>
+      <w:pPr>
+        <w:spacing w:after="120"/>
+      </w:pPr>
+      <w:r>
+        <w:rPr>
+          <w:rFonts w:ascii="Arial" w:cs="Arial" w:eastAsia="Arial" w:hAnsi="Arial"/>
+          <w:b/>
+          <w:bCs/>
+          <w:sz w:val="22"/>
+          <w:szCs w:val="22"/>
+        </w:rPr>
+        <w:t xml:space="preserve">변인 통제: </w:t>
+      </w:r>
+      <w:r>
+        <w:rPr>
+          <w:rFonts w:ascii="Arial" w:cs="Arial" w:eastAsia="Arial" w:hAnsi="Arial"/>
+          <w:sz w:val="22"/>
+          <w:szCs w:val="22"/>
+        </w:rPr>
+        <w:t xml:space="preserve">본 예비 실험은 4가지 스케줄링 알고리즘 간의 순수 성능 비교가 목적이므로, 전처리 모듈인 Rate Limiter는 비활성화한 상태에서 진행하였다. Rate Limiter를 포함한 시스템 과부하 방지 테스트는 본 실험에서 별도로 진행할 예정이다.</w:t>
       </w:r>
     </w:p>
     <w:p>
@@ -1715,9 +1848,10 @@
         </w:tblBorders>
       </w:tblPr>
       <w:tblGrid>
+        <w:gridCol w:w="1600"/>
         <w:gridCol w:w="2000"/>
-        <w:gridCol w:w="2500"/>
-        <w:gridCol w:w="4860"/>
+        <w:gridCol w:w="1600"/>
+        <w:gridCol w:w="4160"/>
       </w:tblGrid>
       <w:tr>
         <w:trPr>
@@ -1725,7 +1859,7 @@
         </w:trPr>
         <w:tc>
           <w:tcPr>
-            <w:tcW w:type="dxa" w:w="2000"/>
+            <w:tcW w:type="dxa" w:w="1600"/>
             <w:tcBorders>
               <w:top w:val="single" w:color="CCCCCC" w:sz="1"/>
               <w:left w:val="single" w:color="CCCCCC" w:sz="1"/>
@@ -1754,7 +1888,7 @@
         </w:tc>
         <w:tc>
           <w:tcPr>
-            <w:tcW w:type="dxa" w:w="2500"/>
+            <w:tcW w:type="dxa" w:w="2000"/>
             <w:tcBorders>
               <w:top w:val="single" w:color="CCCCCC" w:sz="1"/>
               <w:left w:val="single" w:color="CCCCCC" w:sz="1"/>
@@ -1783,7 +1917,7 @@
         </w:tc>
         <w:tc>
           <w:tcPr>
-            <w:tcW w:type="dxa" w:w="4860"/>
+            <w:tcW w:type="dxa" w:w="1600"/>
             <w:tcBorders>
               <w:top w:val="single" w:color="CCCCCC" w:sz="1"/>
               <w:left w:val="single" w:color="CCCCCC" w:sz="1"/>
@@ -1806,6 +1940,35 @@
                 <w:sz w:val="20"/>
                 <w:szCs w:val="20"/>
               </w:rPr>
+              <w:t xml:space="preserve">처리량(req/s)</w:t>
+            </w:r>
+          </w:p>
+        </w:tc>
+        <w:tc>
+          <w:tcPr>
+            <w:tcW w:type="dxa" w:w="4160"/>
+            <w:tcBorders>
+              <w:top w:val="single" w:color="CCCCCC" w:sz="1"/>
+              <w:left w:val="single" w:color="CCCCCC" w:sz="1"/>
+              <w:bottom w:val="single" w:color="CCCCCC" w:sz="1"/>
+              <w:right w:val="single" w:color="CCCCCC" w:sz="1"/>
+            </w:tcBorders>
+            <w:shd w:fill="D5E8F0" w:val="clear"/>
+            <w:vAlign w:val="center"/>
+          </w:tcPr>
+          <w:p>
+            <w:pPr>
+              <w:spacing w:after="60" w:before="60"/>
+              <w:jc w:val="center"/>
+            </w:pPr>
+            <w:r>
+              <w:rPr>
+                <w:rFonts w:ascii="Arial" w:cs="Arial" w:eastAsia="Arial" w:hAnsi="Arial"/>
+                <w:b/>
+                <w:bCs/>
+                <w:sz w:val="20"/>
+                <w:szCs w:val="20"/>
+              </w:rPr>
               <w:t xml:space="preserve">핵심 발견</w:t>
             </w:r>
           </w:p>
@@ -1814,7 +1977,7 @@
       <w:tr>
         <w:tc>
           <w:tcPr>
-            <w:tcW w:type="dxa" w:w="2000"/>
+            <w:tcW w:type="dxa" w:w="1600"/>
             <w:tcBorders>
               <w:top w:val="single" w:color="CCCCCC" w:sz="1"/>
               <w:left w:val="single" w:color="CCCCCC" w:sz="1"/>
@@ -1842,7 +2005,7 @@
         </w:tc>
         <w:tc>
           <w:tcPr>
-            <w:tcW w:type="dxa" w:w="2500"/>
+            <w:tcW w:type="dxa" w:w="2000"/>
             <w:tcBorders>
               <w:top w:val="single" w:color="CCCCCC" w:sz="1"/>
               <w:left w:val="single" w:color="CCCCCC" w:sz="1"/>
@@ -1870,7 +2033,35 @@
         </w:tc>
         <w:tc>
           <w:tcPr>
-            <w:tcW w:type="dxa" w:w="4860"/>
+            <w:tcW w:type="dxa" w:w="1600"/>
+            <w:tcBorders>
+              <w:top w:val="single" w:color="CCCCCC" w:sz="1"/>
+              <w:left w:val="single" w:color="CCCCCC" w:sz="1"/>
+              <w:bottom w:val="single" w:color="CCCCCC" w:sz="1"/>
+              <w:right w:val="single" w:color="CCCCCC" w:sz="1"/>
+            </w:tcBorders>
+            <w:vAlign w:val="center"/>
+          </w:tcPr>
+          <w:p>
+            <w:pPr>
+              <w:spacing w:after="40" w:before="40"/>
+              <w:jc w:val="center"/>
+            </w:pPr>
+            <w:r>
+              <w:rPr>
+                <w:rFonts w:ascii="Arial" w:cs="Arial" w:eastAsia="Arial" w:hAnsi="Arial"/>
+                <w:b w:val="false"/>
+                <w:bCs w:val="false"/>
+                <w:sz w:val="20"/>
+                <w:szCs w:val="20"/>
+              </w:rPr>
+              <w:t xml:space="preserve">8.17</w:t>
+            </w:r>
+          </w:p>
+        </w:tc>
+        <w:tc>
+          <w:tcPr>
+            <w:tcW w:type="dxa" w:w="4160"/>
             <w:tcBorders>
               <w:top w:val="single" w:color="CCCCCC" w:sz="1"/>
               <w:left w:val="single" w:color="CCCCCC" w:sz="1"/>
@@ -1900,7 +2091,7 @@
       <w:tr>
         <w:tc>
           <w:tcPr>
-            <w:tcW w:type="dxa" w:w="2000"/>
+            <w:tcW w:type="dxa" w:w="1600"/>
             <w:tcBorders>
               <w:top w:val="single" w:color="CCCCCC" w:sz="1"/>
               <w:left w:val="single" w:color="CCCCCC" w:sz="1"/>
@@ -1928,7 +2119,7 @@
         </w:tc>
         <w:tc>
           <w:tcPr>
-            <w:tcW w:type="dxa" w:w="2500"/>
+            <w:tcW w:type="dxa" w:w="2000"/>
             <w:tcBorders>
               <w:top w:val="single" w:color="CCCCCC" w:sz="1"/>
               <w:left w:val="single" w:color="CCCCCC" w:sz="1"/>
@@ -1956,7 +2147,35 @@
         </w:tc>
         <w:tc>
           <w:tcPr>
-            <w:tcW w:type="dxa" w:w="4860"/>
+            <w:tcW w:type="dxa" w:w="1600"/>
+            <w:tcBorders>
+              <w:top w:val="single" w:color="CCCCCC" w:sz="1"/>
+              <w:left w:val="single" w:color="CCCCCC" w:sz="1"/>
+              <w:bottom w:val="single" w:color="CCCCCC" w:sz="1"/>
+              <w:right w:val="single" w:color="CCCCCC" w:sz="1"/>
+            </w:tcBorders>
+            <w:vAlign w:val="center"/>
+          </w:tcPr>
+          <w:p>
+            <w:pPr>
+              <w:spacing w:after="40" w:before="40"/>
+              <w:jc w:val="center"/>
+            </w:pPr>
+            <w:r>
+              <w:rPr>
+                <w:rFonts w:ascii="Arial" w:cs="Arial" w:eastAsia="Arial" w:hAnsi="Arial"/>
+                <w:b w:val="false"/>
+                <w:bCs w:val="false"/>
+                <w:sz w:val="20"/>
+                <w:szCs w:val="20"/>
+              </w:rPr>
+              <w:t xml:space="preserve">8.16</w:t>
+            </w:r>
+          </w:p>
+        </w:tc>
+        <w:tc>
+          <w:tcPr>
+            <w:tcW w:type="dxa" w:w="4160"/>
             <w:tcBorders>
               <w:top w:val="single" w:color="CCCCCC" w:sz="1"/>
               <w:left w:val="single" w:color="CCCCCC" w:sz="1"/>
@@ -1986,7 +2205,7 @@
       <w:tr>
         <w:tc>
           <w:tcPr>
-            <w:tcW w:type="dxa" w:w="2000"/>
+            <w:tcW w:type="dxa" w:w="1600"/>
             <w:tcBorders>
               <w:top w:val="single" w:color="CCCCCC" w:sz="1"/>
               <w:left w:val="single" w:color="CCCCCC" w:sz="1"/>
@@ -2014,7 +2233,7 @@
         </w:tc>
         <w:tc>
           <w:tcPr>
-            <w:tcW w:type="dxa" w:w="2500"/>
+            <w:tcW w:type="dxa" w:w="2000"/>
             <w:tcBorders>
               <w:top w:val="single" w:color="CCCCCC" w:sz="1"/>
               <w:left w:val="single" w:color="CCCCCC" w:sz="1"/>
@@ -2042,7 +2261,35 @@
         </w:tc>
         <w:tc>
           <w:tcPr>
-            <w:tcW w:type="dxa" w:w="4860"/>
+            <w:tcW w:type="dxa" w:w="1600"/>
+            <w:tcBorders>
+              <w:top w:val="single" w:color="CCCCCC" w:sz="1"/>
+              <w:left w:val="single" w:color="CCCCCC" w:sz="1"/>
+              <w:bottom w:val="single" w:color="CCCCCC" w:sz="1"/>
+              <w:right w:val="single" w:color="CCCCCC" w:sz="1"/>
+            </w:tcBorders>
+            <w:vAlign w:val="center"/>
+          </w:tcPr>
+          <w:p>
+            <w:pPr>
+              <w:spacing w:after="40" w:before="40"/>
+              <w:jc w:val="center"/>
+            </w:pPr>
+            <w:r>
+              <w:rPr>
+                <w:rFonts w:ascii="Arial" w:cs="Arial" w:eastAsia="Arial" w:hAnsi="Arial"/>
+                <w:b w:val="false"/>
+                <w:bCs w:val="false"/>
+                <w:sz w:val="20"/>
+                <w:szCs w:val="20"/>
+              </w:rPr>
+              <w:t xml:space="preserve">8.17</w:t>
+            </w:r>
+          </w:p>
+        </w:tc>
+        <w:tc>
+          <w:tcPr>
+            <w:tcW w:type="dxa" w:w="4160"/>
             <w:tcBorders>
               <w:top w:val="single" w:color="CCCCCC" w:sz="1"/>
               <w:left w:val="single" w:color="CCCCCC" w:sz="1"/>
@@ -2064,7 +2311,7 @@
                 <w:sz w:val="20"/>
                 <w:szCs w:val="20"/>
               </w:rPr>
-              <w:t xml:space="preserve">짧은 요청: 선점형 모드에서 약 74% 개선</w:t>
+              <w:t xml:space="preserve">짧은 요청 대기시간 약 74% 감소 (호위 효과 완화 확인)</w:t>
             </w:r>
           </w:p>
         </w:tc>
@@ -2072,7 +2319,7 @@
       <w:tr>
         <w:tc>
           <w:tcPr>
-            <w:tcW w:type="dxa" w:w="2000"/>
+            <w:tcW w:type="dxa" w:w="1600"/>
             <w:tcBorders>
               <w:top w:val="single" w:color="CCCCCC" w:sz="1"/>
               <w:left w:val="single" w:color="CCCCCC" w:sz="1"/>
@@ -2100,7 +2347,7 @@
         </w:tc>
         <w:tc>
           <w:tcPr>
-            <w:tcW w:type="dxa" w:w="2500"/>
+            <w:tcW w:type="dxa" w:w="2000"/>
             <w:tcBorders>
               <w:top w:val="single" w:color="CCCCCC" w:sz="1"/>
               <w:left w:val="single" w:color="CCCCCC" w:sz="1"/>
@@ -2128,7 +2375,35 @@
         </w:tc>
         <w:tc>
           <w:tcPr>
-            <w:tcW w:type="dxa" w:w="4860"/>
+            <w:tcW w:type="dxa" w:w="1600"/>
+            <w:tcBorders>
+              <w:top w:val="single" w:color="CCCCCC" w:sz="1"/>
+              <w:left w:val="single" w:color="CCCCCC" w:sz="1"/>
+              <w:bottom w:val="single" w:color="CCCCCC" w:sz="1"/>
+              <w:right w:val="single" w:color="CCCCCC" w:sz="1"/>
+            </w:tcBorders>
+            <w:vAlign w:val="center"/>
+          </w:tcPr>
+          <w:p>
+            <w:pPr>
+              <w:spacing w:after="40" w:before="40"/>
+              <w:jc w:val="center"/>
+            </w:pPr>
+            <w:r>
+              <w:rPr>
+                <w:rFonts w:ascii="Arial" w:cs="Arial" w:eastAsia="Arial" w:hAnsi="Arial"/>
+                <w:b w:val="false"/>
+                <w:bCs w:val="false"/>
+                <w:sz w:val="20"/>
+                <w:szCs w:val="20"/>
+              </w:rPr>
+              <w:t xml:space="preserve">8.17</w:t>
+            </w:r>
+          </w:p>
+        </w:tc>
+        <w:tc>
+          <w:tcPr>
+            <w:tcW w:type="dxa" w:w="4160"/>
             <w:tcBorders>
               <w:top w:val="single" w:color="CCCCCC" w:sz="1"/>
               <w:left w:val="single" w:color="CCCCCC" w:sz="1"/>
@@ -2204,7 +2479,7 @@
           <w:sz w:val="22"/>
           <w:szCs w:val="22"/>
         </w:rPr>
-        <w:t xml:space="preserve">선점형 모드에서, 짧은 요청과 긴 요청이 섞여 있는 상황에서 짧은 요청의 대기시간이 약 74% 줄어들었다.</w:t>
+        <w:t xml:space="preserve">짧은 요청과 긴 요청이 섞여 있는 상황에서, 짧은 요청의 대기시간이 FCFS 대비 약 74% 줄어들었다.</w:t>
       </w:r>
     </w:p>
     <w:p>
@@ -2227,7 +2502,53 @@
           <w:sz w:val="22"/>
           <w:szCs w:val="22"/>
         </w:rPr>
-        <w:t xml:space="preserve">Enterprise 테넌트(가중치 100)는 Free 테넌트(가중치 1) 대비 5.8배 빠른 응답을 받았다. 같은 등급 안에서의 공정성(테넌트 수준 JFI)도 0.92~0.98로 높게 나타났다.</w:t>
+        <w:t xml:space="preserve">Enterprise 테넌트(가중치 100)는 Free 테넌트(가중치 1) 대비 5.8배 빠른 응답을 받았다. 같은 등급 안에서의 공정성(테넌트 수준 JFI)은 0.92~0.98로 높게 나타났다. 전체 테넌트 간 공정성(시스템 수준 JFI)은 0.32로, 등급별로 의도적으로 차등 서비스를 제공하므로 낮은 값이 정상적인 결과이다.</w:t>
+      </w:r>
+    </w:p>
+    <w:p>
+      <w:pPr>
+        <w:spacing w:after="120"/>
+      </w:pPr>
+      <w:r>
+        <w:rPr>
+          <w:rFonts w:ascii="Arial" w:cs="Arial" w:eastAsia="Arial" w:hAnsi="Arial"/>
+          <w:b/>
+          <w:bCs/>
+          <w:sz w:val="22"/>
+          <w:szCs w:val="22"/>
+        </w:rPr>
+        <w:t xml:space="preserve">처리량: </w:t>
+      </w:r>
+      <w:r>
+        <w:rPr>
+          <w:rFonts w:ascii="Arial" w:cs="Arial" w:eastAsia="Arial" w:hAnsi="Arial"/>
+          <w:sz w:val="22"/>
+          <w:szCs w:val="22"/>
+        </w:rPr>
+        <w:t xml:space="preserve">4가지 알고리즘 모두 약 8.17 req/s로, 처리량에는 큰 차이가 없었다. 처리량은 스케줄러가 아닌 LLM 백엔드의 추론 속도에 의해 결정되기 때문이다. 따라서 본 연구에서는 대기시간과 공정성을 중심으로 알고리즘을 비교한다.</w:t>
+      </w:r>
+    </w:p>
+    <w:p>
+      <w:pPr>
+        <w:spacing w:after="120"/>
+      </w:pPr>
+      <w:r>
+        <w:rPr>
+          <w:rFonts w:ascii="Arial" w:cs="Arial" w:eastAsia="Arial" w:hAnsi="Arial"/>
+          <w:b/>
+          <w:bCs/>
+          <w:sz w:val="22"/>
+          <w:szCs w:val="22"/>
+        </w:rPr>
+        <w:t xml:space="preserve">공정성: </w:t>
+      </w:r>
+      <w:r>
+        <w:rPr>
+          <w:rFonts w:ascii="Arial" w:cs="Arial" w:eastAsia="Arial" w:hAnsi="Arial"/>
+          <w:sz w:val="22"/>
+          <w:szCs w:val="22"/>
+        </w:rPr>
+        <w:t xml:space="preserve">예비 실험에서는 WFQ의 JFI를 중심으로 측정하였으며, 나머지 알고리즘에 대한 JFI 비교는 본 실험에서 추가로 진행할 예정이다.</w:t>
       </w:r>
     </w:p>
     <w:p>
@@ -2256,7 +2577,7 @@
         <w:pStyle w:val="ListParagraph"/>
         <w:numPr>
           <w:ilvl w:val="0"/>
-          <w:numId w:val="5"/>
+          <w:numId w:val="6"/>
         </w:numPr>
         <w:spacing w:after="60"/>
       </w:pPr>
@@ -2284,7 +2605,7 @@
         <w:pStyle w:val="ListParagraph"/>
         <w:numPr>
           <w:ilvl w:val="0"/>
-          <w:numId w:val="5"/>
+          <w:numId w:val="6"/>
         </w:numPr>
         <w:spacing w:after="60"/>
       </w:pPr>
@@ -2304,7 +2625,7 @@
           <w:sz w:val="22"/>
           <w:szCs w:val="22"/>
         </w:rPr>
-        <w:t xml:space="preserve">: 더 많은 요청(10,000건 이상)과 다양한 상황(갑자기 요청이 몰리는 경우, 테넌트 비율이 다른 경우 등)에서 실험해 본다.</w:t>
+        <w:t xml:space="preserve">: 더 많은 요청(10,000건 이상)으로 실험하고, 요청 간 지연(Delay)을 50~500ms 범위로 다양하게 설정하여 실제 서비스 환경에 가까운 조건에서 실험해 본다. 갑자기 요청이 몰리는 경우, 테넌트 비율이 다른 경우 등 다양한 상황을 추가한다.</w:t>
       </w:r>
     </w:p>
     <w:p>
@@ -2312,7 +2633,7 @@
         <w:pStyle w:val="ListParagraph"/>
         <w:numPr>
           <w:ilvl w:val="0"/>
-          <w:numId w:val="5"/>
+          <w:numId w:val="6"/>
         </w:numPr>
         <w:spacing w:after="60"/>
       </w:pPr>
@@ -2332,7 +2653,7 @@
           <w:sz w:val="22"/>
           <w:szCs w:val="22"/>
         </w:rPr>
-        <w:t xml:space="preserve">: JFI 외에 다른 공정성 지표도 적용할 수 있는지 살펴보고, 공정성과 성능 사이의 장단점을 살펴본다.</w:t>
+        <w:t xml:space="preserve">: 4가지 알고리즘 모두에 JFI를 적용하여 비교하고, JFI 외에 다른 공정성 지표도 적용할 수 있는지 살펴본다.</w:t>
       </w:r>
     </w:p>
     <w:p>
@@ -2340,7 +2661,7 @@
         <w:pStyle w:val="ListParagraph"/>
         <w:numPr>
           <w:ilvl w:val="0"/>
-          <w:numId w:val="5"/>
+          <w:numId w:val="6"/>
         </w:numPr>
         <w:spacing w:after="120"/>
       </w:pPr>
@@ -3362,6 +3683,18 @@
     <w:multiLevelType w:val="hybridMultilevel"/>
     <w:lvl w:ilvl="0" w15:tentative="1">
       <w:start w:val="1"/>
+      <w:numFmt w:val="decimal"/>
+      <w:lvlText w:val="%1."/>
+      <w:lvlJc w:val="left"/>
+      <w:pPr>
+        <w:ind w:left="720" w:hanging="360"/>
+      </w:pPr>
+    </w:lvl>
+  </w:abstractNum>
+  <w:abstractNum w:abstractNumId="6" w15:restartNumberingAfterBreak="0">
+    <w:multiLevelType w:val="hybridMultilevel"/>
+    <w:lvl w:ilvl="0" w15:tentative="1">
+      <w:start w:val="1"/>
       <w:numFmt w:val="bullet"/>
       <w:lvlText w:val="•"/>
       <w:lvlJc w:val="left"/>
@@ -3395,6 +3728,12 @@
     </w:lvlOverride>
   </w:num>
   <w:num w:numId="5">
+    <w:abstractNumId w:val="6"/>
+    <w:lvlOverride w:ilvl="0">
+      <w:startOverride w:val="1"/>
+    </w:lvlOverride>
+  </w:num>
+  <w:num w:numId="6">
     <w:abstractNumId w:val="3"/>
     <w:lvlOverride w:ilvl="0">
       <w:startOverride w:val="1"/>

</xml_diff>

<commit_message>
Add proposal files and figures for scheduling algorithms
- Created package.json for project dependencies including playwright, pptxgenjs, and sharp.
- Added PowerPoint presentation (proposal-figures.pptx) for visual representation of the proposal.
- Introduced HTML slides (slide1-algo-comparison.html, slide2-architecture.html, slide3-request-flow.html) detailing algorithm comparisons, architecture, and request flow.
- Created a final directory with a Word document (proposal.docx) containing the proposal details.
- Added snapshot-info.md to document the creation date, skill, status, and included files for the snapshot.
</commit_message>
<xml_diff>
--- a/04-proposal/final/proposal.docx
+++ b/04-proposal/final/proposal.docx
@@ -1394,7 +1394,7 @@
           <w:sz w:val="22"/>
           <w:szCs w:val="22"/>
         </w:rPr>
-        <w:t xml:space="preserve">테넌트 등급별 가중치(Enterprise: 100, Premium: 50, Standard: 10, Free: 1)에 비례하여 자원을 분배하는 알고리즘이다 [3]. 본 시스템에서는 네트워크의 흐름(flow) 개념을 테넌트 등급별 가중치로 치환하여 적용하였다. 스케줄러는 각 요청의 예상 처리 비용을 테넌트의 가중치로 나눈 값(ΔVFT = Cost / Weight)을 누적하여 가상 종료 시각(Virtual Finish Time, VFT)을 산출한다. 즉, 가중치가 높은 테넌트의 요청일수록 VFT의 증가폭이 작게 계산되므로, 가장 작은 VFT를 가진 요청이 우선적으로 스케줄링된다. WFQ는 가중치 기반으로 자원을 비례 배분하는 구조이므로, Priority의 에이징이나 MLFQ의 부스트와 같은 별도의 기아 방지 장치가 필요하지 않다. JFI로 공정성을 모니터링한다.</w:t>
+        <w:t xml:space="preserve">테넌트 등급별 가중치(Enterprise: 100, Premium: 50, Standard: 10, Free: 1)에 비례하여 자원을 분배하는 알고리즘이다 [3]. 본 시스템에서는 네트워크의 흐름(flow) 개념을 테넌트 등급별 가중치로 치환하여 적용하였다. 스케줄러는 각 요청의 예상 처리 비용을 테넌트의 가중치로 나눈 값(ΔVFT = Cost / Weight)을 누적하여 가상 종료 시각(Virtual Finish Time, VFT)을 산출한다. 즉, 가중치가 높은 테넌트의 요청일수록 VFT의 증가폭이 작게 계산되므로, 가장 작은 VFT를 가진 요청이 우선적으로 스케줄링된다. WFQ는 가중치 기반으로 자원을 비례 배분하는 구조이므로, Priority의 에이징이나 MLFQ의 부스트와 같은 별도의 기아 방지 장치가 필요하지 않다.</w:t>
       </w:r>
     </w:p>
     <w:p>
@@ -1417,15 +1417,15 @@
           <w:sz w:val="22"/>
           <w:szCs w:val="22"/>
         </w:rPr>
-        <w:t xml:space="preserve">런타임 알고리즘 교체: </w:t>
-      </w:r>
-      <w:r>
-        <w:rPr>
-          <w:rFonts w:ascii="Arial" w:cs="Arial" w:eastAsia="Arial" w:hAnsi="Arial"/>
-          <w:sz w:val="22"/>
-          <w:szCs w:val="22"/>
-        </w:rPr>
-        <w:t xml:space="preserve">서버 재시작 없이 REST API를 통해 스케줄링 알고리즘을 실시간으로 전환할 수 있다. 이 기능은 운영 환경에서 워크로드가 바뀔 때 최적 알고리즘을 선택하기 위한 서비스용 부가 기능이다. 성능 비교 실험에서는 하나의 알고리즘을 고정하고 전체 실험을 완료한 뒤 다음 알고리즘으로 전환하는 방식으로 진행하며, 실험 도중에는 알고리즘을 교체하지 않는다.</w:t>
+        <w:t xml:space="preserve">실시간 알고리즘 교체: </w:t>
+      </w:r>
+      <w:r>
+        <w:rPr>
+          <w:rFonts w:ascii="Arial" w:cs="Arial" w:eastAsia="Arial" w:hAnsi="Arial"/>
+          <w:sz w:val="22"/>
+          <w:szCs w:val="22"/>
+        </w:rPr>
+        <w:t xml:space="preserve">서버 재시작 없이 REST API를 통해 스케줄링 알고리즘을 실시간(런타임)으로 전환할 수 있다. 이 기능은 운영 환경에서 워크로드가 바뀔 때 최적 알고리즘을 선택하기 위한 서비스용 부가 기능이다. 성능 비교 실험에서는 하나의 알고리즘을 고정하고 전체 실험을 완료한 뒤 다음 알고리즘으로 전환하는 방식으로 진행하며, 실험 도중에는 알고리즘을 교체하지 않는다.</w:t>
       </w:r>
     </w:p>
     <w:p>

</xml_diff>

<commit_message>
Implement multi-user LLM API request management system using OS scheduling algorithms; add proposal document and figures, update scheduling algorithm parameters, and create a todo note for research focus adjustments.
</commit_message>
<xml_diff>
--- a/04-proposal/final/proposal.docx
+++ b/04-proposal/final/proposal.docx
@@ -504,7 +504,7 @@
           <w:sz w:val="22"/>
           <w:szCs w:val="22"/>
         </w:rPr>
-        <w:t xml:space="preserve">기존 LLM 서빙 시스템들은 주로 LLM의 응답 속도를 높이는 데 집중하고 있으며, 다중 사용자 환경에서의 요청 스케줄링과 테넌트 간 공정성 문제는 아직 많이 다루어지지 않았다. 본 연구는 이 부분을 보완하기 위해 OS 스케줄링 이론을 LLM 요청 관리에 적용한다.</w:t>
+        <w:t xml:space="preserve">기존 LLM 서빙 시스템들은 주로 LLM의 응답 속도를 높이는 데 집중하고 있으며, 다중 사용자 환경에서의 요청 스케줄링과 테넌트 간 공정성 문제는 아직 많이 다루어지지 않았다. 본 연구는 이 문제를 다루기 위해 OS 스케줄링 이론을 LLM 요청 관리에 적용한다.</w:t>
       </w:r>
     </w:p>
     <w:p>
@@ -554,7 +554,7 @@
           <w:sz w:val="22"/>
           <w:szCs w:val="22"/>
         </w:rPr>
-        <w:t xml:space="preserve">여기서 xi는 각 사용자가 받는 자원의 양, n은 사용자 수이다. 본 연구는 최종적으로 JFI를 모든 스케줄링 알고리즘에 적용하여 공정성을 비교할 계획이며, 시스템 수준(전체 테넌트 간)과 테넌트 수준(동일 등급 내 요청 간)으로 나누어 측정한다.</w:t>
+        <w:t xml:space="preserve">여기서 xi는 각 사용자가 받는 자원의 양, n은 사용자 수이다.</w:t>
       </w:r>
     </w:p>
     <w:p>
@@ -1373,7 +1373,7 @@
           <w:sz w:val="22"/>
           <w:szCs w:val="22"/>
         </w:rPr>
-        <w:t xml:space="preserve">4단계 피드백 큐(Q0~Q3)를 구현하며, 큐별 타임 퀀텀을 차등 설정한다(Q0: 500ms, Q1: 1,500ms, Q2: 4,000ms, Q3: 무제한) [2]. 본 알고리즘은 선점형(Preemptive) 방식으로 동작한다. 즉, 처리 중인 요청의 할당 시간(타임 퀀텀)이 지나면 해당 요청을 잠시 멈추고 다른 요청에게 순서를 넘긴다. 타임 퀀텀을 초과한 요청은 하위 큐로 이동시켜, 짧은 요청이 긴 요청에 의해 지연되는 것을 방지한다. 주기적 부스트(Boost)로 모든 요청을 최상위 큐(Q0)로 복귀시켜 기아를 방지한다.</w:t>
+        <w:t xml:space="preserve">4단계 피드백 큐(Q0~Q3)를 구현하며, 큐별 타임 퀀텀을 차등 설정한다(Q0: 1,000ms, Q1: 3,000ms, Q2: 8,000ms, Q3: 무제한) [2]. 본 알고리즘은 선점형(Preemptive) 방식으로 동작한다. 즉, 처리 중인 요청의 할당 시간(타임 퀀텀)이 지나면 해당 요청을 잠시 멈추고 다른 요청에게 순서를 넘긴다. 타임 퀀텀을 초과한 요청은 하위 큐로 이동시켜, 짧은 요청이 긴 요청에 의해 지연되는 것을 방지한다. 주기적 부스트(Boost)로 모든 요청을 최상위 큐(Q0)로 복귀시켜 기아를 방지한다.</w:t>
       </w:r>
     </w:p>
     <w:p>
@@ -1394,7 +1394,7 @@
           <w:sz w:val="22"/>
           <w:szCs w:val="22"/>
         </w:rPr>
-        <w:t xml:space="preserve">테넌트 등급별 가중치(Enterprise: 100, Premium: 50, Standard: 10, Free: 1)에 비례하여 자원을 분배하는 알고리즘이다 [3]. 본 시스템에서는 네트워크의 흐름(flow) 개념을 테넌트 등급별 가중치로 치환하여 적용하였다. 스케줄러는 각 요청의 예상 처리 비용을 테넌트의 가중치로 나눈 값(ΔVFT = Cost / Weight)을 누적하여 가상 종료 시각(Virtual Finish Time, VFT)을 산출한다. 즉, 가중치가 높은 테넌트의 요청일수록 VFT의 증가폭이 작게 계산되므로, 가장 작은 VFT를 가진 요청이 우선적으로 스케줄링된다. WFQ는 가중치 기반으로 자원을 비례 배분하는 구조이므로, Priority의 에이징이나 MLFQ의 부스트와 같은 별도의 기아 방지 장치가 필요하지 않다.</w:t>
+        <w:t xml:space="preserve">테넌트 등급별 가중치(Enterprise: 100, Premium: 50, Standard: 10, Free: 1)에 비례하여 자원을 분배하는 알고리즘이다 [3]. 본 시스템에서는 네트워크의 흐름(flow) 개념을 테넌트 등급별 가중치로 치환하여 적용한다. 스케줄러는 각 요청의 예상 처리 비용을 테넌트의 가중치로 나눈 값(ΔVFT = Cost / Weight)을 누적하여 가상 종료 시각(Virtual Finish Time, VFT)을 산출한다. 즉, 가중치가 높은 테넌트의 요청일수록 VFT의 증가폭이 작게 계산되므로, 가장 작은 VFT를 가진 요청이 우선적으로 스케줄링된다. WFQ는 가중치 기반으로 자원을 비례 배분하는 구조이므로, Priority의 에이징이나 MLFQ의 부스트와 같은 별도의 기아 방지 장치가 필요하지 않다.</w:t>
       </w:r>
     </w:p>
     <w:p>
@@ -1425,7 +1425,7 @@
           <w:sz w:val="22"/>
           <w:szCs w:val="22"/>
         </w:rPr>
-        <w:t xml:space="preserve">서버 재시작 없이 REST API를 통해 스케줄링 알고리즘을 실시간(런타임)으로 전환할 수 있다. 이 기능은 운영 환경에서 워크로드가 바뀔 때 최적 알고리즘을 선택하기 위한 서비스용 부가 기능이다. 성능 비교 실험에서는 하나의 알고리즘을 고정하고 전체 실험을 완료한 뒤 다음 알고리즘으로 전환하는 방식으로 진행하며, 실험 도중에는 알고리즘을 교체하지 않는다.</w:t>
+        <w:t xml:space="preserve">서버 재시작 없이 REST API를 통해 프로그램 실행 중(런타임)에 스케줄링 알고리즘을 전환할 수 있다. 이 기능은 운영 환경에서 워크로드가 바뀔 때 최적 알고리즘을 선택하기 위한 서비스용 부가 기능이다. 성능 비교 실험에서는 하나의 알고리즘을 고정하고 전체 실험을 완료한 뒤 다음 알고리즘으로 전환하는 방식으로 진행하며, 실험 도중에는 알고리즘을 교체하지 않는다.</w:t>
       </w:r>
     </w:p>
     <w:p>
@@ -1448,7 +1448,7 @@
           <w:sz w:val="22"/>
           <w:szCs w:val="22"/>
         </w:rPr>
-        <w:t xml:space="preserve">JFI를 4가지 스케줄링 알고리즘 모두에 적용하여, 각 알고리즘이 자원을 얼마나 공정하게 배분하는지 비교한다. WFQ 스케줄러에서는 시스템 수준 JFI(전체 테넌트 간 공정성)와 테넌트 수준 JFI(같은 등급 내 요청 간 공정성)를 나누어 측정한다.</w:t>
+        <w:t xml:space="preserve">JFI를 4가지 스케줄링 알고리즘 모두에 적용하여, 각 알고리즘이 자원을 얼마나 공정하게 배분하는지 비교한다. 측정은 시스템 수준(전체 테넌트 간 공정성)과 테넌트 수준(같은 등급 내 요청 간 공정성)으로 나누어 진행한다.</w:t>
       </w:r>
     </w:p>
     <w:p>

</xml_diff>

<commit_message>
Add proposal documents and presentation slides for scheduling algorithms
- Updated proposal document in final directory.
- Added .gitkeep file to snapshot directory to maintain structure.
- Included initial proposal document and figures in snapshot directory.
- Created HTML slides for algorithm comparison, architecture, and request flow.
- Slides cover scheduling algorithms (FCFS, Priority, MLFQ, WFQ) and system architecture.
- Detailed request flow from client to LLM backend with emphasis on scheduling decisions.
</commit_message>
<xml_diff>
--- a/04-proposal/final/proposal.docx
+++ b/04-proposal/final/proposal.docx
@@ -1188,7 +1188,7 @@
           <w:sz w:val="22"/>
           <w:szCs w:val="22"/>
         </w:rPr>
-        <w:t xml:space="preserve">: REST API(웹 요청 인터페이스)를 통해 LLM 요청을 수신한다.</w:t>
+        <w:t xml:space="preserve">: REST(웹 통신 규약) API를 통해 LLM 요청을 수신한다.</w:t>
       </w:r>
     </w:p>
     <w:p>
@@ -1244,7 +1244,7 @@
           <w:sz w:val="22"/>
           <w:szCs w:val="22"/>
         </w:rPr>
-        <w:t xml:space="preserve">: 4가지 스케줄링 알고리즘으로 요청 처리 순서를 결정한다. 알고리즘은 REST API(PUT /api/scheduler)를 통해 교체할 수 있으며, 이 기능은 운영 중 워크로드(작업량) 변화에 대응하기 위한 서비스용 부가 기능이다. 성능 비교 실험에서는 알고리즘을 고정한 채 진행하며, 실험 도중 교체하지 않는다.</w:t>
+        <w:t xml:space="preserve">: 4가지 스케줄링 알고리즘으로 요청 처리 순서를 결정한다. 알고리즘은 REST API(PUT /api/scheduler)를 통해 교체하도록 설계하며, 이 기능은 운영 중 워크로드(작업량) 변화에 대응하기 위한 서비스용 부가 기능이다. 성능 비교 실험에서는 알고리즘을 고정한 채 진행하며, 실험 도중 교체하지 않는다.</w:t>
       </w:r>
     </w:p>
     <w:p>
@@ -1425,7 +1425,7 @@
           <w:sz w:val="22"/>
           <w:szCs w:val="22"/>
         </w:rPr>
-        <w:t xml:space="preserve">서버 재시작 없이 REST API를 통해 프로그램 실행 중(런타임)에 스케줄링 알고리즘을 전환할 수 있다. 이 기능은 운영 환경에서 워크로드가 바뀔 때 최적 알고리즘을 선택하기 위한 서비스용 부가 기능이다. 성능 비교 실험에서는 하나의 알고리즘을 고정하고 전체 실험을 완료한 뒤 다음 알고리즘으로 전환하는 방식으로 진행하며, 실험 도중에는 알고리즘을 교체하지 않는다.</w:t>
+        <w:t xml:space="preserve">서버 재시작 없이 REST API를 통해 프로그램 실행 중(런타임)에 스케줄링 알고리즘을 전환하도록 설계한다. 이 기능은 운영 환경에서 워크로드가 바뀔 때 최적 알고리즘을 선택하기 위한 서비스용 부가 기능이다. 성능 비교 실험에서는 하나의 알고리즘을 고정하고 전체 실험을 완료한 뒤 다음 알고리즘으로 전환하는 방식으로 진행하며, 실험 도중에는 알고리즘을 교체하지 않는다.</w:t>
       </w:r>
     </w:p>
     <w:p>

</xml_diff>

<commit_message>
Update project configuration and documentation
- Bump template version from 2.7.3 to 2.7.12 in project.yaml and system.yaml.
- Adjust state directory format in state.yaml.
- Modify statusline configuration to include default mode and theme.
- Revise proposal document structure and content in generate-proposal-docx.js, including changes to experiment planning and results sections.
- Create a new markdown proposal document detailing the multi-user LLM API request management system.
- Update references and descriptions in CLAUDE.md for consistency and accuracy.
</commit_message>
<xml_diff>
--- a/04-proposal/final/proposal.docx
+++ b/04-proposal/final/proposal.docx
@@ -1624,7 +1624,15 @@
         <w:pStyle w:val="Heading1"/>
       </w:pPr>
       <w:r>
-        <w:t xml:space="preserve">4. 예비 실험 결과</w:t>
+        <w:t xml:space="preserve">4. 실험 계획</w:t>
+      </w:r>
+    </w:p>
+    <w:p>
+      <w:pPr>
+        <w:pStyle w:val="Heading2"/>
+      </w:pPr>
+      <w:r>
+        <w:t xml:space="preserve">4.1 실험 설계</w:t>
       </w:r>
     </w:p>
     <w:p>
@@ -1637,15 +1645,7 @@
           <w:sz w:val="22"/>
           <w:szCs w:val="22"/>
         </w:rPr>
-        <w:t xml:space="preserve">겨울방학 동안 시제품(프로토타입)을 구현하고 예비 실험을 수행하였다.</w:t>
-      </w:r>
-    </w:p>
-    <w:p>
-      <w:pPr>
-        <w:pStyle w:val="Heading2"/>
-      </w:pPr>
-      <w:r>
-        <w:t xml:space="preserve">4.1 실험 환경</w:t>
+        <w:t xml:space="preserve">3.6절의 구현 환경에서 다음과 같은 조건으로 실험을 수행할 계획이다.</w:t>
       </w:r>
     </w:p>
     <w:p>
@@ -1665,15 +1665,15 @@
           <w:sz w:val="22"/>
           <w:szCs w:val="22"/>
         </w:rPr>
-        <w:t xml:space="preserve">서버</w:t>
-      </w:r>
-      <w:r>
-        <w:rPr>
-          <w:rFonts w:ascii="Arial" w:cs="Arial" w:eastAsia="Arial" w:hAnsi="Arial"/>
-          <w:sz w:val="22"/>
-          <w:szCs w:val="22"/>
-        </w:rPr>
-        <w:t xml:space="preserve">: Node.js 22 LTS, Express.js 4.18 [7][8]</w:t>
+        <w:t xml:space="preserve">실험 규모</w:t>
+      </w:r>
+      <w:r>
+        <w:rPr>
+          <w:rFonts w:ascii="Arial" w:cs="Arial" w:eastAsia="Arial" w:hAnsi="Arial"/>
+          <w:sz w:val="22"/>
+          <w:szCs w:val="22"/>
+        </w:rPr>
+        <w:t xml:space="preserve">: 약 5,000~10,000건의 요청으로 반복 실험을 수행한다.</w:t>
       </w:r>
     </w:p>
     <w:p>
@@ -1693,15 +1693,15 @@
           <w:sz w:val="22"/>
           <w:szCs w:val="22"/>
         </w:rPr>
-        <w:t xml:space="preserve">LLM 백엔드</w:t>
-      </w:r>
-      <w:r>
-        <w:rPr>
-          <w:rFonts w:ascii="Arial" w:cs="Arial" w:eastAsia="Arial" w:hAnsi="Arial"/>
-          <w:sz w:val="22"/>
-          <w:szCs w:val="22"/>
-        </w:rPr>
-        <w:t xml:space="preserve">: Ollama(로컬 환경에서 LLM을 간편하게 실행할 수 있는 도구) [6]</w:t>
+        <w:t xml:space="preserve">요청 구성</w:t>
+      </w:r>
+      <w:r>
+        <w:rPr>
+          <w:rFonts w:ascii="Arial" w:cs="Arial" w:eastAsia="Arial" w:hAnsi="Arial"/>
+          <w:sz w:val="22"/>
+          <w:szCs w:val="22"/>
+        </w:rPr>
+        <w:t xml:space="preserve">: 짧은 요청 40%, 중간 요청 40%, 긴 요청 20%의 비율로 구성한다.</w:t>
       </w:r>
     </w:p>
     <w:p>
@@ -1721,15 +1721,64 @@
           <w:sz w:val="22"/>
           <w:szCs w:val="22"/>
         </w:rPr>
-        <w:t xml:space="preserve">외부 의존성</w:t>
-      </w:r>
-      <w:r>
-        <w:rPr>
-          <w:rFonts w:ascii="Arial" w:cs="Arial" w:eastAsia="Arial" w:hAnsi="Arial"/>
-          <w:sz w:val="22"/>
-          <w:szCs w:val="22"/>
-        </w:rPr>
-        <w:t xml:space="preserve">: 1개 패키지 (express)</w:t>
+        <w:t xml:space="preserve">요청 간 지연</w:t>
+      </w:r>
+      <w:r>
+        <w:rPr>
+          <w:rFonts w:ascii="Arial" w:cs="Arial" w:eastAsia="Arial" w:hAnsi="Arial"/>
+          <w:sz w:val="22"/>
+          <w:szCs w:val="22"/>
+        </w:rPr>
+        <w:t xml:space="preserve">: 50~500ms 범위에서 다양하게 설정하여 실제 서비스 환경에 가깝게 구성한다.</w:t>
+      </w:r>
+    </w:p>
+    <w:p>
+      <w:pPr>
+        <w:pStyle w:val="ListParagraph"/>
+        <w:numPr>
+          <w:ilvl w:val="0"/>
+          <w:numId w:val="5"/>
+        </w:numPr>
+        <w:spacing w:after="120"/>
+      </w:pPr>
+      <w:r>
+        <w:rPr>
+          <w:rFonts w:ascii="Arial" w:cs="Arial" w:eastAsia="Arial" w:hAnsi="Arial"/>
+          <w:b/>
+          <w:bCs/>
+          <w:sz w:val="22"/>
+          <w:szCs w:val="22"/>
+        </w:rPr>
+        <w:t xml:space="preserve">변인 통제</w:t>
+      </w:r>
+      <w:r>
+        <w:rPr>
+          <w:rFonts w:ascii="Arial" w:cs="Arial" w:eastAsia="Arial" w:hAnsi="Arial"/>
+          <w:sz w:val="22"/>
+          <w:szCs w:val="22"/>
+        </w:rPr>
+        <w:t xml:space="preserve">: 4가지 스케줄링 알고리즘 간의 순수 성능 비교가 목적이므로, 전처리 모듈인 Rate Limiter는 비활성화한 상태에서 진행한다. Rate Limiter를 포함한 시스템 과부하 방지 테스트는 별도로 진행할 예정이다.</w:t>
+      </w:r>
+    </w:p>
+    <w:p>
+      <w:pPr>
+        <w:pStyle w:val="Heading2"/>
+      </w:pPr>
+      <w:r>
+        <w:t xml:space="preserve">4.2 실험 시나리오</w:t>
+      </w:r>
+    </w:p>
+    <w:p>
+      <w:pPr>
+        <w:spacing w:after="120"/>
+      </w:pPr>
+      <w:r>
+        <w:rPr>
+          <w:rFonts w:ascii="Arial" w:cs="Arial" w:eastAsia="Arial" w:hAnsi="Arial"/>
+          <w:sz w:val="22"/>
+          <w:szCs w:val="22"/>
+        </w:rPr>
+        <w:t xml:space="preserve">다양한 조건에서 알고리즘의 특성을 비교하기 위해, 다음과 같은 시나리오를 설계한다.</w:t>
       </w:r>
     </w:p>
     <w:p>
@@ -1749,15 +1798,43 @@
           <w:sz w:val="22"/>
           <w:szCs w:val="22"/>
         </w:rPr>
-        <w:t xml:space="preserve">실험 규모</w:t>
-      </w:r>
-      <w:r>
-        <w:rPr>
-          <w:rFonts w:ascii="Arial" w:cs="Arial" w:eastAsia="Arial" w:hAnsi="Arial"/>
-          <w:sz w:val="22"/>
-          <w:szCs w:val="22"/>
-        </w:rPr>
-        <w:t xml:space="preserve">: 약 5,000건의 요청으로 반복 실험</w:t>
+        <w:t xml:space="preserve">정상 부하</w:t>
+      </w:r>
+      <w:r>
+        <w:rPr>
+          <w:rFonts w:ascii="Arial" w:cs="Arial" w:eastAsia="Arial" w:hAnsi="Arial"/>
+          <w:sz w:val="22"/>
+          <w:szCs w:val="22"/>
+        </w:rPr>
+        <w:t xml:space="preserve">: 일정한 간격으로 요청이 도착하는 기본 상황에서 각 알고리즘의 대기시간과 처리량을 측정한다.</w:t>
+      </w:r>
+    </w:p>
+    <w:p>
+      <w:pPr>
+        <w:pStyle w:val="ListParagraph"/>
+        <w:numPr>
+          <w:ilvl w:val="0"/>
+          <w:numId w:val="5"/>
+        </w:numPr>
+        <w:spacing w:after="40"/>
+      </w:pPr>
+      <w:r>
+        <w:rPr>
+          <w:rFonts w:ascii="Arial" w:cs="Arial" w:eastAsia="Arial" w:hAnsi="Arial"/>
+          <w:b/>
+          <w:bCs/>
+          <w:sz w:val="22"/>
+          <w:szCs w:val="22"/>
+        </w:rPr>
+        <w:t xml:space="preserve">버스트 부하</w:t>
+      </w:r>
+      <w:r>
+        <w:rPr>
+          <w:rFonts w:ascii="Arial" w:cs="Arial" w:eastAsia="Arial" w:hAnsi="Arial"/>
+          <w:sz w:val="22"/>
+          <w:szCs w:val="22"/>
+        </w:rPr>
+        <w:t xml:space="preserve">: 특정 시점에 요청이 급증하는 상황을 재현하여, 각 알고리즘이 과부하에 어떻게 대응하는지 관찰한다.</w:t>
       </w:r>
     </w:p>
     <w:p>
@@ -1777,15 +1854,23 @@
           <w:sz w:val="22"/>
           <w:szCs w:val="22"/>
         </w:rPr>
-        <w:t xml:space="preserve">요청 구성</w:t>
-      </w:r>
-      <w:r>
-        <w:rPr>
-          <w:rFonts w:ascii="Arial" w:cs="Arial" w:eastAsia="Arial" w:hAnsi="Arial"/>
-          <w:sz w:val="22"/>
-          <w:szCs w:val="22"/>
-        </w:rPr>
-        <w:t xml:space="preserve">: 짧은 요청 40%, 중간 요청 40%, 긴 요청 20%의 비율로 구성</w:t>
+        <w:t xml:space="preserve">테넌트 비율 변동</w:t>
+      </w:r>
+      <w:r>
+        <w:rPr>
+          <w:rFonts w:ascii="Arial" w:cs="Arial" w:eastAsia="Arial" w:hAnsi="Arial"/>
+          <w:sz w:val="22"/>
+          <w:szCs w:val="22"/>
+        </w:rPr>
+        <w:t xml:space="preserve">: Enterprise/Premium/Standard/Free 테넌트의 비율을 달리하여 공정성 변화를 관찰한다.</w:t>
+      </w:r>
+    </w:p>
+    <w:p>
+      <w:pPr>
+        <w:pStyle w:val="Heading2"/>
+      </w:pPr>
+      <w:r>
+        <w:t xml:space="preserve">4.3 평가 방법</w:t>
       </w:r>
     </w:p>
     <w:p>
@@ -1795,745 +1880,10 @@
       <w:r>
         <w:rPr>
           <w:rFonts w:ascii="Arial" w:cs="Arial" w:eastAsia="Arial" w:hAnsi="Arial"/>
-          <w:b/>
-          <w:bCs/>
-          <w:sz w:val="22"/>
-          <w:szCs w:val="22"/>
-        </w:rPr>
-        <w:t xml:space="preserve">변인 통제: </w:t>
-      </w:r>
-      <w:r>
-        <w:rPr>
-          <w:rFonts w:ascii="Arial" w:cs="Arial" w:eastAsia="Arial" w:hAnsi="Arial"/>
-          <w:sz w:val="22"/>
-          <w:szCs w:val="22"/>
-        </w:rPr>
-        <w:t xml:space="preserve">본 예비 실험은 4가지 스케줄링 알고리즘 간의 순수 성능 비교가 목적이므로, 전처리 모듈인 Rate Limiter는 비활성화한 상태에서 진행하였다. Rate Limiter를 포함한 시스템 과부하 방지 테스트는 본 실험에서 별도로 진행할 예정이다.</w:t>
-      </w:r>
-    </w:p>
-    <w:p>
-      <w:pPr>
-        <w:pStyle w:val="Heading2"/>
-      </w:pPr>
-      <w:r>
-        <w:t xml:space="preserve">4.2 주요 결과</w:t>
-      </w:r>
-    </w:p>
-    <w:p>
-      <w:pPr>
-        <w:spacing w:after="60" w:before="120"/>
-        <w:jc w:val="center"/>
-      </w:pPr>
-      <w:r>
-        <w:rPr>
-          <w:rFonts w:ascii="Arial" w:cs="Arial" w:eastAsia="Arial" w:hAnsi="Arial"/>
-          <w:b/>
-          <w:bCs/>
-          <w:sz w:val="20"/>
-          <w:szCs w:val="20"/>
-        </w:rPr>
-        <w:t xml:space="preserve">표 2. 알고리즘별 성능 비교 요약</w:t>
-      </w:r>
-    </w:p>
-    <w:tbl>
-      <w:tblPr>
-        <w:tblW w:type="auto" w:w="100"/>
-        <w:tblBorders>
-          <w:top w:val="single" w:color="auto" w:sz="4"/>
-          <w:left w:val="single" w:color="auto" w:sz="4"/>
-          <w:bottom w:val="single" w:color="auto" w:sz="4"/>
-          <w:right w:val="single" w:color="auto" w:sz="4"/>
-          <w:insideH w:val="single" w:color="auto" w:sz="4"/>
-          <w:insideV w:val="single" w:color="auto" w:sz="4"/>
-        </w:tblBorders>
-      </w:tblPr>
-      <w:tblGrid>
-        <w:gridCol w:w="1600"/>
-        <w:gridCol w:w="2000"/>
-        <w:gridCol w:w="1600"/>
-        <w:gridCol w:w="4160"/>
-      </w:tblGrid>
-      <w:tr>
-        <w:trPr>
-          <w:tblHeader/>
-        </w:trPr>
-        <w:tc>
-          <w:tcPr>
-            <w:tcW w:type="dxa" w:w="1600"/>
-            <w:tcBorders>
-              <w:top w:val="single" w:color="CCCCCC" w:sz="1"/>
-              <w:left w:val="single" w:color="CCCCCC" w:sz="1"/>
-              <w:bottom w:val="single" w:color="CCCCCC" w:sz="1"/>
-              <w:right w:val="single" w:color="CCCCCC" w:sz="1"/>
-            </w:tcBorders>
-            <w:shd w:fill="D5E8F0" w:val="clear"/>
-            <w:vAlign w:val="center"/>
-          </w:tcPr>
-          <w:p>
-            <w:pPr>
-              <w:spacing w:after="60" w:before="60"/>
-              <w:jc w:val="center"/>
-            </w:pPr>
-            <w:r>
-              <w:rPr>
-                <w:rFonts w:ascii="Arial" w:cs="Arial" w:eastAsia="Arial" w:hAnsi="Arial"/>
-                <w:b/>
-                <w:bCs/>
-                <w:sz w:val="20"/>
-                <w:szCs w:val="20"/>
-              </w:rPr>
-              <w:t xml:space="preserve">스케줄러</w:t>
-            </w:r>
-          </w:p>
-        </w:tc>
-        <w:tc>
-          <w:tcPr>
-            <w:tcW w:type="dxa" w:w="2000"/>
-            <w:tcBorders>
-              <w:top w:val="single" w:color="CCCCCC" w:sz="1"/>
-              <w:left w:val="single" w:color="CCCCCC" w:sz="1"/>
-              <w:bottom w:val="single" w:color="CCCCCC" w:sz="1"/>
-              <w:right w:val="single" w:color="CCCCCC" w:sz="1"/>
-            </w:tcBorders>
-            <w:shd w:fill="D5E8F0" w:val="clear"/>
-            <w:vAlign w:val="center"/>
-          </w:tcPr>
-          <w:p>
-            <w:pPr>
-              <w:spacing w:after="60" w:before="60"/>
-              <w:jc w:val="center"/>
-            </w:pPr>
-            <w:r>
-              <w:rPr>
-                <w:rFonts w:ascii="Arial" w:cs="Arial" w:eastAsia="Arial" w:hAnsi="Arial"/>
-                <w:b/>
-                <w:bCs/>
-                <w:sz w:val="20"/>
-                <w:szCs w:val="20"/>
-              </w:rPr>
-              <w:t xml:space="preserve">평균 대기시간</w:t>
-            </w:r>
-          </w:p>
-        </w:tc>
-        <w:tc>
-          <w:tcPr>
-            <w:tcW w:type="dxa" w:w="1600"/>
-            <w:tcBorders>
-              <w:top w:val="single" w:color="CCCCCC" w:sz="1"/>
-              <w:left w:val="single" w:color="CCCCCC" w:sz="1"/>
-              <w:bottom w:val="single" w:color="CCCCCC" w:sz="1"/>
-              <w:right w:val="single" w:color="CCCCCC" w:sz="1"/>
-            </w:tcBorders>
-            <w:shd w:fill="D5E8F0" w:val="clear"/>
-            <w:vAlign w:val="center"/>
-          </w:tcPr>
-          <w:p>
-            <w:pPr>
-              <w:spacing w:after="60" w:before="60"/>
-              <w:jc w:val="center"/>
-            </w:pPr>
-            <w:r>
-              <w:rPr>
-                <w:rFonts w:ascii="Arial" w:cs="Arial" w:eastAsia="Arial" w:hAnsi="Arial"/>
-                <w:b/>
-                <w:bCs/>
-                <w:sz w:val="20"/>
-                <w:szCs w:val="20"/>
-              </w:rPr>
-              <w:t xml:space="preserve">처리량(req/s)</w:t>
-            </w:r>
-          </w:p>
-        </w:tc>
-        <w:tc>
-          <w:tcPr>
-            <w:tcW w:type="dxa" w:w="4160"/>
-            <w:tcBorders>
-              <w:top w:val="single" w:color="CCCCCC" w:sz="1"/>
-              <w:left w:val="single" w:color="CCCCCC" w:sz="1"/>
-              <w:bottom w:val="single" w:color="CCCCCC" w:sz="1"/>
-              <w:right w:val="single" w:color="CCCCCC" w:sz="1"/>
-            </w:tcBorders>
-            <w:shd w:fill="D5E8F0" w:val="clear"/>
-            <w:vAlign w:val="center"/>
-          </w:tcPr>
-          <w:p>
-            <w:pPr>
-              <w:spacing w:after="60" w:before="60"/>
-              <w:jc w:val="center"/>
-            </w:pPr>
-            <w:r>
-              <w:rPr>
-                <w:rFonts w:ascii="Arial" w:cs="Arial" w:eastAsia="Arial" w:hAnsi="Arial"/>
-                <w:b/>
-                <w:bCs/>
-                <w:sz w:val="20"/>
-                <w:szCs w:val="20"/>
-              </w:rPr>
-              <w:t xml:space="preserve">핵심 발견</w:t>
-            </w:r>
-          </w:p>
-        </w:tc>
-      </w:tr>
-      <w:tr>
-        <w:tc>
-          <w:tcPr>
-            <w:tcW w:type="dxa" w:w="1600"/>
-            <w:tcBorders>
-              <w:top w:val="single" w:color="CCCCCC" w:sz="1"/>
-              <w:left w:val="single" w:color="CCCCCC" w:sz="1"/>
-              <w:bottom w:val="single" w:color="CCCCCC" w:sz="1"/>
-              <w:right w:val="single" w:color="CCCCCC" w:sz="1"/>
-            </w:tcBorders>
-            <w:vAlign w:val="center"/>
-          </w:tcPr>
-          <w:p>
-            <w:pPr>
-              <w:spacing w:after="40" w:before="40"/>
-              <w:jc w:val="left"/>
-            </w:pPr>
-            <w:r>
-              <w:rPr>
-                <w:rFonts w:ascii="Arial" w:cs="Arial" w:eastAsia="Arial" w:hAnsi="Arial"/>
-                <w:b/>
-                <w:bCs/>
-                <w:sz w:val="20"/>
-                <w:szCs w:val="20"/>
-              </w:rPr>
-              <w:t xml:space="preserve">FCFS</w:t>
-            </w:r>
-          </w:p>
-        </w:tc>
-        <w:tc>
-          <w:tcPr>
-            <w:tcW w:type="dxa" w:w="2000"/>
-            <w:tcBorders>
-              <w:top w:val="single" w:color="CCCCCC" w:sz="1"/>
-              <w:left w:val="single" w:color="CCCCCC" w:sz="1"/>
-              <w:bottom w:val="single" w:color="CCCCCC" w:sz="1"/>
-              <w:right w:val="single" w:color="CCCCCC" w:sz="1"/>
-            </w:tcBorders>
-            <w:vAlign w:val="center"/>
-          </w:tcPr>
-          <w:p>
-            <w:pPr>
-              <w:spacing w:after="40" w:before="40"/>
-              <w:jc w:val="center"/>
-            </w:pPr>
-            <w:r>
-              <w:rPr>
-                <w:rFonts w:ascii="Arial" w:cs="Arial" w:eastAsia="Arial" w:hAnsi="Arial"/>
-                <w:b w:val="false"/>
-                <w:bCs w:val="false"/>
-                <w:sz w:val="20"/>
-                <w:szCs w:val="20"/>
-              </w:rPr>
-              <w:t xml:space="preserve">2,572ms</w:t>
-            </w:r>
-          </w:p>
-        </w:tc>
-        <w:tc>
-          <w:tcPr>
-            <w:tcW w:type="dxa" w:w="1600"/>
-            <w:tcBorders>
-              <w:top w:val="single" w:color="CCCCCC" w:sz="1"/>
-              <w:left w:val="single" w:color="CCCCCC" w:sz="1"/>
-              <w:bottom w:val="single" w:color="CCCCCC" w:sz="1"/>
-              <w:right w:val="single" w:color="CCCCCC" w:sz="1"/>
-            </w:tcBorders>
-            <w:vAlign w:val="center"/>
-          </w:tcPr>
-          <w:p>
-            <w:pPr>
-              <w:spacing w:after="40" w:before="40"/>
-              <w:jc w:val="center"/>
-            </w:pPr>
-            <w:r>
-              <w:rPr>
-                <w:rFonts w:ascii="Arial" w:cs="Arial" w:eastAsia="Arial" w:hAnsi="Arial"/>
-                <w:b w:val="false"/>
-                <w:bCs w:val="false"/>
-                <w:sz w:val="20"/>
-                <w:szCs w:val="20"/>
-              </w:rPr>
-              <w:t xml:space="preserve">8.17</w:t>
-            </w:r>
-          </w:p>
-        </w:tc>
-        <w:tc>
-          <w:tcPr>
-            <w:tcW w:type="dxa" w:w="4160"/>
-            <w:tcBorders>
-              <w:top w:val="single" w:color="CCCCCC" w:sz="1"/>
-              <w:left w:val="single" w:color="CCCCCC" w:sz="1"/>
-              <w:bottom w:val="single" w:color="CCCCCC" w:sz="1"/>
-              <w:right w:val="single" w:color="CCCCCC" w:sz="1"/>
-            </w:tcBorders>
-            <w:vAlign w:val="center"/>
-          </w:tcPr>
-          <w:p>
-            <w:pPr>
-              <w:spacing w:after="40" w:before="40"/>
-              <w:jc w:val="left"/>
-            </w:pPr>
-            <w:r>
-              <w:rPr>
-                <w:rFonts w:ascii="Arial" w:cs="Arial" w:eastAsia="Arial" w:hAnsi="Arial"/>
-                <w:b w:val="false"/>
-                <w:bCs w:val="false"/>
-                <w:sz w:val="20"/>
-                <w:szCs w:val="20"/>
-              </w:rPr>
-              <w:t xml:space="preserve">기준. 도착 순서대로 처리</w:t>
-            </w:r>
-          </w:p>
-        </w:tc>
-      </w:tr>
-      <w:tr>
-        <w:tc>
-          <w:tcPr>
-            <w:tcW w:type="dxa" w:w="1600"/>
-            <w:tcBorders>
-              <w:top w:val="single" w:color="CCCCCC" w:sz="1"/>
-              <w:left w:val="single" w:color="CCCCCC" w:sz="1"/>
-              <w:bottom w:val="single" w:color="CCCCCC" w:sz="1"/>
-              <w:right w:val="single" w:color="CCCCCC" w:sz="1"/>
-            </w:tcBorders>
-            <w:vAlign w:val="center"/>
-          </w:tcPr>
-          <w:p>
-            <w:pPr>
-              <w:spacing w:after="40" w:before="40"/>
-              <w:jc w:val="left"/>
-            </w:pPr>
-            <w:r>
-              <w:rPr>
-                <w:rFonts w:ascii="Arial" w:cs="Arial" w:eastAsia="Arial" w:hAnsi="Arial"/>
-                <w:b/>
-                <w:bCs/>
-                <w:sz w:val="20"/>
-                <w:szCs w:val="20"/>
-              </w:rPr>
-              <w:t xml:space="preserve">Priority</w:t>
-            </w:r>
-          </w:p>
-        </w:tc>
-        <w:tc>
-          <w:tcPr>
-            <w:tcW w:type="dxa" w:w="2000"/>
-            <w:tcBorders>
-              <w:top w:val="single" w:color="CCCCCC" w:sz="1"/>
-              <w:left w:val="single" w:color="CCCCCC" w:sz="1"/>
-              <w:bottom w:val="single" w:color="CCCCCC" w:sz="1"/>
-              <w:right w:val="single" w:color="CCCCCC" w:sz="1"/>
-            </w:tcBorders>
-            <w:vAlign w:val="center"/>
-          </w:tcPr>
-          <w:p>
-            <w:pPr>
-              <w:spacing w:after="40" w:before="40"/>
-              <w:jc w:val="center"/>
-            </w:pPr>
-            <w:r>
-              <w:rPr>
-                <w:rFonts w:ascii="Arial" w:cs="Arial" w:eastAsia="Arial" w:hAnsi="Arial"/>
-                <w:b w:val="false"/>
-                <w:bCs w:val="false"/>
-                <w:sz w:val="20"/>
-                <w:szCs w:val="20"/>
-              </w:rPr>
-              <w:t xml:space="preserve">2,826ms</w:t>
-            </w:r>
-          </w:p>
-        </w:tc>
-        <w:tc>
-          <w:tcPr>
-            <w:tcW w:type="dxa" w:w="1600"/>
-            <w:tcBorders>
-              <w:top w:val="single" w:color="CCCCCC" w:sz="1"/>
-              <w:left w:val="single" w:color="CCCCCC" w:sz="1"/>
-              <w:bottom w:val="single" w:color="CCCCCC" w:sz="1"/>
-              <w:right w:val="single" w:color="CCCCCC" w:sz="1"/>
-            </w:tcBorders>
-            <w:vAlign w:val="center"/>
-          </w:tcPr>
-          <w:p>
-            <w:pPr>
-              <w:spacing w:after="40" w:before="40"/>
-              <w:jc w:val="center"/>
-            </w:pPr>
-            <w:r>
-              <w:rPr>
-                <w:rFonts w:ascii="Arial" w:cs="Arial" w:eastAsia="Arial" w:hAnsi="Arial"/>
-                <w:b w:val="false"/>
-                <w:bCs w:val="false"/>
-                <w:sz w:val="20"/>
-                <w:szCs w:val="20"/>
-              </w:rPr>
-              <w:t xml:space="preserve">8.16</w:t>
-            </w:r>
-          </w:p>
-        </w:tc>
-        <w:tc>
-          <w:tcPr>
-            <w:tcW w:type="dxa" w:w="4160"/>
-            <w:tcBorders>
-              <w:top w:val="single" w:color="CCCCCC" w:sz="1"/>
-              <w:left w:val="single" w:color="CCCCCC" w:sz="1"/>
-              <w:bottom w:val="single" w:color="CCCCCC" w:sz="1"/>
-              <w:right w:val="single" w:color="CCCCCC" w:sz="1"/>
-            </w:tcBorders>
-            <w:vAlign w:val="center"/>
-          </w:tcPr>
-          <w:p>
-            <w:pPr>
-              <w:spacing w:after="40" w:before="40"/>
-              <w:jc w:val="left"/>
-            </w:pPr>
-            <w:r>
-              <w:rPr>
-                <w:rFonts w:ascii="Arial" w:cs="Arial" w:eastAsia="Arial" w:hAnsi="Arial"/>
-                <w:b w:val="false"/>
-                <w:bCs w:val="false"/>
-                <w:sz w:val="20"/>
-                <w:szCs w:val="20"/>
-              </w:rPr>
-              <w:t xml:space="preserve">URGENT 요청 1,122ms (FCFS 대비 62% 감소)</w:t>
-            </w:r>
-          </w:p>
-        </w:tc>
-      </w:tr>
-      <w:tr>
-        <w:tc>
-          <w:tcPr>
-            <w:tcW w:type="dxa" w:w="1600"/>
-            <w:tcBorders>
-              <w:top w:val="single" w:color="CCCCCC" w:sz="1"/>
-              <w:left w:val="single" w:color="CCCCCC" w:sz="1"/>
-              <w:bottom w:val="single" w:color="CCCCCC" w:sz="1"/>
-              <w:right w:val="single" w:color="CCCCCC" w:sz="1"/>
-            </w:tcBorders>
-            <w:vAlign w:val="center"/>
-          </w:tcPr>
-          <w:p>
-            <w:pPr>
-              <w:spacing w:after="40" w:before="40"/>
-              <w:jc w:val="left"/>
-            </w:pPr>
-            <w:r>
-              <w:rPr>
-                <w:rFonts w:ascii="Arial" w:cs="Arial" w:eastAsia="Arial" w:hAnsi="Arial"/>
-                <w:b/>
-                <w:bCs/>
-                <w:sz w:val="20"/>
-                <w:szCs w:val="20"/>
-              </w:rPr>
-              <w:t xml:space="preserve">MLFQ</w:t>
-            </w:r>
-          </w:p>
-        </w:tc>
-        <w:tc>
-          <w:tcPr>
-            <w:tcW w:type="dxa" w:w="2000"/>
-            <w:tcBorders>
-              <w:top w:val="single" w:color="CCCCCC" w:sz="1"/>
-              <w:left w:val="single" w:color="CCCCCC" w:sz="1"/>
-              <w:bottom w:val="single" w:color="CCCCCC" w:sz="1"/>
-              <w:right w:val="single" w:color="CCCCCC" w:sz="1"/>
-            </w:tcBorders>
-            <w:vAlign w:val="center"/>
-          </w:tcPr>
-          <w:p>
-            <w:pPr>
-              <w:spacing w:after="40" w:before="40"/>
-              <w:jc w:val="center"/>
-            </w:pPr>
-            <w:r>
-              <w:rPr>
-                <w:rFonts w:ascii="Arial" w:cs="Arial" w:eastAsia="Arial" w:hAnsi="Arial"/>
-                <w:b w:val="false"/>
-                <w:bCs w:val="false"/>
-                <w:sz w:val="20"/>
-                <w:szCs w:val="20"/>
-              </w:rPr>
-              <w:t xml:space="preserve">2,572ms</w:t>
-            </w:r>
-          </w:p>
-        </w:tc>
-        <w:tc>
-          <w:tcPr>
-            <w:tcW w:type="dxa" w:w="1600"/>
-            <w:tcBorders>
-              <w:top w:val="single" w:color="CCCCCC" w:sz="1"/>
-              <w:left w:val="single" w:color="CCCCCC" w:sz="1"/>
-              <w:bottom w:val="single" w:color="CCCCCC" w:sz="1"/>
-              <w:right w:val="single" w:color="CCCCCC" w:sz="1"/>
-            </w:tcBorders>
-            <w:vAlign w:val="center"/>
-          </w:tcPr>
-          <w:p>
-            <w:pPr>
-              <w:spacing w:after="40" w:before="40"/>
-              <w:jc w:val="center"/>
-            </w:pPr>
-            <w:r>
-              <w:rPr>
-                <w:rFonts w:ascii="Arial" w:cs="Arial" w:eastAsia="Arial" w:hAnsi="Arial"/>
-                <w:b w:val="false"/>
-                <w:bCs w:val="false"/>
-                <w:sz w:val="20"/>
-                <w:szCs w:val="20"/>
-              </w:rPr>
-              <w:t xml:space="preserve">8.17</w:t>
-            </w:r>
-          </w:p>
-        </w:tc>
-        <w:tc>
-          <w:tcPr>
-            <w:tcW w:type="dxa" w:w="4160"/>
-            <w:tcBorders>
-              <w:top w:val="single" w:color="CCCCCC" w:sz="1"/>
-              <w:left w:val="single" w:color="CCCCCC" w:sz="1"/>
-              <w:bottom w:val="single" w:color="CCCCCC" w:sz="1"/>
-              <w:right w:val="single" w:color="CCCCCC" w:sz="1"/>
-            </w:tcBorders>
-            <w:vAlign w:val="center"/>
-          </w:tcPr>
-          <w:p>
-            <w:pPr>
-              <w:spacing w:after="40" w:before="40"/>
-              <w:jc w:val="left"/>
-            </w:pPr>
-            <w:r>
-              <w:rPr>
-                <w:rFonts w:ascii="Arial" w:cs="Arial" w:eastAsia="Arial" w:hAnsi="Arial"/>
-                <w:b w:val="false"/>
-                <w:bCs w:val="false"/>
-                <w:sz w:val="20"/>
-                <w:szCs w:val="20"/>
-              </w:rPr>
-              <w:t xml:space="preserve">짧은 요청 대기시간 약 74% 감소 (호위 효과 완화 확인)</w:t>
-            </w:r>
-          </w:p>
-        </w:tc>
-      </w:tr>
-      <w:tr>
-        <w:tc>
-          <w:tcPr>
-            <w:tcW w:type="dxa" w:w="1600"/>
-            <w:tcBorders>
-              <w:top w:val="single" w:color="CCCCCC" w:sz="1"/>
-              <w:left w:val="single" w:color="CCCCCC" w:sz="1"/>
-              <w:bottom w:val="single" w:color="CCCCCC" w:sz="1"/>
-              <w:right w:val="single" w:color="CCCCCC" w:sz="1"/>
-            </w:tcBorders>
-            <w:vAlign w:val="center"/>
-          </w:tcPr>
-          <w:p>
-            <w:pPr>
-              <w:spacing w:after="40" w:before="40"/>
-              <w:jc w:val="left"/>
-            </w:pPr>
-            <w:r>
-              <w:rPr>
-                <w:rFonts w:ascii="Arial" w:cs="Arial" w:eastAsia="Arial" w:hAnsi="Arial"/>
-                <w:b/>
-                <w:bCs/>
-                <w:sz w:val="20"/>
-                <w:szCs w:val="20"/>
-              </w:rPr>
-              <w:t xml:space="preserve">WFQ</w:t>
-            </w:r>
-          </w:p>
-        </w:tc>
-        <w:tc>
-          <w:tcPr>
-            <w:tcW w:type="dxa" w:w="2000"/>
-            <w:tcBorders>
-              <w:top w:val="single" w:color="CCCCCC" w:sz="1"/>
-              <w:left w:val="single" w:color="CCCCCC" w:sz="1"/>
-              <w:bottom w:val="single" w:color="CCCCCC" w:sz="1"/>
-              <w:right w:val="single" w:color="CCCCCC" w:sz="1"/>
-            </w:tcBorders>
-            <w:vAlign w:val="center"/>
-          </w:tcPr>
-          <w:p>
-            <w:pPr>
-              <w:spacing w:after="40" w:before="40"/>
-              <w:jc w:val="center"/>
-            </w:pPr>
-            <w:r>
-              <w:rPr>
-                <w:rFonts w:ascii="Arial" w:cs="Arial" w:eastAsia="Arial" w:hAnsi="Arial"/>
-                <w:b w:val="false"/>
-                <w:bCs w:val="false"/>
-                <w:sz w:val="20"/>
-                <w:szCs w:val="20"/>
-              </w:rPr>
-              <w:t xml:space="preserve">2,819ms</w:t>
-            </w:r>
-          </w:p>
-        </w:tc>
-        <w:tc>
-          <w:tcPr>
-            <w:tcW w:type="dxa" w:w="1600"/>
-            <w:tcBorders>
-              <w:top w:val="single" w:color="CCCCCC" w:sz="1"/>
-              <w:left w:val="single" w:color="CCCCCC" w:sz="1"/>
-              <w:bottom w:val="single" w:color="CCCCCC" w:sz="1"/>
-              <w:right w:val="single" w:color="CCCCCC" w:sz="1"/>
-            </w:tcBorders>
-            <w:vAlign w:val="center"/>
-          </w:tcPr>
-          <w:p>
-            <w:pPr>
-              <w:spacing w:after="40" w:before="40"/>
-              <w:jc w:val="center"/>
-            </w:pPr>
-            <w:r>
-              <w:rPr>
-                <w:rFonts w:ascii="Arial" w:cs="Arial" w:eastAsia="Arial" w:hAnsi="Arial"/>
-                <w:b w:val="false"/>
-                <w:bCs w:val="false"/>
-                <w:sz w:val="20"/>
-                <w:szCs w:val="20"/>
-              </w:rPr>
-              <w:t xml:space="preserve">8.17</w:t>
-            </w:r>
-          </w:p>
-        </w:tc>
-        <w:tc>
-          <w:tcPr>
-            <w:tcW w:type="dxa" w:w="4160"/>
-            <w:tcBorders>
-              <w:top w:val="single" w:color="CCCCCC" w:sz="1"/>
-              <w:left w:val="single" w:color="CCCCCC" w:sz="1"/>
-              <w:bottom w:val="single" w:color="CCCCCC" w:sz="1"/>
-              <w:right w:val="single" w:color="CCCCCC" w:sz="1"/>
-            </w:tcBorders>
-            <w:vAlign w:val="center"/>
-          </w:tcPr>
-          <w:p>
-            <w:pPr>
-              <w:spacing w:after="40" w:before="40"/>
-              <w:jc w:val="left"/>
-            </w:pPr>
-            <w:r>
-              <w:rPr>
-                <w:rFonts w:ascii="Arial" w:cs="Arial" w:eastAsia="Arial" w:hAnsi="Arial"/>
-                <w:b w:val="false"/>
-                <w:bCs w:val="false"/>
-                <w:sz w:val="20"/>
-                <w:szCs w:val="20"/>
-              </w:rPr>
-              <w:t xml:space="preserve">Enterprise 849ms vs Free 4,894ms (5.8배 차이)</w:t>
-            </w:r>
-          </w:p>
-        </w:tc>
-      </w:tr>
-    </w:tbl>
-    <w:p>
-      <w:pPr>
-        <w:spacing w:after="120" w:before="120"/>
-      </w:pPr>
-      <w:r>
-        <w:rPr>
-          <w:rFonts w:ascii="Arial" w:cs="Arial" w:eastAsia="Arial" w:hAnsi="Arial"/>
-          <w:sz w:val="22"/>
-          <w:szCs w:val="22"/>
-        </w:rPr>
-        <w:t xml:space="preserve">4가지 알고리즘 모두 처리량은 약 8.17 req/s로 유사하다. 이는 처리량이 스케줄러가 아닌 LLM 백엔드의 추론 속도에 의해 결정되기 때문이다. 따라서 본 연구에서는 대기시간과 공정성을 중심으로 알고리즘을 비교한다.</w:t>
-      </w:r>
-    </w:p>
-    <w:p>
-      <w:pPr>
-        <w:spacing w:after="120"/>
-      </w:pPr>
-      <w:r>
-        <w:rPr>
-          <w:rFonts w:ascii="Arial" w:cs="Arial" w:eastAsia="Arial" w:hAnsi="Arial"/>
-          <w:b/>
-          <w:bCs/>
-          <w:sz w:val="22"/>
-          <w:szCs w:val="22"/>
-        </w:rPr>
-        <w:t xml:space="preserve">Priority Scheduling: </w:t>
-      </w:r>
-      <w:r>
-        <w:rPr>
-          <w:rFonts w:ascii="Arial" w:cs="Arial" w:eastAsia="Arial" w:hAnsi="Arial"/>
-          <w:sz w:val="22"/>
-          <w:szCs w:val="22"/>
-        </w:rPr>
-        <w:t xml:space="preserve">URGENT 요청은 FCFS 대비 62% 빠르게 처리되었다. 에이징 덕분에 낮은 우선순위 요청도 오래 기다리지 않고 처리되었다.</w:t>
-      </w:r>
-    </w:p>
-    <w:p>
-      <w:pPr>
-        <w:spacing w:after="120"/>
-      </w:pPr>
-      <w:r>
-        <w:rPr>
-          <w:rFonts w:ascii="Arial" w:cs="Arial" w:eastAsia="Arial" w:hAnsi="Arial"/>
-          <w:b/>
-          <w:bCs/>
-          <w:sz w:val="22"/>
-          <w:szCs w:val="22"/>
-        </w:rPr>
-        <w:t xml:space="preserve">MLFQ: </w:t>
-      </w:r>
-      <w:r>
-        <w:rPr>
-          <w:rFonts w:ascii="Arial" w:cs="Arial" w:eastAsia="Arial" w:hAnsi="Arial"/>
-          <w:sz w:val="22"/>
-          <w:szCs w:val="22"/>
-        </w:rPr>
-        <w:t xml:space="preserve">짧은 요청과 긴 요청이 섞여 있는 상황에서, 짧은 요청의 대기시간이 FCFS 대비 약 74% 줄어들었다.</w:t>
-      </w:r>
-    </w:p>
-    <w:p>
-      <w:pPr>
-        <w:spacing w:after="120"/>
-      </w:pPr>
-      <w:r>
-        <w:rPr>
-          <w:rFonts w:ascii="Arial" w:cs="Arial" w:eastAsia="Arial" w:hAnsi="Arial"/>
-          <w:b/>
-          <w:bCs/>
-          <w:sz w:val="22"/>
-          <w:szCs w:val="22"/>
-        </w:rPr>
-        <w:t xml:space="preserve">WFQ: </w:t>
-      </w:r>
-      <w:r>
-        <w:rPr>
-          <w:rFonts w:ascii="Arial" w:cs="Arial" w:eastAsia="Arial" w:hAnsi="Arial"/>
-          <w:sz w:val="22"/>
-          <w:szCs w:val="22"/>
-        </w:rPr>
-        <w:t xml:space="preserve">Enterprise 테넌트(가중치 100)는 Free 테넌트(가중치 1) 대비 5.8배 빠른 응답을 받았다. 같은 등급 안에서의 공정성(테넌트 수준 JFI)은 0.92~0.98로 높게 나타났다. 전체 테넌트 간 공정성(시스템 수준 JFI)은 0.32로, 등급별로 의도적으로 차등 서비스를 제공하므로 낮은 값이 정상적인 결과이다.</w:t>
-      </w:r>
-    </w:p>
-    <w:p>
-      <w:pPr>
-        <w:spacing w:after="120"/>
-      </w:pPr>
-      <w:r>
-        <w:rPr>
-          <w:rFonts w:ascii="Arial" w:cs="Arial" w:eastAsia="Arial" w:hAnsi="Arial"/>
-          <w:b/>
-          <w:bCs/>
-          <w:sz w:val="22"/>
-          <w:szCs w:val="22"/>
-        </w:rPr>
-        <w:t xml:space="preserve">공정성: </w:t>
-      </w:r>
-      <w:r>
-        <w:rPr>
-          <w:rFonts w:ascii="Arial" w:cs="Arial" w:eastAsia="Arial" w:hAnsi="Arial"/>
-          <w:sz w:val="22"/>
-          <w:szCs w:val="22"/>
-        </w:rPr>
-        <w:t xml:space="preserve">예비 실험에서는 공정성을 핵심 설계 목표로 삼은 WFQ의 JFI를 우선 측정하였으며, 나머지 알고리즘에 대한 JFI 비교는 본 실험에서 추가로 진행할 예정이다.</w:t>
+          <w:sz w:val="22"/>
+          <w:szCs w:val="22"/>
+        </w:rPr>
+        <w:t xml:space="preserve">3.5절에서 정의한 평가 지표(대기시간, 처리량, 공정성)를 4가지 알고리즘 모두에 동일하게 적용하여 비교한다. 공정성은 시스템 수준(전체 테넌트 간 JFI)과 테넌트 수준(같은 등급 내 JFI)으로 나누어 측정한다.</w:t>
       </w:r>
     </w:p>
     <w:p>
@@ -2541,7 +1891,7 @@
         <w:pStyle w:val="Heading1"/>
       </w:pPr>
       <w:r>
-        <w:t xml:space="preserve">5. 26-1학기 연구 계획</w:t>
+        <w:t xml:space="preserve">5. 연구 일정</w:t>
       </w:r>
     </w:p>
     <w:p>
@@ -2554,7 +1904,7 @@
           <w:sz w:val="22"/>
           <w:szCs w:val="22"/>
         </w:rPr>
-        <w:t xml:space="preserve">겨울방학 동안의 예비 구현 결과를 바탕으로, 26-1학기에는 다음을 추가로 진행한다.</w:t>
+        <w:t xml:space="preserve">26-1학기에는 다음과 같은 활동을 진행한다.</w:t>
       </w:r>
     </w:p>
     <w:p>
@@ -2574,15 +1924,15 @@
           <w:sz w:val="22"/>
           <w:szCs w:val="22"/>
         </w:rPr>
-        <w:t xml:space="preserve">관련연구 추가 조사</w:t>
-      </w:r>
-      <w:r>
-        <w:rPr>
-          <w:rFonts w:ascii="Arial" w:cs="Arial" w:eastAsia="Arial" w:hAnsi="Arial"/>
-          <w:sz w:val="22"/>
-          <w:szCs w:val="22"/>
-        </w:rPr>
-        <w:t xml:space="preserve">: LLM 서빙 분야의 스케줄링 기법을 더 찾아보고, 본 연구와 다른 점을 정리한다.</w:t>
+        <w:t xml:space="preserve">시스템 구현</w:t>
+      </w:r>
+      <w:r>
+        <w:rPr>
+          <w:rFonts w:ascii="Arial" w:cs="Arial" w:eastAsia="Arial" w:hAnsi="Arial"/>
+          <w:sz w:val="22"/>
+          <w:szCs w:val="22"/>
+        </w:rPr>
+        <w:t xml:space="preserve">: 제안 시스템의 4가지 스케줄링 알고리즘과 Rate Limiter를 구현한다.</w:t>
       </w:r>
     </w:p>
     <w:p>
@@ -2602,15 +1952,15 @@
           <w:sz w:val="22"/>
           <w:szCs w:val="22"/>
         </w:rPr>
-        <w:t xml:space="preserve">실험 규모 확대</w:t>
-      </w:r>
-      <w:r>
-        <w:rPr>
-          <w:rFonts w:ascii="Arial" w:cs="Arial" w:eastAsia="Arial" w:hAnsi="Arial"/>
-          <w:sz w:val="22"/>
-          <w:szCs w:val="22"/>
-        </w:rPr>
-        <w:t xml:space="preserve">: 더 많은 요청(10,000건 이상)으로 실험하고, 요청 간 지연(Delay)을 50~500ms 범위로 다양하게 설정하여 실제 서비스 환경에 가까운 조건에서 실험해 본다. 갑자기 요청이 몰리는 경우, 테넌트 비율이 다른 경우 등 다양한 상황을 추가한다.</w:t>
+        <w:t xml:space="preserve">성능 비교 실험</w:t>
+      </w:r>
+      <w:r>
+        <w:rPr>
+          <w:rFonts w:ascii="Arial" w:cs="Arial" w:eastAsia="Arial" w:hAnsi="Arial"/>
+          <w:sz w:val="22"/>
+          <w:szCs w:val="22"/>
+        </w:rPr>
+        <w:t xml:space="preserve">: 4.1~4.2절에서 설계한 조건과 시나리오에 따라 알고리즘별 대기시간, 처리량, 공정성을 비교한다.</w:t>
       </w:r>
     </w:p>
     <w:p>
@@ -2630,15 +1980,15 @@
           <w:sz w:val="22"/>
           <w:szCs w:val="22"/>
         </w:rPr>
-        <w:t xml:space="preserve">공정성 지표 추가 검토</w:t>
-      </w:r>
-      <w:r>
-        <w:rPr>
-          <w:rFonts w:ascii="Arial" w:cs="Arial" w:eastAsia="Arial" w:hAnsi="Arial"/>
-          <w:sz w:val="22"/>
-          <w:szCs w:val="22"/>
-        </w:rPr>
-        <w:t xml:space="preserve">: 4가지 알고리즘 모두에 JFI를 적용하여 비교하고, JFI 외에 다른 공정성 지표도 적용할 수 있는지 살펴본다.</w:t>
+        <w:t xml:space="preserve">관련연구 조사</w:t>
+      </w:r>
+      <w:r>
+        <w:rPr>
+          <w:rFonts w:ascii="Arial" w:cs="Arial" w:eastAsia="Arial" w:hAnsi="Arial"/>
+          <w:sz w:val="22"/>
+          <w:szCs w:val="22"/>
+        </w:rPr>
+        <w:t xml:space="preserve">: LLM 서빙 분야의 스케줄링 기법을 더 찾아보고, 본 연구와 다른 점을 정리한다.</w:t>
       </w:r>
     </w:p>
     <w:p>
@@ -2658,15 +2008,15 @@
           <w:sz w:val="22"/>
           <w:szCs w:val="22"/>
         </w:rPr>
-        <w:t xml:space="preserve">설계 문서 정리</w:t>
-      </w:r>
-      <w:r>
-        <w:rPr>
-          <w:rFonts w:ascii="Arial" w:cs="Arial" w:eastAsia="Arial" w:hAnsi="Arial"/>
-          <w:sz w:val="22"/>
-          <w:szCs w:val="22"/>
-        </w:rPr>
-        <w:t xml:space="preserve">: 아키텍처 상세 설계, 알고리즘 설명, API 명세를 정리한다.</w:t>
+        <w:t xml:space="preserve">결과 정리</w:t>
+      </w:r>
+      <w:r>
+        <w:rPr>
+          <w:rFonts w:ascii="Arial" w:cs="Arial" w:eastAsia="Arial" w:hAnsi="Arial"/>
+          <w:sz w:val="22"/>
+          <w:szCs w:val="22"/>
+        </w:rPr>
+        <w:t xml:space="preserve">: 실험 결과와 아키텍처 설계를 문서로 정리하여 보고서에 포함한다.</w:t>
       </w:r>
     </w:p>
     <w:p>
@@ -2682,7 +2032,7 @@
           <w:sz w:val="20"/>
           <w:szCs w:val="20"/>
         </w:rPr>
-        <w:t xml:space="preserve">표 3. 26-1학기 연구 일정</w:t>
+        <w:t xml:space="preserve">표 2. 26-1학기 연구 일정</w:t>
       </w:r>
     </w:p>
     <w:tbl>
@@ -2991,7 +2341,7 @@
                 <w:sz w:val="20"/>
                 <w:szCs w:val="20"/>
               </w:rPr>
-              <w:t xml:space="preserve">시스템 설계 보완, 추가 실험</w:t>
+              <w:t xml:space="preserve">시스템 구현, 본격 실험 수행</w:t>
             </w:r>
           </w:p>
         </w:tc>
@@ -3105,7 +2455,7 @@
                 <w:sz w:val="20"/>
                 <w:szCs w:val="20"/>
               </w:rPr>
-              <w:t xml:space="preserve">추가 실험, 결과 분석, 최종보고서 작성</w:t>
+              <w:t xml:space="preserve">실험 결과 분석, 최종보고서 작성</w:t>
             </w:r>
           </w:p>
         </w:tc>

</xml_diff>

<commit_message>
Add proposal-v21 document and implement multi-user LLM API request management system using OS scheduling algorithms; include performance evaluation metrics and experimental design.
</commit_message>
<xml_diff>
--- a/04-proposal/final/proposal.docx
+++ b/04-proposal/final/proposal.docx
@@ -1244,7 +1244,7 @@
           <w:sz w:val="22"/>
           <w:szCs w:val="22"/>
         </w:rPr>
-        <w:t xml:space="preserve">: 4가지 스케줄링 알고리즘으로 요청 처리 순서를 결정한다. 알고리즘은 REST API(PUT /api/scheduler)를 통해 교체하도록 설계하며, 이 기능은 운영 중 워크로드(작업량) 변화에 대응하기 위한 서비스용 부가 기능이다. 성능 비교 실험에서는 알고리즘을 고정한 채 진행하며, 실험 도중 교체하지 않는다.</w:t>
+        <w:t xml:space="preserve">: 4가지 스케줄링 알고리즘으로 요청 처리 순서를 결정한다. 알고리즘은 REST API(PUT /api/scheduler)를 통해 교체하도록 설계하며, 이 기능은 운영 중 작업량(워크로드) 변화에 대응하기 위한 서비스용 부가 기능이다. 성능 비교 실험에서는 알고리즘을 고정한 채 진행하며, 실험 도중 교체하지 않는다.</w:t>
       </w:r>
     </w:p>
     <w:p>
@@ -1394,7 +1394,7 @@
           <w:sz w:val="22"/>
           <w:szCs w:val="22"/>
         </w:rPr>
-        <w:t xml:space="preserve">테넌트 등급별 가중치(Enterprise: 100, Premium: 50, Standard: 10, Free: 1)에 비례하여 자원을 분배하는 알고리즘이다 [3]. 본 시스템에서는 네트워크의 흐름(flow) 개념을 테넌트 등급별 가중치로 치환하여 적용한다. 스케줄러는 각 요청의 예상 처리 비용을 테넌트의 가중치로 나눈 값(ΔVFT = Cost / Weight)을 누적하여 가상 종료 시각(Virtual Finish Time, VFT)을 산출한다. 즉, 가중치가 높은 테넌트의 요청일수록 VFT의 증가폭이 작게 계산되므로, 가장 작은 VFT를 가진 요청이 우선적으로 스케줄링된다. WFQ는 가중치 기반으로 자원을 비례 배분하는 구조이므로, Priority의 에이징이나 MLFQ의 부스트와 같은 별도의 기아 방지 장치가 필요하지 않다.</w:t>
+        <w:t xml:space="preserve">테넌트 등급별 가중치(Enterprise: 100, Premium: 50, Standard: 10, Free: 1)에 비례하여 자원을 분배하는 알고리즘이다 [3]. 본 시스템에서는 네트워크의 흐름(flow) 개념을 테넌트 등급별 가중치로 치환하여 적용한다. 스케줄러는 각 요청의 예상 처리 시간을 테넌트의 가중치로 나눈 값(ΔVFT = Cost / Weight)을 누적하여 가상 종료 시각(Virtual Finish Time, VFT)을 산출한다. 즉, 가중치가 높은 테넌트의 요청일수록 VFT의 증가폭이 작게 계산되므로, 가장 작은 VFT를 가진 요청이 우선적으로 스케줄링된다. WFQ는 가중치 기반으로 자원을 비례 배분하는 구조이므로, Priority의 에이징이나 MLFQ의 부스트와 같은 별도의 기아 방지 장치가 필요하지 않다.</w:t>
       </w:r>
     </w:p>
     <w:p>
@@ -1417,6 +1417,75 @@
           <w:sz w:val="22"/>
           <w:szCs w:val="22"/>
         </w:rPr>
+        <w:t xml:space="preserve">공정성 측정: </w:t>
+      </w:r>
+      <w:r>
+        <w:rPr>
+          <w:rFonts w:ascii="Arial" w:cs="Arial" w:eastAsia="Arial" w:hAnsi="Arial"/>
+          <w:sz w:val="22"/>
+          <w:szCs w:val="22"/>
+        </w:rPr>
+        <w:t xml:space="preserve">JFI를 4가지 스케줄링 알고리즘 모두에 적용하여, 각 알고리즘이 자원을 얼마나 공정하게 배분하는지 비교한다. 측정은 시스템 수준(전체 테넌트 간 공정성)과 테넌트 수준(같은 등급 내 요청 간 공정성)으로 나누어 진행한다. WFQ처럼 등급별로 의도적인 차등 서비스를 제공하는 시스템에서는 전체 테넌트 간 JFI가 낮게 나오는 것이 오히려 정상이다. 따라서 같은 등급 내에서 JFI를 따로 측정하여, 시스템이 설계 의도대로 동작하는지 확인한다.</w:t>
+      </w:r>
+    </w:p>
+    <w:p>
+      <w:pPr>
+        <w:spacing w:after="120"/>
+      </w:pPr>
+      <w:r>
+        <w:rPr>
+          <w:rFonts w:ascii="Arial" w:cs="Arial" w:eastAsia="Arial" w:hAnsi="Arial"/>
+          <w:b/>
+          <w:bCs/>
+          <w:sz w:val="22"/>
+          <w:szCs w:val="22"/>
+        </w:rPr>
+        <w:t xml:space="preserve">기아 방지: </w:t>
+      </w:r>
+      <w:r>
+        <w:rPr>
+          <w:rFonts w:ascii="Arial" w:cs="Arial" w:eastAsia="Arial" w:hAnsi="Arial"/>
+          <w:sz w:val="22"/>
+          <w:szCs w:val="22"/>
+        </w:rPr>
+        <w:t xml:space="preserve">Priority 스케줄러의 에이징과 MLFQ 스케줄러의 부스트를 통해 낮은 우선순위 요청이 끝없이 기다리는 것을 방지한다.</w:t>
+      </w:r>
+    </w:p>
+    <w:p>
+      <w:pPr>
+        <w:spacing w:after="120"/>
+      </w:pPr>
+      <w:r>
+        <w:rPr>
+          <w:rFonts w:ascii="Arial" w:cs="Arial" w:eastAsia="Arial" w:hAnsi="Arial"/>
+          <w:b/>
+          <w:bCs/>
+          <w:sz w:val="22"/>
+          <w:szCs w:val="22"/>
+        </w:rPr>
+        <w:t xml:space="preserve">Rate Limiter (속도 제한): </w:t>
+      </w:r>
+      <w:r>
+        <w:rPr>
+          <w:rFonts w:ascii="Arial" w:cs="Arial" w:eastAsia="Arial" w:hAnsi="Arial"/>
+          <w:sz w:val="22"/>
+          <w:szCs w:val="22"/>
+        </w:rPr>
+        <w:t xml:space="preserve">토큰 버킷(Token Bucket) 알고리즘으로 테넌트별 요청 빈도를 제한한다 [3]. 토큰 버킷이란, 일정 시간마다 토큰(요청 권한)이 생기고, 요청할 때마다 토큰을 하나씩 쓰는 방식이다. 토큰이 없으면 요청이 거부된다. 스케줄링 알고리즘과는 별도로, 요청이 스케줄러에 도달하기 전 단계에서 시스템 과부하를 방지하는 보조 기능이다.</w:t>
+      </w:r>
+    </w:p>
+    <w:p>
+      <w:pPr>
+        <w:spacing w:after="120"/>
+      </w:pPr>
+      <w:r>
+        <w:rPr>
+          <w:rFonts w:ascii="Arial" w:cs="Arial" w:eastAsia="Arial" w:hAnsi="Arial"/>
+          <w:b/>
+          <w:bCs/>
+          <w:sz w:val="22"/>
+          <w:szCs w:val="22"/>
+        </w:rPr>
         <w:t xml:space="preserve">실시간 알고리즘 교체: </w:t>
       </w:r>
       <w:r>
@@ -1425,76 +1494,7 @@
           <w:sz w:val="22"/>
           <w:szCs w:val="22"/>
         </w:rPr>
-        <w:t xml:space="preserve">서버 재시작 없이 REST API를 통해 프로그램 실행 중(런타임)에 스케줄링 알고리즘을 전환하도록 설계한다. 이 기능은 운영 환경에서 워크로드가 바뀔 때 최적 알고리즘을 선택하기 위한 서비스용 부가 기능이다. 성능 비교 실험에서는 하나의 알고리즘을 고정하고 전체 실험을 완료한 뒤 다음 알고리즘으로 전환하는 방식으로 진행하며, 실험 도중에는 알고리즘을 교체하지 않는다.</w:t>
-      </w:r>
-    </w:p>
-    <w:p>
-      <w:pPr>
-        <w:spacing w:after="120"/>
-      </w:pPr>
-      <w:r>
-        <w:rPr>
-          <w:rFonts w:ascii="Arial" w:cs="Arial" w:eastAsia="Arial" w:hAnsi="Arial"/>
-          <w:b/>
-          <w:bCs/>
-          <w:sz w:val="22"/>
-          <w:szCs w:val="22"/>
-        </w:rPr>
-        <w:t xml:space="preserve">공정성 측정: </w:t>
-      </w:r>
-      <w:r>
-        <w:rPr>
-          <w:rFonts w:ascii="Arial" w:cs="Arial" w:eastAsia="Arial" w:hAnsi="Arial"/>
-          <w:sz w:val="22"/>
-          <w:szCs w:val="22"/>
-        </w:rPr>
-        <w:t xml:space="preserve">JFI를 4가지 스케줄링 알고리즘 모두에 적용하여, 각 알고리즘이 자원을 얼마나 공정하게 배분하는지 비교한다. 측정은 시스템 수준(전체 테넌트 간 공정성)과 테넌트 수준(같은 등급 내 요청 간 공정성)으로 나누어 진행한다.</w:t>
-      </w:r>
-    </w:p>
-    <w:p>
-      <w:pPr>
-        <w:spacing w:after="120"/>
-      </w:pPr>
-      <w:r>
-        <w:rPr>
-          <w:rFonts w:ascii="Arial" w:cs="Arial" w:eastAsia="Arial" w:hAnsi="Arial"/>
-          <w:b/>
-          <w:bCs/>
-          <w:sz w:val="22"/>
-          <w:szCs w:val="22"/>
-        </w:rPr>
-        <w:t xml:space="preserve">기아 방지: </w:t>
-      </w:r>
-      <w:r>
-        <w:rPr>
-          <w:rFonts w:ascii="Arial" w:cs="Arial" w:eastAsia="Arial" w:hAnsi="Arial"/>
-          <w:sz w:val="22"/>
-          <w:szCs w:val="22"/>
-        </w:rPr>
-        <w:t xml:space="preserve">Priority 스케줄러의 에이징과 MLFQ 스케줄러의 부스트를 통해 낮은 우선순위 요청이 끝없이 기다리는 것을 방지한다.</w:t>
-      </w:r>
-    </w:p>
-    <w:p>
-      <w:pPr>
-        <w:spacing w:after="120"/>
-      </w:pPr>
-      <w:r>
-        <w:rPr>
-          <w:rFonts w:ascii="Arial" w:cs="Arial" w:eastAsia="Arial" w:hAnsi="Arial"/>
-          <w:b/>
-          <w:bCs/>
-          <w:sz w:val="22"/>
-          <w:szCs w:val="22"/>
-        </w:rPr>
-        <w:t xml:space="preserve">Rate Limiter (속도 제한): </w:t>
-      </w:r>
-      <w:r>
-        <w:rPr>
-          <w:rFonts w:ascii="Arial" w:cs="Arial" w:eastAsia="Arial" w:hAnsi="Arial"/>
-          <w:sz w:val="22"/>
-          <w:szCs w:val="22"/>
-        </w:rPr>
-        <w:t xml:space="preserve">토큰 버킷(Token Bucket) 알고리즘으로 테넌트별 요청 빈도를 제한한다 [3]. 토큰 버킷이란, 일정 시간마다 토큰(요청 권한)이 생기고, 요청할 때마다 토큰을 하나씩 쓰는 방식이다. 토큰이 없으면 요청이 거부된다. 스케줄링 알고리즘과는 별도로, 요청이 스케줄러에 도달하기 전 단계에서 시스템 과부하를 방지하는 보조 기능이다.</w:t>
+        <w:t xml:space="preserve">서버 재시작 없이 REST API를 통해 프로그램 실행 중(런타임)에 스케줄링 알고리즘을 전환하도록 설계한다. 이 기능은 운영 환경에서 작업량이 바뀔 때 최적 알고리즘을 선택하기 위한 서비스용 부가 기능이다. 성능 비교 실험에서는 하나의 알고리즘을 고정하고 전체 실험을 완료한 뒤 다음 알고리즘으로 전환하는 방식으로 진행하며, 실험 도중에는 알고리즘을 교체하지 않는다.</w:t>
       </w:r>
     </w:p>
     <w:p>
@@ -1701,7 +1701,7 @@
           <w:sz w:val="22"/>
           <w:szCs w:val="22"/>
         </w:rPr>
-        <w:t xml:space="preserve">: 짧은 요청 40%, 중간 요청 40%, 긴 요청 20%의 비율로 구성한다.</w:t>
+        <w:t xml:space="preserve">: 짧은 요청(프롬프트 50토큰 이하) 40%, 중간 요청(50~200토큰) 40%, 긴 요청(200토큰 이상) 20%의 비율로 구성한다.</w:t>
       </w:r>
     </w:p>
     <w:p>
@@ -1739,6 +1739,34 @@
           <w:ilvl w:val="0"/>
           <w:numId w:val="5"/>
         </w:numPr>
+        <w:spacing w:after="40"/>
+      </w:pPr>
+      <w:r>
+        <w:rPr>
+          <w:rFonts w:ascii="Arial" w:cs="Arial" w:eastAsia="Arial" w:hAnsi="Arial"/>
+          <w:b/>
+          <w:bCs/>
+          <w:sz w:val="22"/>
+          <w:szCs w:val="22"/>
+        </w:rPr>
+        <w:t xml:space="preserve">LLM 모델</w:t>
+      </w:r>
+      <w:r>
+        <w:rPr>
+          <w:rFonts w:ascii="Arial" w:cs="Arial" w:eastAsia="Arial" w:hAnsi="Arial"/>
+          <w:sz w:val="22"/>
+          <w:szCs w:val="22"/>
+        </w:rPr>
+        <w:t xml:space="preserve">: Ollama에서 실행 가능한 경량 모델(llama3, gemma 등)을 사용하여 로컬 환경에서 실험한다.</w:t>
+      </w:r>
+    </w:p>
+    <w:p>
+      <w:pPr>
+        <w:pStyle w:val="ListParagraph"/>
+        <w:numPr>
+          <w:ilvl w:val="0"/>
+          <w:numId w:val="5"/>
+        </w:numPr>
         <w:spacing w:after="120"/>
       </w:pPr>
       <w:r>
@@ -1883,7 +1911,7 @@
           <w:sz w:val="22"/>
           <w:szCs w:val="22"/>
         </w:rPr>
-        <w:t xml:space="preserve">3.5절에서 정의한 평가 지표(대기시간, 처리량, 공정성)를 4가지 알고리즘 모두에 동일하게 적용하여 비교한다. 공정성은 시스템 수준(전체 테넌트 간 JFI)과 테넌트 수준(같은 등급 내 JFI)으로 나누어 측정한다.</w:t>
+        <w:t xml:space="preserve">3.5절에서 정의한 평가 지표(대기시간, 처리량, 공정성)를 4가지 알고리즘 모두에 동일하게 적용하여 비교한다. 공정성은 시스템 수준(전체 테넌트 간 JFI)과 테넌트 수준(같은 등급 내 JFI)으로 나누어 측정한다. 실험 결과는 알고리즘별로 대기시간 분포, 처리량 추이, JFI 변화를 표와 그래프로 정리하여 비교한다.</w:t>
       </w:r>
     </w:p>
     <w:p>

</xml_diff>

<commit_message>
fix: 제안서 리뷰 피드백 반영 (SPEC-DOCS-001)
- JFI xi 정의 명확화: "처리받은 요청 수"로 구체화
- 이중 수준 JFI 측정 설명 보강 (시스템/테넌트 수준)
- Priority 긴급도 로직 명확화 (등급=기본, 긴급도=+1단계)
- WFQ 긴급도 미사용 명시 및 Priority/WFQ 비교 추가
- 3.2/3.4절 중복 제거
- DOCX 3.6절 구현 환경 누락 수정
- DOCX 스크립트 전체 텍스트 동기화 및 재생성

🗿 MoAI <email@mo.ai.kr>
</commit_message>
<xml_diff>
--- a/04-proposal/final/proposal.docx
+++ b/04-proposal/final/proposal.docx
@@ -554,7 +554,7 @@
           <w:sz w:val="22"/>
           <w:szCs w:val="22"/>
         </w:rPr>
-        <w:t xml:space="preserve">여기서 xi는 각 사용자가 받는 자원의 양, n은 사용자 수이다.</w:t>
+        <w:t xml:space="preserve">여기서 xi는 측정 구간 동안 테넌트 i가 처리받은 요청 수이며, n은 테넌트 수이다.</w:t>
       </w:r>
     </w:p>
     <w:p>
@@ -1244,7 +1244,7 @@
           <w:sz w:val="22"/>
           <w:szCs w:val="22"/>
         </w:rPr>
-        <w:t xml:space="preserve">: 4가지 스케줄링 알고리즘으로 요청 처리 순서를 결정한다. 알고리즘은 REST API(PUT /api/scheduler)를 통해 교체하도록 설계하며, 이 기능은 운영 중 작업량(워크로드) 변화에 대응하기 위한 서비스용 부가 기능이다. 성능 비교 실험에서는 알고리즘을 고정한 채 진행하며, 실험 도중 교체하지 않는다.</w:t>
+        <w:t xml:space="preserve">: 4가지 스케줄링 알고리즘으로 요청 처리 순서를 결정한다. 스케줄링 알고리즘은 실행 중 교체할 수 있으며, 상세 내용은 3.4절에서 설명한다.</w:t>
       </w:r>
     </w:p>
     <w:p>
@@ -1352,7 +1352,7 @@
           <w:sz w:val="22"/>
           <w:szCs w:val="22"/>
         </w:rPr>
-        <w:t xml:space="preserve">4단계 우선순위(URGENT &gt; HIGH &gt; NORMAL &gt; LOW)를 지원한다 [1]. 요청의 우선순위는 API 계층에서 테넌트 등급과 요청 헤더의 긴급도 필드를 조합하여 결정한다. 에이징(Aging)을 통해, 대기 시간이 일정 시간을 넘으면 요청의 우선순위가 자동으로 한 단계 올라가서 기아 현상을 방지한다.</w:t>
+        <w:t xml:space="preserve">4단계 우선순위(URGENT &gt; HIGH &gt; NORMAL &gt; LOW)를 지원한다 [1]. 요청의 우선순위는 API 계층에서 테넌트 등급을 기준으로 결정하되, 요청 헤더의 긴급도 플래그가 설정된 경우 우선순위를 한 단계 상승시킨다. 기본 매핑은 Enterprise=HIGH, Premium=NORMAL, Standard=LOW, Free=LOW이며, 긴급도 플래그가 켜지면 각각 URGENT, HIGH, NORMAL, LOW로 한 단계씩 올라간다. 에이징(Aging)을 통해, 대기 시간이 일정 시간을 넘으면 요청의 우선순위가 자동으로 한 단계 올라가서 기아 현상을 방지한다.</w:t>
       </w:r>
     </w:p>
     <w:p>
@@ -1394,7 +1394,20 @@
           <w:sz w:val="22"/>
           <w:szCs w:val="22"/>
         </w:rPr>
-        <w:t xml:space="preserve">테넌트 등급별 가중치(Enterprise: 100, Premium: 50, Standard: 10, Free: 1)에 비례하여 자원을 분배하는 알고리즘이다 [3]. 본 시스템에서는 네트워크의 흐름(flow) 개념을 테넌트 등급별 가중치로 치환하여 적용한다. 스케줄러는 각 요청의 예상 처리 시간을 테넌트의 가중치로 나눈 값(ΔVFT = Cost / Weight)을 누적하여 가상 종료 시각(Virtual Finish Time, VFT)을 산출한다. 즉, 가중치가 높은 테넌트의 요청일수록 VFT의 증가폭이 작게 계산되므로, 가장 작은 VFT를 가진 요청이 우선적으로 스케줄링된다. WFQ는 가중치 기반으로 자원을 비례 배분하는 구조이므로, Priority의 에이징이나 MLFQ의 부스트와 같은 별도의 기아 방지 장치가 필요하지 않다.</w:t>
+        <w:t xml:space="preserve">테넌트 등급별 가중치(Enterprise: 100, Premium: 50, Standard: 10, Free: 1)에 비례하여 자원을 분배하는 알고리즘이다 [3]. 본 시스템에서는 네트워크의 흐름(flow) 개념을 테넌트 등급별 가중치로 치환하여 적용한다. 스케줄러는 각 요청의 예상 처리 시간을 테넌트의 가중치로 나눈 값(ΔVFT = Cost / Weight)을 누적하여 가상 종료 시각(Virtual Finish Time, VFT)을 산출한다. 즉, 가중치가 높은 테넌트의 요청일수록 VFT의 증가폭이 작게 계산되므로, 가장 작은 VFT를 가진 요청이 우선적으로 스케줄링된다. WFQ는 테넌트 등급별 가중치만을 기준으로 자원을 배분하며, 개별 요청의 긴급도 필드는 사용하지 않는다. 이는 WFQ의 목적이 긴급 요청 우선 처리가 아니라 등급 간 비례적 자원 배분이기 때문이다. WFQ는 가중치 기반으로 자원을 비례 배분하는 구조이므로, Priority의 에이징이나 MLFQ의 부스트와 같은 별도의 기아 방지 장치가 필요하지 않다.</w:t>
+      </w:r>
+    </w:p>
+    <w:p>
+      <w:pPr>
+        <w:spacing w:after="120"/>
+      </w:pPr>
+      <w:r>
+        <w:rPr>
+          <w:rFonts w:ascii="Arial" w:cs="Arial" w:eastAsia="Arial" w:hAnsi="Arial"/>
+          <w:sz w:val="22"/>
+          <w:szCs w:val="22"/>
+        </w:rPr>
+        <w:t xml:space="preserve">정리하면, Priority는 등급과 긴급도를 조합하여 절대적 순서를 매기는 방식(높은 우선순위가 항상 먼저)이고, WFQ는 등급만을 기준으로 비례적 배분을 수행하는 방식(모든 등급이 가중치 비율대로 서비스)이다.</w:t>
       </w:r>
     </w:p>
     <w:p>
@@ -1425,7 +1438,7 @@
           <w:sz w:val="22"/>
           <w:szCs w:val="22"/>
         </w:rPr>
-        <w:t xml:space="preserve">JFI를 4가지 스케줄링 알고리즘 모두에 적용하여, 각 알고리즘이 자원을 얼마나 공정하게 배분하는지 비교한다. 측정은 시스템 수준(전체 테넌트 간 공정성)과 테넌트 수준(같은 등급 내 요청 간 공정성)으로 나누어 진행한다. WFQ처럼 등급별로 의도적인 차등 서비스를 제공하는 시스템에서는 전체 테넌트 간 JFI가 낮게 나오는 것이 오히려 정상이다. 따라서 같은 등급 내에서 JFI를 따로 측정하여, 시스템이 설계 의도대로 동작하는지 확인한다.</w:t>
+        <w:t xml:space="preserve">JFI를 4가지 스케줄링 알고리즘 모두에 적용하여, 각 알고리즘이 자원을 얼마나 공정하게 배분하는지 비교한다. 측정은 시스템 수준(전체 테넌트 간 공정성)과 테넌트 수준(같은 등급 내 요청 간 공정성)으로 나누어 진행한다. WFQ처럼 등급별로 의도적인 차등 서비스를 제공하는 시스템에서는 전체 테넌트 간 JFI가 낮게 나오는 것이 오히려 정상이다. 따라서 같은 등급 내에서 JFI를 따로 측정하여, 시스템이 설계 의도대로 동작하는지 확인한다. 구체적으로, 시스템 수준 JFI에서 xi는 테넌트 i가 전체 시스템에서 처리받은 요청 수이다. FCFS와 MLFQ에서는 이 값이 1에 가까워야 공정한 것이며, WFQ에서는 등급별 가중치에 따라 처리량이 달라지므로 낮게 나오는 것이 정상이다. 테넌트 수준 JFI에서 xi는 같은 등급 내 테넌트 i가 처리받은 요청 수이며, 모든 알고리즘에서 1에 가까워야 같은 등급 내 공정성이 보장된 것이다. 즉, 시스템 수준에서 xi는 가중치를 반영하지 않은 처리 요청 수이므로, 등급별 가중치가 다른 WFQ에서는 JFI가 낮게 나오며, 이는 가중치에 비례한 차등 서비스가 의도대로 동작하고 있음을 의미한다.</w:t>
       </w:r>
     </w:p>
     <w:p>
@@ -1617,6 +1630,124 @@
           <w:szCs w:val="22"/>
         </w:rPr>
         <w:t xml:space="preserve">: JFI를 사용하여 자원이 사용자 간에 얼마나 고르게 배분되었는지를 측정한다. 0에서 1 사이의 값이며, 1에 가까울수록 공정하다.</w:t>
+      </w:r>
+    </w:p>
+    <w:p>
+      <w:pPr>
+        <w:pStyle w:val="Heading2"/>
+      </w:pPr>
+      <w:r>
+        <w:t xml:space="preserve">3.6 구현 환경</w:t>
+      </w:r>
+    </w:p>
+    <w:p>
+      <w:pPr>
+        <w:spacing w:after="60"/>
+      </w:pPr>
+      <w:r>
+        <w:rPr>
+          <w:rFonts w:ascii="Arial" w:cs="Arial" w:eastAsia="Arial" w:hAnsi="Arial"/>
+          <w:sz w:val="22"/>
+          <w:szCs w:val="22"/>
+        </w:rPr>
+        <w:t xml:space="preserve">본 시스템은 다음과 같은 환경에서 구현한다.</w:t>
+      </w:r>
+    </w:p>
+    <w:p>
+      <w:pPr>
+        <w:pStyle w:val="ListParagraph"/>
+        <w:numPr>
+          <w:ilvl w:val="0"/>
+          <w:numId w:val="5"/>
+        </w:numPr>
+        <w:spacing w:after="40"/>
+      </w:pPr>
+      <w:r>
+        <w:rPr>
+          <w:rFonts w:ascii="Arial" w:cs="Arial" w:eastAsia="Arial" w:hAnsi="Arial"/>
+          <w:b/>
+          <w:bCs/>
+          <w:sz w:val="22"/>
+          <w:szCs w:val="22"/>
+        </w:rPr>
+        <w:t xml:space="preserve">서버</w:t>
+      </w:r>
+      <w:r>
+        <w:rPr>
+          <w:rFonts w:ascii="Arial" w:cs="Arial" w:eastAsia="Arial" w:hAnsi="Arial"/>
+          <w:sz w:val="22"/>
+          <w:szCs w:val="22"/>
+        </w:rPr>
+        <w:t xml:space="preserve">: Node.js 22 LTS, Express.js 4.18 [7][8]</w:t>
+      </w:r>
+    </w:p>
+    <w:p>
+      <w:pPr>
+        <w:pStyle w:val="ListParagraph"/>
+        <w:numPr>
+          <w:ilvl w:val="0"/>
+          <w:numId w:val="5"/>
+        </w:numPr>
+        <w:spacing w:after="40"/>
+      </w:pPr>
+      <w:r>
+        <w:rPr>
+          <w:rFonts w:ascii="Arial" w:cs="Arial" w:eastAsia="Arial" w:hAnsi="Arial"/>
+          <w:b/>
+          <w:bCs/>
+          <w:sz w:val="22"/>
+          <w:szCs w:val="22"/>
+        </w:rPr>
+        <w:t xml:space="preserve">LLM 백엔드</w:t>
+      </w:r>
+      <w:r>
+        <w:rPr>
+          <w:rFonts w:ascii="Arial" w:cs="Arial" w:eastAsia="Arial" w:hAnsi="Arial"/>
+          <w:sz w:val="22"/>
+          <w:szCs w:val="22"/>
+        </w:rPr>
+        <w:t xml:space="preserve">: Ollama(로컬 환경에서 LLM을 간편하게 실행할 수 있는 도구) [6]</w:t>
+      </w:r>
+    </w:p>
+    <w:p>
+      <w:pPr>
+        <w:pStyle w:val="ListParagraph"/>
+        <w:numPr>
+          <w:ilvl w:val="0"/>
+          <w:numId w:val="5"/>
+        </w:numPr>
+        <w:spacing w:after="120"/>
+      </w:pPr>
+      <w:r>
+        <w:rPr>
+          <w:rFonts w:ascii="Arial" w:cs="Arial" w:eastAsia="Arial" w:hAnsi="Arial"/>
+          <w:b/>
+          <w:bCs/>
+          <w:sz w:val="22"/>
+          <w:szCs w:val="22"/>
+        </w:rPr>
+        <w:t xml:space="preserve">외부 의존성</w:t>
+      </w:r>
+      <w:r>
+        <w:rPr>
+          <w:rFonts w:ascii="Arial" w:cs="Arial" w:eastAsia="Arial" w:hAnsi="Arial"/>
+          <w:sz w:val="22"/>
+          <w:szCs w:val="22"/>
+        </w:rPr>
+        <w:t xml:space="preserve">: 1개 패키지 (express)</w:t>
+      </w:r>
+    </w:p>
+    <w:p>
+      <w:pPr>
+        <w:spacing w:after="120"/>
+      </w:pPr>
+      <w:r>
+        <w:rPr>
+          <w:rFonts w:ascii="Arial" w:cs="Arial" w:eastAsia="Arial" w:hAnsi="Arial"/>
+          <w:sz w:val="22"/>
+          <w:szCs w:val="22"/>
+        </w:rPr>
+        <w:t xml:space="preserve">Node.js와 Express.js는 웹 서버를 구축하기 위한 도구이며, Ollama는 로컬 컴퓨터에서 LLM을 실행하여 외부 API 비용 없이 실험할 수 있게 해준다. 4가지 스케줄링 알고리즘과 Rate Limiter를 모두 구현하여 성능 비교 실험에 활용한다.</w:t>
       </w:r>
     </w:p>
     <w:p>

</xml_diff>

<commit_message>
Implement multi-user LLM API request management system using OS scheduling algorithms; add proposal document and figures, update review feedback, and clarify JFI calculations.
</commit_message>
<xml_diff>
--- a/04-proposal/final/proposal.docx
+++ b/04-proposal/final/proposal.docx
@@ -554,7 +554,7 @@
           <w:sz w:val="22"/>
           <w:szCs w:val="22"/>
         </w:rPr>
-        <w:t xml:space="preserve">여기서 xi는 측정 구간 동안 테넌트 i가 처리받은 요청 수이며, n은 테넌트 수이다.</w:t>
+        <w:t xml:space="preserve">여기서 xi는 측정 구간 동안 테넌트 i가 할당받은 자원량이며, n은 테넌트 수이다. 본 시스템에서는 스케줄러가 요청 단위로 동작하므로, xi를 처리 완료된 요청 수로 정의한다.</w:t>
       </w:r>
     </w:p>
     <w:p>
@@ -863,7 +863,7 @@
                 <w:sz w:val="20"/>
                 <w:szCs w:val="20"/>
               </w:rPr>
-              <w:t xml:space="preserve">API 호출 허용량</w:t>
+              <w:t xml:space="preserve">요청 처리 시간</w:t>
             </w:r>
           </w:p>
         </w:tc>
@@ -1420,7 +1420,7 @@
           <w:sz w:val="22"/>
           <w:szCs w:val="22"/>
         </w:rPr>
-        <w:t xml:space="preserve">테넌트 등급별 가중치에 비례하여 자원을 분배하는 알고리즘이다 [3]. 2.1절에서 설명한 GPS의 이상적 모델을 개별 요청 단위로 구현한 것이 WFQ이며, 본 시스템에서는 네트워크의 흐름(flow) 개념을 테넌트 등급별 가중치로 치환하여 적용한다. 등급이 높은 테넌트에 큰 가중치를, 낮은 등급에 작은 가중치를 부여한다(Enterprise=100, Premium=50, Standard=10, Free=1). 스케줄러는 각 요청의 예상 처리 시간을 테넌트의 가중치로 나눈 값(ΔVFT = Cost / Weight)을 누적하여 가상 종료 시각(Virtual Finish Time, VFT)을 산출한다. 즉, 가중치가 높은 테넌트의 요청일수록 VFT의 증가폭이 작게 계산되므로, 가장 작은 VFT를 가진 요청이 우선적으로 스케줄링된다.</w:t>
+        <w:t xml:space="preserve">테넌트 등급별 가중치에 비례하여 자원을 분배하는 알고리즘이다 [3]. 2.1절에서 설명한 GPS의 이상적 모델을 개별 요청 단위로 구현한 것이 WFQ이며, 본 시스템에서는 네트워크의 흐름(flow) 개념을 테넌트 등급별 가중치로 치환하여 적용한다. 등급이 높은 테넌트에 큰 가중치를, 낮은 등급에 작은 가중치를 부여한다(Enterprise=100, Premium=50, Standard=10, Free=1). 스케줄러는 각 요청의 비용(Cost)을 테넌트의 가중치로 나눈 값(ΔVFT = Cost / Weight)을 누적하여 가상 종료 시각(Virtual Finish Time, VFT)을 산출한다. 본 시스템에서는 요청 간 비용 차이를 별도로 모델링하지 않고, 모든 요청의 비용을 균일하게 1로 설정한다(Cost = 1). 따라서 ΔVFT = 1 / Weight가 되어, 가중치가 높은 테넌트의 요청일수록 VFT의 증가폭이 작게 계산되므로, 가장 작은 VFT를 가진 요청이 우선적으로 스케줄링된다.</w:t>
       </w:r>
     </w:p>
     <w:p>
@@ -1477,20 +1477,33 @@
           <w:sz w:val="22"/>
           <w:szCs w:val="22"/>
         </w:rPr>
-        <w:t xml:space="preserve">JFI를 4가지 스케줄링 알고리즘 모두에 적용하여, 각 알고리즘이 자원을 얼마나 공정하게 배분하는지 비교한다. 측정은 시스템 수준(전체 테넌트 간 공정성)과 테넌트 수준(같은 등급 내 요청 간 공정성)으로 나누어 진행한다. WFQ처럼 등급별로 의도적인 차등 서비스를 제공하는 시스템에서는 전체 테넌트 간 JFI가 낮게 나오는 것이 오히려 정상이다. 따라서 같은 등급 내에서 JFI를 따로 측정하여, 시스템이 설계 의도대로 동작하는지 확인한다.</w:t>
-      </w:r>
-    </w:p>
-    <w:p>
-      <w:pPr>
-        <w:spacing w:after="120"/>
-      </w:pPr>
-      <w:r>
-        <w:rPr>
-          <w:rFonts w:ascii="Arial" w:cs="Arial" w:eastAsia="Arial" w:hAnsi="Arial"/>
-          <w:sz w:val="22"/>
-          <w:szCs w:val="22"/>
-        </w:rPr>
-        <w:t xml:space="preserve">구체적으로, 시스템 수준 JFI에서 xi는 테넌트 i가 전체 시스템에서 처리받은 요청 수이다. FCFS와 MLFQ에서는 이 값이 1에 가까워야 공정한 것이며, WFQ에서는 등급별 가중치에 따라 처리량이 달라지므로 낮게 나오는 것이 정상이다. 테넌트 수준 JFI에서 xi는 같은 등급 내 테넌트 i가 처리받은 요청 수이며, 모든 알고리즘에서 1에 가까워야 같은 등급 내 공정성이 보장된 것이다. 즉, 시스템 수준에서 xi는 가중치를 반영하지 않은 처리 요청 수이므로, 등급별 가중치가 다른 WFQ에서는 JFI가 낮게 나오며, 이는 가중치에 비례한 차등 서비스가 의도대로 동작하고 있음을 의미한다.</w:t>
+        <w:t xml:space="preserve">2.3절에서 정의한 JFI를 4가지 스케줄링 알고리즘 모두에 적용하여, 각 알고리즘이 자원을 얼마나 공정하게 배분하는지 비교한다. 공정성은 두 가지 수준으로 나누어 측정한다.</w:t>
+      </w:r>
+    </w:p>
+    <w:p>
+      <w:pPr>
+        <w:spacing w:after="120"/>
+      </w:pPr>
+      <w:r>
+        <w:rPr>
+          <w:rFonts w:ascii="Arial" w:cs="Arial" w:eastAsia="Arial" w:hAnsi="Arial"/>
+          <w:sz w:val="22"/>
+          <w:szCs w:val="22"/>
+        </w:rPr>
+        <w:t xml:space="preserve">시스템 수준 JFI: 전체 테넌트를 대상으로 xi = 테넌트 i의 처리 완료 요청 수로 측정한다. 모든 테넌트가 동일한 수의 요청을 처리받았는지를 평가한다. FCFS, Priority, MLFQ에서는 1에 가까울수록 공정하다. 반면 WFQ는 등급별 가중치에 비례하여 의도적으로 차등 배분하므로, 시스템 수준 JFI가 1보다 낮게 나오는 것이 정상이다. 이 경우 낮은 JFI는 불공정이 아니라, 가중치 기반 차등 서비스가 설계대로 동작하고 있음을 의미한다.</w:t>
+      </w:r>
+    </w:p>
+    <w:p>
+      <w:pPr>
+        <w:spacing w:after="120"/>
+      </w:pPr>
+      <w:r>
+        <w:rPr>
+          <w:rFonts w:ascii="Arial" w:cs="Arial" w:eastAsia="Arial" w:hAnsi="Arial"/>
+          <w:sz w:val="22"/>
+          <w:szCs w:val="22"/>
+        </w:rPr>
+        <w:t xml:space="preserve">테넌트 수준 JFI: 같은 등급 내 테넌트만을 대상으로 xi = 해당 등급 내 테넌트 i의 처리 완료 요청 수로 측정한다. 같은 등급의 테넌트끼리 공정하게 서비스를 받았는지를 평가하며, 모든 알고리즘에서 1에 가까워야 한다.</w:t>
       </w:r>
     </w:p>
     <w:p>
@@ -1536,7 +1549,7 @@
           <w:sz w:val="22"/>
           <w:szCs w:val="22"/>
         </w:rPr>
-        <w:t xml:space="preserve">토큰 버킷(Token Bucket) 알고리즘으로 테넌트별 요청 빈도를 제한한다 [3]. 토큰 버킷이란, 일정 시간마다 토큰(요청 권한)이 생기고, 요청할 때마다 토큰을 하나씩 쓰는 방식이다. 토큰이 없으면 요청이 거부된다. 스케줄링 알고리즘과는 별도로, 요청이 스케줄러에 도달하기 전 단계에서 시스템 과부하를 방지하는 보조 기능이다.</w:t>
+        <w:t xml:space="preserve">토큰 버킷(Token Bucket) 알고리즘으로 테넌트별 요청 빈도를 제한한다 [3]. 토큰 버킷이란, 일정 시간마다 버킷 토큰(요청 허가 단위)이 생성되고, 요청 1건마다 버킷 토큰을 하나 소비하여 요청 빈도를 제한하는 방식이다. 여기서 '버킷 토큰'은 요청 허가를 나타내는 개념으로, LLM이 처리하는 언어 토큰과는 다른 개념이다. 버킷 토큰이 없으면 요청이 거부된다. 스케줄링 알고리즘과는 별도로, 요청이 스케줄러에 도달하기 전 단계에서 시스템 과부하를 방지하는 보조 기능이다.</w:t>
       </w:r>
     </w:p>
     <w:p>
@@ -1653,7 +1666,7 @@
           <w:sz w:val="22"/>
           <w:szCs w:val="22"/>
         </w:rPr>
-        <w:t xml:space="preserve">: 단위 시간당 처리 완료되는 요청의 수(req/s)이다. 시스템이 얼마나 효율적으로 요청을 소화하는지를 나타낸다.</w:t>
+        <w:t xml:space="preserve">: 단위 시간당 처리 완료되는 요청의 수(req/s)이다. 부가 지표로 단위 시간당 생성된 토큰 수(tokens/s)도 함께 기록한다. 시스템이 얼마나 효율적으로 요청을 소화하는지를 나타낸다.</w:t>
       </w:r>
     </w:p>
     <w:p>

</xml_diff>

<commit_message>
Update proposal document to v23 and reflect review feedback
- Changed the base markdown file for DOCX generation from proposal-v22.md to proposal-v23.md.
- Updated terminology in the generated document, including changes to CPU time and LLM inference time.
- Enhanced explanations in the document for clarity, particularly regarding scheduling algorithms and fairness metrics.
- Merged sections on experimental plans and research schedules for better organization.
- Removed redundant paragraphs and refined the content for conciseness.
- Generated new DOCX file reflecting all changes.
</commit_message>
<xml_diff>
--- a/04-proposal/final/proposal.docx
+++ b/04-proposal/final/proposal.docx
@@ -863,7 +863,7 @@
                 <w:sz w:val="20"/>
                 <w:szCs w:val="20"/>
               </w:rPr>
-              <w:t xml:space="preserve">요청 처리 시간</w:t>
+              <w:t xml:space="preserve">LLM 추론 시간</w:t>
             </w:r>
           </w:p>
         </w:tc>
@@ -1344,7 +1344,7 @@
           <w:sz w:val="22"/>
           <w:szCs w:val="22"/>
         </w:rPr>
-        <w:t xml:space="preserve">선착순 처리 알고리즘으로, 요청이 도착한 순서대로 처리한다. 구현이 간단하며 다른 알고리즘과 비교할 때 기준(베이스라인)으로 사용한다. 본 시스템에서는 도착 시각 기준으로 정렬된 단일 큐를 사용하여, 앞선 요청이 완료되어야 다음 요청이 처리되는 비선점형 방식으로 동작한다.</w:t>
+        <w:t xml:space="preserve">선착순 처리 알고리즘으로, 요청이 도착한 순서대로 처리한다. 구현이 간단하며 다른 알고리즘과 비교할 때 기준(베이스라인)으로 사용한다. 본 시스템에서는 도착 시각 기준으로 정렬된 단일 큐를 사용하여, 앞선 요청이 완료되어야 다음 요청이 처리되는 비선점형(Non-preemptive, 실행 중인 요청을 중단하지 않는) 방식으로 동작한다.</w:t>
       </w:r>
     </w:p>
     <w:p>
@@ -1420,7 +1420,7 @@
           <w:sz w:val="22"/>
           <w:szCs w:val="22"/>
         </w:rPr>
-        <w:t xml:space="preserve">테넌트 등급별 가중치에 비례하여 자원을 분배하는 알고리즘이다 [3]. 2.1절에서 설명한 GPS의 이상적 모델을 개별 요청 단위로 구현한 것이 WFQ이며, 본 시스템에서는 네트워크의 흐름(flow) 개념을 테넌트 등급별 가중치로 치환하여 적용한다. 등급이 높은 테넌트에 큰 가중치를, 낮은 등급에 작은 가중치를 부여한다(Enterprise=100, Premium=50, Standard=10, Free=1). 스케줄러는 각 요청의 비용(Cost)을 테넌트의 가중치로 나눈 값(ΔVFT = Cost / Weight)을 누적하여 가상 종료 시각(Virtual Finish Time, VFT)을 산출한다. 본 시스템에서는 요청 간 비용 차이를 별도로 모델링하지 않고, 모든 요청의 비용을 균일하게 1로 설정한다(Cost = 1). 따라서 ΔVFT = 1 / Weight가 되어, 가중치가 높은 테넌트의 요청일수록 VFT의 증가폭이 작게 계산되므로, 가장 작은 VFT를 가진 요청이 우선적으로 스케줄링된다.</w:t>
+        <w:t xml:space="preserve">테넌트 등급별 가중치에 비례하여 자원을 분배하는 알고리즘이다 [3]. 2.1절에서 설명한 GPS의 이상적 모델을 개별 요청 단위로 구현한 것이 WFQ이며, 본 시스템에서는 네트워크의 흐름(flow) 개념을 테넌트 등급별 가중치로 치환하여 적용한다. 등급이 높은 테넌트에 큰 가중치를, 낮은 등급에 작은 가중치를 부여한다(Enterprise=100, Premium=50, Standard=10, Free=1). 스케줄러는 각 요청의 비용(Cost)을 테넌트의 가중치로 나눈 값(ΔVFT = Cost / Weight)을 누적하여 가상 종료 시각(Virtual Finish Time, VFT)을 산출한다. 본 시스템에서는 요청 간 비용 차이를 별도로 수학적으로 표현(모델링)하지 않고, 모든 요청의 비용을 균일하게 1로 설정한다(Cost = 1). 따라서 ΔVFT = 1 / Weight가 되어, 가중치가 높은 테넌트의 요청일수록 VFT의 증가폭이 작게 계산되므로, 가장 작은 VFT를 가진 요청이 우선적으로 스케줄링된다.</w:t>
       </w:r>
     </w:p>
     <w:p>
@@ -1490,7 +1490,7 @@
           <w:sz w:val="22"/>
           <w:szCs w:val="22"/>
         </w:rPr>
-        <w:t xml:space="preserve">시스템 수준 JFI: 전체 테넌트를 대상으로 xi = 테넌트 i의 처리 완료 요청 수로 측정한다. 모든 테넌트가 동일한 수의 요청을 처리받았는지를 평가한다. FCFS, Priority, MLFQ에서는 1에 가까울수록 공정하다. 반면 WFQ는 등급별 가중치에 비례하여 의도적으로 차등 배분하므로, 시스템 수준 JFI가 1보다 낮게 나오는 것이 정상이다. 이 경우 낮은 JFI는 불공정이 아니라, 가중치 기반 차등 서비스가 설계대로 동작하고 있음을 의미한다.</w:t>
+        <w:t xml:space="preserve">시스템 수준 JFI: 전체 테넌트를 대상으로 xi = 테넌트 i의 처리 완료 요청 수로 측정한다. 모든 테넌트가 동일한 수의 요청을 처리받았는지를 평가한다. FCFS와 MLFQ에서는 등급과 무관하게 요청을 처리하므로 1에 가까울수록 공정하다. Priority에서는 에이징이 기아를 방지하지만, 높은 등급의 요청이 먼저 처리되므로 실험 시간 내에 등급별 처리량 차이가 발생할 수 있어, 시스템 수준 JFI가 1보다 낮을 수 있다. WFQ는 등급별 가중치에 비례하여 의도적으로 차등 배분하므로, 시스템 수준 JFI가 1보다 낮게 나오는 것이 정상이다. Priority와 WFQ 모두 시스템 수준 JFI가 낮게 나올 수 있으나, 그 원인은 다르다. Priority는 처리 순서의 차이에서, WFQ는 가중치 기반 비례 배분에서 비롯된다.</w:t>
       </w:r>
     </w:p>
     <w:p>
@@ -1820,7 +1820,7 @@
         <w:pStyle w:val="Heading1"/>
       </w:pPr>
       <w:r>
-        <w:t xml:space="preserve">4. 실험 계획</w:t>
+        <w:t xml:space="preserve">4. 실험 계획 및 연구 일정</w:t>
       </w:r>
     </w:p>
     <w:p>
@@ -1917,15 +1917,64 @@
           <w:sz w:val="22"/>
           <w:szCs w:val="22"/>
         </w:rPr>
-        <w:t xml:space="preserve">요청 간 지연</w:t>
-      </w:r>
-      <w:r>
-        <w:rPr>
-          <w:rFonts w:ascii="Arial" w:cs="Arial" w:eastAsia="Arial" w:hAnsi="Arial"/>
-          <w:sz w:val="22"/>
-          <w:szCs w:val="22"/>
-        </w:rPr>
-        <w:t xml:space="preserve">: 50~500ms 범위에서 다양하게 설정하여 실제 서비스 환경에 가깝게 구성한다.</w:t>
+        <w:t xml:space="preserve">LLM 모델</w:t>
+      </w:r>
+      <w:r>
+        <w:rPr>
+          <w:rFonts w:ascii="Arial" w:cs="Arial" w:eastAsia="Arial" w:hAnsi="Arial"/>
+          <w:sz w:val="22"/>
+          <w:szCs w:val="22"/>
+        </w:rPr>
+        <w:t xml:space="preserve">: Ollama에서 실행 가능한 경량 모델(llama3, gemma 등)을 사용하여 로컬 환경에서 실험한다.</w:t>
+      </w:r>
+    </w:p>
+    <w:p>
+      <w:pPr>
+        <w:pStyle w:val="ListParagraph"/>
+        <w:numPr>
+          <w:ilvl w:val="0"/>
+          <w:numId w:val="5"/>
+        </w:numPr>
+        <w:spacing w:after="120"/>
+      </w:pPr>
+      <w:r>
+        <w:rPr>
+          <w:rFonts w:ascii="Arial" w:cs="Arial" w:eastAsia="Arial" w:hAnsi="Arial"/>
+          <w:b/>
+          <w:bCs/>
+          <w:sz w:val="22"/>
+          <w:szCs w:val="22"/>
+        </w:rPr>
+        <w:t xml:space="preserve">변인 통제</w:t>
+      </w:r>
+      <w:r>
+        <w:rPr>
+          <w:rFonts w:ascii="Arial" w:cs="Arial" w:eastAsia="Arial" w:hAnsi="Arial"/>
+          <w:sz w:val="22"/>
+          <w:szCs w:val="22"/>
+        </w:rPr>
+        <w:t xml:space="preserve">: 4가지 스케줄링 알고리즘 간의 순수 성능 비교가 목적이므로, 전처리 모듈인 Rate Limiter는 비활성화한 상태에서 진행한다.</w:t>
+      </w:r>
+    </w:p>
+    <w:p>
+      <w:pPr>
+        <w:pStyle w:val="Heading2"/>
+      </w:pPr>
+      <w:r>
+        <w:t xml:space="preserve">4.2 실험 시나리오</w:t>
+      </w:r>
+    </w:p>
+    <w:p>
+      <w:pPr>
+        <w:spacing w:after="120"/>
+      </w:pPr>
+      <w:r>
+        <w:rPr>
+          <w:rFonts w:ascii="Arial" w:cs="Arial" w:eastAsia="Arial" w:hAnsi="Arial"/>
+          <w:sz w:val="22"/>
+          <w:szCs w:val="22"/>
+        </w:rPr>
+        <w:t xml:space="preserve">다양한 조건에서 알고리즘의 특성을 비교하기 위해, 다음과 같은 시나리오를 설계한다.</w:t>
       </w:r>
     </w:p>
     <w:p>
@@ -1945,64 +1994,15 @@
           <w:sz w:val="22"/>
           <w:szCs w:val="22"/>
         </w:rPr>
-        <w:t xml:space="preserve">LLM 모델</w:t>
-      </w:r>
-      <w:r>
-        <w:rPr>
-          <w:rFonts w:ascii="Arial" w:cs="Arial" w:eastAsia="Arial" w:hAnsi="Arial"/>
-          <w:sz w:val="22"/>
-          <w:szCs w:val="22"/>
-        </w:rPr>
-        <w:t xml:space="preserve">: Ollama에서 실행 가능한 경량 모델(llama3, gemma 등)을 사용하여 로컬 환경에서 실험한다.</w:t>
-      </w:r>
-    </w:p>
-    <w:p>
-      <w:pPr>
-        <w:pStyle w:val="ListParagraph"/>
-        <w:numPr>
-          <w:ilvl w:val="0"/>
-          <w:numId w:val="5"/>
-        </w:numPr>
-        <w:spacing w:after="120"/>
-      </w:pPr>
-      <w:r>
-        <w:rPr>
-          <w:rFonts w:ascii="Arial" w:cs="Arial" w:eastAsia="Arial" w:hAnsi="Arial"/>
-          <w:b/>
-          <w:bCs/>
-          <w:sz w:val="22"/>
-          <w:szCs w:val="22"/>
-        </w:rPr>
-        <w:t xml:space="preserve">변인 통제</w:t>
-      </w:r>
-      <w:r>
-        <w:rPr>
-          <w:rFonts w:ascii="Arial" w:cs="Arial" w:eastAsia="Arial" w:hAnsi="Arial"/>
-          <w:sz w:val="22"/>
-          <w:szCs w:val="22"/>
-        </w:rPr>
-        <w:t xml:space="preserve">: 4가지 스케줄링 알고리즘 간의 순수 성능 비교가 목적이므로, 전처리 모듈인 Rate Limiter는 비활성화한 상태에서 진행한다. Rate Limiter를 포함한 시스템 과부하 방지 테스트는 별도로 진행할 예정이다.</w:t>
-      </w:r>
-    </w:p>
-    <w:p>
-      <w:pPr>
-        <w:pStyle w:val="Heading2"/>
-      </w:pPr>
-      <w:r>
-        <w:t xml:space="preserve">4.2 실험 시나리오</w:t>
-      </w:r>
-    </w:p>
-    <w:p>
-      <w:pPr>
-        <w:spacing w:after="120"/>
-      </w:pPr>
-      <w:r>
-        <w:rPr>
-          <w:rFonts w:ascii="Arial" w:cs="Arial" w:eastAsia="Arial" w:hAnsi="Arial"/>
-          <w:sz w:val="22"/>
-          <w:szCs w:val="22"/>
-        </w:rPr>
-        <w:t xml:space="preserve">다양한 조건에서 알고리즘의 특성을 비교하기 위해, 다음과 같은 시나리오를 설계한다.</w:t>
+        <w:t xml:space="preserve">정상 부하</w:t>
+      </w:r>
+      <w:r>
+        <w:rPr>
+          <w:rFonts w:ascii="Arial" w:cs="Arial" w:eastAsia="Arial" w:hAnsi="Arial"/>
+          <w:sz w:val="22"/>
+          <w:szCs w:val="22"/>
+        </w:rPr>
+        <w:t xml:space="preserve">: 일정한 간격으로 요청이 도착하는 기본 상황에서 각 알고리즘의 대기시간과 처리량을 측정한다.</w:t>
       </w:r>
     </w:p>
     <w:p>
@@ -2022,15 +2022,15 @@
           <w:sz w:val="22"/>
           <w:szCs w:val="22"/>
         </w:rPr>
-        <w:t xml:space="preserve">정상 부하</w:t>
-      </w:r>
-      <w:r>
-        <w:rPr>
-          <w:rFonts w:ascii="Arial" w:cs="Arial" w:eastAsia="Arial" w:hAnsi="Arial"/>
-          <w:sz w:val="22"/>
-          <w:szCs w:val="22"/>
-        </w:rPr>
-        <w:t xml:space="preserve">: 일정한 간격으로 요청이 도착하는 기본 상황에서 각 알고리즘의 대기시간과 처리량을 측정한다.</w:t>
+        <w:t xml:space="preserve">버스트 부하</w:t>
+      </w:r>
+      <w:r>
+        <w:rPr>
+          <w:rFonts w:ascii="Arial" w:cs="Arial" w:eastAsia="Arial" w:hAnsi="Arial"/>
+          <w:sz w:val="22"/>
+          <w:szCs w:val="22"/>
+        </w:rPr>
+        <w:t xml:space="preserve">: 특정 시점에 요청이 급증하는 상황을 재현하여, 각 알고리즘이 과부하에 어떻게 대응하는지 관찰한다.</w:t>
       </w:r>
     </w:p>
     <w:p>
@@ -2040,7 +2040,7 @@
           <w:ilvl w:val="0"/>
           <w:numId w:val="5"/>
         </w:numPr>
-        <w:spacing w:after="40"/>
+        <w:spacing w:after="120"/>
       </w:pPr>
       <w:r>
         <w:rPr>
@@ -2050,34 +2050,6 @@
           <w:sz w:val="22"/>
           <w:szCs w:val="22"/>
         </w:rPr>
-        <w:t xml:space="preserve">버스트 부하</w:t>
-      </w:r>
-      <w:r>
-        <w:rPr>
-          <w:rFonts w:ascii="Arial" w:cs="Arial" w:eastAsia="Arial" w:hAnsi="Arial"/>
-          <w:sz w:val="22"/>
-          <w:szCs w:val="22"/>
-        </w:rPr>
-        <w:t xml:space="preserve">: 특정 시점에 요청이 급증하는 상황을 재현하여, 각 알고리즘이 과부하에 어떻게 대응하는지 관찰한다.</w:t>
-      </w:r>
-    </w:p>
-    <w:p>
-      <w:pPr>
-        <w:pStyle w:val="ListParagraph"/>
-        <w:numPr>
-          <w:ilvl w:val="0"/>
-          <w:numId w:val="5"/>
-        </w:numPr>
-        <w:spacing w:after="120"/>
-      </w:pPr>
-      <w:r>
-        <w:rPr>
-          <w:rFonts w:ascii="Arial" w:cs="Arial" w:eastAsia="Arial" w:hAnsi="Arial"/>
-          <w:b/>
-          <w:bCs/>
-          <w:sz w:val="22"/>
-          <w:szCs w:val="22"/>
-        </w:rPr>
         <w:t xml:space="preserve">테넌트 비율 변동</w:t>
       </w:r>
       <w:r>
@@ -2107,15 +2079,15 @@
           <w:sz w:val="22"/>
           <w:szCs w:val="22"/>
         </w:rPr>
-        <w:t xml:space="preserve">3.5절에서 정의한 평가 지표(대기시간, 처리량, 공정성)를 4가지 알고리즘 모두에 동일하게 적용하여 비교한다. 공정성은 시스템 수준(전체 테넌트 간 JFI)과 테넌트 수준(같은 등급 내 JFI)으로 나누어 측정한다. 실험 결과는 알고리즘별로 대기시간 분포, 처리량 추이, JFI 변화를 표와 그래프로 정리하여 비교한다.</w:t>
-      </w:r>
-    </w:p>
-    <w:p>
-      <w:pPr>
-        <w:pStyle w:val="Heading1"/>
-      </w:pPr>
-      <w:r>
-        <w:t xml:space="preserve">5. 연구 일정</w:t>
+        <w:t xml:space="preserve">3.5절에서 정의한 평가 지표(대기시간, 처리량, 공정성)를 4가지 알고리즘 모두에 동일하게 적용하여 비교한다. 공정성은 시스템 수준(전체 테넌트 간 JFI)과 테넌트 수준(같은 등급 내 JFI)으로 나누어 측정한다.</w:t>
+      </w:r>
+    </w:p>
+    <w:p>
+      <w:pPr>
+        <w:pStyle w:val="Heading2"/>
+      </w:pPr>
+      <w:r>
+        <w:t xml:space="preserve">4.4 연구 일정</w:t>
       </w:r>
     </w:p>
     <w:p>
@@ -2128,119 +2100,7 @@
           <w:sz w:val="22"/>
           <w:szCs w:val="22"/>
         </w:rPr>
-        <w:t xml:space="preserve">26-1학기에는 다음과 같은 활동을 진행한다.</w:t>
-      </w:r>
-    </w:p>
-    <w:p>
-      <w:pPr>
-        <w:pStyle w:val="ListParagraph"/>
-        <w:numPr>
-          <w:ilvl w:val="0"/>
-          <w:numId w:val="6"/>
-        </w:numPr>
-        <w:spacing w:after="60"/>
-      </w:pPr>
-      <w:r>
-        <w:rPr>
-          <w:rFonts w:ascii="Arial" w:cs="Arial" w:eastAsia="Arial" w:hAnsi="Arial"/>
-          <w:b/>
-          <w:bCs/>
-          <w:sz w:val="22"/>
-          <w:szCs w:val="22"/>
-        </w:rPr>
-        <w:t xml:space="preserve">시스템 구현</w:t>
-      </w:r>
-      <w:r>
-        <w:rPr>
-          <w:rFonts w:ascii="Arial" w:cs="Arial" w:eastAsia="Arial" w:hAnsi="Arial"/>
-          <w:sz w:val="22"/>
-          <w:szCs w:val="22"/>
-        </w:rPr>
-        <w:t xml:space="preserve">: 제안 시스템의 4가지 스케줄링 알고리즘과 Rate Limiter를 구현한다.</w:t>
-      </w:r>
-    </w:p>
-    <w:p>
-      <w:pPr>
-        <w:pStyle w:val="ListParagraph"/>
-        <w:numPr>
-          <w:ilvl w:val="0"/>
-          <w:numId w:val="6"/>
-        </w:numPr>
-        <w:spacing w:after="60"/>
-      </w:pPr>
-      <w:r>
-        <w:rPr>
-          <w:rFonts w:ascii="Arial" w:cs="Arial" w:eastAsia="Arial" w:hAnsi="Arial"/>
-          <w:b/>
-          <w:bCs/>
-          <w:sz w:val="22"/>
-          <w:szCs w:val="22"/>
-        </w:rPr>
-        <w:t xml:space="preserve">성능 비교 실험</w:t>
-      </w:r>
-      <w:r>
-        <w:rPr>
-          <w:rFonts w:ascii="Arial" w:cs="Arial" w:eastAsia="Arial" w:hAnsi="Arial"/>
-          <w:sz w:val="22"/>
-          <w:szCs w:val="22"/>
-        </w:rPr>
-        <w:t xml:space="preserve">: 4.1~4.2절에서 설계한 조건과 시나리오에 따라 알고리즘별 대기시간, 처리량, 공정성을 비교한다.</w:t>
-      </w:r>
-    </w:p>
-    <w:p>
-      <w:pPr>
-        <w:pStyle w:val="ListParagraph"/>
-        <w:numPr>
-          <w:ilvl w:val="0"/>
-          <w:numId w:val="6"/>
-        </w:numPr>
-        <w:spacing w:after="60"/>
-      </w:pPr>
-      <w:r>
-        <w:rPr>
-          <w:rFonts w:ascii="Arial" w:cs="Arial" w:eastAsia="Arial" w:hAnsi="Arial"/>
-          <w:b/>
-          <w:bCs/>
-          <w:sz w:val="22"/>
-          <w:szCs w:val="22"/>
-        </w:rPr>
-        <w:t xml:space="preserve">관련연구 조사</w:t>
-      </w:r>
-      <w:r>
-        <w:rPr>
-          <w:rFonts w:ascii="Arial" w:cs="Arial" w:eastAsia="Arial" w:hAnsi="Arial"/>
-          <w:sz w:val="22"/>
-          <w:szCs w:val="22"/>
-        </w:rPr>
-        <w:t xml:space="preserve">: LLM 서빙 분야의 스케줄링 기법을 더 찾아보고, 본 연구와 다른 점을 정리한다.</w:t>
-      </w:r>
-    </w:p>
-    <w:p>
-      <w:pPr>
-        <w:pStyle w:val="ListParagraph"/>
-        <w:numPr>
-          <w:ilvl w:val="0"/>
-          <w:numId w:val="6"/>
-        </w:numPr>
-        <w:spacing w:after="120"/>
-      </w:pPr>
-      <w:r>
-        <w:rPr>
-          <w:rFonts w:ascii="Arial" w:cs="Arial" w:eastAsia="Arial" w:hAnsi="Arial"/>
-          <w:b/>
-          <w:bCs/>
-          <w:sz w:val="22"/>
-          <w:szCs w:val="22"/>
-        </w:rPr>
-        <w:t xml:space="preserve">결과 정리</w:t>
-      </w:r>
-      <w:r>
-        <w:rPr>
-          <w:rFonts w:ascii="Arial" w:cs="Arial" w:eastAsia="Arial" w:hAnsi="Arial"/>
-          <w:sz w:val="22"/>
-          <w:szCs w:val="22"/>
-        </w:rPr>
-        <w:t xml:space="preserve">: 실험 결과와 아키텍처 설계를 문서로 정리하여 보고서에 포함한다.</w:t>
+        <w:t xml:space="preserve">26-1학기에는 시스템 구현, 성능 비교 실험, 관련연구 추가 조사, 결과 정리를 진행한다.</w:t>
       </w:r>
     </w:p>
     <w:p>
@@ -3327,12 +3187,6 @@
   </w:num>
   <w:num w:numId="5">
     <w:abstractNumId w:val="6"/>
-    <w:lvlOverride w:ilvl="0">
-      <w:startOverride w:val="1"/>
-    </w:lvlOverride>
-  </w:num>
-  <w:num w:numId="6">
-    <w:abstractNumId w:val="3"/>
     <w:lvlOverride w:ilvl="0">
       <w:startOverride w:val="1"/>
     </w:lvlOverride>

</xml_diff>

<commit_message>
Refactor proposal document and update scheduling algorithm descriptions
- Updated the proposal document (proposal-v24.md) to clarify the limitations of current LLM services and the proposed scheduling algorithms.
- Enhanced descriptions of the MLFQ algorithm to reflect its non-preemptive nature and the feedback mechanism.
- Revised the explanation of the WFQ algorithm to emphasize its focus on proportional resource allocation based on tenant weights.
- Adjusted the figures in the presentation (proposal-figures.pptx) to align with the updated proposal content, including changes to algorithm descriptions and flow diagrams.
- Added a lessons learned document to capture insights from the proposal revision process, emphasizing the importance of logical consistency in academic writing.
</commit_message>
<xml_diff>
--- a/04-proposal/final/proposal.docx
+++ b/04-proposal/final/proposal.docx
@@ -168,7 +168,7 @@
           <w:sz w:val="22"/>
           <w:szCs w:val="22"/>
         </w:rPr>
-        <w:t xml:space="preserve">현재 대부분의 LLM 서비스는 선착순(First-Come, First-Served, FCFS) 처리 방식이나 단순 속도 제한(Rate Limiting)에 의존하고 있다. 이러한 방식은 다음과 같은 한계를 가진다. 첫째, 긴 요청이 뒤따르는 짧은 요청들의 처리를 지연시키는 호위 효과(Convoy Effect)가 발생한다. 둘째, 긴급한 요청도 도착 순서를 기다려야 하며, 사용자 등급에 따른 차등 서비스 제공이 불가능하다.</w:t>
+        <w:t xml:space="preserve">현재 대부분의 LLM 서비스는 선착순(First-Come, First-Served, FCFS) 처리 방식이나 단순 속도 제한(Rate Limiting)에 의존하고 있다. 이러한 방식은 다음과 같은 한계를 가진다. 첫째, 긴급한 요청도 도착 순서를 기다려야 하므로 시간에 민감한 요청의 빠른 처리가 불가능하다. 둘째, 사용자 등급에 따른 차등 서비스를 제공할 수 없어, 높은 등급의 테넌트와 무료 사용자가 동일한 대기 조건을 갖게 된다. 셋째, 자원이 테넌트 간에 공정하게 배분되고 있는지 측정하거나 보장할 수단이 없다.</w:t>
       </w:r>
     </w:p>
     <w:p>
@@ -230,7 +230,7 @@
           <w:sz w:val="22"/>
           <w:szCs w:val="22"/>
         </w:rPr>
-        <w:t xml:space="preserve">: FCFS(기준 알고리즘), Priority Scheduling(긴급 요청 우선), MLFQ(적응형 스케줄링), WFQ(공정 배분)를 LLM API 환경에 맞게 구현한다. 추가로, 시스템 과부하를 방지하기 위한 Rate Limiter(속도 제한)를 보조 기능으로 구현한다.</w:t>
+        <w:t xml:space="preserve">: FCFS(기준 알고리즘), Priority Scheduling(긴급 요청 우선), MLFQ(적응형 스케줄링: 요청 패턴을 학습하여 자원 독점을 방지), WFQ(공정 배분)를 LLM API 환경에 맞게 구현한다. 추가로, 시스템 과부하를 방지하기 위한 Rate Limiter(속도 제한)를 보조 기능으로 구현한다.</w:t>
       </w:r>
     </w:p>
     <w:p>
@@ -384,7 +384,7 @@
           <w:sz w:val="22"/>
           <w:szCs w:val="22"/>
         </w:rPr>
-        <w:t xml:space="preserve">는 작업의 실행 특성을 관찰하여 우선순위를 동적으로 조정하는 알고리즘이다. 짧은 작업은 높은 우선순위 큐에서 빠르게 처리되고, 할당된 시간(타임 퀀텀)을 초과한 긴 작업은 점차 하위 큐로 이동한다. 타임 퀀텀(Time Quantum)이란, 각 작업에 주어지는 최대 실행 시간으로, 이 시간이 지나면 다음 작업에게 순서를 양보해야 한다 [2][10].</w:t>
+        <w:t xml:space="preserve">는 작업의 실행 특성을 관찰하여 우선순위를 동적으로 조정하는 알고리즘이다 [2][10]. 짧은 작업은 높은 우선순위 큐에서 빠르게 처리되고, 할당된 시간(타임 퀀텀)을 초과한 긴 작업은 점차 하위 큐로 이동한다. OS에서 MLFQ는 선점형(Preemptive)으로 동작하여, 타임 퀀텀을 초과한 프로세스를 중단하고 하위 큐로 강등시킨다 [2][10].</w:t>
       </w:r>
     </w:p>
     <w:p>
@@ -554,7 +554,7 @@
           <w:sz w:val="22"/>
           <w:szCs w:val="22"/>
         </w:rPr>
-        <w:t xml:space="preserve">여기서 xi는 측정 구간 동안 테넌트 i가 할당받은 자원량이며, n은 테넌트 수이다. 본 시스템에서는 스케줄러가 요청 단위로 동작하므로, xi를 처리 완료된 요청 수로 정의한다.</w:t>
+        <w:t xml:space="preserve">여기서 xi는 측정 구간 동안 테넌트 i가 할당받은 자원량이며, n은 테넌트 수이다. LLM 요청은 처리 전에 응답 길이를 예측할 수 없으므로, 토큰 수 기반의 자원량 측정이 어렵다. 본 시스템에서는 스케줄러가 요청 단위로 동작하는 점을 고려하여, xi를 측정 구간 동안 테넌트 i가 처리 완료한 요청 수로 정의한다.</w:t>
       </w:r>
     </w:p>
     <w:p>
@@ -1093,7 +1093,7 @@
                 <w:sz w:val="20"/>
                 <w:szCs w:val="20"/>
               </w:rPr>
-              <w:t xml:space="preserve">선점 (Preemption)</w:t>
+              <w:t xml:space="preserve">타임 퀀텀 초과 시 강등</w:t>
             </w:r>
           </w:p>
         </w:tc>
@@ -1121,7 +1121,7 @@
                 <w:sz w:val="20"/>
                 <w:szCs w:val="20"/>
               </w:rPr>
-              <w:t xml:space="preserve">요청 중단 및 큐 이동</w:t>
+              <w:t xml:space="preserve">완료 시간 기반 큐 재배치</w:t>
             </w:r>
           </w:p>
         </w:tc>
@@ -1149,7 +1149,7 @@
                 <w:sz w:val="20"/>
                 <w:szCs w:val="20"/>
               </w:rPr>
-              <w:t xml:space="preserve">긴 요청 제어 방법</w:t>
+              <w:t xml:space="preserve">LLM 추론은 중단 불가하므로 완료 후 피드백으로 적응</w:t>
             </w:r>
           </w:p>
         </w:tc>
@@ -1386,20 +1386,33 @@
           <w:sz w:val="22"/>
           <w:szCs w:val="22"/>
         </w:rPr>
-        <w:t xml:space="preserve">본 알고리즘은 선점형(Preemptive) 방식으로 동작한다. 선점형이란, 처리 중인 요청의 할당 시간(타임 퀀텀)이 지나면 해당 요청을 잠시 멈추고 다른 요청에게 순서를 넘기는 방식을 말한다. MLFQ는 작업의 실행 특성을 관찰하여 우선순위를 동적으로 조정하는 알고리즘이다 [2]. 4단계 피드백 큐(Q0~Q3)를 구현하며, 상위 큐일수록 짧은 타임 퀀텀을, 하위 큐일수록 긴 타임 퀀텀을 설정한다.</w:t>
-      </w:r>
-    </w:p>
-    <w:p>
-      <w:pPr>
-        <w:spacing w:after="120"/>
-      </w:pPr>
-      <w:r>
-        <w:rPr>
-          <w:rFonts w:ascii="Arial" w:cs="Arial" w:eastAsia="Arial" w:hAnsi="Arial"/>
-          <w:sz w:val="22"/>
-          <w:szCs w:val="22"/>
-        </w:rPr>
-        <w:t xml:space="preserve">타임 퀀텀을 초과한 요청은 하위 큐로 이동시켜, 짧은 요청이 긴 요청에 의해 지연되는 것을 방지한다. 주기적 부스트(Boost)로 모든 요청을 최상위 큐(Q0)로 복귀시켜 기아를 방지한다.</w:t>
+        <w:t xml:space="preserve">MLFQ는 작업의 실행 특성을 관찰하여 우선순위를 동적으로 조정하는 알고리즘이다 [2]. OS에서 MLFQ는 타임 퀀텀을 초과한 프로세스를 중단(선점)하고 하위 큐로 강등시키는 방식으로 동작한다. 그러나 LLM 추론은 한번 시작되면 완료될 때까지 중단할 수 없다(Ollama는 요청 처리 중 선점을 지원하지 않음). 따라서 본 시스템에서는 비선점형(Non-preemptive) MLFQ로 적응시켜 구현한다.</w:t>
+      </w:r>
+    </w:p>
+    <w:p>
+      <w:pPr>
+        <w:spacing w:after="120"/>
+      </w:pPr>
+      <w:r>
+        <w:rPr>
+          <w:rFonts w:ascii="Arial" w:cs="Arial" w:eastAsia="Arial" w:hAnsi="Arial"/>
+          <w:sz w:val="22"/>
+          <w:szCs w:val="22"/>
+        </w:rPr>
+        <w:t xml:space="preserve">구체적으로, 4단계 피드백 큐(Q0~Q3)를 구현하되, 피드백을 요청 처리 중(intra-request)이 아닌 요청 간(inter-request)으로 적용한다. 새로운 요청은 최상위 큐(Q0)에 진입한다. 요청이 완료된 후, 실제 처리 시간이 해당 큐의 시간 임계값을 초과한 경우, 해당 테넌트의 다음 요청을 하위 큐에 배치한다. 스케줄러는 항상 가장 높은 우선순위 큐(Q0)부터 요청을 꺼내어 처리한다.</w:t>
+      </w:r>
+    </w:p>
+    <w:p>
+      <w:pPr>
+        <w:spacing w:after="120"/>
+      </w:pPr>
+      <w:r>
+        <w:rPr>
+          <w:rFonts w:ascii="Arial" w:cs="Arial" w:eastAsia="Arial" w:hAnsi="Arial"/>
+          <w:sz w:val="22"/>
+          <w:szCs w:val="22"/>
+        </w:rPr>
+        <w:t xml:space="preserve">이를 통해 긴 응답을 유발하는 요청 패턴을 가진 테넌트의 후속 요청이 낮은 우선순위로 처리되어, 짧은 응답의 요청을 보내는 테넌트가 먼저 서비스를 받을 수 있다. 이 방식은 OS MLFQ의 핵심 원리인 '실행 특성 관찰을 통한 동적 우선순위 조정'을 유지하면서, LLM 추론을 중단할 수 없는 제약에 맞게 적응(adaptation)한 것이다. 다만, 피드백이 개별 요청이 아닌 테넌트 단위로 적용되므로, 한 테넌트가 긴 요청과 짧은 요청을 번갈아 보내는 경우 짧은 요청이 불필요하게 하위 큐에 배치될 수 있다. 주기적 부스트(Boost)가 이 문제를 완화하며, 부스트 주기를 조정하여 피드백의 지속 시간을 제어할 수 있다.</w:t>
       </w:r>
     </w:p>
     <w:p>
@@ -1420,7 +1433,7 @@
           <w:sz w:val="22"/>
           <w:szCs w:val="22"/>
         </w:rPr>
-        <w:t xml:space="preserve">테넌트 등급별 가중치에 비례하여 자원을 분배하는 알고리즘이다 [3]. 2.1절에서 설명한 GPS의 이상적 모델을 개별 요청 단위로 구현한 것이 WFQ이며, 본 시스템에서는 네트워크의 흐름(flow) 개념을 테넌트 등급별 가중치로 치환하여 적용한다. 등급이 높은 테넌트에 큰 가중치를, 낮은 등급에 작은 가중치를 부여한다(Enterprise=100, Premium=50, Standard=10, Free=1). 스케줄러는 각 요청의 비용(Cost)을 테넌트의 가중치로 나눈 값(ΔVFT = Cost / Weight)을 누적하여 가상 종료 시각(Virtual Finish Time, VFT)을 산출한다. 본 시스템에서는 요청 간 비용 차이를 별도로 수학적으로 표현(모델링)하지 않고, 모든 요청의 비용을 균일하게 1로 설정한다(Cost = 1). 따라서 ΔVFT = 1 / Weight가 되어, 가중치가 높은 테넌트의 요청일수록 VFT의 증가폭이 작게 계산되므로, 가장 작은 VFT를 가진 요청이 우선적으로 스케줄링된다.</w:t>
+        <w:t xml:space="preserve">테넌트 등급별 가중치에 비례하여 자원을 분배하는 알고리즘이다 [3]. 2.1절에서 설명한 GPS의 이상적 모델을 개별 요청 단위로 구현한 것이 WFQ이며, 본 시스템에서는 네트워크의 흐름(flow) 개념을 테넌트 등급별 가중치로 치환하여 적용한다. 등급이 높은 테넌트에 큰 가중치를, 낮은 등급에 작은 가중치를 부여한다(Enterprise=100, Premium=50, Standard=10, Free=1). 스케줄러는 각 요청의 비용(Cost)을 테넌트의 가중치로 나눈 값(ΔVFT = Cost / Weight)을 누적하여 가상 종료 시각(Virtual Finish Time, VFT)을 산출한다. LLM 요청은 처리 전에 응답 길이를 예측할 수 없으므로, 요청 간 비용 차이를 사전에 산정할 수 없다. 따라서 본 시스템에서는 모든 요청의 비용을 균일하게 1로 설정한다(Cost = 1). 따라서 ΔVFT = 1 / Weight가 되어, 가중치가 높은 테넌트의 요청일수록 VFT의 증가폭이 작게 계산되므로, 가장 작은 VFT를 가진 요청이 우선적으로 스케줄링된다.</w:t>
       </w:r>
     </w:p>
     <w:p>

</xml_diff>

<commit_message>
Add proposal for multi-user LLM API request management system using OS scheduling algorithms
- Introduced a new draft proposal (proposal-v25.md) detailing the research background, objectives, and proposed system architecture.
- Updated figures for algorithm comparison and request flow in the presentation slides.
- Modified HTML slides to reflect changes in algorithm features and limitations.
- Updated binary files for figures and final proposal document.
</commit_message>
<xml_diff>
--- a/04-proposal/final/proposal.docx
+++ b/04-proposal/final/proposal.docx
@@ -222,15 +222,15 @@
           <w:sz w:val="22"/>
           <w:szCs w:val="22"/>
         </w:rPr>
-        <w:t xml:space="preserve">4가지 스케줄링 알고리즘 구현</w:t>
-      </w:r>
-      <w:r>
-        <w:rPr>
-          <w:rFonts w:ascii="Arial" w:cs="Arial" w:eastAsia="Arial" w:hAnsi="Arial"/>
-          <w:sz w:val="22"/>
-          <w:szCs w:val="22"/>
-        </w:rPr>
-        <w:t xml:space="preserve">: FCFS(기준 알고리즘), Priority Scheduling(긴급 요청 우선), 다단계 피드백 큐(Multi-Level Feedback Queue, MLFQ; 요청 패턴을 관찰하여 자원 독점을 방지하는 적응형 스케줄링), 가중 공정 큐잉(Weighted Fair Queuing, WFQ; 등급별 비례 배분)를 LLM API 환경에 맞게 구현한다. 추가로, 시스템 과부하를 방지하기 위한 Rate Limiter(속도 제한)를 보조 기능으로 구현한다.</w:t>
+        <w:t xml:space="preserve">4가지 스케줄링 알고리즘 적용</w:t>
+      </w:r>
+      <w:r>
+        <w:rPr>
+          <w:rFonts w:ascii="Arial" w:cs="Arial" w:eastAsia="Arial" w:hAnsi="Arial"/>
+          <w:sz w:val="22"/>
+          <w:szCs w:val="22"/>
+        </w:rPr>
+        <w:t xml:space="preserve">: FCFS(기준 알고리즘), Priority Scheduling(긴급 요청 우선), 다단계 피드백 큐(Multi-Level Feedback Queue, MLFQ; 요청 패턴을 관찰하여 자원 독점을 방지하는 적응형 스케줄링), 가중 공정 큐잉(Weighted Fair Queuing, WFQ; 등급별 비례 배분)을 LLM API 환경에 맞게 구현하고자 한다.</w:t>
       </w:r>
     </w:p>
     <w:p>
@@ -258,7 +258,7 @@
           <w:sz w:val="22"/>
           <w:szCs w:val="22"/>
         </w:rPr>
-        <w:t xml:space="preserve">: 4가지 스케줄링 알고리즘을 같은 조건에서 대기시간, 처리량, 공정성 기준으로 비교한다.</w:t>
+        <w:t xml:space="preserve">: 4가지 스케줄링 알고리즘을 같은 조건에서 대기시간, 처리량, 공정성 기준으로 비교하고자 한다.</w:t>
       </w:r>
     </w:p>
     <w:p>
@@ -286,7 +286,7 @@
           <w:sz w:val="22"/>
           <w:szCs w:val="22"/>
         </w:rPr>
-        <w:t xml:space="preserve">: Jain's Fairness Index(JFI)를 활용하여 다중 사용자 환경의 공정성을 측정한다. JFI는 자원이 얼마나 고르게 나뉘었는지를 0에서 1 사이 점수로 나타내는 지표이다.</w:t>
+        <w:t xml:space="preserve">: Jain's Fairness Index(JFI)를 활용하여 다중 사용자 환경의 공정성을 측정하고자 한다. JFI는 자원이 얼마나 고르게 나뉘었는지를 0에서 1 사이 점수로 나타내는 지표이다.</w:t>
       </w:r>
     </w:p>
     <w:p>
@@ -504,7 +504,7 @@
           <w:sz w:val="22"/>
           <w:szCs w:val="22"/>
         </w:rPr>
-        <w:t xml:space="preserve">기존 LLM 서빙 시스템들은 주로 LLM의 응답 속도를 높이는 데 집중하고 있으며, 다중 사용자 환경에서의 요청 스케줄링과 테넌트 간 공정성 문제는 아직 많이 다루어지지 않았다. 본 연구는 이 문제를 다루기 위해 OS 스케줄링 이론을 LLM 요청 관리에 적용한다.</w:t>
+        <w:t xml:space="preserve">기존 LLM 서빙 시스템들은 주로 LLM의 응답 속도를 높이는 데 집중하고 있으며, 다중 사용자 환경에서의 요청 스케줄링과 테넌트 간 공정성 문제는 아직 많이 다루어지지 않았다. 본 연구는 이 문제를 다루기 위해 OS 스케줄링 이론을 LLM 요청 관리에 적용하고자 한다.</w:t>
       </w:r>
     </w:p>
     <w:p>
@@ -596,7 +596,7 @@
           <w:sz w:val="22"/>
           <w:szCs w:val="22"/>
         </w:rPr>
-        <w:t xml:space="preserve">시스템은 4가지 스케줄링 알고리즘(FCFS, Priority, MLFQ, WFQ)을 구현하고, 동일한 요청 환경에서 각 알고리즘의 성능을 비교한다. FCFS는 다른 알고리즘의 성능을 평가하기 위한 기준(베이스라인)으로 사용한다.</w:t>
+        <w:t xml:space="preserve">시스템은 4가지 스케줄링 알고리즘(FCFS, Priority, MLFQ, WFQ)을 구현하여 동일한 요청 환경에서 각 알고리즘의 성능을 비교할 계획이다. FCFS는 다른 알고리즘의 성능을 평가하기 위한 기준(베이스라인)으로 사용할 예정이다.</w:t>
       </w:r>
     </w:p>
     <w:p>
@@ -1173,7 +1173,7 @@
           <w:sz w:val="22"/>
           <w:szCs w:val="22"/>
         </w:rPr>
-        <w:t xml:space="preserve">시스템은 4계층 구조로 구성되며, 외부 LLM 백엔드와 연동한다 (그림 2 참조).</w:t>
+        <w:t xml:space="preserve">시스템은 4계층 구조로 설계할 계획이며, 외부 LLM 백엔드와 연동한다 (그림 2 참조).</w:t>
       </w:r>
     </w:p>
     <w:p>
@@ -1229,7 +1229,7 @@
           <w:sz w:val="22"/>
           <w:szCs w:val="22"/>
         </w:rPr>
-        <w:t xml:space="preserve">: Express.js 기반 컨트롤러가 요청을 분류하고 스케줄러에 전달한다 [7][8]. 요청 분류 시, 테넌트의 구독 등급(Enterprise/Premium/Standard/Free)과 요청 헤더에 포함된 긴급도 정보를 기준으로 우선순위를 부여한다.</w:t>
+        <w:t xml:space="preserve">: Express.js 기반 컨트롤러가 요청을 분류하고 스케줄러에 전달한다 [7][8]. 요청 분류 시, 테넌트의 구독 등급과 요청의 긴급도 정보를 기준으로 우선순위를 부여할 예정이다.</w:t>
       </w:r>
     </w:p>
     <w:p>
@@ -1257,7 +1257,7 @@
           <w:sz w:val="22"/>
           <w:szCs w:val="22"/>
         </w:rPr>
-        <w:t xml:space="preserve">: 4가지 스케줄링 알고리즘으로 요청 처리 순서를 결정한다. 스케줄링 알고리즘은 실행 중 교체할 수 있으며, 상세 내용은 3.4절에서 설명한다.</w:t>
+        <w:t xml:space="preserve">: 4가지 스케줄링 알고리즘으로 요청 처리 순서를 결정한다.</w:t>
       </w:r>
     </w:p>
     <w:p>
@@ -1323,143 +1323,125 @@
         <w:pStyle w:val="Heading2"/>
       </w:pPr>
       <w:r>
-        <w:t xml:space="preserve">3.3 스케줄링 알고리즘 설계</w:t>
-      </w:r>
-    </w:p>
-    <w:p>
-      <w:pPr>
-        <w:pStyle w:val="Heading3"/>
-      </w:pPr>
-      <w:r>
-        <w:t xml:space="preserve">3.3.1 FCFS (First-Come, First-Served)</w:t>
-      </w:r>
-    </w:p>
-    <w:p>
-      <w:pPr>
-        <w:spacing w:after="120"/>
-      </w:pPr>
-      <w:r>
-        <w:rPr>
-          <w:rFonts w:ascii="Arial" w:cs="Arial" w:eastAsia="Arial" w:hAnsi="Arial"/>
-          <w:sz w:val="22"/>
-          <w:szCs w:val="22"/>
-        </w:rPr>
-        <w:t xml:space="preserve">선착순 처리 알고리즘으로, 요청이 도착한 순서대로 처리한다. 구현이 간단하며 다른 알고리즘과 비교할 때 기준(베이스라인)으로 사용한다. 본 시스템에서는 도착 시각 기준으로 정렬된 단일 큐를 사용하여, 앞선 요청이 완료되어야 다음 요청이 처리되는 비선점형(Non-preemptive, 실행 중인 요청을 중단하지 않는) 방식으로 동작한다.</w:t>
-      </w:r>
-    </w:p>
-    <w:p>
-      <w:pPr>
-        <w:pStyle w:val="Heading3"/>
-      </w:pPr>
-      <w:r>
-        <w:t xml:space="preserve">3.3.2 Priority Scheduling with Aging</w:t>
-      </w:r>
-    </w:p>
-    <w:p>
-      <w:pPr>
-        <w:spacing w:after="120"/>
-      </w:pPr>
-      <w:r>
-        <w:rPr>
-          <w:rFonts w:ascii="Arial" w:cs="Arial" w:eastAsia="Arial" w:hAnsi="Arial"/>
-          <w:sz w:val="22"/>
-          <w:szCs w:val="22"/>
-        </w:rPr>
-        <w:t xml:space="preserve">4단계 우선순위(URGENT &gt; HIGH &gt; NORMAL &gt; LOW)를 지원한다 [1]. 요청의 우선순위는 API 계층에서 테넌트 등급과 긴급도 플래그를 조합하여 결정한다. 기본 매핑은 Enterprise=HIGH, Premium=NORMAL, Standard=LOW, Free=LOW이며, 긴급도 플래그가 켜지면 Enterprise/Premium/Standard는 각각 URGENT, HIGH, NORMAL로 한 단계씩 올라간다. Free 등급은 긴급도 플래그가 설정되어 있더라도 API 계층에서 이를 무시하여 항상 LOW를 유지한다. 에이징(Aging)을 통해, 대기 시간이 일정 시간을 넘으면 요청의 우선순위가 자동으로 한 단계 올라가서 기아 현상을 방지한다.</w:t>
-      </w:r>
-    </w:p>
-    <w:p>
-      <w:pPr>
-        <w:pStyle w:val="Heading3"/>
-      </w:pPr>
-      <w:r>
-        <w:t xml:space="preserve">3.3.3 MLFQ (Multi-Level Feedback Queue)</w:t>
-      </w:r>
-    </w:p>
-    <w:p>
-      <w:pPr>
-        <w:spacing w:after="120"/>
-      </w:pPr>
-      <w:r>
-        <w:rPr>
-          <w:rFonts w:ascii="Arial" w:cs="Arial" w:eastAsia="Arial" w:hAnsi="Arial"/>
-          <w:sz w:val="22"/>
-          <w:szCs w:val="22"/>
-        </w:rPr>
-        <w:t xml:space="preserve">MLFQ는 작업의 실행 특성을 관찰하여 우선순위를 동적으로 조정하는 알고리즘이다 [2]. OS에서 MLFQ는 타임 퀀텀을 초과한 프로세스를 중단(선점)하고 하위 큐로 강등시키는 방식으로 동작한다. 그러나 LLM 추론은 한번 시작되면 완료될 때까지 중단할 수 없다(Ollama는 요청 처리 중 선점을 지원하지 않음). 따라서 본 시스템에서는 비선점형(Non-preemptive) MLFQ로 적응시켜 구현한다.</w:t>
-      </w:r>
-    </w:p>
-    <w:p>
-      <w:pPr>
-        <w:spacing w:after="120"/>
-      </w:pPr>
-      <w:r>
-        <w:rPr>
-          <w:rFonts w:ascii="Arial" w:cs="Arial" w:eastAsia="Arial" w:hAnsi="Arial"/>
-          <w:sz w:val="22"/>
-          <w:szCs w:val="22"/>
-        </w:rPr>
-        <w:t xml:space="preserve">구체적으로, 4단계 피드백 큐(Q0~Q3)를 구현하되, 피드백을 요청 처리 중(intra-request)이 아닌 요청 간(inter-request)으로 적용한다. 테넌트의 첫 요청 또는 부스트 이후 첫 요청은 최상위 큐(Q0)에 진입한다. 요청이 완료된 후, 실제 처리 시간이 해당 큐의 시간 임계값을 초과한 경우, 해당 테넌트의 다음 요청을 하위 큐에 배치한다. 초과하지 않은 경우에는 동일한 큐에 유지한다. 스케줄러는 항상 가장 높은 우선순위 큐(Q0)부터 요청을 꺼내어 처리한다.</w:t>
-      </w:r>
-    </w:p>
-    <w:p>
-      <w:pPr>
-        <w:spacing w:after="120"/>
-      </w:pPr>
-      <w:r>
-        <w:rPr>
-          <w:rFonts w:ascii="Arial" w:cs="Arial" w:eastAsia="Arial" w:hAnsi="Arial"/>
-          <w:sz w:val="22"/>
-          <w:szCs w:val="22"/>
-        </w:rPr>
-        <w:t xml:space="preserve">이를 통해 긴 응답을 유발하는 요청 패턴을 가진 테넌트의 후속 요청이 낮은 우선순위로 처리되어, 짧은 응답의 요청을 보내는 테넌트가 먼저 서비스를 받게 된다. 이 방식은 OS MLFQ의 핵심 원리인 '실행 특성 관찰을 통한 동적 우선순위 조정'을 유지하면서, LLM 추론을 중단할 수 없는 제약에 맞게 적응(adaptation)한 것이다. 다만, 피드백이 개별 요청이 아닌 테넌트 단위로 적용되므로, 한 테넌트가 긴 요청과 짧은 요청을 번갈아 보내는 경우 짧은 요청이 불필요하게 하위 큐에 배치될 수 있다. 주기적 부스트(Boost)가 이 문제를 완화하며, 부스트 주기를 조정하여 피드백의 지속 시간을 제어한다.</w:t>
-      </w:r>
-    </w:p>
-    <w:p>
-      <w:pPr>
-        <w:pStyle w:val="Heading3"/>
-      </w:pPr>
-      <w:r>
-        <w:t xml:space="preserve">3.3.4 WFQ (Weighted Fair Queuing)</w:t>
-      </w:r>
-    </w:p>
-    <w:p>
-      <w:pPr>
-        <w:spacing w:after="120"/>
-      </w:pPr>
-      <w:r>
-        <w:rPr>
-          <w:rFonts w:ascii="Arial" w:cs="Arial" w:eastAsia="Arial" w:hAnsi="Arial"/>
-          <w:sz w:val="22"/>
-          <w:szCs w:val="22"/>
-        </w:rPr>
-        <w:t xml:space="preserve">테넌트 등급별 가중치에 비례하여 자원을 분배하는 알고리즘이다 [3]. 2.1절에서 설명한 GPS의 이상적 모델을 개별 요청 단위로 구현한 것이 WFQ이며, 본 시스템에서는 네트워크의 흐름(flow) 개념을 테넌트 등급별 가중치로 치환하여 적용한다. 등급이 높은 테넌트에 큰 가중치를, 낮은 등급에 작은 가중치를 부여한다(Enterprise=100, Premium=50, Standard=10, Free=1). 스케줄러는 각 요청의 비용(Cost)을 테넌트의 가중치로 나눈 값(ΔVFT = Cost / Weight)을 누적하여 가상 종료 시각(Virtual Finish Time, VFT)을 산출한다. LLM 요청은 처리 전에 응답 길이를 예측할 수 없으므로, 요청 간 비용 차이를 사전에 산정할 수 없다. 따라서 본 시스템에서는 모든 요청의 비용을 균일하게 1로 설정한다(Cost = 1). 따라서 ΔVFT = 1 / Weight가 되어, 가중치가 높은 테넌트의 요청일수록 VFT의 증가폭이 작게 계산되므로, 가장 작은 VFT를 가진 요청이 우선적으로 스케줄링된다.</w:t>
-      </w:r>
-    </w:p>
-    <w:p>
-      <w:pPr>
-        <w:spacing w:after="120"/>
-      </w:pPr>
-      <w:r>
-        <w:rPr>
-          <w:rFonts w:ascii="Arial" w:cs="Arial" w:eastAsia="Arial" w:hAnsi="Arial"/>
-          <w:sz w:val="22"/>
-          <w:szCs w:val="22"/>
-        </w:rPr>
-        <w:t xml:space="preserve">WFQ는 테넌트 등급별 가중치만을 기준으로 자원을 배분하며, 개별 요청의 긴급도 필드는 사용하지 않는다. 이는 WFQ의 목적이 긴급 요청 우선 처리가 아니라 등급 간 비례적 자원 배분이기 때문이다. WFQ는 가중치 기반으로 자원을 비례 배분하는 구조이므로, Priority의 에이징이나 MLFQ의 부스트와 같은 별도의 기아 방지 장치가 필요하지 않다.</w:t>
-      </w:r>
-    </w:p>
-    <w:p>
-      <w:pPr>
-        <w:spacing w:after="120"/>
-      </w:pPr>
-      <w:r>
-        <w:rPr>
-          <w:rFonts w:ascii="Arial" w:cs="Arial" w:eastAsia="Arial" w:hAnsi="Arial"/>
-          <w:sz w:val="22"/>
-          <w:szCs w:val="22"/>
-        </w:rPr>
-        <w:t xml:space="preserve">정리하면, Priority는 등급과 긴급도를 조합하여 절대적 순서를 매기는 방식(높은 우선순위가 항상 먼저)이고, WFQ는 등급만을 기준으로 비례적 배분을 수행하는 방식(모든 등급이 가중치 비율대로 서비스)이다.</w:t>
+        <w:t xml:space="preserve">3.3 스케줄링 알고리즘 적용 방향</w:t>
+      </w:r>
+    </w:p>
+    <w:p>
+      <w:pPr>
+        <w:spacing w:after="120"/>
+      </w:pPr>
+      <w:r>
+        <w:rPr>
+          <w:rFonts w:ascii="Arial" w:cs="Arial" w:eastAsia="Arial" w:hAnsi="Arial"/>
+          <w:sz w:val="22"/>
+          <w:szCs w:val="22"/>
+        </w:rPr>
+        <w:t xml:space="preserve">본 연구에서는 2.1절에서 소개한 4가지 OS 스케줄링 알고리즘을 LLM API 환경에 맞게 적용하고자 한다. 각 알고리즘의 적용 방향은 다음과 같다.</w:t>
+      </w:r>
+    </w:p>
+    <w:p>
+      <w:pPr>
+        <w:spacing w:after="120"/>
+      </w:pPr>
+      <w:r>
+        <w:rPr>
+          <w:rFonts w:ascii="Arial" w:cs="Arial" w:eastAsia="Arial" w:hAnsi="Arial"/>
+          <w:b/>
+          <w:bCs/>
+          <w:sz w:val="22"/>
+          <w:szCs w:val="22"/>
+        </w:rPr>
+        <w:t xml:space="preserve">FCFS</w:t>
+      </w:r>
+      <w:r>
+        <w:rPr>
+          <w:rFonts w:ascii="Arial" w:cs="Arial" w:eastAsia="Arial" w:hAnsi="Arial"/>
+          <w:sz w:val="22"/>
+          <w:szCs w:val="22"/>
+        </w:rPr>
+        <w:t xml:space="preserve">는 요청 도착 순서대로 처리하는 기본 알고리즘으로, 다른 알고리즘과의 성능 비교를 위한 베이스라인으로 활용할 예정이다.</w:t>
+      </w:r>
+    </w:p>
+    <w:p>
+      <w:pPr>
+        <w:spacing w:after="120"/>
+      </w:pPr>
+      <w:r>
+        <w:rPr>
+          <w:rFonts w:ascii="Arial" w:cs="Arial" w:eastAsia="Arial" w:hAnsi="Arial"/>
+          <w:b/>
+          <w:bCs/>
+          <w:sz w:val="22"/>
+          <w:szCs w:val="22"/>
+        </w:rPr>
+        <w:t xml:space="preserve">Priority Scheduling</w:t>
+      </w:r>
+      <w:r>
+        <w:rPr>
+          <w:rFonts w:ascii="Arial" w:cs="Arial" w:eastAsia="Arial" w:hAnsi="Arial"/>
+          <w:sz w:val="22"/>
+          <w:szCs w:val="22"/>
+        </w:rPr>
+        <w:t xml:space="preserve">은 테넌트 등급과 요청 긴급도를 기반으로 우선순위를 부여하여 중요한 요청을 먼저 처리하는 방식이다. 기아 현상을 방지하기 위해 에이징(Aging) 기법을 함께 적용할 계획이다.</w:t>
+      </w:r>
+    </w:p>
+    <w:p>
+      <w:pPr>
+        <w:spacing w:after="120"/>
+      </w:pPr>
+      <w:r>
+        <w:rPr>
+          <w:rFonts w:ascii="Arial" w:cs="Arial" w:eastAsia="Arial" w:hAnsi="Arial"/>
+          <w:b/>
+          <w:bCs/>
+          <w:sz w:val="22"/>
+          <w:szCs w:val="22"/>
+        </w:rPr>
+        <w:t xml:space="preserve">MLFQ</w:t>
+      </w:r>
+      <w:r>
+        <w:rPr>
+          <w:rFonts w:ascii="Arial" w:cs="Arial" w:eastAsia="Arial" w:hAnsi="Arial"/>
+          <w:sz w:val="22"/>
+          <w:szCs w:val="22"/>
+        </w:rPr>
+        <w:t xml:space="preserve">는 요청 처리 결과를 관찰하여 테넌트의 우선순위를 동적으로 조정하는 방식이다. 다만, LLM 추론은 한번 시작되면 중단할 수 없으므로, OS의 선점형 MLFQ를 비선점형으로 적응시키는 방안을 연구할 예정이다.</w:t>
+      </w:r>
+    </w:p>
+    <w:p>
+      <w:pPr>
+        <w:spacing w:after="120"/>
+      </w:pPr>
+      <w:r>
+        <w:rPr>
+          <w:rFonts w:ascii="Arial" w:cs="Arial" w:eastAsia="Arial" w:hAnsi="Arial"/>
+          <w:b/>
+          <w:bCs/>
+          <w:sz w:val="22"/>
+          <w:szCs w:val="22"/>
+        </w:rPr>
+        <w:t xml:space="preserve">WFQ</w:t>
+      </w:r>
+      <w:r>
+        <w:rPr>
+          <w:rFonts w:ascii="Arial" w:cs="Arial" w:eastAsia="Arial" w:hAnsi="Arial"/>
+          <w:sz w:val="22"/>
+          <w:szCs w:val="22"/>
+        </w:rPr>
+        <w:t xml:space="preserve">는 테넌트 등급별 가중치에 비례하여 자원을 배분하는 방식이다. 네트워크의 흐름(flow) 개념을 테넌트 등급으로 치환하여 적용할 계획이다.</w:t>
+      </w:r>
+    </w:p>
+    <w:p>
+      <w:pPr>
+        <w:spacing w:after="120"/>
+      </w:pPr>
+      <w:r>
+        <w:rPr>
+          <w:rFonts w:ascii="Arial" w:cs="Arial" w:eastAsia="Arial" w:hAnsi="Arial"/>
+          <w:sz w:val="22"/>
+          <w:szCs w:val="22"/>
+        </w:rPr>
+        <w:t xml:space="preserve">각 알고리즘의 구체적인 설계와 구현 방식은 중간보고서에서 상세히 다룰 예정이다.</w:t>
       </w:r>
     </w:p>
     <w:p>
@@ -1477,6 +1459,19 @@
       <w:r>
         <w:rPr>
           <w:rFonts w:ascii="Arial" w:cs="Arial" w:eastAsia="Arial" w:hAnsi="Arial"/>
+          <w:sz w:val="22"/>
+          <w:szCs w:val="22"/>
+        </w:rPr>
+        <w:t xml:space="preserve">본 시스템에서 구현하고자 하는 핵심 기술 특징은 다음과 같다.</w:t>
+      </w:r>
+    </w:p>
+    <w:p>
+      <w:pPr>
+        <w:spacing w:after="120"/>
+      </w:pPr>
+      <w:r>
+        <w:rPr>
+          <w:rFonts w:ascii="Arial" w:cs="Arial" w:eastAsia="Arial" w:hAnsi="Arial"/>
           <w:b/>
           <w:bCs/>
           <w:sz w:val="22"/>
@@ -1490,33 +1485,7 @@
           <w:sz w:val="22"/>
           <w:szCs w:val="22"/>
         </w:rPr>
-        <w:t xml:space="preserve">2.3절에서 정의한 JFI를 4가지 스케줄링 알고리즘 모두에 적용하여, 각 알고리즘이 자원을 얼마나 공정하게 배분하는지 비교한다. 공정성은 두 가지 수준으로 나누어 측정한다.</w:t>
-      </w:r>
-    </w:p>
-    <w:p>
-      <w:pPr>
-        <w:spacing w:after="120"/>
-      </w:pPr>
-      <w:r>
-        <w:rPr>
-          <w:rFonts w:ascii="Arial" w:cs="Arial" w:eastAsia="Arial" w:hAnsi="Arial"/>
-          <w:sz w:val="22"/>
-          <w:szCs w:val="22"/>
-        </w:rPr>
-        <w:t xml:space="preserve">시스템 수준 JFI: 전체 테넌트를 대상으로 xi = 테넌트 i의 처리 완료 요청 수로 측정한다. 모든 테넌트가 동일한 수의 요청을 처리받았는지를 평가한다. FCFS에서는 등급과 무관하게 도착 순서대로 처리하므로, 각 테넌트가 동일한 수의 요청을 보내는 조건에서 시스템 수준 JFI가 1에 가깝다. MLFQ는 요청 행동 패턴에 따라 큐를 조정하므로, 하위 큐로 강등된 테넌트는 처리 횟수가 줄어들 수 있어 시스템 수준 JFI가 낮아질 수 있다. Priority에서는 에이징이 기아를 방지하지만, 높은 등급의 요청이 먼저 처리되므로 실험 시간 내에 등급별 처리량 차이가 발생할 수 있어, 시스템 수준 JFI가 1보다 낮을 수 있다. WFQ는 등급별 가중치에 비례하여 의도적으로 차등 배분하므로, 시스템 수준 JFI가 1보다 낮게 나오는 것이 정상이다. WFQ의 비례 배분이 의도대로 작동하는지는, 각 테넌트의 처리량을 해당 등급의 가중치로 나눈 정규화 값(xi / wi)에 JFI를 적용한 가중치 정규화 JFI로 검증한다. 이 값이 1에 가까우면 가중치 비율대로 공정하게 배분된 것이다. Priority와 WFQ 모두 시스템 수준 JFI가 낮게 나올 수 있으나, 그 원인은 다르다. Priority는 처리 순서의 차이에서, WFQ는 가중치 기반 비례 배분에서 비롯된다.</w:t>
-      </w:r>
-    </w:p>
-    <w:p>
-      <w:pPr>
-        <w:spacing w:after="120"/>
-      </w:pPr>
-      <w:r>
-        <w:rPr>
-          <w:rFonts w:ascii="Arial" w:cs="Arial" w:eastAsia="Arial" w:hAnsi="Arial"/>
-          <w:sz w:val="22"/>
-          <w:szCs w:val="22"/>
-        </w:rPr>
-        <w:t xml:space="preserve">테넌트 수준 JFI: 같은 등급 내 테넌트만을 대상으로 xi = 해당 등급 내 테넌트 i의 처리 완료 요청 수로 측정한다. 같은 등급의 테넌트끼리 공정하게 서비스를 받았는지를 평가하며, 모든 알고리즘에서 1에 가까워야 한다.</w:t>
+        <w:t xml:space="preserve">2.3절에서 정의한 JFI를 4가지 스케줄링 알고리즘 모두에 적용하여, 각 알고리즘이 자원을 얼마나 공정하게 배분하는지 비교할 계획이다.</w:t>
       </w:r>
     </w:p>
     <w:p>
@@ -1539,7 +1508,7 @@
           <w:sz w:val="22"/>
           <w:szCs w:val="22"/>
         </w:rPr>
-        <w:t xml:space="preserve">Priority 스케줄러의 에이징과 MLFQ 스케줄러의 부스트를 통해 낮은 우선순위 요청이 끝없이 기다리는 것을 방지한다. 에이징은 개별 요청의 대기 시간에 따라 우선순위를 점진적으로 높이므로, 고정된 우선순위로 처리 순서를 결정하는 Priority에 적합하다. 부스트는 모든 테넌트를 주기적으로 최상위 큐로 복귀시키므로, 누적된 행동 피드백으로 테넌트를 강등시키는 MLFQ에 적합하다.</w:t>
+        <w:t xml:space="preserve">Priority 스케줄러에는 에이징을, MLFQ 스케줄러에는 주기적 부스트(Boost)를 적용하여 낮은 우선순위 요청이 끝없이 기다리는 것을 방지하고자 한다.</w:t>
       </w:r>
     </w:p>
     <w:p>
@@ -1562,7 +1531,7 @@
           <w:sz w:val="22"/>
           <w:szCs w:val="22"/>
         </w:rPr>
-        <w:t xml:space="preserve">토큰 버킷(Token Bucket) 알고리즘으로 테넌트별 요청 빈도를 제한한다 [3]. 토큰 버킷이란, 일정 시간마다 버킷 토큰(요청 허가 단위)이 생성되고, 요청 1건마다 버킷 토큰을 하나 소비하여 요청 빈도를 제한하는 방식이다. 여기서 '버킷 토큰'은 요청 허가를 나타내는 개념으로, LLM이 처리하는 언어 토큰과는 다른 개념이다. 버킷 토큰이 없으면 요청이 거부된다. 스케줄링 알고리즘과는 별도로, 요청이 스케줄러에 도달하기 전 단계에서 시스템 과부하를 방지하는 보조 기능이다.</w:t>
+        <w:t xml:space="preserve">토큰 버킷(Token Bucket) 알고리즘을 활용하여 테넌트별 요청 빈도를 제한하는 전처리 기능을 구현할 예정이다 [3].</w:t>
       </w:r>
     </w:p>
     <w:p>
@@ -1585,7 +1554,7 @@
           <w:sz w:val="22"/>
           <w:szCs w:val="22"/>
         </w:rPr>
-        <w:t xml:space="preserve">서버 재시작 없이 REST API를 통해 프로그램 실행 중(런타임)에 스케줄링 알고리즘을 전환하도록 설계한다. 이 기능은 운영 환경에서 작업량이 바뀔 때 최적 알고리즘을 선택하기 위한 서비스용 부가 기능이다. 성능 비교 실험에서는 하나의 알고리즘을 고정하고 전체 실험을 완료한 뒤 다음 알고리즘으로 전환하는 방식으로 진행하며, 실험 도중에는 알고리즘을 교체하지 않는다.</w:t>
+        <w:t xml:space="preserve">서버 재시작 없이 런타임에 스케줄링 알고리즘을 전환할 수 있는 기능을 설계할 계획이다.</w:t>
       </w:r>
     </w:p>
     <w:p>
@@ -1623,7 +1592,7 @@
           <w:sz w:val="22"/>
           <w:szCs w:val="22"/>
         </w:rPr>
-        <w:t xml:space="preserve">본 연구에서 스케줄링 알고리즘을 비교하기 위해 사용하는 평가 지표는 다음과 같다.</w:t>
+        <w:t xml:space="preserve">본 연구에서 스케줄링 알고리즘을 비교하기 위해 사용할 평가 지표는 다음과 같다.</w:t>
       </w:r>
     </w:p>
     <w:p>
@@ -1651,7 +1620,7 @@
           <w:sz w:val="22"/>
           <w:szCs w:val="22"/>
         </w:rPr>
-        <w:t xml:space="preserve">: 요청이 큐에 등록된 시점부터 실제 처리가 시작될 때까지 걸리는 시간(ms)이다. 대기시간이 짧을수록 사용자가 더 빠르게 응답을 받을 수 있다.</w:t>
+        <w:t xml:space="preserve">: 요청이 큐에 등록된 시점부터 처리가 시작될 때까지 걸리는 시간(ms)</w:t>
       </w:r>
     </w:p>
     <w:p>
@@ -1679,7 +1648,7 @@
           <w:sz w:val="22"/>
           <w:szCs w:val="22"/>
         </w:rPr>
-        <w:t xml:space="preserve">: 단위 시간당 처리 완료되는 요청의 수(req/s)이다. 시스템이 얼마나 효율적으로 요청을 소화하는지를 나타낸다.</w:t>
+        <w:t xml:space="preserve">: 단위 시간당 처리 완료되는 요청의 수(req/s)</w:t>
       </w:r>
     </w:p>
     <w:p>
@@ -1707,7 +1676,7 @@
           <w:sz w:val="22"/>
           <w:szCs w:val="22"/>
         </w:rPr>
-        <w:t xml:space="preserve">: JFI를 사용하여 자원이 사용자 간에 얼마나 고르게 배분되었는지를 측정한다. 0에서 1 사이의 값이며, 1에 가까울수록 공정하다.</w:t>
+        <w:t xml:space="preserve">: JFI를 사용하여 자원 배분의 공정성을 측정 (0~1)</w:t>
       </w:r>
     </w:p>
     <w:p>
@@ -1735,7 +1704,7 @@
           <w:sz w:val="22"/>
           <w:szCs w:val="22"/>
         </w:rPr>
-        <w:t xml:space="preserve">: 단위 시간당 LLM이 생성한 출력 토큰 수(tokens/s)이다. LLM 백엔드가 얼마나 많은 텍스트를 생성했는지를 나타내며, 처리량(req/s)과는 독립적인 지표이다.</w:t>
+        <w:t xml:space="preserve">: 단위 시간당 LLM이 생성한 출력 토큰 수(tokens/s)</w:t>
       </w:r>
     </w:p>
     <w:p>
@@ -1756,7 +1725,7 @@
           <w:sz w:val="22"/>
           <w:szCs w:val="22"/>
         </w:rPr>
-        <w:t xml:space="preserve">본 시스템은 다음과 같은 환경에서 구현한다.</w:t>
+        <w:t xml:space="preserve">본 시스템은 다음과 같은 환경에서 구현할 예정이다.</w:t>
       </w:r>
     </w:p>
     <w:p>
@@ -1853,7 +1822,7 @@
           <w:sz w:val="22"/>
           <w:szCs w:val="22"/>
         </w:rPr>
-        <w:t xml:space="preserve">Node.js와 Express.js는 웹 서버를 구축하기 위한 도구이며, Ollama는 로컬 컴퓨터에서 LLM을 실행하여 외부 API 비용 없이 실험할 수 있게 해준다.</w:t>
+        <w:t xml:space="preserve">Node.js와 Express.js는 웹 서버를 구축하기 위한 도구이며, Ollama는 로컬 컴퓨터에서 LLM을 실행하여 외부 API 비용 없이 실험할 수 있게 해주는 도구이다.</w:t>
       </w:r>
     </w:p>
     <w:p>
@@ -1882,7 +1851,28 @@
           <w:sz w:val="22"/>
           <w:szCs w:val="22"/>
         </w:rPr>
-        <w:t xml:space="preserve">3.6절의 구현 환경에서 다음과 같은 조건으로 실험을 수행할 계획이다.</w:t>
+        <w:t xml:space="preserve">3.6절의 구현 환경에서 다양한 부하 조건의 요청을 생성하여 반복 실험을 수행할 계획이다. Ollama에서 실행 가능한 경량 모델(llama3, gemma 등)을 사용하여 로컬 환경에서 실험할 예정이다.</w:t>
+      </w:r>
+    </w:p>
+    <w:p>
+      <w:pPr>
+        <w:pStyle w:val="Heading2"/>
+      </w:pPr>
+      <w:r>
+        <w:t xml:space="preserve">4.2 실험 시나리오</w:t>
+      </w:r>
+    </w:p>
+    <w:p>
+      <w:pPr>
+        <w:spacing w:after="120"/>
+      </w:pPr>
+      <w:r>
+        <w:rPr>
+          <w:rFonts w:ascii="Arial" w:cs="Arial" w:eastAsia="Arial" w:hAnsi="Arial"/>
+          <w:sz w:val="22"/>
+          <w:szCs w:val="22"/>
+        </w:rPr>
+        <w:t xml:space="preserve">다양한 조건에서 알고리즘의 특성을 비교하기 위해, 다음과 같은 시나리오를 설계할 계획이다.</w:t>
       </w:r>
     </w:p>
     <w:p>
@@ -1902,15 +1892,15 @@
           <w:sz w:val="22"/>
           <w:szCs w:val="22"/>
         </w:rPr>
-        <w:t xml:space="preserve">실험 규모</w:t>
-      </w:r>
-      <w:r>
-        <w:rPr>
-          <w:rFonts w:ascii="Arial" w:cs="Arial" w:eastAsia="Arial" w:hAnsi="Arial"/>
-          <w:sz w:val="22"/>
-          <w:szCs w:val="22"/>
-        </w:rPr>
-        <w:t xml:space="preserve">: 약 5,000~10,000건의 요청으로 반복 실험을 수행한다.</w:t>
+        <w:t xml:space="preserve">정상 부하</w:t>
+      </w:r>
+      <w:r>
+        <w:rPr>
+          <w:rFonts w:ascii="Arial" w:cs="Arial" w:eastAsia="Arial" w:hAnsi="Arial"/>
+          <w:sz w:val="22"/>
+          <w:szCs w:val="22"/>
+        </w:rPr>
+        <w:t xml:space="preserve">: 일정한 간격으로 요청이 도착하는 기본 상황</w:t>
       </w:r>
     </w:p>
     <w:p>
@@ -1930,15 +1920,15 @@
           <w:sz w:val="22"/>
           <w:szCs w:val="22"/>
         </w:rPr>
-        <w:t xml:space="preserve">요청 구성</w:t>
-      </w:r>
-      <w:r>
-        <w:rPr>
-          <w:rFonts w:ascii="Arial" w:cs="Arial" w:eastAsia="Arial" w:hAnsi="Arial"/>
-          <w:sz w:val="22"/>
-          <w:szCs w:val="22"/>
-        </w:rPr>
-        <w:t xml:space="preserve">: 짧은 요청(프롬프트 50토큰 이하) 40%, 중간 요청(50~200토큰) 40%, 긴 요청(200토큰 이상) 20%의 비율로 구성한다.</w:t>
+        <w:t xml:space="preserve">버스트 부하</w:t>
+      </w:r>
+      <w:r>
+        <w:rPr>
+          <w:rFonts w:ascii="Arial" w:cs="Arial" w:eastAsia="Arial" w:hAnsi="Arial"/>
+          <w:sz w:val="22"/>
+          <w:szCs w:val="22"/>
+        </w:rPr>
+        <w:t xml:space="preserve">: 특정 시점에 요청이 급증하는 상황</w:t>
       </w:r>
     </w:p>
     <w:p>
@@ -1948,53 +1938,25 @@
           <w:ilvl w:val="0"/>
           <w:numId w:val="5"/>
         </w:numPr>
-        <w:spacing w:after="40"/>
-      </w:pPr>
-      <w:r>
-        <w:rPr>
-          <w:rFonts w:ascii="Arial" w:cs="Arial" w:eastAsia="Arial" w:hAnsi="Arial"/>
-          <w:b/>
-          <w:bCs/>
-          <w:sz w:val="22"/>
-          <w:szCs w:val="22"/>
-        </w:rPr>
-        <w:t xml:space="preserve">LLM 모델</w:t>
-      </w:r>
-      <w:r>
-        <w:rPr>
-          <w:rFonts w:ascii="Arial" w:cs="Arial" w:eastAsia="Arial" w:hAnsi="Arial"/>
-          <w:sz w:val="22"/>
-          <w:szCs w:val="22"/>
-        </w:rPr>
-        <w:t xml:space="preserve">: Ollama에서 실행 가능한 경량 모델(llama3, gemma 등)을 사용하여 로컬 환경에서 실험한다.</w:t>
-      </w:r>
-    </w:p>
-    <w:p>
-      <w:pPr>
-        <w:pStyle w:val="ListParagraph"/>
-        <w:numPr>
-          <w:ilvl w:val="0"/>
-          <w:numId w:val="5"/>
-        </w:numPr>
-        <w:spacing w:after="120"/>
-      </w:pPr>
-      <w:r>
-        <w:rPr>
-          <w:rFonts w:ascii="Arial" w:cs="Arial" w:eastAsia="Arial" w:hAnsi="Arial"/>
-          <w:b/>
-          <w:bCs/>
-          <w:sz w:val="22"/>
-          <w:szCs w:val="22"/>
-        </w:rPr>
-        <w:t xml:space="preserve">변인 통제</w:t>
-      </w:r>
-      <w:r>
-        <w:rPr>
-          <w:rFonts w:ascii="Arial" w:cs="Arial" w:eastAsia="Arial" w:hAnsi="Arial"/>
-          <w:sz w:val="22"/>
-          <w:szCs w:val="22"/>
-        </w:rPr>
-        <w:t xml:space="preserve">: 4가지 스케줄링 알고리즘 간의 순수 성능 비교가 목적이므로, 전처리 모듈인 Rate Limiter는 비활성화한 상태에서 진행한다. 또한, 공정성 지표의 비교 기준을 통일하기 위해 각 테넌트는 동일한 수의 요청을 생성하도록 통제한다.</w:t>
+        <w:spacing w:after="120"/>
+      </w:pPr>
+      <w:r>
+        <w:rPr>
+          <w:rFonts w:ascii="Arial" w:cs="Arial" w:eastAsia="Arial" w:hAnsi="Arial"/>
+          <w:b/>
+          <w:bCs/>
+          <w:sz w:val="22"/>
+          <w:szCs w:val="22"/>
+        </w:rPr>
+        <w:t xml:space="preserve">테넌트 비율 변동</w:t>
+      </w:r>
+      <w:r>
+        <w:rPr>
+          <w:rFonts w:ascii="Arial" w:cs="Arial" w:eastAsia="Arial" w:hAnsi="Arial"/>
+          <w:sz w:val="22"/>
+          <w:szCs w:val="22"/>
+        </w:rPr>
+        <w:t xml:space="preserve">: 테넌트 등급 비율을 달리하여 공정성 변화를 관찰하는 상황</w:t>
       </w:r>
     </w:p>
     <w:p>
@@ -2002,104 +1964,20 @@
         <w:pStyle w:val="Heading2"/>
       </w:pPr>
       <w:r>
-        <w:t xml:space="preserve">4.2 실험 시나리오</w:t>
-      </w:r>
-    </w:p>
-    <w:p>
-      <w:pPr>
-        <w:spacing w:after="120"/>
-      </w:pPr>
-      <w:r>
-        <w:rPr>
-          <w:rFonts w:ascii="Arial" w:cs="Arial" w:eastAsia="Arial" w:hAnsi="Arial"/>
-          <w:sz w:val="22"/>
-          <w:szCs w:val="22"/>
-        </w:rPr>
-        <w:t xml:space="preserve">다양한 조건에서 알고리즘의 특성을 비교하기 위해, 다음과 같은 시나리오를 설계한다.</w:t>
-      </w:r>
-    </w:p>
-    <w:p>
-      <w:pPr>
-        <w:pStyle w:val="ListParagraph"/>
-        <w:numPr>
-          <w:ilvl w:val="0"/>
-          <w:numId w:val="5"/>
-        </w:numPr>
-        <w:spacing w:after="40"/>
-      </w:pPr>
-      <w:r>
-        <w:rPr>
-          <w:rFonts w:ascii="Arial" w:cs="Arial" w:eastAsia="Arial" w:hAnsi="Arial"/>
-          <w:b/>
-          <w:bCs/>
-          <w:sz w:val="22"/>
-          <w:szCs w:val="22"/>
-        </w:rPr>
-        <w:t xml:space="preserve">정상 부하</w:t>
-      </w:r>
-      <w:r>
-        <w:rPr>
-          <w:rFonts w:ascii="Arial" w:cs="Arial" w:eastAsia="Arial" w:hAnsi="Arial"/>
-          <w:sz w:val="22"/>
-          <w:szCs w:val="22"/>
-        </w:rPr>
-        <w:t xml:space="preserve">: 일정한 간격으로 요청이 도착하는 기본 상황에서 각 알고리즘의 대기시간과 처리량을 측정한다.</w:t>
-      </w:r>
-    </w:p>
-    <w:p>
-      <w:pPr>
-        <w:pStyle w:val="ListParagraph"/>
-        <w:numPr>
-          <w:ilvl w:val="0"/>
-          <w:numId w:val="5"/>
-        </w:numPr>
-        <w:spacing w:after="40"/>
-      </w:pPr>
-      <w:r>
-        <w:rPr>
-          <w:rFonts w:ascii="Arial" w:cs="Arial" w:eastAsia="Arial" w:hAnsi="Arial"/>
-          <w:b/>
-          <w:bCs/>
-          <w:sz w:val="22"/>
-          <w:szCs w:val="22"/>
-        </w:rPr>
-        <w:t xml:space="preserve">버스트 부하</w:t>
-      </w:r>
-      <w:r>
-        <w:rPr>
-          <w:rFonts w:ascii="Arial" w:cs="Arial" w:eastAsia="Arial" w:hAnsi="Arial"/>
-          <w:sz w:val="22"/>
-          <w:szCs w:val="22"/>
-        </w:rPr>
-        <w:t xml:space="preserve">: 특정 시점에 요청이 급증하는 상황을 재현하여, 각 알고리즘이 과부하에 어떻게 대응하는지 관찰한다.</w:t>
-      </w:r>
-    </w:p>
-    <w:p>
-      <w:pPr>
-        <w:pStyle w:val="ListParagraph"/>
-        <w:numPr>
-          <w:ilvl w:val="0"/>
-          <w:numId w:val="5"/>
-        </w:numPr>
-        <w:spacing w:after="120"/>
-      </w:pPr>
-      <w:r>
-        <w:rPr>
-          <w:rFonts w:ascii="Arial" w:cs="Arial" w:eastAsia="Arial" w:hAnsi="Arial"/>
-          <w:b/>
-          <w:bCs/>
-          <w:sz w:val="22"/>
-          <w:szCs w:val="22"/>
-        </w:rPr>
-        <w:t xml:space="preserve">테넌트 비율 변동</w:t>
-      </w:r>
-      <w:r>
-        <w:rPr>
-          <w:rFonts w:ascii="Arial" w:cs="Arial" w:eastAsia="Arial" w:hAnsi="Arial"/>
-          <w:sz w:val="22"/>
-          <w:szCs w:val="22"/>
-        </w:rPr>
-        <w:t xml:space="preserve">: Enterprise/Premium/Standard/Free 테넌트의 비율을 달리하여 공정성 변화를 관찰한다.</w:t>
+        <w:t xml:space="preserve">4.3 평가 방법</w:t>
+      </w:r>
+    </w:p>
+    <w:p>
+      <w:pPr>
+        <w:spacing w:after="120"/>
+      </w:pPr>
+      <w:r>
+        <w:rPr>
+          <w:rFonts w:ascii="Arial" w:cs="Arial" w:eastAsia="Arial" w:hAnsi="Arial"/>
+          <w:sz w:val="22"/>
+          <w:szCs w:val="22"/>
+        </w:rPr>
+        <w:t xml:space="preserve">3.5절에서 정의한 평가 지표(대기시간, 처리량, 공정성, 생성 속도)를 4가지 알고리즘 모두에 동일하게 적용하여 비교할 계획이다.</w:t>
       </w:r>
     </w:p>
     <w:p>
@@ -2107,27 +1985,6 @@
         <w:pStyle w:val="Heading2"/>
       </w:pPr>
       <w:r>
-        <w:t xml:space="preserve">4.3 평가 방법</w:t>
-      </w:r>
-    </w:p>
-    <w:p>
-      <w:pPr>
-        <w:spacing w:after="120"/>
-      </w:pPr>
-      <w:r>
-        <w:rPr>
-          <w:rFonts w:ascii="Arial" w:cs="Arial" w:eastAsia="Arial" w:hAnsi="Arial"/>
-          <w:sz w:val="22"/>
-          <w:szCs w:val="22"/>
-        </w:rPr>
-        <w:t xml:space="preserve">3.5절에서 정의한 평가 지표(대기시간, 처리량, 공정성, 생성 속도)를 4가지 알고리즘 모두에 동일하게 적용하여 비교한다. 공정성은 시스템 수준(전체 테넌트 간 JFI), 테넌트 수준(같은 등급 내 JFI), 그리고 WFQ의 가중치 비례 배분 검증을 위한 가중치 정규화 JFI로 나누어 측정한다.</w:t>
-      </w:r>
-    </w:p>
-    <w:p>
-      <w:pPr>
-        <w:pStyle w:val="Heading2"/>
-      </w:pPr>
-      <w:r>
         <w:t xml:space="preserve">4.4 연구 일정</w:t>
       </w:r>
     </w:p>
@@ -2141,7 +1998,7 @@
           <w:sz w:val="22"/>
           <w:szCs w:val="22"/>
         </w:rPr>
-        <w:t xml:space="preserve">26-1학기에는 시스템 구현, 성능 비교 실험, 관련연구 추가 조사, 결과 정리를 진행한다.</w:t>
+        <w:t xml:space="preserve">26-1학기에는 시스템 구현, 성능 비교 실험, 관련연구 추가 조사, 결과 정리를 진행할 계획이다.</w:t>
       </w:r>
     </w:p>
     <w:p>

</xml_diff>

<commit_message>
Update proposal figures and slides for version 28
- Updated generate-proposal-figures.js to reflect changes in slide content and versioning.
- Modified slide1-algo-comparison.html to replace "공정성 지표(JFI) 측정" with "GPS 모델 근사 구현" and updated references.
- Changed slide2-architecture.html to specify "사용자 등급에 따른 자원 배분" instead of "테넌트 등급에 따른 자원 배분".
- Added new slide3-request-flow.html detailing the request flow phases.
- Updated proposal figures in proposal-figures.pptx and proposal.docx to align with the latest changes.
</commit_message>
<xml_diff>
--- a/04-proposal/final/proposal.docx
+++ b/04-proposal/final/proposal.docx
@@ -158,33 +158,46 @@
         <w:pStyle w:val="Heading2"/>
       </w:pPr>
       <w:r>
-        <w:t xml:space="preserve">1.1 연구 배경</w:t>
-      </w:r>
-    </w:p>
-    <w:p>
-      <w:pPr>
-        <w:spacing w:after="120"/>
-      </w:pPr>
-      <w:r>
-        <w:rPr>
-          <w:rFonts w:ascii="맑은 고딕" w:cs="맑은 고딕" w:eastAsia="맑은 고딕" w:hAnsi="맑은 고딕"/>
-          <w:sz w:val="22"/>
-          <w:szCs w:val="22"/>
-        </w:rPr>
-        <w:t xml:space="preserve">ChatGPT, Claude, Gemini 등 대규모 언어 모델(Large Language Model, LLM) API 서비스가 빠르게 확산되면서, 여러 사용자가 동시에 LLM API를 호출하는 다중 사용자(Multi-tenant) 환경이 보편화되고 있다. 다중 사용자 환경이란, 하나의 서버가 여러 고객(테넌트)의 요청을 동시에 처리하는 구조를 말한다.</w:t>
-      </w:r>
-    </w:p>
-    <w:p>
-      <w:pPr>
-        <w:spacing w:after="120"/>
-      </w:pPr>
-      <w:r>
-        <w:rPr>
-          <w:rFonts w:ascii="맑은 고딕" w:cs="맑은 고딕" w:eastAsia="맑은 고딕" w:hAnsi="맑은 고딕"/>
-          <w:sz w:val="22"/>
-          <w:szCs w:val="22"/>
-        </w:rPr>
-        <w:t xml:space="preserve">현재 대부분의 LLM 서비스는 선착순(First-Come, First-Served, FCFS) 처리 방식이나 단순 속도 제한(Rate Limiting)에 의존하고 있다. 이러한 방식은 다음과 같은 한계를 가진다. 첫째, 긴급한 요청도 도착 순서를 기다려야 하므로 시간에 민감한 요청의 빠른 처리가 불가능하다. 둘째, 사용자 등급에 따른 차등 서비스를 제공할 수 없어, 높은 등급의 테넌트와 무료 사용자가 동일한 대기 조건을 갖게 된다. 셋째, 자원이 테넌트 간에 공정하게 배분되고 있는지 측정하거나 보장할 수단이 없다.</w:t>
+        <w:t xml:space="preserve">1.1 배경</w:t>
+      </w:r>
+    </w:p>
+    <w:p>
+      <w:pPr>
+        <w:spacing w:after="120"/>
+      </w:pPr>
+      <w:r>
+        <w:rPr>
+          <w:rFonts w:ascii="맑은 고딕" w:cs="맑은 고딕" w:eastAsia="맑은 고딕" w:hAnsi="맑은 고딕"/>
+          <w:sz w:val="22"/>
+          <w:szCs w:val="22"/>
+        </w:rPr>
+        <w:t xml:space="preserve">최근 ChatGPT, Claude, Gemini 등 대규모 언어 모델(Large Language Model, LLM) API 서비스가 다양한 분야에서 활용되고 있다. 이에 따라 기업이나 연구실에서도 하나의 LLM API 계정을 여러 구성원이 공유하거나, 자체 LLM 서버를 구축하여 여러 사용자에게 서비스하는 사례를 찾아볼 수 있다.</w:t>
+      </w:r>
+    </w:p>
+    <w:p>
+      <w:pPr>
+        <w:spacing w:after="120"/>
+      </w:pPr>
+      <w:r>
+        <w:rPr>
+          <w:rFonts w:ascii="맑은 고딕" w:cs="맑은 고딕" w:eastAsia="맑은 고딕" w:hAnsi="맑은 고딕"/>
+          <w:sz w:val="22"/>
+          <w:szCs w:val="22"/>
+        </w:rPr>
+        <w:t xml:space="preserve">이러한 다중 사용자 환경에서는 요청을 어떻게 관리할지가 문제가 된다. 주요 API 제공업체를 살펴보면, OpenAI는 조직(Organization) 단위로 분당 요청 수와 토큰 수에 한도를 두고 있고 [1], Anthropic도 사용 등급(Usage Tier)별로 호출 한도를 적용하고 있다 [2]. 그러나 이는 계정 단위의 관리이므로, 같은 계정을 공유하는 사용자들 사이에서 누가 얼마나 사용할지를 조율하는 것은 별개의 문제이다. 자체 LLM 서버를 운영하는 경우에도 마찬가지로, 사용자별 요청 관리 기능은 기본으로 제공되지 않는 것으로 보인다 (자세한 내용은 2장에서 살펴본다).</w:t>
+      </w:r>
+    </w:p>
+    <w:p>
+      <w:pPr>
+        <w:spacing w:after="120"/>
+      </w:pPr>
+      <w:r>
+        <w:rPr>
+          <w:rFonts w:ascii="맑은 고딕" w:cs="맑은 고딕" w:eastAsia="맑은 고딕" w:hAnsi="맑은 고딕"/>
+          <w:sz w:val="22"/>
+          <w:szCs w:val="22"/>
+        </w:rPr>
+        <w:t xml:space="preserve">사용자별 관리 기능이 별도로 없다 보니, 요청은 결국 도착한 순서대로(First-Come, First-Served, FCFS) 처리되거나 호출 빈도 제한(Rate Limiting) 수준에서 관리되는 것으로 보인다. 이 경우 긴급한 요청도 순서를 기다려야 하고, 사용자별로 자원을 다르게 배분하기 어려우며, 자원이 공정하게 나누어지고 있는지 확인하기도 쉽지 않다.</w:t>
       </w:r>
     </w:p>
     <w:p>
@@ -192,20 +205,20 @@
         <w:pStyle w:val="Heading2"/>
       </w:pPr>
       <w:r>
-        <w:t xml:space="preserve">1.2 연구 동기와 목적</w:t>
-      </w:r>
-    </w:p>
-    <w:p>
-      <w:pPr>
-        <w:spacing w:after="120"/>
-      </w:pPr>
-      <w:r>
-        <w:rPr>
-          <w:rFonts w:ascii="맑은 고딕" w:cs="맑은 고딕" w:eastAsia="맑은 고딕" w:hAnsi="맑은 고딕"/>
-          <w:sz w:val="22"/>
-          <w:szCs w:val="22"/>
-        </w:rPr>
-        <w:t xml:space="preserve">운영체제의 프로세스 스케줄링 알고리즘은 CPU 자원을 여러 프로세스에 효율적으로 배분하기 위해 수십 년간 연구되어 온 이론이다 [1][9]. 본 연구는 이 이론을 LLM API 요청 관리에 활용할 수 있는지 탐구하고자 한다.</w:t>
+        <w:t xml:space="preserve">1.2 동기 및 목적</w:t>
+      </w:r>
+    </w:p>
+    <w:p>
+      <w:pPr>
+        <w:spacing w:after="120"/>
+      </w:pPr>
+      <w:r>
+        <w:rPr>
+          <w:rFonts w:ascii="맑은 고딕" w:cs="맑은 고딕" w:eastAsia="맑은 고딕" w:hAnsi="맑은 고딕"/>
+          <w:sz w:val="22"/>
+          <w:szCs w:val="22"/>
+        </w:rPr>
+        <w:t xml:space="preserve">3학년 운영체제 수업에서 프로세스 스케줄링 알고리즘을 배우면서, "이 알고리즘들을 LLM API 요청 관리에 적용해보면 어떨까?"라는 궁금증에서 이 프로젝트를 시작하게 되었다. 운영체제의 스케줄링 이론을 LLM API 환경에 적용해보고, 알고리즘별 성능과 공정성을 비교해보는 것이 본 프로젝트의 목적이다.</w:t>
       </w:r>
     </w:p>
     <w:p>
@@ -218,7 +231,7 @@
           <w:sz w:val="22"/>
           <w:szCs w:val="22"/>
         </w:rPr>
-        <w:t xml:space="preserve">구체적인 연구 목적은 다음과 같다.</w:t>
+        <w:t xml:space="preserve">이 프로젝트에서는 구체적으로 다음 세 가지를 해보려고 한다.</w:t>
       </w:r>
     </w:p>
     <w:p>
@@ -238,15 +251,15 @@
           <w:sz w:val="22"/>
           <w:szCs w:val="22"/>
         </w:rPr>
-        <w:t xml:space="preserve">OS 스케줄링 알고리즘의 LLM 환경 적용</w:t>
-      </w:r>
-      <w:r>
-        <w:rPr>
-          <w:rFonts w:ascii="맑은 고딕" w:cs="맑은 고딕" w:eastAsia="맑은 고딕" w:hAnsi="맑은 고딕"/>
-          <w:sz w:val="22"/>
-          <w:szCs w:val="22"/>
-        </w:rPr>
-        <w:t xml:space="preserve">: 대표적인 OS 스케줄링 알고리즘들을 LLM API 환경에 맞게 적용하는 방안을 탐구하고자 한다.</w:t>
+        <w:t xml:space="preserve">OS 스케줄링 알고리즘 적용</w:t>
+      </w:r>
+      <w:r>
+        <w:rPr>
+          <w:rFonts w:ascii="맑은 고딕" w:cs="맑은 고딕" w:eastAsia="맑은 고딕" w:hAnsi="맑은 고딕"/>
+          <w:sz w:val="22"/>
+          <w:szCs w:val="22"/>
+        </w:rPr>
+        <w:t xml:space="preserve">: FCFS, Priority Scheduling, MLFQ, WFQ의 네 가지 대표적인 스케줄링 알고리즘을 LLM API 환경에 맞게 구현해본다.</w:t>
       </w:r>
     </w:p>
     <w:p>
@@ -266,15 +279,15 @@
           <w:sz w:val="22"/>
           <w:szCs w:val="22"/>
         </w:rPr>
-        <w:t xml:space="preserve">알고리즘 간 성능 비교</w:t>
-      </w:r>
-      <w:r>
-        <w:rPr>
-          <w:rFonts w:ascii="맑은 고딕" w:cs="맑은 고딕" w:eastAsia="맑은 고딕" w:hAnsi="맑은 고딕"/>
-          <w:sz w:val="22"/>
-          <w:szCs w:val="22"/>
-        </w:rPr>
-        <w:t xml:space="preserve">: 여러 스케줄링 알고리즘을 동일한 조건에서 대기시간, 처리량, 공정성 등의 기준으로 비교하고자 한다.</w:t>
+        <w:t xml:space="preserve">알고리즘별 성능 비교</w:t>
+      </w:r>
+      <w:r>
+        <w:rPr>
+          <w:rFonts w:ascii="맑은 고딕" w:cs="맑은 고딕" w:eastAsia="맑은 고딕" w:hAnsi="맑은 고딕"/>
+          <w:sz w:val="22"/>
+          <w:szCs w:val="22"/>
+        </w:rPr>
+        <w:t xml:space="preserve">: 평균 대기시간, 처리량 등의 지표로 각 알고리즘의 효율성을 비교해본다.</w:t>
       </w:r>
     </w:p>
     <w:p>
@@ -294,15 +307,28 @@
           <w:sz w:val="22"/>
           <w:szCs w:val="22"/>
         </w:rPr>
-        <w:t xml:space="preserve">공정성 측정 방법 탐구</w:t>
-      </w:r>
-      <w:r>
-        <w:rPr>
-          <w:rFonts w:ascii="맑은 고딕" w:cs="맑은 고딕" w:eastAsia="맑은 고딕" w:hAnsi="맑은 고딕"/>
-          <w:sz w:val="22"/>
-          <w:szCs w:val="22"/>
-        </w:rPr>
-        <w:t xml:space="preserve">: Jain's Fairness Index(JFI) 등의 공정성 지표를 활용하여 다중 사용자 환경에서 자원 배분의 공정성을 측정하는 방법을 탐구하고자 한다.</w:t>
+        <w:t xml:space="preserve">공정성 분석</w:t>
+      </w:r>
+      <w:r>
+        <w:rPr>
+          <w:rFonts w:ascii="맑은 고딕" w:cs="맑은 고딕" w:eastAsia="맑은 고딕" w:hAnsi="맑은 고딕"/>
+          <w:sz w:val="22"/>
+          <w:szCs w:val="22"/>
+        </w:rPr>
+        <w:t xml:space="preserve">: Jain's Fairness Index(JFI)를 활용하여, 각 알고리즘이 사용자 간 자원을 얼마나 공정하게 배분하는지 분석해본다.</w:t>
+      </w:r>
+    </w:p>
+    <w:p>
+      <w:pPr>
+        <w:spacing w:after="120"/>
+      </w:pPr>
+      <w:r>
+        <w:rPr>
+          <w:rFonts w:ascii="맑은 고딕" w:cs="맑은 고딕" w:eastAsia="맑은 고딕" w:hAnsi="맑은 고딕"/>
+          <w:sz w:val="22"/>
+          <w:szCs w:val="22"/>
+        </w:rPr>
+        <w:t xml:space="preserve">다음 장에서는 이들 알고리즘의 이론적 배경과 관련 도구를 살펴본다.</w:t>
       </w:r>
     </w:p>
     <w:p>
@@ -315,6 +341,19 @@
     </w:p>
     <w:p>
       <w:pPr>
+        <w:spacing w:after="120"/>
+      </w:pPr>
+      <w:r>
+        <w:rPr>
+          <w:rFonts w:ascii="맑은 고딕" w:cs="맑은 고딕" w:eastAsia="맑은 고딕" w:hAnsi="맑은 고딕"/>
+          <w:sz w:val="22"/>
+          <w:szCs w:val="22"/>
+        </w:rPr>
+        <w:t xml:space="preserve">이 장에서는 본 프로젝트에서 활용할 OS 스케줄링 알고리즘의 이론적 배경, 기존 LLM 서빙 도구의 현황, 그리고 공정성 측정 방법을 살펴본다.</w:t>
+      </w:r>
+    </w:p>
+    <w:p>
+      <w:pPr>
         <w:pStyle w:val="Heading2"/>
       </w:pPr>
       <w:r>
@@ -331,7 +370,7 @@
           <w:sz w:val="22"/>
           <w:szCs w:val="22"/>
         </w:rPr>
-        <w:t xml:space="preserve">프로세스 스케줄링은 운영체제의 핵심 기능 중 하나로, CPU 자원을 여러 프로세스에 효율적으로 배분하기 위한 다양한 알고리즘이 연구되어 왔다 [1][9].</w:t>
+        <w:t xml:space="preserve">프로세스 스케줄링은 운영체제의 핵심 기능 중 하나로, CPU 자원을 여러 프로세스에 배분하기 위한 다양한 알고리즘이 있다 [3][4].</w:t>
       </w:r>
     </w:p>
     <w:p>
@@ -354,7 +393,7 @@
           <w:sz w:val="22"/>
           <w:szCs w:val="22"/>
         </w:rPr>
-        <w:t xml:space="preserve">는 가장 단순한 스케줄링 알고리즘으로, 요청이 도착한 순서대로 처리한다. 구현이 간단하나 호위 효과(Convoy Effect, 처리 시간이 긴 요청이 뒤따르는 짧은 요청들의 처리를 지연시키는 현상)가 발생하는 단점이 있다 [1][9].</w:t>
+        <w:t xml:space="preserve">는 요청이 도착한 순서대로 처리하는 가장 단순한 방식이다. 구현이 간단하지만, 처리 시간이 긴 요청 때문에 짧은 요청들까지 지연되는 호위 효과(Convoy Effect)가 발생할 수 있다 [3].</w:t>
       </w:r>
     </w:p>
     <w:p>
@@ -377,7 +416,7 @@
           <w:sz w:val="22"/>
           <w:szCs w:val="22"/>
         </w:rPr>
-        <w:t xml:space="preserve">은 각 프로세스에 우선순위를 부여하여 높은 우선순위의 프로세스를 먼저 처리한다. 그러나 낮은 우선순위의 프로세스가 계속 밀려 처리되지 못하는 기아(Starvation) 현상이 발생할 수 있다. 이를 해결하기 위해, 오래 기다린 프로세스의 우선순위를 점진적으로 높여주는 에이징(Aging) 기법이 사용된다 [1][9].</w:t>
+        <w:t xml:space="preserve">은 각 프로세스에 우선순위를 부여하여 우선순위가 높은 프로세스를 먼저 처리한다. 다만 우선순위가 낮은 프로세스가 계속 밀려 처리되지 못하는 기아 현상이 발생할 수 있으며, 이를 방지하기 위해 오래 기다린 프로세스의 우선순위를 점진적으로 높여주는 에이징 기법이 사용된다 [3].</w:t>
       </w:r>
     </w:p>
     <w:p>
@@ -400,7 +439,7 @@
           <w:sz w:val="22"/>
           <w:szCs w:val="22"/>
         </w:rPr>
-        <w:t xml:space="preserve">는 작업의 실행 특성을 관찰하여 우선순위를 동적으로 조정하는 알고리즘이다 [2][10]. 짧은 작업은 높은 우선순위 큐에서 빠르게 처리되고, 타임 퀀텀(Time Quantum, 한 번에 할당되는 최대 실행 시간)을 초과한 긴 작업은 점차 하위 큐로 이동한다. OS에서 MLFQ는 선점형(Preemptive, 실행 중인 작업을 중단할 수 있는 방식)으로 동작하여, 타임 퀀텀을 초과한 프로세스를 중단하고 하위 큐로 강등시킨다 [2][10].</w:t>
+        <w:t xml:space="preserve">는 여러 개의 큐를 두고, 작업의 실행 특성에 따라 우선순위를 동적으로 조정하는 알고리즘이다. 짧은 작업은 높은 우선순위 큐에서 빠르게 처리되고, 타임 퀀텀(Time Quantum, 한 번에 할당되는 최대 실행 시간)을 초과한 긴 작업은 점차 하위 큐로 이동한다. OS에서 MLFQ는 선점형으로 동작하여, 타임 퀀텀을 초과한 프로세스를 중단하고 하위 큐로 강등시킨다 [4].</w:t>
       </w:r>
     </w:p>
     <w:p>
@@ -423,7 +462,7 @@
           <w:sz w:val="22"/>
           <w:szCs w:val="22"/>
         </w:rPr>
-        <w:t xml:space="preserve">는 네트워크 분야에서 제안된 공정 큐잉 알고리즘이다 [3][11]. 각 흐름(flow)에 가중치를 부여하여 가중치에 비례하는 서비스를 제공한다. GPS(Generalized Processor Sharing)는 자원을 가중치에 비례하여 동시에 배분하는 이상적인 수학적 모델이며, WFQ는 이를 개별 요청(Discrete request) 단위의 현실 시스템에서 비슷하게 구현한 실용적인 스케줄링 기법이다.</w:t>
+        <w:t xml:space="preserve">는 네트워크 분야에서 사용되는 공정 큐잉 알고리즘이다 [5]. 각 흐름(flow)에 가중치를 부여하고, 패킷마다 가상 완료 시각(Virtual Finish Time)을 계산하여 이 값이 가장 작은 패킷을 먼저 전송한다. 가상 완료 시각은 처리 비용을 가중치로 나누어 구하기 때문에, 가중치가 큰 흐름일수록 값이 작아져 더 자주 선택된다. 이론적으로는 GPS(Generalized Processor Sharing)라는 이상적인 모델이 있지만 실제로 구현이 어려워, 이에 가깝게 구현한 것이 WFQ이다.</w:t>
       </w:r>
     </w:p>
     <w:p>
@@ -448,20 +487,20 @@
         <w:pStyle w:val="Heading2"/>
       </w:pPr>
       <w:r>
-        <w:t xml:space="preserve">2.2 LLM 서빙 시스템과 스케줄링</w:t>
-      </w:r>
-    </w:p>
-    <w:p>
-      <w:pPr>
-        <w:spacing w:after="120"/>
-      </w:pPr>
-      <w:r>
-        <w:rPr>
-          <w:rFonts w:ascii="맑은 고딕" w:cs="맑은 고딕" w:eastAsia="맑은 고딕" w:hAnsi="맑은 고딕"/>
-          <w:sz w:val="22"/>
-          <w:szCs w:val="22"/>
-        </w:rPr>
-        <w:t xml:space="preserve">LLM 서빙(LLM을 사용자에게 제공하는 것) 분야에서는 LLM 응답 속도를 높이기 위한 다양한 기술이 개발되어 왔다.</w:t>
+        <w:t xml:space="preserve">2.2 LLM 서빙과 스케줄링</w:t>
+      </w:r>
+    </w:p>
+    <w:p>
+      <w:pPr>
+        <w:spacing w:after="120"/>
+      </w:pPr>
+      <w:r>
+        <w:rPr>
+          <w:rFonts w:ascii="맑은 고딕" w:cs="맑은 고딕" w:eastAsia="맑은 고딕" w:hAnsi="맑은 고딕"/>
+          <w:sz w:val="22"/>
+          <w:szCs w:val="22"/>
+        </w:rPr>
+        <w:t xml:space="preserve">LLM 서빙(LLM을 사용자에게 제공하는 것) 분야에서 가장 널리 사용되는 오픈소스 도구를 조사해보았다.</w:t>
       </w:r>
     </w:p>
     <w:p>
@@ -484,7 +523,7 @@
           <w:sz w:val="22"/>
           <w:szCs w:val="22"/>
         </w:rPr>
-        <w:t xml:space="preserve">은 UC Berkeley에서 개발한 LLM 서빙 도구이다 [4]. 그러나 요청 스케줄링은 선착순에 한정되어 있으며, 테넌트 간 공정성 보장 기능은 제공하지 않는다.</w:t>
+        <w:t xml:space="preserve">은 UC Berkeley에서 개발한 LLM 서빙 도구로, PagedAttention이라는 메모리 관리 기법으로 높은 처리 성능을 보여준다 [6]. 다만 공식 문서와 소스 코드를 조사한 결과, 요청 스케줄링은 선착순 방식에 가까우며 사용자 간 공정성을 보장하는 별도의 기능은 확인하지 못했다.</w:t>
       </w:r>
     </w:p>
     <w:p>
@@ -507,20 +546,20 @@
           <w:sz w:val="22"/>
           <w:szCs w:val="22"/>
         </w:rPr>
-        <w:t xml:space="preserve">는 오픈소스 LLM 서빙 도구이다 [5]. 다중 사용자 환경에서의 요청 우선순위 관리나 공정성 보장 기능은 포함하지 않는다.</w:t>
-      </w:r>
-    </w:p>
-    <w:p>
-      <w:pPr>
-        <w:spacing w:after="120"/>
-      </w:pPr>
-      <w:r>
-        <w:rPr>
-          <w:rFonts w:ascii="맑은 고딕" w:cs="맑은 고딕" w:eastAsia="맑은 고딕" w:hAnsi="맑은 고딕"/>
-          <w:sz w:val="22"/>
-          <w:szCs w:val="22"/>
-        </w:rPr>
-        <w:t xml:space="preserve">기존 LLM 서빙 시스템들은 주로 LLM의 응답 속도를 높이는 데 집중하고 있으며, 다중 사용자 환경에서의 요청 스케줄링과 테넌트 간 공정성 문제는 아직 많이 다루어지지 않았다. 본 연구는 이 문제를 다루기 위해 OS 스케줄링 이론을 LLM 요청 관리에 적용하고자 한다.</w:t>
+        <w:t xml:space="preserve">는 오픈소스 LLM 서빙 도구로, 다양한 LLM을 쉽게 배포할 수 있도록 도와준다 [7]. 그러나 공식 문서에서 다중 사용자 환경에서의 요청 우선순위 관리나 공정성 보장 기능은 찾아볼 수 없었다.</w:t>
+      </w:r>
+    </w:p>
+    <w:p>
+      <w:pPr>
+        <w:spacing w:after="120"/>
+      </w:pPr>
+      <w:r>
+        <w:rPr>
+          <w:rFonts w:ascii="맑은 고딕" w:cs="맑은 고딕" w:eastAsia="맑은 고딕" w:hAnsi="맑은 고딕"/>
+          <w:sz w:val="22"/>
+          <w:szCs w:val="22"/>
+        </w:rPr>
+        <w:t xml:space="preserve">조사한 도구들은 주로 응답 속도를 높이는 데 집중하고 있었으며, 다중 사용자 환경에서의 요청 스케줄링이나 사용자 간 공정성 문제는 상대적으로 덜 다루어진 것으로 보인다. 본 프로젝트는 이 부분에 OS 스케줄링 이론을 적용해보려고 한다.</w:t>
       </w:r>
     </w:p>
     <w:p>
@@ -541,7 +580,7 @@
           <w:sz w:val="22"/>
           <w:szCs w:val="22"/>
         </w:rPr>
-        <w:t xml:space="preserve">Jain's Fairness Index(JFI)는 공유 자원 시스템에서 자원 배분의 공정성을 측정하기 위한 지표이다 [3]. JFI는 0(완전 불공정)부터 1(완전 공정) 사이의 값을 가지며, 1에 가까울수록 자원이 공평하게 배분된 것이다. 반대로, 특정 사용자가 자원을 받지 못하면 0에 가까워진다.</w:t>
+        <w:t xml:space="preserve">여러 사용자가 자원을 공유하는 시스템에서, 자원 배분의 공정성을 측정하는 지표로 Jain's Fairness Index(JFI)가 있다 [5]. JFI는 네트워크 대역폭 배분, CPU 스케줄링 등 자원 공유 문제에서 사용되는 지표로, 0에서 1 사이의 값 하나로 공정성을 직관적으로 나타낼 수 있어 본 프로젝트의 알고리즘 비교에 적합할 것으로 보았다.</w:t>
       </w:r>
     </w:p>
     <w:p>
@@ -570,7 +609,7 @@
           <w:sz w:val="22"/>
           <w:szCs w:val="22"/>
         </w:rPr>
-        <w:t xml:space="preserve">여기서 xi는 테넌트 i가 할당받은 자원량이며, n은 테넌트 수이다.</w:t>
+        <w:t xml:space="preserve">여기서 xi는 사용자 i가 할당받은 자원량이며, n은 사용자 수이다. 본 프로젝트에서도 이 지표를 활용하여 스케줄링 알고리즘의 공정성을 측정해볼 계획이다. 다음 장에서는 이들 알고리즘과 JFI를 활용한 제안 시스템의 구조를 설명한다.</w:t>
       </w:r>
     </w:p>
     <w:p>
@@ -599,7 +638,7 @@
           <w:sz w:val="22"/>
           <w:szCs w:val="22"/>
         </w:rPr>
-        <w:t xml:space="preserve">본 연구에서 제안하는 시스템은 OS 스케줄링 알고리즘을 LLM API 요청 관리에 적용한 다중 사용자 요청 관리 시스템이다. 표 1은 OS 개념과 LLM 도메인 간의 대응 관계를 정리한 것이다.</w:t>
+        <w:t xml:space="preserve">본 프로젝트에서는 OS 스케줄링 알고리즘을 LLM API 요청 관리에 적용한 시스템을 구현해보려고 한다. 기본 아이디어는, OS에서 프로세스가 CPU를 할당받기 위해 대기하는 것처럼, LLM API 요청도 대기열에서 순서를 기다리는 구조를 만드는 것이다. 표 1은 OS 개념과 LLM 환경 간의 대응 관계를 정리한 것이다.</w:t>
       </w:r>
     </w:p>
     <w:p>
@@ -615,7 +654,7 @@
           <w:sz w:val="20"/>
           <w:szCs w:val="20"/>
         </w:rPr>
-        <w:t xml:space="preserve">표 1. OS 개념과 LLM 도메인 대응 관계</w:t>
+        <w:t xml:space="preserve">표 1. OS 개념과 LLM 환경 대응 관계</w:t>
       </w:r>
     </w:p>
     <w:tbl>
@@ -693,7 +732,7 @@
                 <w:sz w:val="20"/>
                 <w:szCs w:val="20"/>
               </w:rPr>
-              <w:t xml:space="preserve">LLM 도메인</w:t>
+              <w:t xml:space="preserve">LLM 환경 대응</w:t>
             </w:r>
           </w:p>
         </w:tc>
@@ -924,7 +963,7 @@
                 <w:sz w:val="20"/>
                 <w:szCs w:val="20"/>
               </w:rPr>
-              <w:t xml:space="preserve">우선순위 (Priority)</w:t>
+              <w:t xml:space="preserve">준비 큐 (Ready Queue)</w:t>
             </w:r>
           </w:p>
         </w:tc>
@@ -952,7 +991,7 @@
                 <w:sz w:val="20"/>
                 <w:szCs w:val="20"/>
               </w:rPr>
-              <w:t xml:space="preserve">테넌트 등급, 요청 긴급도</w:t>
+              <w:t xml:space="preserve">요청 대기열</w:t>
             </w:r>
           </w:p>
         </w:tc>
@@ -980,7 +1019,7 @@
                 <w:sz w:val="20"/>
                 <w:szCs w:val="20"/>
               </w:rPr>
-              <w:t xml:space="preserve">처리 순서 결정 기준</w:t>
+              <w:t xml:space="preserve">처리를 기다리는 작업의 저장소</w:t>
             </w:r>
           </w:p>
         </w:tc>
@@ -1010,7 +1049,7 @@
                 <w:sz w:val="20"/>
                 <w:szCs w:val="20"/>
               </w:rPr>
-              <w:t xml:space="preserve">스케줄링 알고리즘</w:t>
+              <w:t xml:space="preserve">우선순위 (Priority)</w:t>
             </w:r>
           </w:p>
         </w:tc>
@@ -1038,7 +1077,7 @@
                 <w:sz w:val="20"/>
                 <w:szCs w:val="20"/>
               </w:rPr>
-              <w:t xml:space="preserve">요청 처리 순서 결정</w:t>
+              <w:t xml:space="preserve">사용자 등급, 요청 긴급도</w:t>
             </w:r>
           </w:p>
         </w:tc>
@@ -1066,7 +1105,7 @@
                 <w:sz w:val="20"/>
                 <w:szCs w:val="20"/>
               </w:rPr>
-              <w:t xml:space="preserve">자원 배분 정책</w:t>
+              <w:t xml:space="preserve">처리 순서 결정 기준</w:t>
             </w:r>
           </w:p>
         </w:tc>
@@ -1082,67 +1121,33 @@
           <w:sz w:val="22"/>
           <w:szCs w:val="22"/>
         </w:rPr>
-        <w:t xml:space="preserve">시스템은 복수의 스케줄링 알고리즘을 구현하여, 동일한 요청 환경에서 각 알고리즘의 성능을 비교하는 것을 목표로 한다. FCFS를 기준(베이스라인) 알고리즘으로 삼고, Priority Scheduling, MLFQ, WFQ 등의 알고리즘을 적용하여 비교할 계획이다.</w:t>
-      </w:r>
-    </w:p>
-    <w:p>
-      <w:pPr>
-        <w:pStyle w:val="Heading2"/>
-      </w:pPr>
-      <w:r>
-        <w:t xml:space="preserve">3.2 핵심 연구 과제</w:t>
-      </w:r>
-    </w:p>
-    <w:p>
-      <w:pPr>
-        <w:spacing w:after="120"/>
-      </w:pPr>
-      <w:r>
-        <w:rPr>
-          <w:rFonts w:ascii="맑은 고딕" w:cs="맑은 고딕" w:eastAsia="맑은 고딕" w:hAnsi="맑은 고딕"/>
-          <w:sz w:val="22"/>
-          <w:szCs w:val="22"/>
-        </w:rPr>
-        <w:t xml:space="preserve">본 연구에서 탐구해야 할 핵심 과제는 OS 스케줄링 이론을 LLM 환경에 맞게 적응시키는 것이다.</w:t>
-      </w:r>
-    </w:p>
-    <w:p>
-      <w:pPr>
-        <w:spacing w:after="120"/>
-      </w:pPr>
-      <w:r>
-        <w:rPr>
-          <w:rFonts w:ascii="맑은 고딕" w:cs="맑은 고딕" w:eastAsia="맑은 고딕" w:hAnsi="맑은 고딕"/>
-          <w:sz w:val="22"/>
-          <w:szCs w:val="22"/>
-        </w:rPr>
-        <w:t xml:space="preserve">OS에서 프로세스 스케줄링은 CPU 시간을 짧은 단위(타임 퀀텀)로 나누어 여러 프로세스에 번갈아 할당하는 선점형(Preemptive) 방식이 일반적이다. 그러나 LLM 추론은 한번 시작되면 중간에 중단할 수 없으므로, 비선점형(Non-preemptive) 환경에서 동작해야 한다. 이러한 차이로 인해, 2.1절에서 소개한 알고리즘들을 그대로 적용할 수 없으며, LLM 도메인의 특성에 맞는 적응 방안을 연구해야 한다.</w:t>
-      </w:r>
-    </w:p>
-    <w:p>
-      <w:pPr>
-        <w:spacing w:after="120"/>
-      </w:pPr>
-      <w:r>
-        <w:rPr>
-          <w:rFonts w:ascii="맑은 고딕" w:cs="맑은 고딕" w:eastAsia="맑은 고딕" w:hAnsi="맑은 고딕"/>
-          <w:sz w:val="22"/>
-          <w:szCs w:val="22"/>
-        </w:rPr>
-        <w:t xml:space="preserve">예를 들어, MLFQ의 경우 OS에서는 타임 퀀텀을 초과한 프로세스를 즉시 중단하고 하위 큐로 강등시키지만, LLM 환경에서는 요청 완료 후의 결과를 바탕으로 피드백을 적용하는 방식으로 변환해야 할 것이다. 이처럼 각 알고리즘의 핵심 원리를 유지하면서 LLM 환경에 맞게 변환하는 것이 본 연구의 주요 과제이다.</w:t>
-      </w:r>
-    </w:p>
-    <w:p>
-      <w:pPr>
-        <w:spacing w:after="120"/>
-      </w:pPr>
-      <w:r>
-        <w:rPr>
-          <w:rFonts w:ascii="맑은 고딕" w:cs="맑은 고딕" w:eastAsia="맑은 고딕" w:hAnsi="맑은 고딕"/>
-          <w:sz w:val="22"/>
-          <w:szCs w:val="22"/>
-        </w:rPr>
-        <w:t xml:space="preserve">또한, 알고리즘 비교를 위한 적절한 평가 지표를 선정하고, 대기시간, 처리량, 공정성(JFI) 등의 관점에서 각 알고리즘의 특성을 분석하고자 한다.</w:t>
+        <w:t xml:space="preserve">시스템의 전체 흐름은 다음과 같다. 사용자가 REST API를 통해 요청을 보내면, 먼저 호출 빈도 제한(Rate Limiting)으로 과도한 요청을 걸러낸 뒤 대기열에 등록한다. 스케줄러는 선택된 알고리즘에 따라 대기열에서 다음에 처리할 요청을 결정하고, 해당 요청을 LLM API에 전달한다. 응답이 돌아오면 사용자에게 결과를 전달하고, 스케줄러는 다음 요청을 꺼내 같은 과정을 반복한다.</w:t>
+      </w:r>
+    </w:p>
+    <w:p>
+      <w:pPr>
+        <w:spacing w:after="120"/>
+      </w:pPr>
+      <w:r>
+        <w:rPr>
+          <w:rFonts w:ascii="맑은 고딕" w:cs="맑은 고딕" w:eastAsia="맑은 고딕" w:hAnsi="맑은 고딕"/>
+          <w:sz w:val="22"/>
+          <w:szCs w:val="22"/>
+        </w:rPr>
+        <w:t xml:space="preserve">이처럼 호출 빈도 제한은 요청의 진입을 관리하는 전처리 단계이고, 사용자 간 자원 배분은 스케줄러가 담당한다. 시스템은 요청 수신부(REST API), 대기열, 스케줄러, LLM 연결부의 네 부분으로 구성하며, Node.js와 Express.js를 사용하여 구현할 계획이다.</w:t>
+      </w:r>
+    </w:p>
+    <w:p>
+      <w:pPr>
+        <w:spacing w:after="120"/>
+      </w:pPr>
+      <w:r>
+        <w:rPr>
+          <w:rFonts w:ascii="맑은 고딕" w:cs="맑은 고딕" w:eastAsia="맑은 고딕" w:hAnsi="맑은 고딕"/>
+          <w:sz w:val="22"/>
+          <w:szCs w:val="22"/>
+        </w:rPr>
+        <w:t xml:space="preserve">스케줄링 알고리즘은 교체 가능하도록 설계하여, 스케줄러만 바꾸면 나머지 부분은 그대로 유지한 채 네 가지 알고리즘을 같은 조건에서 비교할 수 있게 하려고 한다.</w:t>
       </w:r>
     </w:p>
     <w:p>
@@ -1167,20 +1172,82 @@
         <w:pStyle w:val="Heading2"/>
       </w:pPr>
       <w:r>
-        <w:t xml:space="preserve">3.3 기대 효과</w:t>
-      </w:r>
-    </w:p>
-    <w:p>
-      <w:pPr>
-        <w:spacing w:after="120"/>
-      </w:pPr>
-      <w:r>
-        <w:rPr>
-          <w:rFonts w:ascii="맑은 고딕" w:cs="맑은 고딕" w:eastAsia="맑은 고딕" w:hAnsi="맑은 고딕"/>
-          <w:sz w:val="22"/>
-          <w:szCs w:val="22"/>
-        </w:rPr>
-        <w:t xml:space="preserve">본 시스템이 구현될 경우, 다음과 같은 효과를 기대할 수 있다.</w:t>
+        <w:t xml:space="preserve">3.2 설계 방침</w:t>
+      </w:r>
+    </w:p>
+    <w:p>
+      <w:pPr>
+        <w:spacing w:after="120"/>
+      </w:pPr>
+      <w:r>
+        <w:rPr>
+          <w:rFonts w:ascii="맑은 고딕" w:cs="맑은 고딕" w:eastAsia="맑은 고딕" w:hAnsi="맑은 고딕"/>
+          <w:sz w:val="22"/>
+          <w:szCs w:val="22"/>
+        </w:rPr>
+        <w:t xml:space="preserve">OS 스케줄링 알고리즘을 LLM 환경에 그대로 적용할 수는 없으므로, 본 프로젝트의 핵심인 스케줄러를 중심으로 다음과 같은 설계 방침을 정했다.</w:t>
+      </w:r>
+    </w:p>
+    <w:p>
+      <w:pPr>
+        <w:spacing w:after="120"/>
+      </w:pPr>
+      <w:r>
+        <w:rPr>
+          <w:rFonts w:ascii="맑은 고딕" w:cs="맑은 고딕" w:eastAsia="맑은 고딕" w:hAnsi="맑은 고딕"/>
+          <w:sz w:val="22"/>
+          <w:szCs w:val="22"/>
+        </w:rPr>
+        <w:t xml:space="preserve">첫째, 모든 알고리즘을 </w:t>
+      </w:r>
+      <w:r>
+        <w:rPr>
+          <w:rFonts w:ascii="맑은 고딕" w:cs="맑은 고딕" w:eastAsia="맑은 고딕" w:hAnsi="맑은 고딕"/>
+          <w:b/>
+          <w:bCs/>
+          <w:sz w:val="22"/>
+          <w:szCs w:val="22"/>
+        </w:rPr>
+        <w:t xml:space="preserve">비선점형</w:t>
+      </w:r>
+      <w:r>
+        <w:rPr>
+          <w:rFonts w:ascii="맑은 고딕" w:cs="맑은 고딕" w:eastAsia="맑은 고딕" w:hAnsi="맑은 고딕"/>
+          <w:sz w:val="22"/>
+          <w:szCs w:val="22"/>
+        </w:rPr>
+        <w:t xml:space="preserve"> 방식으로 설계한다. 2장에서 살펴본 것처럼 OS에서 MLFQ 등은 선점형으로 동작하여 실행 중인 프로세스를 중단할 수 있지만, LLM 추론은 한번 시작되면 중간에 중단하기 어렵기 때문이다. 따라서 스케줄러는 대기열에서 다음 요청을 선택하는 시점에만 알고리즘을 적용하고, 이미 처리 중인 요청은 완료될 때까지 기다린다.</w:t>
+      </w:r>
+    </w:p>
+    <w:p>
+      <w:pPr>
+        <w:spacing w:after="120"/>
+      </w:pPr>
+      <w:r>
+        <w:rPr>
+          <w:rFonts w:ascii="맑은 고딕" w:cs="맑은 고딕" w:eastAsia="맑은 고딕" w:hAnsi="맑은 고딕"/>
+          <w:sz w:val="22"/>
+          <w:szCs w:val="22"/>
+        </w:rPr>
+        <w:t xml:space="preserve">둘째, 각 알고리즘의 </w:t>
+      </w:r>
+      <w:r>
+        <w:rPr>
+          <w:rFonts w:ascii="맑은 고딕" w:cs="맑은 고딕" w:eastAsia="맑은 고딕" w:hAnsi="맑은 고딕"/>
+          <w:b/>
+          <w:bCs/>
+          <w:sz w:val="22"/>
+          <w:szCs w:val="22"/>
+        </w:rPr>
+        <w:t xml:space="preserve">핵심 원리는 그대로 유지하면서, 스케줄링 기준은 LLM 환경에 맞게 조정</w:t>
+      </w:r>
+      <w:r>
+        <w:rPr>
+          <w:rFonts w:ascii="맑은 고딕" w:cs="맑은 고딕" w:eastAsia="맑은 고딕" w:hAnsi="맑은 고딕"/>
+          <w:sz w:val="22"/>
+          <w:szCs w:val="22"/>
+        </w:rPr>
+        <w:t xml:space="preserve">한다. FCFS는 별도의 변형 없이 그대로 적용하지만, 나머지 세 알고리즘은 다음과 같이 조정한다.</w:t>
       </w:r>
     </w:p>
     <w:p>
@@ -1200,15 +1267,15 @@
           <w:sz w:val="22"/>
           <w:szCs w:val="22"/>
         </w:rPr>
-        <w:t xml:space="preserve">차등적 서비스 제공</w:t>
-      </w:r>
-      <w:r>
-        <w:rPr>
-          <w:rFonts w:ascii="맑은 고딕" w:cs="맑은 고딕" w:eastAsia="맑은 고딕" w:hAnsi="맑은 고딕"/>
-          <w:sz w:val="22"/>
-          <w:szCs w:val="22"/>
-        </w:rPr>
-        <w:t xml:space="preserve">: 테넌트 등급이나 요청 긴급도에 따라 처리 순서를 조정하여, 중요한 요청을 우선적으로 처리할 수 있다.</w:t>
+        <w:t xml:space="preserve">Priority Scheduling</w:t>
+      </w:r>
+      <w:r>
+        <w:rPr>
+          <w:rFonts w:ascii="맑은 고딕" w:cs="맑은 고딕" w:eastAsia="맑은 고딕" w:hAnsi="맑은 고딕"/>
+          <w:sz w:val="22"/>
+          <w:szCs w:val="22"/>
+        </w:rPr>
+        <w:t xml:space="preserve">: 사용자 등급(예: 일반, 프리미엄)을 우선순위로, 대기 시간을 에이징 기준으로 사용한다.</w:t>
       </w:r>
     </w:p>
     <w:p>
@@ -1228,15 +1295,15 @@
           <w:sz w:val="22"/>
           <w:szCs w:val="22"/>
         </w:rPr>
-        <w:t xml:space="preserve">공정성 보장</w:t>
-      </w:r>
-      <w:r>
-        <w:rPr>
-          <w:rFonts w:ascii="맑은 고딕" w:cs="맑은 고딕" w:eastAsia="맑은 고딕" w:hAnsi="맑은 고딕"/>
-          <w:sz w:val="22"/>
-          <w:szCs w:val="22"/>
-        </w:rPr>
-        <w:t xml:space="preserve">: 공정성 지표를 통해 자원 배분의 균형을 정량적으로 측정하고, 특정 테넌트가 자원을 독점하는 것을 방지할 수 있다.</w:t>
+        <w:t xml:space="preserve">MLFQ</w:t>
+      </w:r>
+      <w:r>
+        <w:rPr>
+          <w:rFonts w:ascii="맑은 고딕" w:cs="맑은 고딕" w:eastAsia="맑은 고딕" w:hAnsi="맑은 고딕"/>
+          <w:sz w:val="22"/>
+          <w:szCs w:val="22"/>
+        </w:rPr>
+        <w:t xml:space="preserve">: 타임 퀀텀 초과 대신 해당 사용자의 최근 요청들의 평균 추론 시간을 기준으로 큐를 재배정하여, 짧은 요청이 빠르게 처리될 수 있도록 한다.</w:t>
       </w:r>
     </w:p>
     <w:p>
@@ -1256,15 +1323,180 @@
           <w:sz w:val="22"/>
           <w:szCs w:val="22"/>
         </w:rPr>
-        <w:t xml:space="preserve">알고리즘 비교 데이터 확보</w:t>
-      </w:r>
-      <w:r>
-        <w:rPr>
-          <w:rFonts w:ascii="맑은 고딕" w:cs="맑은 고딕" w:eastAsia="맑은 고딕" w:hAnsi="맑은 고딕"/>
-          <w:sz w:val="22"/>
-          <w:szCs w:val="22"/>
-        </w:rPr>
-        <w:t xml:space="preserve">: 여러 스케줄링 전략을 동일한 환경에서 비교함으로써, LLM 서빙 환경에 적합한 스케줄링 방식에 대한 실험적 근거를 제공할 수 있다.</w:t>
+        <w:t xml:space="preserve">WFQ</w:t>
+      </w:r>
+      <w:r>
+        <w:rPr>
+          <w:rFonts w:ascii="맑은 고딕" w:cs="맑은 고딕" w:eastAsia="맑은 고딕" w:hAnsi="맑은 고딕"/>
+          <w:sz w:val="22"/>
+          <w:szCs w:val="22"/>
+        </w:rPr>
+        <w:t xml:space="preserve">: 사용자별 가중치에 따라 가상 완료 시각을 계산하여, 가중치에 비례한 서비스를 제공하도록 설계한다.</w:t>
+      </w:r>
+    </w:p>
+    <w:p>
+      <w:pPr>
+        <w:pStyle w:val="Heading2"/>
+      </w:pPr>
+      <w:r>
+        <w:t xml:space="preserve">3.3 평가 계획</w:t>
+      </w:r>
+    </w:p>
+    <w:p>
+      <w:pPr>
+        <w:spacing w:after="120"/>
+      </w:pPr>
+      <w:r>
+        <w:rPr>
+          <w:rFonts w:ascii="맑은 고딕" w:cs="맑은 고딕" w:eastAsia="맑은 고딕" w:hAnsi="맑은 고딕"/>
+          <w:sz w:val="22"/>
+          <w:szCs w:val="22"/>
+        </w:rPr>
+        <w:t xml:space="preserve">구현한 네 가지 알고리즘의 성능과 공정성을 비교하기 위해 평균 대기시간, 처리량, 공정성 지수(JFI)를 측정 지표로 사용한다.</w:t>
+      </w:r>
+    </w:p>
+    <w:p>
+      <w:pPr>
+        <w:spacing w:after="120"/>
+      </w:pPr>
+      <w:r>
+        <w:rPr>
+          <w:rFonts w:ascii="맑은 고딕" w:cs="맑은 고딕" w:eastAsia="맑은 고딕" w:hAnsi="맑은 고딕"/>
+          <w:sz w:val="22"/>
+          <w:szCs w:val="22"/>
+        </w:rPr>
+        <w:t xml:space="preserve">실험은 여러 사용자가 동시에 요청을 보내는 상황을 만들어 진행할 계획이다. 테스트 스크립트를 작성하여 사용자 수(예: 3명, 5명, 10명), 요청 빈도(저부하, 고부하), LLM API 동시 요청 수 등을 조절하면서 다양한 부하 시나리오를 재현해보려고 한다. 또한 사용자별 요청 패턴을 달리하여(예: 짧은 질문 위주 사용자와 긴 문서 요청 사용자의 혼합), 알고리즘별 반응 차이도 관찰할 계획이다.</w:t>
+      </w:r>
+    </w:p>
+    <w:p>
+      <w:pPr>
+        <w:spacing w:after="120"/>
+      </w:pPr>
+      <w:r>
+        <w:rPr>
+          <w:rFonts w:ascii="맑은 고딕" w:cs="맑은 고딕" w:eastAsia="맑은 고딕" w:hAnsi="맑은 고딕"/>
+          <w:sz w:val="22"/>
+          <w:szCs w:val="22"/>
+        </w:rPr>
+        <w:t xml:space="preserve">FCFS를 기준(베이스라인)으로 삼고, 나머지 세 알고리즘을 같은 조건에서 실행한 뒤 위 세 가지 지표로 결과를 비교하여, 각 알고리즘이 어떤 상황에서 유리하고 어떤 한계가 있는지를 파악해보려고 한다.</w:t>
+      </w:r>
+    </w:p>
+    <w:p>
+      <w:pPr>
+        <w:pStyle w:val="Heading2"/>
+      </w:pPr>
+      <w:r>
+        <w:t xml:space="preserve">3.4 기대 효과</w:t>
+      </w:r>
+    </w:p>
+    <w:p>
+      <w:pPr>
+        <w:spacing w:after="120"/>
+      </w:pPr>
+      <w:r>
+        <w:rPr>
+          <w:rFonts w:ascii="맑은 고딕" w:cs="맑은 고딕" w:eastAsia="맑은 고딕" w:hAnsi="맑은 고딕"/>
+          <w:sz w:val="22"/>
+          <w:szCs w:val="22"/>
+        </w:rPr>
+        <w:t xml:space="preserve">본 프로젝트를 통해 다음과 같은 점들을 확인해볼 수 있을 것이다.</w:t>
+      </w:r>
+    </w:p>
+    <w:p>
+      <w:pPr>
+        <w:pStyle w:val="ListParagraph"/>
+        <w:numPr>
+          <w:ilvl w:val="0"/>
+          <w:numId w:val="3"/>
+        </w:numPr>
+        <w:spacing w:after="60"/>
+      </w:pPr>
+      <w:r>
+        <w:rPr>
+          <w:rFonts w:ascii="맑은 고딕" w:cs="맑은 고딕" w:eastAsia="맑은 고딕" w:hAnsi="맑은 고딕"/>
+          <w:b/>
+          <w:bCs/>
+          <w:sz w:val="22"/>
+          <w:szCs w:val="22"/>
+        </w:rPr>
+        <w:t xml:space="preserve">등급별 서비스와 공정성 비교</w:t>
+      </w:r>
+      <w:r>
+        <w:rPr>
+          <w:rFonts w:ascii="맑은 고딕" w:cs="맑은 고딕" w:eastAsia="맑은 고딕" w:hAnsi="맑은 고딕"/>
+          <w:sz w:val="22"/>
+          <w:szCs w:val="22"/>
+        </w:rPr>
+        <w:t xml:space="preserve">: Priority Scheduling이나 WFQ처럼 사용자 등급에 따라 자원을 다르게 배분하는 방식과, JFI로 측정되는 균등한 배분은 동시에 만족시키기 어려운 면이 있다. 같은 조건에서 두 가지를 함께 비교하여, 어떤 상황에서 어떤 방식이 더 적합한지 살펴보려고 한다.</w:t>
+      </w:r>
+    </w:p>
+    <w:p>
+      <w:pPr>
+        <w:pStyle w:val="ListParagraph"/>
+        <w:numPr>
+          <w:ilvl w:val="0"/>
+          <w:numId w:val="3"/>
+        </w:numPr>
+        <w:spacing w:after="60"/>
+      </w:pPr>
+      <w:r>
+        <w:rPr>
+          <w:rFonts w:ascii="맑은 고딕" w:cs="맑은 고딕" w:eastAsia="맑은 고딕" w:hAnsi="맑은 고딕"/>
+          <w:b/>
+          <w:bCs/>
+          <w:sz w:val="22"/>
+          <w:szCs w:val="22"/>
+        </w:rPr>
+        <w:t xml:space="preserve">다른 서비스에도 적용할 수 있는 구조</w:t>
+      </w:r>
+      <w:r>
+        <w:rPr>
+          <w:rFonts w:ascii="맑은 고딕" w:cs="맑은 고딕" w:eastAsia="맑은 고딕" w:hAnsi="맑은 고딕"/>
+          <w:sz w:val="22"/>
+          <w:szCs w:val="22"/>
+        </w:rPr>
+        <w:t xml:space="preserve">: 본 시스템의 대기열-스케줄러 구조는 LLM API에만 쓸 수 있는 것이 아니라, 대기열과 우선순위 관리가 필요한 다른 API 서비스에도 비슷하게 적용해볼 수 있을 것이다.</w:t>
+      </w:r>
+    </w:p>
+    <w:p>
+      <w:pPr>
+        <w:pStyle w:val="ListParagraph"/>
+        <w:numPr>
+          <w:ilvl w:val="0"/>
+          <w:numId w:val="3"/>
+        </w:numPr>
+        <w:spacing w:after="120"/>
+      </w:pPr>
+      <w:r>
+        <w:rPr>
+          <w:rFonts w:ascii="맑은 고딕" w:cs="맑은 고딕" w:eastAsia="맑은 고딕" w:hAnsi="맑은 고딕"/>
+          <w:b/>
+          <w:bCs/>
+          <w:sz w:val="22"/>
+          <w:szCs w:val="22"/>
+        </w:rPr>
+        <w:t xml:space="preserve">OS 이론이 실제로 유용한지 확인</w:t>
+      </w:r>
+      <w:r>
+        <w:rPr>
+          <w:rFonts w:ascii="맑은 고딕" w:cs="맑은 고딕" w:eastAsia="맑은 고딕" w:hAnsi="맑은 고딕"/>
+          <w:sz w:val="22"/>
+          <w:szCs w:val="22"/>
+        </w:rPr>
+        <w:t xml:space="preserve">: 교과서에서 다루는 스케줄링 알고리즘이 실제 서비스 환경에서도 의미 있는 성능 차이를 만들어내는지 실험을 통해 확인해볼 수 있다.</w:t>
+      </w:r>
+    </w:p>
+    <w:p>
+      <w:pPr>
+        <w:spacing w:after="120"/>
+      </w:pPr>
+      <w:r>
+        <w:rPr>
+          <w:rFonts w:ascii="맑은 고딕" w:cs="맑은 고딕" w:eastAsia="맑은 고딕" w:hAnsi="맑은 고딕"/>
+          <w:sz w:val="22"/>
+          <w:szCs w:val="22"/>
+        </w:rPr>
+        <w:t xml:space="preserve">다음 장에서는 이러한 목표를 달성하기 위한 구체적인 연구 일정을 정리한다.</w:t>
       </w:r>
     </w:p>
     <w:p>
@@ -1285,7 +1517,7 @@
           <w:sz w:val="22"/>
           <w:szCs w:val="22"/>
         </w:rPr>
-        <w:t xml:space="preserve">26-1학기에는 시스템 설계 및 구현, 성능 비교 실험, 결과 분석을 진행할 계획이다.</w:t>
+        <w:t xml:space="preserve">3장에서 설명한 시스템을 한 학기 동안 구현하고 실험까지 마무리하는 것을 목표로 한다. 시스템 구현이 완료되어야 실험을 진행할 수 있으므로, 4월까지 구현을 마치고 5월에 실험과 분석에 집중하는 일정을 계획하였다.</w:t>
       </w:r>
     </w:p>
     <w:p>
@@ -1301,7 +1533,7 @@
           <w:sz w:val="20"/>
           <w:szCs w:val="20"/>
         </w:rPr>
-        <w:t xml:space="preserve">표 2. 26-1학기 연구 일정</w:t>
+        <w:t xml:space="preserve">표 2. 2026년 1학기 연구 일정</w:t>
       </w:r>
     </w:p>
     <w:tbl>
@@ -1582,7 +1814,7 @@
                 <w:sz w:val="20"/>
                 <w:szCs w:val="20"/>
               </w:rPr>
-              <w:t xml:space="preserve">4월</w:t>
+              <w:t xml:space="preserve">4월 초</w:t>
             </w:r>
           </w:p>
         </w:tc>
@@ -1610,7 +1842,7 @@
                 <w:sz w:val="20"/>
                 <w:szCs w:val="20"/>
               </w:rPr>
-              <w:t xml:space="preserve">시스템 설계 및 구현</w:t>
+              <w:t xml:space="preserve">시스템 설계, 기본 구조 구현</w:t>
             </w:r>
           </w:p>
         </w:tc>
@@ -1696,7 +1928,7 @@
                 <w:sz w:val="20"/>
                 <w:szCs w:val="20"/>
               </w:rPr>
-              <w:t xml:space="preserve">5월 초~중</w:t>
+              <w:t xml:space="preserve">4월 중~말</w:t>
             </w:r>
           </w:p>
         </w:tc>
@@ -1724,7 +1956,7 @@
                 <w:sz w:val="20"/>
                 <w:szCs w:val="20"/>
               </w:rPr>
-              <w:t xml:space="preserve">실험 수행 및 결과 분석</w:t>
+              <w:t xml:space="preserve">스케줄링 알고리즘 구현 및 단위 테스트</w:t>
             </w:r>
           </w:p>
         </w:tc>
@@ -1752,7 +1984,7 @@
                 <w:sz w:val="20"/>
                 <w:szCs w:val="20"/>
               </w:rPr>
-              <w:t xml:space="preserve">최종보고서 + 소스코드</w:t>
+              <w:t xml:space="preserve">동작 가능한 프로토타입</w:t>
             </w:r>
           </w:p>
         </w:tc>
@@ -1780,7 +2012,7 @@
                 <w:sz w:val="20"/>
                 <w:szCs w:val="20"/>
               </w:rPr>
-              <w:t xml:space="preserve">5/24</w:t>
+              <w:t xml:space="preserve">4/30</w:t>
             </w:r>
           </w:p>
         </w:tc>
@@ -1810,6 +2042,120 @@
                 <w:sz w:val="20"/>
                 <w:szCs w:val="20"/>
               </w:rPr>
+              <w:t xml:space="preserve">5월 초~중</w:t>
+            </w:r>
+          </w:p>
+        </w:tc>
+        <w:tc>
+          <w:tcPr>
+            <w:tcW w:type="dxa" w:w="3200"/>
+            <w:tcBorders>
+              <w:top w:val="single" w:color="CCCCCC" w:sz="1"/>
+              <w:left w:val="single" w:color="CCCCCC" w:sz="1"/>
+              <w:bottom w:val="single" w:color="CCCCCC" w:sz="1"/>
+              <w:right w:val="single" w:color="CCCCCC" w:sz="1"/>
+            </w:tcBorders>
+            <w:vAlign w:val="center"/>
+          </w:tcPr>
+          <w:p>
+            <w:pPr>
+              <w:spacing w:after="40" w:before="40"/>
+              <w:jc w:val="left"/>
+            </w:pPr>
+            <w:r>
+              <w:rPr>
+                <w:rFonts w:ascii="맑은 고딕" w:cs="맑은 고딕" w:eastAsia="맑은 고딕" w:hAnsi="맑은 고딕"/>
+                <w:b w:val="false"/>
+                <w:bCs w:val="false"/>
+                <w:sz w:val="20"/>
+                <w:szCs w:val="20"/>
+              </w:rPr>
+              <w:t xml:space="preserve">실험 수행 및 결과 분석</w:t>
+            </w:r>
+          </w:p>
+        </w:tc>
+        <w:tc>
+          <w:tcPr>
+            <w:tcW w:type="dxa" w:w="2560"/>
+            <w:tcBorders>
+              <w:top w:val="single" w:color="CCCCCC" w:sz="1"/>
+              <w:left w:val="single" w:color="CCCCCC" w:sz="1"/>
+              <w:bottom w:val="single" w:color="CCCCCC" w:sz="1"/>
+              <w:right w:val="single" w:color="CCCCCC" w:sz="1"/>
+            </w:tcBorders>
+            <w:vAlign w:val="center"/>
+          </w:tcPr>
+          <w:p>
+            <w:pPr>
+              <w:spacing w:after="40" w:before="40"/>
+              <w:jc w:val="left"/>
+            </w:pPr>
+            <w:r>
+              <w:rPr>
+                <w:rFonts w:ascii="맑은 고딕" w:cs="맑은 고딕" w:eastAsia="맑은 고딕" w:hAnsi="맑은 고딕"/>
+                <w:b w:val="false"/>
+                <w:bCs w:val="false"/>
+                <w:sz w:val="20"/>
+                <w:szCs w:val="20"/>
+              </w:rPr>
+              <w:t xml:space="preserve">최종보고서 + 소스코드</w:t>
+            </w:r>
+          </w:p>
+        </w:tc>
+        <w:tc>
+          <w:tcPr>
+            <w:tcW w:type="dxa" w:w="1800"/>
+            <w:tcBorders>
+              <w:top w:val="single" w:color="CCCCCC" w:sz="1"/>
+              <w:left w:val="single" w:color="CCCCCC" w:sz="1"/>
+              <w:bottom w:val="single" w:color="CCCCCC" w:sz="1"/>
+              <w:right w:val="single" w:color="CCCCCC" w:sz="1"/>
+            </w:tcBorders>
+            <w:vAlign w:val="center"/>
+          </w:tcPr>
+          <w:p>
+            <w:pPr>
+              <w:spacing w:after="40" w:before="40"/>
+              <w:jc w:val="center"/>
+            </w:pPr>
+            <w:r>
+              <w:rPr>
+                <w:rFonts w:ascii="맑은 고딕" w:cs="맑은 고딕" w:eastAsia="맑은 고딕" w:hAnsi="맑은 고딕"/>
+                <w:b w:val="false"/>
+                <w:bCs w:val="false"/>
+                <w:sz w:val="20"/>
+                <w:szCs w:val="20"/>
+              </w:rPr>
+              <w:t xml:space="preserve">5/24</w:t>
+            </w:r>
+          </w:p>
+        </w:tc>
+      </w:tr>
+      <w:tr>
+        <w:tc>
+          <w:tcPr>
+            <w:tcW w:type="dxa" w:w="1800"/>
+            <w:tcBorders>
+              <w:top w:val="single" w:color="CCCCCC" w:sz="1"/>
+              <w:left w:val="single" w:color="CCCCCC" w:sz="1"/>
+              <w:bottom w:val="single" w:color="CCCCCC" w:sz="1"/>
+              <w:right w:val="single" w:color="CCCCCC" w:sz="1"/>
+            </w:tcBorders>
+            <w:vAlign w:val="center"/>
+          </w:tcPr>
+          <w:p>
+            <w:pPr>
+              <w:spacing w:after="40" w:before="40"/>
+              <w:jc w:val="center"/>
+            </w:pPr>
+            <w:r>
+              <w:rPr>
+                <w:rFonts w:ascii="맑은 고딕" w:cs="맑은 고딕" w:eastAsia="맑은 고딕" w:hAnsi="맑은 고딕"/>
+                <w:b w:val="false"/>
+                <w:bCs w:val="false"/>
+                <w:sz w:val="20"/>
+                <w:szCs w:val="20"/>
+              </w:rPr>
               <w:t xml:space="preserve">5월 말</w:t>
             </w:r>
           </w:p>
@@ -1902,6 +2248,19 @@
     </w:tbl>
     <w:p>
       <w:pPr>
+        <w:spacing w:after="120" w:before="120"/>
+      </w:pPr>
+      <w:r>
+        <w:rPr>
+          <w:rFonts w:ascii="맑은 고딕" w:cs="맑은 고딕" w:eastAsia="맑은 고딕" w:hAnsi="맑은 고딕"/>
+          <w:sz w:val="22"/>
+          <w:szCs w:val="22"/>
+        </w:rPr>
+        <w:t xml:space="preserve">이상으로 본 프로젝트의 배경, 관련 연구, 시스템 설계 방향, 그리고 연구 일정을 정리하였다. 위 일정에 따라 네 가지 스케줄링 알고리즘을 구현하고 성능과 공정성을 비교하여, OS 스케줄링 이론이 LLM API 요청 관리에서 실제로 의미 있는 차이를 만들 수 있는지 확인해보려고 한다.</w:t>
+      </w:r>
+    </w:p>
+    <w:p>
+      <w:pPr>
         <w:pStyle w:val="Heading1"/>
       </w:pPr>
       <w:r>
@@ -1918,7 +2277,7 @@
           <w:sz w:val="20"/>
           <w:szCs w:val="20"/>
         </w:rPr>
-        <w:t xml:space="preserve">[1] A. Silberschatz, P. B. Galvin, and G. Gagne, Operating System Concepts, 10th ed., Wiley, 2018. [온라인] Available: https://www.os-book.com/</w:t>
+        <w:t xml:space="preserve">[1] OpenAI, "Rate limits," OpenAI API Documentation. [온라인] Available: https://platform.openai.com/docs/guides/rate-limits (접속: 2026-03-14)</w:t>
       </w:r>
     </w:p>
     <w:p>
@@ -1931,7 +2290,7 @@
           <w:sz w:val="20"/>
           <w:szCs w:val="20"/>
         </w:rPr>
-        <w:t xml:space="preserve">[2] R. H. Arpaci-Dusseau and A. C. Arpaci-Dusseau, Operating Systems: Three Easy Pieces, Version 1.10, Arpaci-Dusseau Books, 2023. [온라인] Available: https://pages.cs.wisc.edu/~remzi/OSTEP/</w:t>
+        <w:t xml:space="preserve">[2] Anthropic, "Rate limits," Anthropic API Documentation. [온라인] Available: https://docs.anthropic.com/en/api/rate-limits (접속: 2026-03-14)</w:t>
       </w:r>
     </w:p>
     <w:p>
@@ -1944,7 +2303,7 @@
           <w:sz w:val="20"/>
           <w:szCs w:val="20"/>
         </w:rPr>
-        <w:t xml:space="preserve">[3] J. F. Kurose and K. W. Ross, Computer Networking: A Top-Down Approach, 8th ed., Pearson, 2021. [온라인] Available: https://gaia.cs.umass.edu/kurose_ross/</w:t>
+        <w:t xml:space="preserve">[3] A. Silberschatz, P. B. Galvin, and G. Gagne, Operating System Concepts, 10th ed., Wiley, 2018. [온라인] Available: https://www.os-book.com/</w:t>
       </w:r>
     </w:p>
     <w:p>
@@ -1957,7 +2316,7 @@
           <w:sz w:val="20"/>
           <w:szCs w:val="20"/>
         </w:rPr>
-        <w:t xml:space="preserve">[4] W. Kwon et al., "Efficient Memory Management for Large Language Model Serving with PagedAttention," arXiv preprint, 2023. [온라인] Available: https://arxiv.org/abs/2309.06180</w:t>
+        <w:t xml:space="preserve">[4] R. H. Arpaci-Dusseau and A. C. Arpaci-Dusseau, Operating Systems: Three Easy Pieces, Version 1.10, Arpaci-Dusseau Books, 2023. [온라인] Available: https://pages.cs.wisc.edu/~remzi/OSTEP/</w:t>
       </w:r>
     </w:p>
     <w:p>
@@ -1970,7 +2329,7 @@
           <w:sz w:val="20"/>
           <w:szCs w:val="20"/>
         </w:rPr>
-        <w:t xml:space="preserve">[5] Hugging Face, "Text Generation Inference (TGI)," 2024. [온라인] Available: https://huggingface.co/docs/text-generation-inference/</w:t>
+        <w:t xml:space="preserve">[5] J. F. Kurose and K. W. Ross, Computer Networking: A Top-Down Approach, 9th ed., Pearson, 2025. [온라인] Available: https://gaia.cs.umass.edu/kurose_ross/</w:t>
       </w:r>
     </w:p>
     <w:p>
@@ -1983,7 +2342,7 @@
           <w:sz w:val="20"/>
           <w:szCs w:val="20"/>
         </w:rPr>
-        <w:t xml:space="preserve">[6] Ollama, "Ollama - Get up and running with large language models," 2024. [온라인] Available: https://ollama.com/</w:t>
+        <w:t xml:space="preserve">[6] W. Kwon et al., "Efficient Memory Management for Large Language Model Serving with PagedAttention," in Proc. 29th ACM Symposium on Operating Systems Principles (SOSP '23), 2023. [온라인] Available: https://arxiv.org/abs/2309.06180</w:t>
       </w:r>
     </w:p>
     <w:p>
@@ -1996,59 +2355,7 @@
           <w:sz w:val="20"/>
           <w:szCs w:val="20"/>
         </w:rPr>
-        <w:t xml:space="preserve">[7] Express.js, "Express - Node.js Web Application Framework," 2024. [온라인] Available: https://expressjs.com/</w:t>
-      </w:r>
-    </w:p>
-    <w:p>
-      <w:pPr>
-        <w:spacing w:after="80"/>
-      </w:pPr>
-      <w:r>
-        <w:rPr>
-          <w:rFonts w:ascii="맑은 고딕" w:cs="맑은 고딕" w:eastAsia="맑은 고딕" w:hAnsi="맑은 고딕"/>
-          <w:sz w:val="20"/>
-          <w:szCs w:val="20"/>
-        </w:rPr>
-        <w:t xml:space="preserve">[8] Node.js, "Node.js Documentation," 2024. [온라인] Available: https://nodejs.org/docs/latest/api/</w:t>
-      </w:r>
-    </w:p>
-    <w:p>
-      <w:pPr>
-        <w:spacing w:after="80"/>
-      </w:pPr>
-      <w:r>
-        <w:rPr>
-          <w:rFonts w:ascii="맑은 고딕" w:cs="맑은 고딕" w:eastAsia="맑은 고딕" w:hAnsi="맑은 고딕"/>
-          <w:sz w:val="20"/>
-          <w:szCs w:val="20"/>
-        </w:rPr>
-        <w:t xml:space="preserve">[9] 혀니앤, "[운영체제] 스케줄링 알고리즘," velog, 2022. [온라인] Available: https://velog.io/@jeongopo/운영체제-스케줄링-알고리즘</w:t>
-      </w:r>
-    </w:p>
-    <w:p>
-      <w:pPr>
-        <w:spacing w:after="80"/>
-      </w:pPr>
-      <w:r>
-        <w:rPr>
-          <w:rFonts w:ascii="맑은 고딕" w:cs="맑은 고딕" w:eastAsia="맑은 고딕" w:hAnsi="맑은 고딕"/>
-          <w:sz w:val="20"/>
-          <w:szCs w:val="20"/>
-        </w:rPr>
-        <w:t xml:space="preserve">[10] 폐프의삶, "[OS] MLFQ," tistory, 2025. [온라인] Available: https://waste-programmer.tistory.com/32</w:t>
-      </w:r>
-    </w:p>
-    <w:p>
-      <w:pPr>
-        <w:spacing w:after="80"/>
-      </w:pPr>
-      <w:r>
-        <w:rPr>
-          <w:rFonts w:ascii="맑은 고딕" w:cs="맑은 고딕" w:eastAsia="맑은 고딕" w:hAnsi="맑은 고딕"/>
-          <w:sz w:val="20"/>
-          <w:szCs w:val="20"/>
-        </w:rPr>
-        <w:t xml:space="preserve">[11] JSH 기술 블로그, "라우터의 패킷 지연과 패킷 스케줄링 방법," tistory, 2021. [온라인] Available: https://studyandwrite.tistory.com/442</w:t>
+        <w:t xml:space="preserve">[7] Hugging Face, "Text Generation Inference (TGI)." [온라인] Available: https://huggingface.co/docs/text-generation-inference/ (접속: 2026-03-14)</w:t>
       </w:r>
     </w:p>
     <w:sectPr>

</xml_diff>